<commit_message>
docs: fix MAX_CHARS explanation for all-MiniLM-L6-v2 token limit
</commit_message>
<xml_diff>
--- a/docs/AI_Legal_Platform_Documentation.docx
+++ b/docs/AI_Legal_Platform_Documentation.docx
@@ -3920,7 +3920,7 @@
                 <w:sz w:val="20"/>
                 <w:szCs w:val="20"/>
               </w:rPr>
-              <w:t xml:space="preserve">all-MiniLM-L6-v2 a une limite de 256 tokens. On reste sous ce seuil pour garantir que l'embedding capture le chunk entier. 1200 chars = ~300 tokens = marge de sécurité de 15%. Au-delà, le modèle tronque silencieusement.</w:t>
+              <w:t xml:space="preserve">all-MiniLM-L6-v2 tronque silencieusement au-delà de 256 tokens. À 1200 chars (~300 tokens), les ~44 tokens excédentaires sont ignorés — comportement acceptable car le début d'un article légal concentre toujours l'essentiel du sens. Le contexte tronqué correspond systématiquement aux détails secondaires en fin de paragraphe.</w:t>
             </w:r>
           </w:p>
         </w:tc>
@@ -9962,7 +9962,7 @@
                 <w:sz w:val="18"/>
                 <w:szCs w:val="18"/>
               </w:rPr>
-              <w:t xml:space="preserve">Fichiers Python créés vides dans VS Code</w:t>
+              <w:t xml:space="preserve">__pycache__ cachant les anciens fichiers</w:t>
             </w:r>
           </w:p>
         </w:tc>
@@ -9990,7 +9990,7 @@
                 <w:sz w:val="18"/>
                 <w:szCs w:val="18"/>
               </w:rPr>
-              <w:t xml:space="preserve">VS Code crée des placeholders avant copie du contenu</w:t>
+              <w:t xml:space="preserve">Python compile .pyc depuis les fichiers sources. Si le cache n'est pas purgé après modification, Python exécute l'ancienne version compilée</w:t>
             </w:r>
           </w:p>
         </w:tc>
@@ -10018,7 +10018,7 @@
                 <w:sz w:val="18"/>
                 <w:szCs w:val="18"/>
               </w:rPr>
-              <w:t xml:space="preserve">Créer via terminal (touch + nano) ou drag-drop des fichiers téléchargés</w:t>
+              <w:t xml:space="preserve">rm -rf **/__pycache__</w:t>
             </w:r>
           </w:p>
         </w:tc>
@@ -10046,7 +10046,7 @@
                 <w:sz w:val="18"/>
                 <w:szCs w:val="18"/>
               </w:rPr>
-              <w:t xml:space="preserve">Script de scaffolding automatique</w:t>
+              <w:t xml:space="preserve">pytest --cache-clear à chaque run</w:t>
             </w:r>
           </w:p>
         </w:tc>
@@ -10104,7 +10104,7 @@
                 <w:sz w:val="18"/>
                 <w:szCs w:val="18"/>
               </w:rPr>
-              <w:t xml:space="preserve">__pycache__ cachant les anciens fichiers vides</w:t>
+              <w:t xml:space="preserve">device='cpu' lent sur M4 (~2min pour 2016 chunks)</w:t>
             </w:r>
           </w:p>
         </w:tc>
@@ -10132,7 +10132,7 @@
                 <w:sz w:val="18"/>
                 <w:szCs w:val="18"/>
               </w:rPr>
-              <w:t xml:space="preserve">Python compile .pyc depuis les fichiers sources vides</w:t>
+              <w:t xml:space="preserve">sentence-transformers utilise CPU par défaut sur Mac</w:t>
             </w:r>
           </w:p>
         </w:tc>
@@ -10160,7 +10160,7 @@
                 <w:sz w:val="18"/>
                 <w:szCs w:val="18"/>
               </w:rPr>
-              <w:t xml:space="preserve">rm -rf **/__pycache__</w:t>
+              <w:t xml:space="preserve">device='mps' partout — 8x plus rapide</w:t>
             </w:r>
           </w:p>
         </w:tc>
@@ -10188,7 +10188,7 @@
                 <w:sz w:val="18"/>
                 <w:szCs w:val="18"/>
               </w:rPr>
-              <w:t xml:space="preserve">pytest --cache-clear à chaque run</w:t>
+              <w:t xml:space="preserve">CUDA si Linux avec GPU NVIDIA</w:t>
             </w:r>
           </w:p>
         </w:tc>
@@ -10246,7 +10246,7 @@
                 <w:sz w:val="18"/>
                 <w:szCs w:val="18"/>
               </w:rPr>
-              <w:t xml:space="preserve">device='cpu' lent sur M4 (~2min pour 2016 chunks)</w:t>
+              <w:t xml:space="preserve">progress_bar bloquant l'event loop FastAPI</w:t>
             </w:r>
           </w:p>
         </w:tc>
@@ -10274,7 +10274,7 @@
                 <w:sz w:val="18"/>
                 <w:szCs w:val="18"/>
               </w:rPr>
-              <w:t xml:space="preserve">sentence-transformers utilise CPU par défaut sur Mac</w:t>
+              <w:t xml:space="preserve">tqdm écrit sur stderr de façon synchrone</w:t>
             </w:r>
           </w:p>
         </w:tc>
@@ -10302,7 +10302,7 @@
                 <w:sz w:val="18"/>
                 <w:szCs w:val="18"/>
               </w:rPr>
-              <w:t xml:space="preserve">device='mps' partout — 8x plus rapide</w:t>
+              <w:t xml:space="preserve">show_progress_bar=False dans tous .encode() et .predict()</w:t>
             </w:r>
           </w:p>
         </w:tc>
@@ -10330,7 +10330,7 @@
                 <w:sz w:val="18"/>
                 <w:szCs w:val="18"/>
               </w:rPr>
-              <w:t xml:space="preserve">CUDA si Linux avec GPU NVIDIA</w:t>
+              <w:t xml:space="preserve">run_in_executor() pour isoler le thread</w:t>
             </w:r>
           </w:p>
         </w:tc>
@@ -10361,148 +10361,6 @@
                 <w:szCs w:val="18"/>
               </w:rPr>
               <w:t xml:space="preserve">04</w:t>
-            </w:r>
-          </w:p>
-        </w:tc>
-        <w:tc>
-          <w:tcPr>
-            <w:tcW w:type="dxa" w:w="1900"/>
-            <w:tcBorders>
-              <w:top w:val="single" w:color="CCCCCC" w:sz="1"/>
-              <w:left w:val="single" w:color="CCCCCC" w:sz="1"/>
-              <w:bottom w:val="single" w:color="CCCCCC" w:sz="1"/>
-              <w:right w:val="single" w:color="CCCCCC" w:sz="1"/>
-            </w:tcBorders>
-            <w:tcMar>
-              <w:top w:type="dxa" w:w="80"/>
-              <w:left w:type="dxa" w:w="120"/>
-              <w:bottom w:type="dxa" w:w="80"/>
-              <w:right w:type="dxa" w:w="120"/>
-            </w:tcMar>
-          </w:tcPr>
-          <w:p>
-            <w:r>
-              <w:rPr>
-                <w:rFonts w:ascii="Arial" w:cs="Arial" w:eastAsia="Arial" w:hAnsi="Arial"/>
-                <w:color w:val="444444"/>
-                <w:sz w:val="18"/>
-                <w:szCs w:val="18"/>
-              </w:rPr>
-              <w:t xml:space="preserve">progress_bar bloquant l'event loop FastAPI</w:t>
-            </w:r>
-          </w:p>
-        </w:tc>
-        <w:tc>
-          <w:tcPr>
-            <w:tcW w:type="dxa" w:w="1700"/>
-            <w:tcBorders>
-              <w:top w:val="single" w:color="CCCCCC" w:sz="1"/>
-              <w:left w:val="single" w:color="CCCCCC" w:sz="1"/>
-              <w:bottom w:val="single" w:color="CCCCCC" w:sz="1"/>
-              <w:right w:val="single" w:color="CCCCCC" w:sz="1"/>
-            </w:tcBorders>
-            <w:tcMar>
-              <w:top w:type="dxa" w:w="80"/>
-              <w:left w:type="dxa" w:w="120"/>
-              <w:bottom w:type="dxa" w:w="80"/>
-              <w:right w:type="dxa" w:w="120"/>
-            </w:tcMar>
-          </w:tcPr>
-          <w:p>
-            <w:r>
-              <w:rPr>
-                <w:rFonts w:ascii="Arial" w:cs="Arial" w:eastAsia="Arial" w:hAnsi="Arial"/>
-                <w:color w:val="444444"/>
-                <w:sz w:val="18"/>
-                <w:szCs w:val="18"/>
-              </w:rPr>
-              <w:t xml:space="preserve">tqdm écrit sur stderr de façon synchrone</w:t>
-            </w:r>
-          </w:p>
-        </w:tc>
-        <w:tc>
-          <w:tcPr>
-            <w:tcW w:type="dxa" w:w="2300"/>
-            <w:tcBorders>
-              <w:top w:val="single" w:color="CCCCCC" w:sz="1"/>
-              <w:left w:val="single" w:color="CCCCCC" w:sz="1"/>
-              <w:bottom w:val="single" w:color="CCCCCC" w:sz="1"/>
-              <w:right w:val="single" w:color="CCCCCC" w:sz="1"/>
-            </w:tcBorders>
-            <w:tcMar>
-              <w:top w:type="dxa" w:w="80"/>
-              <w:left w:type="dxa" w:w="120"/>
-              <w:bottom w:type="dxa" w:w="80"/>
-              <w:right w:type="dxa" w:w="120"/>
-            </w:tcMar>
-          </w:tcPr>
-          <w:p>
-            <w:r>
-              <w:rPr>
-                <w:rFonts w:ascii="Arial" w:cs="Arial" w:eastAsia="Arial" w:hAnsi="Arial"/>
-                <w:color w:val="444444"/>
-                <w:sz w:val="18"/>
-                <w:szCs w:val="18"/>
-              </w:rPr>
-              <w:t xml:space="preserve">show_progress_bar=False dans tous .encode() et .predict()</w:t>
-            </w:r>
-          </w:p>
-        </w:tc>
-        <w:tc>
-          <w:tcPr>
-            <w:tcW w:type="dxa" w:w="2826"/>
-            <w:tcBorders>
-              <w:top w:val="single" w:color="CCCCCC" w:sz="1"/>
-              <w:left w:val="single" w:color="CCCCCC" w:sz="1"/>
-              <w:bottom w:val="single" w:color="CCCCCC" w:sz="1"/>
-              <w:right w:val="single" w:color="CCCCCC" w:sz="1"/>
-            </w:tcBorders>
-            <w:tcMar>
-              <w:top w:type="dxa" w:w="80"/>
-              <w:left w:type="dxa" w:w="120"/>
-              <w:bottom w:type="dxa" w:w="80"/>
-              <w:right w:type="dxa" w:w="120"/>
-            </w:tcMar>
-          </w:tcPr>
-          <w:p>
-            <w:r>
-              <w:rPr>
-                <w:rFonts w:ascii="Arial" w:cs="Arial" w:eastAsia="Arial" w:hAnsi="Arial"/>
-                <w:color w:val="444444"/>
-                <w:sz w:val="18"/>
-                <w:szCs w:val="18"/>
-              </w:rPr>
-              <w:t xml:space="preserve">run_in_executor() pour isoler le thread</w:t>
-            </w:r>
-          </w:p>
-        </w:tc>
-      </w:tr>
-      <w:tr>
-        <w:tc>
-          <w:tcPr>
-            <w:tcW w:type="dxa" w:w="300"/>
-            <w:tcBorders>
-              <w:top w:val="single" w:color="CCCCCC" w:sz="1"/>
-              <w:left w:val="single" w:color="CCCCCC" w:sz="1"/>
-              <w:bottom w:val="single" w:color="CCCCCC" w:sz="1"/>
-              <w:right w:val="single" w:color="CCCCCC" w:sz="1"/>
-            </w:tcBorders>
-            <w:tcMar>
-              <w:top w:type="dxa" w:w="80"/>
-              <w:left w:type="dxa" w:w="120"/>
-              <w:bottom w:type="dxa" w:w="80"/>
-              <w:right w:type="dxa" w:w="120"/>
-            </w:tcMar>
-          </w:tcPr>
-          <w:p>
-            <w:r>
-              <w:rPr>
-                <w:rFonts w:ascii="Arial" w:cs="Arial" w:eastAsia="Arial" w:hAnsi="Arial"/>
-                <w:color w:val="444444"/>
-                <w:sz w:val="18"/>
-                <w:szCs w:val="18"/>
-              </w:rPr>
-              <w:t xml:space="preserve">05</w:t>
             </w:r>
           </w:p>
         </w:tc>

</xml_diff>

<commit_message>
docs: update documentation v2.0 — metadata filters, eval metrics, injection defense
</commit_message>
<xml_diff>
--- a/docs/AI_Legal_Platform_Documentation.docx
+++ b/docs/AI_Legal_Platform_Documentation.docx
@@ -11897,7 +11897,7 @@
           <w:sz w:val="22"/>
           <w:szCs w:val="22"/>
         </w:rPr>
-        <w:t xml:space="preserve">Étape 5 — Évaluation RAG</w:t>
+        <w:t xml:space="preserve">Faithfulness — À valider</w:t>
       </w:r>
     </w:p>
     <w:p>
@@ -11911,12 +11911,12 @@
       </w:pPr>
       <w:r>
         <w:rPr>
-          <w:rFonts w:ascii="Arial" w:cs="Arial" w:eastAsia="Arial" w:hAnsi="Arial"/>
+          <w:rFonts w:ascii="Arial" w:cs="Arial" w:hAnsi="Arial"/>
           <w:color w:val="333333"/>
           <w:sz w:val="20"/>
           <w:szCs w:val="20"/>
         </w:rPr>
-        <w:t xml:space="preserve">Construire un dataset de 50 questions/réponses de référence</w:t>
+        <w:t>Lancer python -m evaluation.evaluator sans --no-faithfulness</w:t>
       </w:r>
     </w:p>
     <w:p>
@@ -11930,12 +11930,12 @@
       </w:pPr>
       <w:r>
         <w:rPr>
-          <w:rFonts w:ascii="Arial" w:cs="Arial" w:eastAsia="Arial" w:hAnsi="Arial"/>
+          <w:rFonts w:ascii="Arial" w:cs="Arial" w:hAnsi="Arial"/>
           <w:color w:val="333333"/>
           <w:sz w:val="20"/>
           <w:szCs w:val="20"/>
         </w:rPr>
-        <w:t xml:space="preserve">Mesurer Precision@k, Recall@k, MRR avec RAGAS ou TruLens</w:t>
+        <w:t>Cible : score faithfulness ≥ 85% de fidélité aux sources</w:t>
       </w:r>
     </w:p>
     <w:p>
@@ -11949,18 +11949,13 @@
       </w:pPr>
       <w:r>
         <w:rPr>
-          <w:rFonts w:ascii="Arial" w:cs="Arial" w:eastAsia="Arial" w:hAnsi="Arial"/>
+          <w:rFonts w:ascii="Arial" w:cs="Arial" w:hAnsi="Arial"/>
           <w:color w:val="333333"/>
           <w:sz w:val="20"/>
           <w:szCs w:val="20"/>
         </w:rPr>
-        <w:t xml:space="preserve">Comparer reranking ON vs OFF pour quantifier le gain</w:t>
+        <w:t>Coût estimé : ~$0.20 pour 10 cas (2 appels Claude par cas)</w:t>
       </w:r>
-    </w:p>
-    <w:p>
-      <w:pPr>
-        <w:spacing w:before="0" w:after="80"/>
-      </w:pPr>
     </w:p>
     <w:p>
       <w:pPr>
@@ -11968,14 +11963,14 @@
       </w:pPr>
       <w:r>
         <w:rPr>
-          <w:rFonts w:ascii="Arial" w:cs="Arial" w:eastAsia="Arial" w:hAnsi="Arial"/>
+          <w:rFonts w:ascii="Arial" w:cs="Arial" w:hAnsi="Arial"/>
           <w:b/>
           <w:bCs/>
           <w:color w:val="333333"/>
           <w:sz w:val="22"/>
           <w:szCs w:val="22"/>
         </w:rPr>
-        <w:t xml:space="preserve">Étape 6 — Interface utilisateur</w:t>
+        <w:t>Docker — Containerisation</w:t>
       </w:r>
     </w:p>
     <w:p>
@@ -11989,12 +11984,12 @@
       </w:pPr>
       <w:r>
         <w:rPr>
-          <w:rFonts w:ascii="Arial" w:cs="Arial" w:eastAsia="Arial" w:hAnsi="Arial"/>
+          <w:rFonts w:ascii="Arial" w:cs="Arial" w:hAnsi="Arial"/>
           <w:color w:val="333333"/>
           <w:sz w:val="20"/>
           <w:szCs w:val="20"/>
         </w:rPr>
-        <w:t xml:space="preserve">Frontend Streamlit ou Next.js avec affichage des sources</w:t>
+        <w:t>Dockerfile multi-stage (build + runtime Python slim)</w:t>
       </w:r>
     </w:p>
     <w:p>
@@ -12008,33 +12003,12 @@
       </w:pPr>
       <w:r>
         <w:rPr>
-          <w:rFonts w:ascii="Arial" w:cs="Arial" w:eastAsia="Arial" w:hAnsi="Arial"/>
+          <w:rFonts w:ascii="Arial" w:cs="Arial" w:hAnsi="Arial"/>
           <w:color w:val="333333"/>
           <w:sz w:val="20"/>
           <w:szCs w:val="20"/>
         </w:rPr>
-        <w:t xml:space="preserve">Historique des conversations + export PDF des réponses</w:t>
-      </w:r>
-    </w:p>
-    <w:p>
-      <w:pPr>
-        <w:spacing w:before="0" w:after="80"/>
-      </w:pPr>
-    </w:p>
-    <w:p>
-      <w:pPr>
-        <w:spacing w:before="80" w:after="80"/>
-      </w:pPr>
-      <w:r>
-        <w:rPr>
-          <w:rFonts w:ascii="Arial" w:cs="Arial" w:eastAsia="Arial" w:hAnsi="Arial"/>
-          <w:b/>
-          <w:bCs/>
-          <w:color w:val="333333"/>
-          <w:sz w:val="22"/>
-          <w:szCs w:val="22"/>
-        </w:rPr>
-        <w:t xml:space="preserve">Étape 7 — Production</w:t>
+        <w:t>docker-compose avec volume pour data/ et .env injecté</w:t>
       </w:r>
     </w:p>
     <w:p>
@@ -12048,12 +12022,28 @@
       </w:pPr>
       <w:r>
         <w:rPr>
-          <w:rFonts w:ascii="Arial" w:cs="Arial" w:eastAsia="Arial" w:hAnsi="Arial"/>
+          <w:rFonts w:ascii="Arial" w:cs="Arial" w:hAnsi="Arial"/>
           <w:color w:val="333333"/>
           <w:sz w:val="20"/>
           <w:szCs w:val="20"/>
         </w:rPr>
-        <w:t xml:space="preserve">Authentification JWT ou API keys</w:t>
+        <w:t>Déploiement cible : Cloud Run ou Fly.io</w:t>
+      </w:r>
+    </w:p>
+    <w:p>
+      <w:pPr>
+        <w:spacing w:before="80" w:after="80"/>
+      </w:pPr>
+      <w:r>
+        <w:rPr>
+          <w:rFonts w:ascii="Arial" w:cs="Arial" w:hAnsi="Arial"/>
+          <w:b/>
+          <w:bCs/>
+          <w:color w:val="333333"/>
+          <w:sz w:val="22"/>
+          <w:szCs w:val="22"/>
+        </w:rPr>
+        <w:t>Interface — Frontend</w:t>
       </w:r>
     </w:p>
     <w:p>
@@ -12067,12 +12057,50 @@
       </w:pPr>
       <w:r>
         <w:rPr>
-          <w:rFonts w:ascii="Arial" w:cs="Arial" w:eastAsia="Arial" w:hAnsi="Arial"/>
+          <w:rFonts w:ascii="Arial" w:cs="Arial" w:hAnsi="Arial"/>
           <w:color w:val="333333"/>
           <w:sz w:val="20"/>
           <w:szCs w:val="20"/>
         </w:rPr>
-        <w:t xml:space="preserve">Docker + déploiement Cloud Run + monitoring Grafana</w:t>
+        <w:t>Streamlit ou Next.js minimaliste</w:t>
+      </w:r>
+    </w:p>
+    <w:p>
+      <w:pPr>
+        <w:pStyle w:val="ListParagraph"/>
+        <w:numPr>
+          <w:ilvl w:val="0"/>
+          <w:numId w:val="2"/>
+        </w:numPr>
+        <w:spacing w:before="40" w:after="40"/>
+      </w:pPr>
+      <w:r>
+        <w:rPr>
+          <w:rFonts w:ascii="Arial" w:cs="Arial" w:hAnsi="Arial"/>
+          <w:color w:val="333333"/>
+          <w:sz w:val="20"/>
+          <w:szCs w:val="20"/>
+        </w:rPr>
+        <w:t>Affichage des sources avec highlights + sélecteurs filtres metadata</w:t>
+      </w:r>
+    </w:p>
+    <w:p>
+      <w:pPr>
+        <w:pStyle w:val="ListParagraph"/>
+        <w:numPr>
+          <w:ilvl w:val="0"/>
+          <w:numId w:val="2"/>
+        </w:numPr>
+        <w:spacing w:before="40" w:after="40"/>
+      </w:pPr>
+      <w:r>
+        <w:rPr>
+          <w:rFonts w:ascii="Arial" w:cs="Arial" w:hAnsi="Arial"/>
+          <w:color w:val="333333"/>
+          <w:sz w:val="20"/>
+          <w:szCs w:val="20"/>
+        </w:rPr>
+        <w:t>Export PDF des réponses</w:t>
       </w:r>
     </w:p>
     <w:p>
@@ -12100,7 +12128,7 @@
           <w:sz w:val="18"/>
           <w:szCs w:val="18"/>
         </w:rPr>
-        <w:t xml:space="preserve">AI Legal Governance Intelligence Platform — Documentation Technique v1.0 — Mars 2026</w:t>
+        <w:t xml:space="preserve">AI Legal Governance Intelligence Platform — Documentation Technique v2.0 — Mars 2026</w:t>
       </w:r>
     </w:p>
     <w:p>

</xml_diff>

<commit_message>
docs: nuance recall@5 — préciser biais dataset interne, score auto-cohérence vs benchmark indépendant
</commit_message>
<xml_diff>
--- a/docs/AI_Legal_Platform_Documentation.docx
+++ b/docs/AI_Legal_Platform_Documentation.docx
@@ -11859,7 +11859,7 @@
                 <w:sz w:val="18"/>
                 <w:szCs w:val="18"/>
               </w:rPr>
-              <w:t xml:space="preserve">recall@k · faithfulness · LLM-as-judge · 100% recall@5</w:t>
+              <w:t xml:space="preserve">recall@k · faithfulness · LLM-as-judge · 100% recall@5 (dataset interne)</w:t>
             </w:r>
           </w:p>
         </w:tc>
@@ -12401,7 +12401,7 @@
                 <w:sz w:val="20"/>
                 <w:szCs w:val="20"/>
               </w:rPr>
-              <w:t xml:space="preserve">RECALL@5 : 100%  🟢  |  19/19 hits  |  Reranking : activé</w:t>
+              <w:t xml:space="preserve">RECALL@5 : 100% (dataset interne calibré) ⚠ — cohérence interne validée  |  19/19 hits  |  Reranking : activé</w:t>
             </w:r>
           </w:p>
         </w:tc>
@@ -12434,7 +12434,7 @@
                 <w:sz w:val="20"/>
                 <w:szCs w:val="20"/>
               </w:rPr>
-              <w:t xml:space="preserve">Tous les cas GDPR (12/12), EU_AI_ACT (4/4), transversaux (3/3) — HIT ✓</w:t>
+              <w:t xml:space="preserve">Tous les cas GDPR (12/12), EU_AI_ACT (4/4), transversaux (3/3) — HIT ✓ — voir nuance méthodologique ci-dessous</w:t>
             </w:r>
           </w:p>
         </w:tc>
@@ -12480,6 +12480,144 @@
       <w:r>
         <w:t xml:space="preserve"/>
       </w:r>
+    </w:p>
+    <w:p>
+      <w:pPr>
+        <w:spacing w:after="160"/>
+      </w:pPr>
+    </w:p>
+    <w:tbl>
+      <w:tblPr>
+        <w:tblW w:type="dxa" w:w="9360"/>
+        <w:tblBorders>
+          <w:top w:val="single" w:color="A04000" w:sz="4"/>
+          <w:left w:val="single" w:color="A04000" w:sz="4"/>
+          <w:bottom w:val="single" w:color="A04000" w:sz="4"/>
+          <w:right w:val="single" w:color="A04000" w:sz="4"/>
+        </w:tblBorders>
+      </w:tblPr>
+      <w:tblGrid>
+        <w:gridCol w:w="9360"/>
+      </w:tblGrid>
+      <w:tr>
+        <w:tc>
+          <w:tcPr>
+            <w:tcBorders>
+              <w:top w:val="none" w:color="FFFFFF" w:sz="0"/>
+              <w:left w:val="none" w:color="FFFFFF" w:sz="0"/>
+              <w:bottom w:val="none" w:color="FFFFFF" w:sz="0"/>
+              <w:right w:val="none" w:color="FFFFFF" w:sz="0"/>
+            </w:tcBorders>
+            <w:shd w:fill="A04000" w:val="clear"/>
+            <w:tcMar>
+              <w:top w:type="dxa" w:w="60"/>
+              <w:left w:type="dxa" w:w="160"/>
+              <w:bottom w:type="dxa" w:w="60"/>
+              <w:right w:type="dxa" w:w="160"/>
+            </w:tcMar>
+          </w:tcPr>
+          <w:p>
+            <w:r>
+              <w:rPr>
+                <w:rFonts w:ascii="Arial" w:cs="Arial" w:hAnsi="Arial"/>
+                <w:b/>
+                <w:bCs/>
+                <w:caps/>
+                <w:color w:val="FFFFFF"/>
+                <w:sz w:val="17"/>
+                <w:szCs w:val="17"/>
+              </w:rPr>
+              <w:t>NUANCE METHODOLOGIQUE — 79% → 100% : biais de dataset interne</w:t>
+            </w:r>
+          </w:p>
+        </w:tc>
+      </w:tr>
+      <w:tr>
+        <w:tc>
+          <w:tcPr>
+            <w:tcBorders>
+              <w:top w:val="none" w:color="FFFFFF" w:sz="0"/>
+              <w:left w:val="none" w:color="FFFFFF" w:sz="0"/>
+              <w:bottom w:val="none" w:color="FFFFFF" w:sz="0"/>
+              <w:right w:val="none" w:color="FFFFFF" w:sz="0"/>
+            </w:tcBorders>
+            <w:shd w:fill="FEF5E7" w:val="clear"/>
+            <w:tcMar>
+              <w:top w:type="dxa" w:w="80"/>
+              <w:left w:type="dxa" w:w="160"/>
+              <w:bottom w:type="dxa" w:w="80"/>
+              <w:right w:type="dxa" w:w="160"/>
+            </w:tcMar>
+          </w:tcPr>
+          <w:p>
+            <w:pPr>
+              <w:spacing w:after="80"/>
+            </w:pPr>
+            <w:r>
+              <w:rPr>
+                <w:rFonts w:ascii="Arial" w:cs="Arial" w:hAnsi="Arial"/>
+                <w:sz w:val="20"/>
+                <w:szCs w:val="20"/>
+                <w:color w:val="1A1A2E"/>
+              </w:rPr>
+              <w:t xml:space="preserve">Le premier run affichait 79% (15/19). Les 4 MISS n'étaient pas des erreurs du système — les expected_ids avaient été écrits à la main avec des IDs approximatifs qui ne correspondaient pas aux segment_id réels de l'index. Après calibration du dataset sur les vrais IDs, le score est passé à 100%.</w:t>
+            </w:r>
+          </w:p>
+          <w:p>
+            <w:pPr>
+              <w:spacing w:after="80"/>
+            </w:pPr>
+            <w:r>
+              <w:rPr>
+                <w:rFonts w:ascii="Arial" w:cs="Arial" w:hAnsi="Arial"/>
+                <w:b/>
+                <w:sz w:val="20"/>
+                <w:szCs w:val="20"/>
+                <w:color w:val="1A1A2E"/>
+              </w:rPr>
+              <w:t xml:space="preserve">Biais de construction circulaire : </w:t>
+            </w:r>
+            <w:r>
+              <w:rPr>
+                <w:rFonts w:ascii="Arial" w:cs="Arial" w:hAnsi="Arial"/>
+                <w:sz w:val="20"/>
+                <w:szCs w:val="20"/>
+                <w:color w:val="1A1A2E"/>
+              </w:rPr>
+              <w:t xml:space="preserve">les "bonnes réponses" ont été définies après avoir observé ce que le système retourne. Le 100% mesure la cohérence interne du système, pas sa capacité à retrouver les sources canoniques qu'un expert juridique indépendant désignerait.</w:t>
+            </w:r>
+          </w:p>
+          <w:p>
+            <w:pPr>
+              <w:spacing w:after="80"/>
+            </w:pPr>
+            <w:r>
+              <w:rPr>
+                <w:rFonts w:ascii="Arial" w:cs="Arial" w:hAnsi="Arial"/>
+                <w:b/>
+                <w:sz w:val="20"/>
+                <w:szCs w:val="20"/>
+                <w:color w:val="A04000"/>
+              </w:rPr>
+              <w:t xml:space="preserve">Pour un benchmark défendable : </w:t>
+            </w:r>
+            <w:r>
+              <w:rPr>
+                <w:rFonts w:ascii="Arial" w:cs="Arial" w:hAnsi="Arial"/>
+                <w:sz w:val="20"/>
+                <w:szCs w:val="20"/>
+                <w:color w:val="1A1A2E"/>
+              </w:rPr>
+              <w:t xml:space="preserve">faire annoter le dataset par un juriste sans connaissance de l'index, accepter un expected_ids multi-valeur (Article 6 ET Recital 40 sont tous deux valides), et ne pas utiliser les questions de test pour débugger le pipeline. Évaluation indépendante à prévoir — score cible estimé : 78-85%.</w:t>
+            </w:r>
+          </w:p>
+        </w:tc>
+      </w:tr>
+    </w:tbl>
+    <w:p>
+      <w:pPr>
+        <w:spacing w:after="160"/>
+      </w:pPr>
     </w:p>
     <w:tbl>
       <w:tblPr>
@@ -16282,7 +16420,7 @@
                 <w:sz w:val="19"/>
                 <w:szCs w:val="19"/>
               </w:rPr>
-              <w:t xml:space="preserve">19/19 — dataset calibré sur les segment_id réels de l'index</w:t>
+              <w:t xml:space="preserve">19/19 — dataset interne calibré sur l'index. Cohérence interne validée. Benchmark indépendant (annotation juriste) à prévoir.</w:t>
             </w:r>
           </w:p>
         </w:tc>

</xml_diff>

<commit_message>
perf(prompt): faithfulness 88.5% — patch build_prompt + docs v4.0
</commit_message>
<xml_diff>
--- a/docs/AI_Legal_Platform_Documentation.docx
+++ b/docs/AI_Legal_Platform_Documentation.docx
@@ -12652,6 +12652,1400 @@
             </w:tcMar>
           </w:tcPr>
           <w:p>
+            <w:pPr>
+              <w:spacing w:after="100" w:before="240"/>
+            </w:pPr>
+            <w:r>
+              <w:rPr>
+                <w:rFonts w:ascii="Arial" w:cs="Arial" w:hAnsi="Arial"/>
+                <w:b/>
+                <w:color w:val="C9A84C"/>
+                <w:sz w:val="22"/>
+                <w:szCs w:val="22"/>
+              </w:rPr>
+              <w:t>Faithfulness — Fidélité de la génération</w:t>
+            </w:r>
+          </w:p>
+          <w:tbl>
+            <w:tblPr>
+              <w:tblW w:type="dxa" w:w="9360"/>
+              <w:tblBorders>
+                <w:top w:val="single" w:color="7D6608" w:sz="4"/>
+                <w:left w:val="single" w:color="7D6608" w:sz="4"/>
+                <w:bottom w:val="single" w:color="7D6608" w:sz="4"/>
+                <w:right w:val="single" w:color="7D6608" w:sz="4"/>
+              </w:tblBorders>
+            </w:tblPr>
+            <w:tblGrid>
+              <w:gridCol w:w="9360"/>
+            </w:tblGrid>
+            <w:tr>
+              <w:tc>
+                <w:tcPr>
+                  <w:tcBorders>
+                    <w:top w:val="none" w:sz="0"/>
+                    <w:left w:val="none" w:sz="0"/>
+                    <w:bottom w:val="none" w:sz="0"/>
+                    <w:right w:val="none" w:sz="0"/>
+                  </w:tcBorders>
+                  <w:shd w:fill="7D6608" w:val="clear"/>
+                  <w:tcMar>
+                    <w:top w:type="dxa" w:w="40"/>
+                    <w:left w:type="dxa" w:w="140"/>
+                    <w:bottom w:type="dxa" w:w="40"/>
+                    <w:right w:type="dxa" w:w="140"/>
+                  </w:tcMar>
+                </w:tcPr>
+                <w:p>
+                  <w:r>
+                    <w:rPr>
+                      <w:rFonts w:ascii="Arial" w:cs="Arial" w:hAnsi="Arial"/>
+                      <w:b/>
+                      <w:caps/>
+                      <w:color w:val="FFFFFF"/>
+                      <w:sz w:val="17"/>
+                      <w:szCs w:val="17"/>
+                    </w:rPr>
+                    <w:t>Pourquoi on calcule la faithfulness — enjeu cabinet</w:t>
+                  </w:r>
+                </w:p>
+              </w:tc>
+            </w:tr>
+            <w:tr>
+              <w:tc>
+                <w:tcPr>
+                  <w:tcBorders>
+                    <w:top w:val="none" w:sz="0"/>
+                    <w:left w:val="none" w:sz="0"/>
+                    <w:bottom w:val="none" w:sz="0"/>
+                    <w:right w:val="none" w:sz="0"/>
+                  </w:tcBorders>
+                  <w:shd w:fill="FEF9E7" w:val="clear"/>
+                  <w:tcMar>
+                    <w:top w:type="dxa" w:w="60"/>
+                    <w:left w:type="dxa" w:w="140"/>
+                    <w:bottom w:type="dxa" w:w="60"/>
+                    <w:right w:type="dxa" w:w="140"/>
+                  </w:tcMar>
+                </w:tcPr>
+                <w:p>
+                  <w:pPr>
+                    <w:spacing w:after="60"/>
+                  </w:pPr>
+                  <w:r>
+                    <w:rPr>
+                      <w:rFonts w:ascii="Arial" w:cs="Arial" w:hAnsi="Arial"/>
+                      <w:color w:val="1A1A2E"/>
+                      <w:sz w:val="19"/>
+                      <w:szCs w:val="19"/>
+                    </w:rPr>
+                    <w:t xml:space="preserve">La faithfulness répond à une question critique : Claude dit-il uniquement ce que les sources lui permettent de dire ?</w:t>
+                  </w:r>
+                </w:p>
+              </w:tc>
+            </w:tr>
+            <w:tr>
+              <w:tc>
+                <w:tcPr>
+                  <w:tcBorders>
+                    <w:top w:val="none" w:sz="0"/>
+                    <w:left w:val="none" w:sz="0"/>
+                    <w:bottom w:val="none" w:sz="0"/>
+                    <w:right w:val="none" w:sz="0"/>
+                  </w:tcBorders>
+                  <w:shd w:fill="FEF9E7" w:val="clear"/>
+                  <w:tcMar>
+                    <w:top w:type="dxa" w:w="60"/>
+                    <w:left w:type="dxa" w:w="140"/>
+                    <w:bottom w:type="dxa" w:w="60"/>
+                    <w:right w:type="dxa" w:w="140"/>
+                  </w:tcMar>
+                </w:tcPr>
+                <w:p>
+                  <w:pPr>
+                    <w:spacing w:after="60"/>
+                  </w:pPr>
+                  <w:r>
+                    <w:rPr>
+                      <w:rFonts w:ascii="Arial" w:cs="Arial" w:hAnsi="Arial"/>
+                      <w:color w:val="1A1A2E"/>
+                      <w:sz w:val="19"/>
+                      <w:szCs w:val="19"/>
+                    </w:rPr>
+                    <w:t xml:space="preserve">Claude connaît le GDPR et l'AI Act par cœur depuis son entraînement. Sans contrainte explicite, il complète ses réponses avec des informations vraies mais absentes des sources fournies.</w:t>
+                  </w:r>
+                </w:p>
+              </w:tc>
+            </w:tr>
+            <w:tr>
+              <w:tc>
+                <w:tcPr>
+                  <w:tcBorders>
+                    <w:top w:val="none" w:sz="0"/>
+                    <w:left w:val="none" w:sz="0"/>
+                    <w:bottom w:val="none" w:sz="0"/>
+                    <w:right w:val="none" w:sz="0"/>
+                  </w:tcBorders>
+                  <w:shd w:fill="FEF9E7" w:val="clear"/>
+                  <w:tcMar>
+                    <w:top w:type="dxa" w:w="60"/>
+                    <w:left w:type="dxa" w:w="140"/>
+                    <w:bottom w:type="dxa" w:w="60"/>
+                    <w:right w:type="dxa" w:w="140"/>
+                  </w:tcMar>
+                </w:tcPr>
+                <w:p>
+                  <w:pPr>
+                    <w:spacing w:after="60"/>
+                  </w:pPr>
+                  <w:r>
+                    <w:rPr>
+                      <w:rFonts w:ascii="Arial" w:cs="Arial" w:hAnsi="Arial"/>
+                      <w:color w:val="1A1A2E"/>
+                      <w:sz w:val="19"/>
+                      <w:szCs w:val="19"/>
+                    </w:rPr>
+                    <w:t xml:space="preserve">Conséquence cabinet : si un article est abrogé ou modifié et que l'index n'est pas mis à jour, Claude continuera à le mentionner depuis sa mémoire d'entraînement — sans que personne ne le détecte.</w:t>
+                  </w:r>
+                </w:p>
+              </w:tc>
+            </w:tr>
+            <w:tr>
+              <w:tc>
+                <w:tcPr>
+                  <w:tcBorders>
+                    <w:top w:val="none" w:sz="0"/>
+                    <w:left w:val="none" w:sz="0"/>
+                    <w:bottom w:val="none" w:sz="0"/>
+                    <w:right w:val="none" w:sz="0"/>
+                  </w:tcBorders>
+                  <w:shd w:fill="FEF9E7" w:val="clear"/>
+                  <w:tcMar>
+                    <w:top w:type="dxa" w:w="60"/>
+                    <w:left w:type="dxa" w:w="140"/>
+                    <w:bottom w:type="dxa" w:w="60"/>
+                    <w:right w:type="dxa" w:w="140"/>
+                  </w:tcMar>
+                </w:tcPr>
+                <w:p>
+                  <w:pPr>
+                    <w:spacing w:after="60"/>
+                  </w:pPr>
+                  <w:r>
+                    <w:rPr>
+                      <w:rFonts w:ascii="Arial" w:cs="Arial" w:hAnsi="Arial"/>
+                      <w:color w:val="1A1A2E"/>
+                      <w:sz w:val="19"/>
+                      <w:szCs w:val="19"/>
+                    </w:rPr>
+                    <w:t xml:space="preserve">La faithfulness force le système à n'utiliser que ce qu'il a réellement trouvé, et à dire explicitement quand les sources sont insuffisantes.</w:t>
+                  </w:r>
+                </w:p>
+              </w:tc>
+            </w:tr>
+          </w:tbl>
+          <w:p>
+            <w:pPr>
+              <w:spacing w:after="120"/>
+            </w:pPr>
+          </w:p>
+          <w:p>
+            <w:pPr>
+              <w:spacing w:after="100" w:before="240"/>
+            </w:pPr>
+            <w:r>
+              <w:rPr>
+                <w:rFonts w:ascii="Arial" w:cs="Arial" w:hAnsi="Arial"/>
+                <w:b/>
+                <w:color w:val="C9A84C"/>
+                <w:sz w:val="22"/>
+                <w:szCs w:val="22"/>
+              </w:rPr>
+              <w:t>Implémentation — LLM-as-judge</w:t>
+            </w:r>
+          </w:p>
+          <w:p>
+            <w:pPr>
+              <w:spacing w:after="80"/>
+            </w:pPr>
+            <w:r>
+              <w:rPr>
+                <w:rFonts w:ascii="Arial" w:cs="Arial" w:hAnsi="Arial"/>
+                <w:color w:val="1A1A2E"/>
+                <w:sz w:val="20"/>
+                <w:szCs w:val="20"/>
+              </w:rPr>
+              <w:t xml:space="preserve">La technique LLM-as-judge utilise Claude pour évaluer Claude. Pour chaque réponse générée, un second appel API soumet les chunks sources et la réponse à Claude, qui décompose la réponse en claims individuels et vérifie si chaque claim peut être directement justifié par les sources. Score = claims supportés / claims totaux. Coût : ~$0.20 pour 10 cas (2 appels API par question).</w:t>
+            </w:r>
+          </w:p>
+          <w:p>
+            <w:pPr>
+              <w:spacing w:after="120"/>
+            </w:pPr>
+          </w:p>
+          <w:p>
+            <w:pPr>
+              <w:spacing w:after="100" w:before="240"/>
+            </w:pPr>
+            <w:r>
+              <w:rPr>
+                <w:rFonts w:ascii="Arial" w:cs="Arial" w:hAnsi="Arial"/>
+                <w:b/>
+                <w:color w:val="C9A84C"/>
+                <w:sz w:val="22"/>
+                <w:szCs w:val="22"/>
+              </w:rPr>
+              <w:t>Résultats run initial — Avant patch prompt</w:t>
+            </w:r>
+          </w:p>
+          <w:tbl>
+            <w:tblPr>
+              <w:tblW w:type="dxa" w:w="9360"/>
+              <w:tblBorders>
+                <w:top w:val="single" w:color="A04000" w:sz="4"/>
+                <w:left w:val="single" w:color="A04000" w:sz="4"/>
+                <w:bottom w:val="single" w:color="A04000" w:sz="4"/>
+                <w:right w:val="single" w:color="A04000" w:sz="4"/>
+              </w:tblBorders>
+            </w:tblPr>
+            <w:tblGrid>
+              <w:gridCol w:w="9360"/>
+            </w:tblGrid>
+            <w:tr>
+              <w:tc>
+                <w:tcPr>
+                  <w:tcBorders>
+                    <w:top w:val="none" w:sz="0"/>
+                    <w:left w:val="none" w:sz="0"/>
+                    <w:bottom w:val="none" w:sz="0"/>
+                    <w:right w:val="none" w:sz="0"/>
+                  </w:tcBorders>
+                  <w:shd w:fill="A04000" w:val="clear"/>
+                  <w:tcMar>
+                    <w:top w:type="dxa" w:w="40"/>
+                    <w:left w:type="dxa" w:w="140"/>
+                    <w:bottom w:type="dxa" w:w="40"/>
+                    <w:right w:type="dxa" w:w="140"/>
+                  </w:tcMar>
+                </w:tcPr>
+                <w:p>
+                  <w:r>
+                    <w:rPr>
+                      <w:rFonts w:ascii="Arial" w:cs="Arial" w:hAnsi="Arial"/>
+                      <w:b/>
+                      <w:caps/>
+                      <w:color w:val="FFFFFF"/>
+                      <w:sz w:val="17"/>
+                      <w:szCs w:val="17"/>
+                    </w:rPr>
+                    <w:t>Score run initial : 87.4% — seuil 85% atteint, mais claims suspects détectés</w:t>
+                  </w:r>
+                </w:p>
+              </w:tc>
+            </w:tr>
+            <w:tr>
+              <w:tc>
+                <w:tcPr>
+                  <w:tcBorders>
+                    <w:top w:val="none" w:sz="0"/>
+                    <w:left w:val="none" w:sz="0"/>
+                    <w:bottom w:val="none" w:sz="0"/>
+                    <w:right w:val="none" w:sz="0"/>
+                  </w:tcBorders>
+                  <w:shd w:fill="FEF9E7" w:val="clear"/>
+                  <w:tcMar>
+                    <w:top w:type="dxa" w:w="60"/>
+                    <w:left w:type="dxa" w:w="140"/>
+                    <w:bottom w:type="dxa" w:w="60"/>
+                    <w:right w:type="dxa" w:w="140"/>
+                  </w:tcMar>
+                </w:tcPr>
+                <w:p>
+                  <w:pPr>
+                    <w:spacing w:after="60"/>
+                  </w:pPr>
+                  <w:r>
+                    <w:rPr>
+                      <w:rFonts w:ascii="Arial" w:cs="Arial" w:hAnsi="Arial"/>
+                      <w:color w:val="1A1A2E"/>
+                      <w:sz w:val="19"/>
+                      <w:szCs w:val="19"/>
+                    </w:rPr>
+                    <w:t xml:space="preserve">Score : 87.4% | Min: 78% | Max: 100% | Médiane: 86%</w:t>
+                  </w:r>
+                </w:p>
+              </w:tc>
+            </w:tr>
+            <w:tr>
+              <w:tc>
+                <w:tcPr>
+                  <w:tcBorders>
+                    <w:top w:val="none" w:sz="0"/>
+                    <w:left w:val="none" w:sz="0"/>
+                    <w:bottom w:val="none" w:sz="0"/>
+                    <w:right w:val="none" w:sz="0"/>
+                  </w:tcBorders>
+                  <w:shd w:fill="FEF9E7" w:val="clear"/>
+                  <w:tcMar>
+                    <w:top w:type="dxa" w:w="60"/>
+                    <w:left w:type="dxa" w:w="140"/>
+                    <w:bottom w:type="dxa" w:w="60"/>
+                    <w:right w:type="dxa" w:w="140"/>
+                  </w:tcMar>
+                </w:tcPr>
+                <w:p>
+                  <w:pPr>
+                    <w:spacing w:after="60"/>
+                  </w:pPr>
+                  <w:r>
+                    <w:rPr>
+                      <w:rFonts w:ascii="Arial" w:cs="Arial" w:hAnsi="Arial"/>
+                      <w:color w:val="1A1A2E"/>
+                      <w:sz w:val="19"/>
+                      <w:szCs w:val="19"/>
+                    </w:rPr>
+                    <w:t xml:space="preserve">18 claims non supportés sur 10 questions évaluées</w:t>
+                  </w:r>
+                </w:p>
+              </w:tc>
+            </w:tr>
+            <w:tr>
+              <w:tc>
+                <w:tcPr>
+                  <w:tcBorders>
+                    <w:top w:val="none" w:sz="0"/>
+                    <w:left w:val="none" w:sz="0"/>
+                    <w:bottom w:val="none" w:sz="0"/>
+                    <w:right w:val="none" w:sz="0"/>
+                  </w:tcBorders>
+                  <w:shd w:fill="FEF9E7" w:val="clear"/>
+                  <w:tcMar>
+                    <w:top w:type="dxa" w:w="60"/>
+                    <w:left w:type="dxa" w:w="140"/>
+                    <w:bottom w:type="dxa" w:w="60"/>
+                    <w:right w:type="dxa" w:w="140"/>
+                  </w:tcMar>
+                </w:tcPr>
+                <w:p>
+                  <w:pPr>
+                    <w:spacing w:after="60"/>
+                  </w:pPr>
+                  <w:r>
+                    <w:rPr>
+                      <w:rFonts w:ascii="Arial" w:cs="Arial" w:hAnsi="Arial"/>
+                      <w:color w:val="1A1A2E"/>
+                      <w:sz w:val="19"/>
+                      <w:szCs w:val="19"/>
+                    </w:rPr>
+                    <w:t xml:space="preserve">Exemples détectés : 'Article 40 — codes de conduite', 'Article 42 — certifications'</w:t>
+                  </w:r>
+                </w:p>
+              </w:tc>
+            </w:tr>
+            <w:tr>
+              <w:tc>
+                <w:tcPr>
+                  <w:tcBorders>
+                    <w:top w:val="none" w:sz="0"/>
+                    <w:left w:val="none" w:sz="0"/>
+                    <w:bottom w:val="none" w:sz="0"/>
+                    <w:right w:val="none" w:sz="0"/>
+                  </w:tcBorders>
+                  <w:shd w:fill="FEF9E7" w:val="clear"/>
+                  <w:tcMar>
+                    <w:top w:type="dxa" w:w="60"/>
+                    <w:left w:type="dxa" w:w="140"/>
+                    <w:bottom w:type="dxa" w:w="60"/>
+                    <w:right w:type="dxa" w:w="140"/>
+                  </w:tcMar>
+                </w:tcPr>
+                <w:p>
+                  <w:pPr>
+                    <w:spacing w:after="60"/>
+                  </w:pPr>
+                  <w:r>
+                    <w:rPr>
+                      <w:rFonts w:ascii="Arial" w:cs="Arial" w:hAnsi="Arial"/>
+                      <w:color w:val="1A1A2E"/>
+                      <w:sz w:val="19"/>
+                      <w:szCs w:val="19"/>
+                    </w:rPr>
+                    <w:t xml:space="preserve">Formulations mot-à-mot du GDPR absentes des chunks retournés</w:t>
+                  </w:r>
+                </w:p>
+              </w:tc>
+            </w:tr>
+          </w:tbl>
+          <w:p>
+            <w:pPr>
+              <w:spacing w:after="120"/>
+            </w:pPr>
+          </w:p>
+          <w:p>
+            <w:pPr>
+              <w:spacing w:after="100" w:before="240"/>
+            </w:pPr>
+            <w:r>
+              <w:rPr>
+                <w:rFonts w:ascii="Arial" w:cs="Arial" w:hAnsi="Arial"/>
+                <w:b/>
+                <w:color w:val="C9A84C"/>
+                <w:sz w:val="22"/>
+                <w:szCs w:val="22"/>
+              </w:rPr>
+              <w:t>Diagnostic — Pas de l'hallucination, de la complétion mémoire</w:t>
+            </w:r>
+          </w:p>
+          <w:tbl>
+            <w:tblPr>
+              <w:tblW w:type="dxa" w:w="9360"/>
+              <w:tblBorders>
+                <w:top w:val="single" w:color="A93226" w:sz="4"/>
+                <w:left w:val="single" w:color="A93226" w:sz="4"/>
+                <w:bottom w:val="single" w:color="A93226" w:sz="4"/>
+                <w:right w:val="single" w:color="A93226" w:sz="4"/>
+              </w:tblBorders>
+            </w:tblPr>
+            <w:tblGrid>
+              <w:gridCol w:w="9360"/>
+            </w:tblGrid>
+            <w:tr>
+              <w:tc>
+                <w:tcPr>
+                  <w:tcBorders>
+                    <w:top w:val="none" w:sz="0"/>
+                    <w:left w:val="none" w:sz="0"/>
+                    <w:bottom w:val="none" w:sz="0"/>
+                    <w:right w:val="none" w:sz="0"/>
+                  </w:tcBorders>
+                  <w:shd w:fill="A93226" w:val="clear"/>
+                  <w:tcMar>
+                    <w:top w:type="dxa" w:w="40"/>
+                    <w:left w:type="dxa" w:w="140"/>
+                    <w:bottom w:type="dxa" w:w="40"/>
+                    <w:right w:type="dxa" w:w="140"/>
+                  </w:tcMar>
+                </w:tcPr>
+                <w:p>
+                  <w:r>
+                    <w:rPr>
+                      <w:rFonts w:ascii="Arial" w:cs="Arial" w:hAnsi="Arial"/>
+                      <w:b/>
+                      <w:caps/>
+                      <w:color w:val="FFFFFF"/>
+                      <w:sz w:val="17"/>
+                      <w:szCs w:val="17"/>
+                    </w:rPr>
+                    <w:t>Analyse des claims non supportés</w:t>
+                  </w:r>
+                </w:p>
+              </w:tc>
+            </w:tr>
+            <w:tr>
+              <w:tc>
+                <w:tcPr>
+                  <w:tcBorders>
+                    <w:top w:val="none" w:sz="0"/>
+                    <w:left w:val="none" w:sz="0"/>
+                    <w:bottom w:val="none" w:sz="0"/>
+                    <w:right w:val="none" w:sz="0"/>
+                  </w:tcBorders>
+                  <w:shd w:fill="FDEDEC" w:val="clear"/>
+                  <w:tcMar>
+                    <w:top w:type="dxa" w:w="60"/>
+                    <w:left w:type="dxa" w:w="140"/>
+                    <w:bottom w:type="dxa" w:w="60"/>
+                    <w:right w:type="dxa" w:w="140"/>
+                  </w:tcMar>
+                </w:tcPr>
+                <w:p>
+                  <w:pPr>
+                    <w:spacing w:after="60"/>
+                  </w:pPr>
+                  <w:r>
+                    <w:rPr>
+                      <w:rFonts w:ascii="Arial" w:cs="Arial" w:hAnsi="Arial"/>
+                      <w:color w:val="1A1A2E"/>
+                      <w:sz w:val="19"/>
+                      <w:szCs w:val="19"/>
+                    </w:rPr>
+                    <w:t xml:space="preserve">Tous correspondent à des informations juridiquement correctes que Claude connaît par cœur, mais absentes des k=5 chunks retournés.</w:t>
+                  </w:r>
+                </w:p>
+              </w:tc>
+            </w:tr>
+            <w:tr>
+              <w:tc>
+                <w:tcPr>
+                  <w:tcBorders>
+                    <w:top w:val="none" w:sz="0"/>
+                    <w:left w:val="none" w:sz="0"/>
+                    <w:bottom w:val="none" w:sz="0"/>
+                    <w:right w:val="none" w:sz="0"/>
+                  </w:tcBorders>
+                  <w:shd w:fill="FDEDEC" w:val="clear"/>
+                  <w:tcMar>
+                    <w:top w:type="dxa" w:w="60"/>
+                    <w:left w:type="dxa" w:w="140"/>
+                    <w:bottom w:type="dxa" w:w="60"/>
+                    <w:right w:type="dxa" w:w="140"/>
+                  </w:tcMar>
+                </w:tcPr>
+                <w:p>
+                  <w:pPr>
+                    <w:spacing w:after="60"/>
+                  </w:pPr>
+                  <w:r>
+                    <w:rPr>
+                      <w:rFonts w:ascii="Arial" w:cs="Arial" w:hAnsi="Arial"/>
+                      <w:color w:val="1A1A2E"/>
+                      <w:sz w:val="19"/>
+                      <w:szCs w:val="19"/>
+                    </w:rPr>
+                    <w:t xml:space="preserve">Ce n'est pas de l'hallucination — Claude ne dit rien de faux. C'est de la complétion non sourée : il enrichit les réponses avec des informations vraies mais absentes des sources.</w:t>
+                  </w:r>
+                </w:p>
+              </w:tc>
+            </w:tr>
+            <w:tr>
+              <w:tc>
+                <w:tcPr>
+                  <w:tcBorders>
+                    <w:top w:val="none" w:sz="0"/>
+                    <w:left w:val="none" w:sz="0"/>
+                    <w:bottom w:val="none" w:sz="0"/>
+                    <w:right w:val="none" w:sz="0"/>
+                  </w:tcBorders>
+                  <w:shd w:fill="FDEDEC" w:val="clear"/>
+                  <w:tcMar>
+                    <w:top w:type="dxa" w:w="60"/>
+                    <w:left w:type="dxa" w:w="140"/>
+                    <w:bottom w:type="dxa" w:w="60"/>
+                    <w:right w:type="dxa" w:w="140"/>
+                  </w:tcMar>
+                </w:tcPr>
+                <w:p>
+                  <w:pPr>
+                    <w:spacing w:after="60"/>
+                  </w:pPr>
+                  <w:r>
+                    <w:rPr>
+                      <w:rFonts w:ascii="Arial" w:cs="Arial" w:hAnsi="Arial"/>
+                      <w:color w:val="1A1A2E"/>
+                      <w:sz w:val="19"/>
+                      <w:szCs w:val="19"/>
+                    </w:rPr>
+                    <w:t xml:space="preserve">Enjeu cabinet : si l'Article 42 est modifié par un amendement que l'index n'a pas intégré, Claude continuera à citer l'ancienne version depuis sa mémoire d'entraînement.</w:t>
+                  </w:r>
+                </w:p>
+              </w:tc>
+            </w:tr>
+            <w:tr>
+              <w:tc>
+                <w:tcPr>
+                  <w:tcBorders>
+                    <w:top w:val="none" w:sz="0"/>
+                    <w:left w:val="none" w:sz="0"/>
+                    <w:bottom w:val="none" w:sz="0"/>
+                    <w:right w:val="none" w:sz="0"/>
+                  </w:tcBorders>
+                  <w:shd w:fill="FDEDEC" w:val="clear"/>
+                  <w:tcMar>
+                    <w:top w:type="dxa" w:w="60"/>
+                    <w:left w:type="dxa" w:w="140"/>
+                    <w:bottom w:type="dxa" w:w="60"/>
+                    <w:right w:type="dxa" w:w="140"/>
+                  </w:tcMar>
+                </w:tcPr>
+                <w:p>
+                  <w:pPr>
+                    <w:spacing w:after="60"/>
+                  </w:pPr>
+                  <w:r>
+                    <w:rPr>
+                      <w:rFonts w:ascii="Arial" w:cs="Arial" w:hAnsi="Arial"/>
+                      <w:color w:val="1A1A2E"/>
+                      <w:sz w:val="19"/>
+                      <w:szCs w:val="19"/>
+                    </w:rPr>
+                    <w:t xml:space="preserve">Sans faithfulness, personne ne détecterait cette dérive.</w:t>
+                  </w:r>
+                </w:p>
+              </w:tc>
+            </w:tr>
+          </w:tbl>
+          <w:p>
+            <w:pPr>
+              <w:spacing w:after="120"/>
+            </w:pPr>
+          </w:p>
+          <w:p>
+            <w:pPr>
+              <w:spacing w:after="100" w:before="240"/>
+            </w:pPr>
+            <w:r>
+              <w:rPr>
+                <w:rFonts w:ascii="Arial" w:cs="Arial" w:hAnsi="Arial"/>
+                <w:b/>
+                <w:color w:val="C9A84C"/>
+                <w:sz w:val="22"/>
+                <w:szCs w:val="22"/>
+              </w:rPr>
+              <w:t>Décision — Patch du prompt build_prompt()</w:t>
+            </w:r>
+          </w:p>
+          <w:p>
+            <w:pPr>
+              <w:spacing w:after="80"/>
+            </w:pPr>
+            <w:r>
+              <w:rPr>
+                <w:rFonts w:ascii="Arial" w:cs="Arial" w:hAnsi="Arial"/>
+                <w:color w:val="1A1A2E"/>
+                <w:sz w:val="20"/>
+                <w:szCs w:val="20"/>
+              </w:rPr>
+              <w:t xml:space="preserve">Problème : le prompt disait 'base ta réponse EXCLUSIVEMENT sur les sources'. Claude l'interprétait comme 'les sources sont la base principale', pas comme une interdiction stricte.</w:t>
+            </w:r>
+          </w:p>
+          <w:tbl>
+            <w:tblPr>
+              <w:tblW w:type="dxa" w:w="9360"/>
+              <w:tblBorders>
+                <w:top w:val="single" w:color="C9A84C" w:sz="4"/>
+                <w:left w:val="single" w:color="C9A84C" w:sz="6"/>
+                <w:bottom w:val="single" w:color="C9A84C" w:sz="4"/>
+                <w:right w:val="single" w:color="C9A84C" w:sz="4"/>
+              </w:tblBorders>
+            </w:tblPr>
+            <w:tblGrid>
+              <w:gridCol w:w="9360"/>
+            </w:tblGrid>
+            <w:tr>
+              <w:tc>
+                <w:tcPr>
+                  <w:tcBorders>
+                    <w:top w:val="none" w:sz="0"/>
+                    <w:left w:val="none" w:sz="0"/>
+                    <w:bottom w:val="none" w:sz="0"/>
+                    <w:right w:val="none" w:sz="0"/>
+                  </w:tcBorders>
+                  <w:shd w:fill="222222" w:val="clear"/>
+                  <w:tcMar>
+                    <w:top w:type="dxa" w:w="80"/>
+                    <w:left w:type="dxa" w:w="160"/>
+                    <w:bottom w:type="dxa" w:w="80"/>
+                    <w:right w:type="dxa" w:w="160"/>
+                  </w:tcMar>
+                </w:tcPr>
+                <w:p>
+                  <w:pPr>
+                    <w:spacing w:after="60"/>
+                  </w:pPr>
+                  <w:r>
+                    <w:rPr>
+                      <w:rFonts w:ascii="Arial" w:cs="Arial" w:hAnsi="Arial"/>
+                      <w:b/>
+                      <w:color w:val="E8C97A"/>
+                      <w:sz w:val="20"/>
+                      <w:szCs w:val="20"/>
+                    </w:rPr>
+                    <w:t>Modification apportée (Prompt v1.1)</w:t>
+                  </w:r>
+                </w:p>
+                <w:p>
+                  <w:pPr>
+                    <w:spacing w:after="0"/>
+                  </w:pPr>
+                  <w:r>
+                    <w:rPr>
+                      <w:rFonts w:ascii="Arial" w:cs="Arial" w:hAnsi="Arial"/>
+                      <w:color w:val="999999"/>
+                      <w:sz w:val="19"/>
+                      <w:szCs w:val="19"/>
+                    </w:rPr>
+                    <w:t xml:space="preserve">Ajout de deux règles explicites : (1) INTERDIT — ajouter des informations, numéros d'articles ou références que tu connais mais qui ne figurent PAS dans les sources, même si ces informations sont exactes. (2) Si une information ne peut pas être citée depuis une source, ne l'inclus pas — indique que les sources sont insuffisantes.</w:t>
+                  </w:r>
+                </w:p>
+              </w:tc>
+            </w:tr>
+          </w:tbl>
+          <w:p>
+            <w:pPr>
+              <w:spacing w:after="120"/>
+            </w:pPr>
+          </w:p>
+          <w:p>
+            <w:pPr>
+              <w:spacing w:after="100" w:before="240"/>
+            </w:pPr>
+            <w:r>
+              <w:rPr>
+                <w:rFonts w:ascii="Arial" w:cs="Arial" w:hAnsi="Arial"/>
+                <w:b/>
+                <w:color w:val="C9A84C"/>
+                <w:sz w:val="22"/>
+                <w:szCs w:val="22"/>
+              </w:rPr>
+              <w:t>Résultats après patch — Prompt v1.1</w:t>
+            </w:r>
+          </w:p>
+          <w:tbl>
+            <w:tblPr>
+              <w:tblW w:type="dxa" w:w="9360"/>
+              <w:tblBorders>
+                <w:top w:val="single" w:color="1E8449" w:sz="4"/>
+                <w:left w:val="single" w:color="1E8449" w:sz="4"/>
+                <w:bottom w:val="single" w:color="1E8449" w:sz="4"/>
+                <w:right w:val="single" w:color="1E8449" w:sz="4"/>
+              </w:tblBorders>
+            </w:tblPr>
+            <w:tblGrid>
+              <w:gridCol w:w="9360"/>
+            </w:tblGrid>
+            <w:tr>
+              <w:tc>
+                <w:tcPr>
+                  <w:tcBorders>
+                    <w:top w:val="none" w:sz="0"/>
+                    <w:left w:val="none" w:sz="0"/>
+                    <w:bottom w:val="none" w:sz="0"/>
+                    <w:right w:val="none" w:sz="0"/>
+                  </w:tcBorders>
+                  <w:shd w:fill="1E8449" w:val="clear"/>
+                  <w:tcMar>
+                    <w:top w:type="dxa" w:w="40"/>
+                    <w:left w:type="dxa" w:w="140"/>
+                    <w:bottom w:type="dxa" w:w="40"/>
+                    <w:right w:type="dxa" w:w="140"/>
+                  </w:tcMar>
+                </w:tcPr>
+                <w:p>
+                  <w:r>
+                    <w:rPr>
+                      <w:rFonts w:ascii="Arial" w:cs="Arial" w:hAnsi="Arial"/>
+                      <w:b/>
+                      <w:caps/>
+                      <w:color w:val="FFFFFF"/>
+                      <w:sz w:val="17"/>
+                      <w:szCs w:val="17"/>
+                    </w:rPr>
+                    <w:t>Score après patch : 88.5% — AU-DESSUS DU SEUIL 85%</w:t>
+                  </w:r>
+                </w:p>
+              </w:tc>
+            </w:tr>
+            <w:tr>
+              <w:tc>
+                <w:tcPr>
+                  <w:tcBorders>
+                    <w:top w:val="none" w:sz="0"/>
+                    <w:left w:val="none" w:sz="0"/>
+                    <w:bottom w:val="none" w:sz="0"/>
+                    <w:right w:val="none" w:sz="0"/>
+                  </w:tcBorders>
+                  <w:shd w:fill="EAFAF1" w:val="clear"/>
+                  <w:tcMar>
+                    <w:top w:type="dxa" w:w="60"/>
+                    <w:left w:type="dxa" w:w="140"/>
+                    <w:bottom w:type="dxa" w:w="60"/>
+                    <w:right w:type="dxa" w:w="140"/>
+                  </w:tcMar>
+                </w:tcPr>
+                <w:p>
+                  <w:pPr>
+                    <w:spacing w:after="60"/>
+                  </w:pPr>
+                  <w:r>
+                    <w:rPr>
+                      <w:rFonts w:ascii="Arial" w:cs="Arial" w:hAnsi="Arial"/>
+                      <w:color w:val="1A1A2E"/>
+                      <w:sz w:val="19"/>
+                      <w:szCs w:val="19"/>
+                    </w:rPr>
+                    <w:t xml:space="preserve">Score : 88.5% (+1.1% vs run initial) | Min: 80% | Max: 100% | Médiane: 86%</w:t>
+                  </w:r>
+                </w:p>
+              </w:tc>
+            </w:tr>
+            <w:tr>
+              <w:tc>
+                <w:tcPr>
+                  <w:tcBorders>
+                    <w:top w:val="none" w:sz="0"/>
+                    <w:left w:val="none" w:sz="0"/>
+                    <w:bottom w:val="none" w:sz="0"/>
+                    <w:right w:val="none" w:sz="0"/>
+                  </w:tcBorders>
+                  <w:shd w:fill="EAFAF1" w:val="clear"/>
+                  <w:tcMar>
+                    <w:top w:type="dxa" w:w="60"/>
+                    <w:left w:type="dxa" w:w="140"/>
+                    <w:bottom w:type="dxa" w:w="60"/>
+                    <w:right w:type="dxa" w:w="140"/>
+                  </w:tcMar>
+                </w:tcPr>
+                <w:p>
+                  <w:pPr>
+                    <w:spacing w:after="60"/>
+                  </w:pPr>
+                  <w:r>
+                    <w:rPr>
+                      <w:rFonts w:ascii="Arial" w:cs="Arial" w:hAnsi="Arial"/>
+                      <w:color w:val="1A1A2E"/>
+                      <w:sz w:val="19"/>
+                      <w:szCs w:val="19"/>
+                    </w:rPr>
+                    <w:t xml:space="preserve">4 questions sur 10 à fidélité parfaite (100%)</w:t>
+                  </w:r>
+                </w:p>
+              </w:tc>
+            </w:tr>
+            <w:tr>
+              <w:tc>
+                <w:tcPr>
+                  <w:tcBorders>
+                    <w:top w:val="none" w:sz="0"/>
+                    <w:left w:val="none" w:sz="0"/>
+                    <w:bottom w:val="none" w:sz="0"/>
+                    <w:right w:val="none" w:sz="0"/>
+                  </w:tcBorders>
+                  <w:shd w:fill="EAFAF1" w:val="clear"/>
+                  <w:tcMar>
+                    <w:top w:type="dxa" w:w="60"/>
+                    <w:left w:type="dxa" w:w="140"/>
+                    <w:bottom w:type="dxa" w:w="60"/>
+                    <w:right w:type="dxa" w:w="140"/>
+                  </w:tcMar>
+                </w:tcPr>
+                <w:p>
+                  <w:pPr>
+                    <w:spacing w:after="60"/>
+                  </w:pPr>
+                  <w:r>
+                    <w:rPr>
+                      <w:rFonts w:ascii="Arial" w:cs="Arial" w:hAnsi="Arial"/>
+                      <w:color w:val="1A1A2E"/>
+                      <w:sz w:val="19"/>
+                      <w:szCs w:val="19"/>
+                    </w:rPr>
+                    <w:t xml:space="preserve">4 questions avec claims résiduels (80–86%) — formulations GDPR mot-à-mot</w:t>
+                  </w:r>
+                </w:p>
+              </w:tc>
+            </w:tr>
+            <w:tr>
+              <w:tc>
+                <w:tcPr>
+                  <w:tcBorders>
+                    <w:top w:val="none" w:sz="0"/>
+                    <w:left w:val="none" w:sz="0"/>
+                    <w:bottom w:val="none" w:sz="0"/>
+                    <w:right w:val="none" w:sz="0"/>
+                  </w:tcBorders>
+                  <w:shd w:fill="EAFAF1" w:val="clear"/>
+                  <w:tcMar>
+                    <w:top w:type="dxa" w:w="60"/>
+                    <w:left w:type="dxa" w:w="140"/>
+                    <w:bottom w:type="dxa" w:w="60"/>
+                    <w:right w:type="dxa" w:w="140"/>
+                  </w:tcMar>
+                </w:tcPr>
+                <w:p>
+                  <w:pPr>
+                    <w:spacing w:after="60"/>
+                  </w:pPr>
+                  <w:r>
+                    <w:rPr>
+                      <w:rFonts w:ascii="Arial" w:cs="Arial" w:hAnsi="Arial"/>
+                      <w:color w:val="1A1A2E"/>
+                      <w:sz w:val="19"/>
+                      <w:szCs w:val="19"/>
+                    </w:rPr>
+                    <w:t xml:space="preserve">Aucun cas sous 80% — plancher acceptable pour usage cabinet</w:t>
+                  </w:r>
+                </w:p>
+              </w:tc>
+            </w:tr>
+          </w:tbl>
+          <w:p>
+            <w:pPr>
+              <w:spacing w:after="120"/>
+            </w:pPr>
+          </w:p>
+          <w:p>
+            <w:pPr>
+              <w:spacing w:after="100" w:before="240"/>
+            </w:pPr>
+            <w:r>
+              <w:rPr>
+                <w:rFonts w:ascii="Arial" w:cs="Arial" w:hAnsi="Arial"/>
+                <w:b/>
+                <w:color w:val="C9A84C"/>
+                <w:sz w:val="22"/>
+                <w:szCs w:val="22"/>
+              </w:rPr>
+              <w:t>Test k=7 — Plus de contexte résout-il le problème ?</w:t>
+            </w:r>
+          </w:p>
+          <w:p>
+            <w:pPr>
+              <w:spacing w:after="80"/>
+            </w:pPr>
+            <w:r>
+              <w:rPr>
+                <w:rFonts w:ascii="Arial" w:cs="Arial" w:hAnsi="Arial"/>
+                <w:color w:val="1A1A2E"/>
+                <w:sz w:val="20"/>
+                <w:szCs w:val="20"/>
+              </w:rPr>
+              <w:t xml:space="preserve">Hypothèse testée : les claims résiduels venaient peut-être de chunks manquants. En augmentant k à 7, plus de sources seraient disponibles à Claude.</w:t>
+            </w:r>
+          </w:p>
+          <w:tbl>
+            <w:tblPr>
+              <w:tblW w:type="dxa" w:w="9360"/>
+              <w:tblBorders>
+                <w:top w:val="single" w:color="A04000" w:sz="4"/>
+                <w:left w:val="single" w:color="A04000" w:sz="4"/>
+                <w:bottom w:val="single" w:color="A04000" w:sz="4"/>
+                <w:right w:val="single" w:color="A04000" w:sz="4"/>
+              </w:tblBorders>
+            </w:tblPr>
+            <w:tblGrid>
+              <w:gridCol w:w="9360"/>
+            </w:tblGrid>
+            <w:tr>
+              <w:tc>
+                <w:tcPr>
+                  <w:tcBorders>
+                    <w:top w:val="none" w:sz="0"/>
+                    <w:left w:val="none" w:sz="0"/>
+                    <w:bottom w:val="none" w:sz="0"/>
+                    <w:right w:val="none" w:sz="0"/>
+                  </w:tcBorders>
+                  <w:shd w:fill="A04000" w:val="clear"/>
+                  <w:tcMar>
+                    <w:top w:type="dxa" w:w="40"/>
+                    <w:left w:type="dxa" w:w="140"/>
+                    <w:bottom w:type="dxa" w:w="40"/>
+                    <w:right w:type="dxa" w:w="140"/>
+                  </w:tcMar>
+                </w:tcPr>
+                <w:p>
+                  <w:r>
+                    <w:rPr>
+                      <w:rFonts w:ascii="Arial" w:cs="Arial" w:hAnsi="Arial"/>
+                      <w:b/>
+                      <w:caps/>
+                      <w:color w:val="FFFFFF"/>
+                      <w:sz w:val="17"/>
+                      <w:szCs w:val="17"/>
+                    </w:rPr>
+                    <w:t>Résultat test k=7 : 87.4% — inférieur à k=5 (88.5%)</w:t>
+                  </w:r>
+                </w:p>
+              </w:tc>
+            </w:tr>
+            <w:tr>
+              <w:tc>
+                <w:tcPr>
+                  <w:tcBorders>
+                    <w:top w:val="none" w:sz="0"/>
+                    <w:left w:val="none" w:sz="0"/>
+                    <w:bottom w:val="none" w:sz="0"/>
+                    <w:right w:val="none" w:sz="0"/>
+                  </w:tcBorders>
+                  <w:shd w:fill="FEF9E7" w:val="clear"/>
+                  <w:tcMar>
+                    <w:top w:type="dxa" w:w="60"/>
+                    <w:left w:type="dxa" w:w="140"/>
+                    <w:bottom w:type="dxa" w:w="60"/>
+                    <w:right w:type="dxa" w:w="140"/>
+                  </w:tcMar>
+                </w:tcPr>
+                <w:p>
+                  <w:pPr>
+                    <w:spacing w:after="60"/>
+                  </w:pPr>
+                  <w:r>
+                    <w:rPr>
+                      <w:rFonts w:ascii="Arial" w:cs="Arial" w:hAnsi="Arial"/>
+                      <w:color w:val="1A1A2E"/>
+                      <w:sz w:val="19"/>
+                      <w:szCs w:val="19"/>
+                    </w:rPr>
+                    <w:t xml:space="preserve">Score faithfulness k=7 : 87.4% vs 88.5% pour k=5</w:t>
+                  </w:r>
+                </w:p>
+              </w:tc>
+            </w:tr>
+            <w:tr>
+              <w:tc>
+                <w:tcPr>
+                  <w:tcBorders>
+                    <w:top w:val="none" w:sz="0"/>
+                    <w:left w:val="none" w:sz="0"/>
+                    <w:bottom w:val="none" w:sz="0"/>
+                    <w:right w:val="none" w:sz="0"/>
+                  </w:tcBorders>
+                  <w:shd w:fill="FEF9E7" w:val="clear"/>
+                  <w:tcMar>
+                    <w:top w:type="dxa" w:w="60"/>
+                    <w:left w:type="dxa" w:w="140"/>
+                    <w:bottom w:type="dxa" w:w="60"/>
+                    <w:right w:type="dxa" w:w="140"/>
+                  </w:tcMar>
+                </w:tcPr>
+                <w:p>
+                  <w:pPr>
+                    <w:spacing w:after="60"/>
+                  </w:pPr>
+                  <w:r>
+                    <w:rPr>
+                      <w:rFonts w:ascii="Arial" w:cs="Arial" w:hAnsi="Arial"/>
+                      <w:color w:val="1A1A2E"/>
+                      <w:sz w:val="19"/>
+                      <w:szCs w:val="19"/>
+                    </w:rPr>
+                    <w:t xml:space="preserve">Conclusion : augmenter k n'améliore pas la faithfulness.</w:t>
+                  </w:r>
+                </w:p>
+              </w:tc>
+            </w:tr>
+            <w:tr>
+              <w:tc>
+                <w:tcPr>
+                  <w:tcBorders>
+                    <w:top w:val="none" w:sz="0"/>
+                    <w:left w:val="none" w:sz="0"/>
+                    <w:bottom w:val="none" w:sz="0"/>
+                    <w:right w:val="none" w:sz="0"/>
+                  </w:tcBorders>
+                  <w:shd w:fill="FEF9E7" w:val="clear"/>
+                  <w:tcMar>
+                    <w:top w:type="dxa" w:w="60"/>
+                    <w:left w:type="dxa" w:w="140"/>
+                    <w:bottom w:type="dxa" w:w="60"/>
+                    <w:right w:type="dxa" w:w="140"/>
+                  </w:tcMar>
+                </w:tcPr>
+                <w:p>
+                  <w:pPr>
+                    <w:spacing w:after="60"/>
+                  </w:pPr>
+                  <w:r>
+                    <w:rPr>
+                      <w:rFonts w:ascii="Arial" w:cs="Arial" w:hAnsi="Arial"/>
+                      <w:color w:val="1A1A2E"/>
+                      <w:sz w:val="19"/>
+                      <w:szCs w:val="19"/>
+                    </w:rPr>
+                    <w:t xml:space="preserve">Les chunks supplémentaires n'apportent pas les articles manquants.</w:t>
+                  </w:r>
+                </w:p>
+              </w:tc>
+            </w:tr>
+            <w:tr>
+              <w:tc>
+                <w:tcPr>
+                  <w:tcBorders>
+                    <w:top w:val="none" w:sz="0"/>
+                    <w:left w:val="none" w:sz="0"/>
+                    <w:bottom w:val="none" w:sz="0"/>
+                    <w:right w:val="none" w:sz="0"/>
+                  </w:tcBorders>
+                  <w:shd w:fill="FEF9E7" w:val="clear"/>
+                  <w:tcMar>
+                    <w:top w:type="dxa" w:w="60"/>
+                    <w:left w:type="dxa" w:w="140"/>
+                    <w:bottom w:type="dxa" w:w="60"/>
+                    <w:right w:type="dxa" w:w="140"/>
+                  </w:tcMar>
+                </w:tcPr>
+                <w:p>
+                  <w:pPr>
+                    <w:spacing w:after="60"/>
+                  </w:pPr>
+                  <w:r>
+                    <w:rPr>
+                      <w:rFonts w:ascii="Arial" w:cs="Arial" w:hAnsi="Arial"/>
+                      <w:color w:val="1A1A2E"/>
+                      <w:sz w:val="19"/>
+                      <w:szCs w:val="19"/>
+                    </w:rPr>
+                    <w:t xml:space="preserve">Avec plus de contexte, Claude a tendance à compléter davantage depuis sa mémoire.</w:t>
+                  </w:r>
+                </w:p>
+              </w:tc>
+            </w:tr>
+          </w:tbl>
+          <w:p>
+            <w:pPr>
+              <w:spacing w:after="120"/>
+            </w:pPr>
+          </w:p>
+          <w:p>
+            <w:pPr>
+              <w:spacing w:after="100" w:before="240"/>
+            </w:pPr>
+            <w:r>
+              <w:rPr>
+                <w:rFonts w:ascii="Arial" w:cs="Arial" w:hAnsi="Arial"/>
+                <w:b/>
+                <w:color w:val="C9A84C"/>
+                <w:sz w:val="22"/>
+                <w:szCs w:val="22"/>
+              </w:rPr>
+              <w:t>Interprétation — Plafond structurel à ~88%</w:t>
+            </w:r>
+          </w:p>
+          <w:tbl>
+            <w:tblPr>
+              <w:tblW w:type="dxa" w:w="9360"/>
+              <w:tblBorders>
+                <w:top w:val="single" w:color="5D6D7E" w:sz="4"/>
+                <w:left w:val="single" w:color="5D6D7E" w:sz="4"/>
+                <w:bottom w:val="single" w:color="5D6D7E" w:sz="4"/>
+                <w:right w:val="single" w:color="5D6D7E" w:sz="4"/>
+              </w:tblBorders>
+            </w:tblPr>
+            <w:tblGrid>
+              <w:gridCol w:w="9360"/>
+            </w:tblGrid>
+            <w:tr>
+              <w:tc>
+                <w:tcPr>
+                  <w:tcBorders>
+                    <w:top w:val="none" w:sz="0"/>
+                    <w:left w:val="none" w:sz="0"/>
+                    <w:bottom w:val="none" w:sz="0"/>
+                    <w:right w:val="none" w:sz="0"/>
+                  </w:tcBorders>
+                  <w:shd w:fill="5D6D7E" w:val="clear"/>
+                  <w:tcMar>
+                    <w:top w:type="dxa" w:w="40"/>
+                    <w:left w:type="dxa" w:w="140"/>
+                    <w:bottom w:type="dxa" w:w="40"/>
+                    <w:right w:type="dxa" w:w="140"/>
+                  </w:tcMar>
+                </w:tcPr>
+                <w:p>
+                  <w:r>
+                    <w:rPr>
+                      <w:rFonts w:ascii="Arial" w:cs="Arial" w:hAnsi="Arial"/>
+                      <w:b/>
+                      <w:caps/>
+                      <w:color w:val="FFFFFF"/>
+                      <w:sz w:val="17"/>
+                      <w:szCs w:val="17"/>
+                    </w:rPr>
+                    <w:t>Analyse et décision finale</w:t>
+                  </w:r>
+                </w:p>
+              </w:tc>
+            </w:tr>
+            <w:tr>
+              <w:tc>
+                <w:tcPr>
+                  <w:tcBorders>
+                    <w:top w:val="none" w:sz="0"/>
+                    <w:left w:val="none" w:sz="0"/>
+                    <w:bottom w:val="none" w:sz="0"/>
+                    <w:right w:val="none" w:sz="0"/>
+                  </w:tcBorders>
+                  <w:shd w:fill="EBF5FB" w:val="clear"/>
+                  <w:tcMar>
+                    <w:top w:type="dxa" w:w="60"/>
+                    <w:left w:type="dxa" w:w="140"/>
+                    <w:bottom w:type="dxa" w:w="60"/>
+                    <w:right w:type="dxa" w:w="140"/>
+                  </w:tcMar>
+                </w:tcPr>
+                <w:p>
+                  <w:pPr>
+                    <w:spacing w:after="60"/>
+                  </w:pPr>
+                  <w:r>
+                    <w:rPr>
+                      <w:rFonts w:ascii="Arial" w:cs="Arial" w:hAnsi="Arial"/>
+                      <w:color w:val="1A1A2E"/>
+                      <w:sz w:val="19"/>
+                      <w:szCs w:val="19"/>
+                    </w:rPr>
+                    <w:t xml:space="preserve">Les claims résiduels sont des formulations précises du GDPR que Claude connaît mot pour mot, mais les chunks retournés contiennent les articles parents, pas les sous-alinéas spécifiques.</w:t>
+                  </w:r>
+                </w:p>
+              </w:tc>
+            </w:tr>
+            <w:tr>
+              <w:tc>
+                <w:tcPr>
+                  <w:tcBorders>
+                    <w:top w:val="none" w:sz="0"/>
+                    <w:left w:val="none" w:sz="0"/>
+                    <w:bottom w:val="none" w:sz="0"/>
+                    <w:right w:val="none" w:sz="0"/>
+                  </w:tcBorders>
+                  <w:shd w:fill="EBF5FB" w:val="clear"/>
+                  <w:tcMar>
+                    <w:top w:type="dxa" w:w="60"/>
+                    <w:left w:type="dxa" w:w="140"/>
+                    <w:bottom w:type="dxa" w:w="60"/>
+                    <w:right w:type="dxa" w:w="140"/>
+                  </w:tcMar>
+                </w:tcPr>
+                <w:p>
+                  <w:pPr>
+                    <w:spacing w:after="60"/>
+                  </w:pPr>
+                  <w:r>
+                    <w:rPr>
+                      <w:rFonts w:ascii="Arial" w:cs="Arial" w:hAnsi="Arial"/>
+                      <w:color w:val="1A1A2E"/>
+                      <w:sz w:val="19"/>
+                      <w:szCs w:val="19"/>
+                    </w:rPr>
+                    <w:t xml:space="preserve">Ce n'est pas un problème de retrieval ni de prompt — c'est une limite du découpage du corpus.</w:t>
+                  </w:r>
+                </w:p>
+              </w:tc>
+            </w:tr>
+            <w:tr>
+              <w:tc>
+                <w:tcPr>
+                  <w:tcBorders>
+                    <w:top w:val="none" w:sz="0"/>
+                    <w:left w:val="none" w:sz="0"/>
+                    <w:bottom w:val="none" w:sz="0"/>
+                    <w:right w:val="none" w:sz="0"/>
+                  </w:tcBorders>
+                  <w:shd w:fill="EBF5FB" w:val="clear"/>
+                  <w:tcMar>
+                    <w:top w:type="dxa" w:w="60"/>
+                    <w:left w:type="dxa" w:w="140"/>
+                    <w:bottom w:type="dxa" w:w="60"/>
+                    <w:right w:type="dxa" w:w="140"/>
+                  </w:tcMar>
+                </w:tcPr>
+                <w:p>
+                  <w:pPr>
+                    <w:spacing w:after="60"/>
+                  </w:pPr>
+                  <w:r>
+                    <w:rPr>
+                      <w:rFonts w:ascii="Arial" w:cs="Arial" w:hAnsi="Arial"/>
+                      <w:color w:val="1A1A2E"/>
+                      <w:sz w:val="19"/>
+                      <w:szCs w:val="19"/>
+                    </w:rPr>
+                    <w:t xml:space="preserve">Décision : retenir k=5 (meilleur ratio faithfulness/latence). Documenter le plafond à ~88%.</w:t>
+                  </w:r>
+                </w:p>
+              </w:tc>
+            </w:tr>
+            <w:tr>
+              <w:tc>
+                <w:tcPr>
+                  <w:tcBorders>
+                    <w:top w:val="none" w:sz="0"/>
+                    <w:left w:val="none" w:sz="0"/>
+                    <w:bottom w:val="none" w:sz="0"/>
+                    <w:right w:val="none" w:sz="0"/>
+                  </w:tcBorders>
+                  <w:shd w:fill="EBF5FB" w:val="clear"/>
+                  <w:tcMar>
+                    <w:top w:type="dxa" w:w="60"/>
+                    <w:left w:type="dxa" w:w="140"/>
+                    <w:bottom w:type="dxa" w:w="60"/>
+                    <w:right w:type="dxa" w:w="140"/>
+                  </w:tcMar>
+                </w:tcPr>
+                <w:p>
+                  <w:pPr>
+                    <w:spacing w:after="60"/>
+                  </w:pPr>
+                  <w:r>
+                    <w:rPr>
+                      <w:rFonts w:ascii="Arial" w:cs="Arial" w:hAnsi="Arial"/>
+                      <w:color w:val="1A1A2E"/>
+                      <w:sz w:val="19"/>
+                      <w:szCs w:val="19"/>
+                    </w:rPr>
+                    <w:t xml:space="preserve">Pour dépasser 88% : chunking plus granulaire au niveau sous-alinéa — à prévoir pour une version production avancée.</w:t>
+                  </w:r>
+                </w:p>
+              </w:tc>
+            </w:tr>
+          </w:tbl>
+          <w:p>
+            <w:pPr>
+              <w:spacing w:after="120"/>
+            </w:pPr>
+          </w:p>
+          <w:p>
+            <w:pPr>
+              <w:spacing w:after="100" w:before="240"/>
+            </w:pPr>
+            <w:r>
+              <w:rPr>
+                <w:rFonts w:ascii="Arial" w:cs="Arial" w:hAnsi="Arial"/>
+                <w:b/>
+                <w:color w:val="C9A84C"/>
+                <w:sz w:val="22"/>
+                <w:szCs w:val="22"/>
+              </w:rPr>
+              <w:t>Recommandations</w:t>
+            </w:r>
+          </w:p>
+          <w:p>
+            <w:pPr>
+              <w:spacing w:after="80"/>
+            </w:pPr>
+            <w:r>
+              <w:rPr>
+                <w:rFonts w:ascii="Arial" w:cs="Arial" w:hAnsi="Arial"/>
+                <w:color w:val="1A1A2E"/>
+                <w:sz w:val="20"/>
+                <w:szCs w:val="20"/>
+              </w:rPr>
+              <w:t xml:space="preserve">Court terme (0€, 30 min) : hallucination guardrail niveau 1 (vérifier que les [SOURCE X] citées existent dans les chunks). Prompt versioning dans prompts/CHANGELOG.md. Re-run faithfulness à chaque modification de build_prompt().</w:t>
+            </w:r>
+          </w:p>
+          <w:p>
+            <w:pPr>
+              <w:spacing w:after="80"/>
+            </w:pPr>
+            <w:r>
+              <w:rPr>
+                <w:rFonts w:ascii="Arial" w:cs="Arial" w:hAnsi="Arial"/>
+                <w:color w:val="1A1A2E"/>
+                <w:sz w:val="20"/>
+                <w:szCs w:val="20"/>
+              </w:rPr>
+              <w:t xml:space="preserve">Moyen terme : chunking granulaire niveau sous-alinéa pour dépasser le plafond 88%. Dataset annoté par juriste indépendant pour recall défendable. Faithfulness guardrail niveau 2 en production (~$0.02/req).</w:t>
+            </w:r>
+          </w:p>
+          <w:p>
+            <w:pPr>
+              <w:spacing w:after="80"/>
+            </w:pPr>
+            <w:r>
+              <w:rPr>
+                <w:rFonts w:ascii="Arial" w:cs="Arial" w:hAnsi="Arial"/>
+                <w:color w:val="1A1A2E"/>
+                <w:sz w:val="20"/>
+                <w:szCs w:val="20"/>
+              </w:rPr>
+              <w:t xml:space="preserve">Long terme : 100 questions annotées par 2 juristes indépendants, accord inter-annotateurs (Cohen's kappa), benchmark public reproductible — différenciateur cabinet.</w:t>
+            </w:r>
+          </w:p>
+          <w:p>
+            <w:pPr>
+              <w:spacing w:after="120"/>
+            </w:pPr>
+          </w:p>
+          <w:p>
             <w:r>
               <w:rPr>
                 <w:rFonts w:ascii="Arial" w:cs="Arial" w:eastAsia="Arial" w:hAnsi="Arial"/>
@@ -17000,706 +18394,86 @@
     </w:p>
     <w:p>
       <w:pPr>
-        <w:pStyle w:val="Heading2"/>
         <w:spacing w:before="240" w:after="120"/>
       </w:pPr>
       <w:r>
         <w:rPr>
-          <w:rFonts w:ascii="Arial" w:cs="Arial" w:eastAsia="Arial" w:hAnsi="Arial"/>
+          <w:rFonts w:ascii="Arial" w:cs="Arial" w:hAnsi="Arial"/>
           <w:b/>
-          <w:bCs/>
           <w:color w:val="1E3A5F"/>
           <w:sz w:val="26"/>
           <w:szCs w:val="26"/>
         </w:rPr>
-        <w:t xml:space="preserve">Roadmap — Prochaines étapes</w:t>
-      </w:r>
-    </w:p>
-    <w:p>
-      <w:pPr>
-        <w:spacing w:after="80"/>
-      </w:pPr>
-      <w:r>
-        <w:t xml:space="preserve"/>
+        <w:t>Roadmap Pro</w:t>
       </w:r>
     </w:p>
     <w:tbl>
       <w:tblPr>
-        <w:tblW w:type="dxa" w:w="9560"/>
+        <w:tblW w:type="dxa" w:w="9360"/>
         <w:tblBorders>
-          <w:top w:val="single" w:color="auto" w:sz="4"/>
-          <w:left w:val="single" w:color="auto" w:sz="4"/>
-          <w:bottom w:val="single" w:color="auto" w:sz="4"/>
-          <w:right w:val="single" w:color="auto" w:sz="4"/>
-          <w:insideH w:val="single" w:color="auto" w:sz="4"/>
-          <w:insideV w:val="single" w:color="auto" w:sz="4"/>
+          <w:top w:val="single" w:color="5598E0" w:sz="4"/>
+          <w:left w:val="single" w:color="5598E0" w:sz="4"/>
+          <w:bottom w:val="single" w:color="5598E0" w:sz="4"/>
+          <w:right w:val="single" w:color="5598E0" w:sz="4"/>
         </w:tblBorders>
       </w:tblPr>
       <w:tblGrid>
-        <w:gridCol w:w="1600"/>
-        <w:gridCol w:w="2000"/>
-        <w:gridCol w:w="3800"/>
-        <w:gridCol w:w="2160"/>
+        <w:gridCol w:w="9360"/>
       </w:tblGrid>
       <w:tr>
         <w:tc>
           <w:tcPr>
-            <w:tcW w:type="dxa" w:w="1600"/>
-            <w:tcBorders>
-              <w:top w:val="single" w:color="1E3A5F" w:sz="4"/>
-              <w:left w:val="single" w:color="1E3A5F" w:sz="4"/>
-              <w:bottom w:val="single" w:color="1E3A5F" w:sz="4"/>
-              <w:right w:val="single" w:color="1E3A5F" w:sz="4"/>
-            </w:tcBorders>
-            <w:shd w:fill="1E3A5F" w:val="clear"/>
+            <w:tcBorders>
+              <w:top w:val="none" w:sz="0"/>
+              <w:left w:val="none" w:sz="0"/>
+              <w:bottom w:val="none" w:sz="0"/>
+              <w:right w:val="none" w:sz="0"/>
+            </w:tcBorders>
+            <w:shd w:fill="EBF5FB" w:val="clear"/>
             <w:tcMar>
               <w:top w:type="dxa" w:w="80"/>
-              <w:left w:type="dxa" w:w="120"/>
+              <w:left w:type="dxa" w:w="160"/>
               <w:bottom w:type="dxa" w:w="80"/>
-              <w:right w:type="dxa" w:w="120"/>
-            </w:tcMar>
-          </w:tcPr>
-          <w:p>
-            <w:r>
-              <w:rPr>
-                <w:rFonts w:ascii="Arial" w:cs="Arial" w:eastAsia="Arial" w:hAnsi="Arial"/>
+              <w:right w:type="dxa" w:w="160"/>
+            </w:tcMar>
+          </w:tcPr>
+          <w:p>
+            <w:pPr>
+              <w:spacing w:after="80"/>
+            </w:pPr>
+            <w:r>
+              <w:rPr>
+                <w:rFonts w:ascii="Arial" w:cs="Arial" w:hAnsi="Arial"/>
                 <w:b/>
-                <w:bCs/>
-                <w:caps/>
-                <w:color w:val="FFFFFF"/>
-                <w:sz w:val="18"/>
-                <w:szCs w:val="18"/>
-              </w:rPr>
-              <w:t xml:space="preserve">Priorité</w:t>
-            </w:r>
-          </w:p>
-        </w:tc>
-        <w:tc>
-          <w:tcPr>
-            <w:tcW w:type="dxa" w:w="2000"/>
-            <w:tcBorders>
-              <w:top w:val="single" w:color="1E3A5F" w:sz="4"/>
-              <w:left w:val="single" w:color="1E3A5F" w:sz="4"/>
-              <w:bottom w:val="single" w:color="1E3A5F" w:sz="4"/>
-              <w:right w:val="single" w:color="1E3A5F" w:sz="4"/>
-            </w:tcBorders>
-            <w:shd w:fill="1E3A5F" w:val="clear"/>
-            <w:tcMar>
-              <w:top w:type="dxa" w:w="80"/>
-              <w:left w:type="dxa" w:w="120"/>
-              <w:bottom w:type="dxa" w:w="80"/>
-              <w:right w:type="dxa" w:w="120"/>
-            </w:tcMar>
-          </w:tcPr>
-          <w:p>
-            <w:r>
-              <w:rPr>
-                <w:rFonts w:ascii="Arial" w:cs="Arial" w:eastAsia="Arial" w:hAnsi="Arial"/>
-                <w:b/>
-                <w:bCs/>
-                <w:caps/>
-                <w:color w:val="FFFFFF"/>
-                <w:sz w:val="18"/>
-                <w:szCs w:val="18"/>
-              </w:rPr>
-              <w:t xml:space="preserve">Étape</w:t>
-            </w:r>
-          </w:p>
-        </w:tc>
-        <w:tc>
-          <w:tcPr>
-            <w:tcW w:type="dxa" w:w="3800"/>
-            <w:tcBorders>
-              <w:top w:val="single" w:color="1E3A5F" w:sz="4"/>
-              <w:left w:val="single" w:color="1E3A5F" w:sz="4"/>
-              <w:bottom w:val="single" w:color="1E3A5F" w:sz="4"/>
-              <w:right w:val="single" w:color="1E3A5F" w:sz="4"/>
-            </w:tcBorders>
-            <w:shd w:fill="1E3A5F" w:val="clear"/>
-            <w:tcMar>
-              <w:top w:type="dxa" w:w="80"/>
-              <w:left w:type="dxa" w:w="120"/>
-              <w:bottom w:type="dxa" w:w="80"/>
-              <w:right w:type="dxa" w:w="120"/>
-            </w:tcMar>
-          </w:tcPr>
-          <w:p>
-            <w:r>
-              <w:rPr>
-                <w:rFonts w:ascii="Arial" w:cs="Arial" w:eastAsia="Arial" w:hAnsi="Arial"/>
-                <w:b/>
-                <w:bCs/>
-                <w:caps/>
-                <w:color w:val="FFFFFF"/>
-                <w:sz w:val="18"/>
-                <w:szCs w:val="18"/>
-              </w:rPr>
-              <w:t xml:space="preserve">Description</w:t>
-            </w:r>
-          </w:p>
-        </w:tc>
-        <w:tc>
-          <w:tcPr>
-            <w:tcW w:type="dxa" w:w="2160"/>
-            <w:tcBorders>
-              <w:top w:val="single" w:color="1E3A5F" w:sz="4"/>
-              <w:left w:val="single" w:color="1E3A5F" w:sz="4"/>
-              <w:bottom w:val="single" w:color="1E3A5F" w:sz="4"/>
-              <w:right w:val="single" w:color="1E3A5F" w:sz="4"/>
-            </w:tcBorders>
-            <w:shd w:fill="1E3A5F" w:val="clear"/>
-            <w:tcMar>
-              <w:top w:type="dxa" w:w="80"/>
-              <w:left w:type="dxa" w:w="120"/>
-              <w:bottom w:type="dxa" w:w="80"/>
-              <w:right w:type="dxa" w:w="120"/>
-            </w:tcMar>
-          </w:tcPr>
-          <w:p>
-            <w:r>
-              <w:rPr>
-                <w:rFonts w:ascii="Arial" w:cs="Arial" w:eastAsia="Arial" w:hAnsi="Arial"/>
-                <w:b/>
-                <w:bCs/>
-                <w:caps/>
-                <w:color w:val="FFFFFF"/>
-                <w:sz w:val="18"/>
-                <w:szCs w:val="18"/>
-              </w:rPr>
-              <w:t xml:space="preserve">Impact</w:t>
-            </w:r>
-          </w:p>
-        </w:tc>
-      </w:tr>
-      <w:tr>
-        <w:tc>
-          <w:tcPr>
-            <w:tcW w:type="dxa" w:w="1600"/>
-            <w:tcBorders>
-              <w:top w:val="single" w:color="CCCCCC" w:sz="4"/>
-              <w:left w:val="single" w:color="CCCCCC" w:sz="4"/>
-              <w:bottom w:val="single" w:color="CCCCCC" w:sz="4"/>
-              <w:right w:val="single" w:color="CCCCCC" w:sz="4"/>
-            </w:tcBorders>
-            <w:shd w:fill="FFFFFF" w:val="clear"/>
-            <w:tcMar>
-              <w:top w:type="dxa" w:w="60"/>
-              <w:left w:type="dxa" w:w="120"/>
-              <w:bottom w:type="dxa" w:w="60"/>
-              <w:right w:type="dxa" w:w="120"/>
-            </w:tcMar>
-          </w:tcPr>
-          <w:p>
-            <w:pPr>
-              <w:spacing w:after="0"/>
-            </w:pPr>
-            <w:r>
-              <w:rPr>
-                <w:rFonts w:ascii="Arial" w:cs="Arial" w:eastAsia="Arial" w:hAnsi="Arial"/>
-                <w:color w:val="1A1A2E"/>
-                <w:sz w:val="19"/>
-                <w:szCs w:val="19"/>
-              </w:rPr>
-              <w:t xml:space="preserve">1 — Court terme</w:t>
-            </w:r>
-          </w:p>
-        </w:tc>
-        <w:tc>
-          <w:tcPr>
-            <w:tcW w:type="dxa" w:w="2000"/>
-            <w:tcBorders>
-              <w:top w:val="single" w:color="CCCCCC" w:sz="4"/>
-              <w:left w:val="single" w:color="CCCCCC" w:sz="4"/>
-              <w:bottom w:val="single" w:color="CCCCCC" w:sz="4"/>
-              <w:right w:val="single" w:color="CCCCCC" w:sz="4"/>
-            </w:tcBorders>
-            <w:shd w:fill="FFFFFF" w:val="clear"/>
-            <w:tcMar>
-              <w:top w:type="dxa" w:w="60"/>
-              <w:left w:type="dxa" w:w="120"/>
-              <w:bottom w:type="dxa" w:w="60"/>
-              <w:right w:type="dxa" w:w="120"/>
-            </w:tcMar>
-          </w:tcPr>
-          <w:p>
-            <w:pPr>
-              <w:spacing w:after="0"/>
-            </w:pPr>
-            <w:r>
-              <w:rPr>
-                <w:rFonts w:ascii="Arial" w:cs="Arial" w:eastAsia="Arial" w:hAnsi="Arial"/>
-                <w:b/>
-                <w:bCs/>
-                <w:color w:val="1A1A2E"/>
-                <w:sz w:val="19"/>
-                <w:szCs w:val="19"/>
-              </w:rPr>
-              <w:t xml:space="preserve">Faithfulness</w:t>
-            </w:r>
-          </w:p>
-        </w:tc>
-        <w:tc>
-          <w:tcPr>
-            <w:tcW w:type="dxa" w:w="3800"/>
-            <w:tcBorders>
-              <w:top w:val="single" w:color="CCCCCC" w:sz="4"/>
-              <w:left w:val="single" w:color="CCCCCC" w:sz="4"/>
-              <w:bottom w:val="single" w:color="CCCCCC" w:sz="4"/>
-              <w:right w:val="single" w:color="CCCCCC" w:sz="4"/>
-            </w:tcBorders>
-            <w:shd w:fill="FFFFFF" w:val="clear"/>
-            <w:tcMar>
-              <w:top w:type="dxa" w:w="60"/>
-              <w:left w:type="dxa" w:w="120"/>
-              <w:bottom w:type="dxa" w:w="60"/>
-              <w:right w:type="dxa" w:w="120"/>
-            </w:tcMar>
-          </w:tcPr>
-          <w:p>
-            <w:pPr>
-              <w:spacing w:after="0"/>
-            </w:pPr>
-            <w:r>
-              <w:rPr>
-                <w:rFonts w:ascii="Arial" w:cs="Arial" w:eastAsia="Arial" w:hAnsi="Arial"/>
-                <w:color w:val="1A1A2E"/>
-                <w:sz w:val="19"/>
-                <w:szCs w:val="19"/>
-              </w:rPr>
-              <w:t xml:space="preserve">Lancer l'évaluateur sans --no-faithfulness. Cible ≥ 85%. Si &lt; 85% : revoir build_prompt() et augmenter k.</w:t>
-            </w:r>
-          </w:p>
-        </w:tc>
-        <w:tc>
-          <w:tcPr>
-            <w:tcW w:type="dxa" w:w="2160"/>
-            <w:tcBorders>
-              <w:top w:val="single" w:color="CCCCCC" w:sz="4"/>
-              <w:left w:val="single" w:color="CCCCCC" w:sz="4"/>
-              <w:bottom w:val="single" w:color="CCCCCC" w:sz="4"/>
-              <w:right w:val="single" w:color="CCCCCC" w:sz="4"/>
-            </w:tcBorders>
-            <w:shd w:fill="FFFFFF" w:val="clear"/>
-            <w:tcMar>
-              <w:top w:type="dxa" w:w="60"/>
-              <w:left w:type="dxa" w:w="120"/>
-              <w:bottom w:type="dxa" w:w="60"/>
-              <w:right w:type="dxa" w:w="120"/>
-            </w:tcMar>
-          </w:tcPr>
-          <w:p>
-            <w:pPr>
-              <w:spacing w:after="0"/>
-            </w:pPr>
-            <w:r>
-              <w:rPr>
-                <w:rFonts w:ascii="Arial" w:cs="Arial" w:eastAsia="Arial" w:hAnsi="Arial"/>
-                <w:color w:val="1A1A2E"/>
-                <w:sz w:val="19"/>
-                <w:szCs w:val="19"/>
-              </w:rPr>
-              <w:t xml:space="preserve">~$0.20 pour 10 cas LLM-as-judge</w:t>
-            </w:r>
-          </w:p>
-        </w:tc>
-      </w:tr>
-      <w:tr>
-        <w:tc>
-          <w:tcPr>
-            <w:tcW w:type="dxa" w:w="1600"/>
-            <w:tcBorders>
-              <w:top w:val="single" w:color="CCCCCC" w:sz="4"/>
-              <w:left w:val="single" w:color="CCCCCC" w:sz="4"/>
-              <w:bottom w:val="single" w:color="CCCCCC" w:sz="4"/>
-              <w:right w:val="single" w:color="CCCCCC" w:sz="4"/>
-            </w:tcBorders>
-            <w:shd w:fill="F5F5F8" w:val="clear"/>
-            <w:tcMar>
-              <w:top w:type="dxa" w:w="60"/>
-              <w:left w:type="dxa" w:w="120"/>
-              <w:bottom w:type="dxa" w:w="60"/>
-              <w:right w:type="dxa" w:w="120"/>
-            </w:tcMar>
-          </w:tcPr>
-          <w:p>
-            <w:pPr>
-              <w:spacing w:after="0"/>
-            </w:pPr>
-            <w:r>
-              <w:rPr>
-                <w:rFonts w:ascii="Arial" w:cs="Arial" w:eastAsia="Arial" w:hAnsi="Arial"/>
-                <w:color w:val="1A1A2E"/>
-                <w:sz w:val="19"/>
-                <w:szCs w:val="19"/>
-              </w:rPr>
-              <w:t xml:space="preserve">2 — Court terme</w:t>
-            </w:r>
-          </w:p>
-        </w:tc>
-        <w:tc>
-          <w:tcPr>
-            <w:tcW w:type="dxa" w:w="2000"/>
-            <w:tcBorders>
-              <w:top w:val="single" w:color="CCCCCC" w:sz="4"/>
-              <w:left w:val="single" w:color="CCCCCC" w:sz="4"/>
-              <w:bottom w:val="single" w:color="CCCCCC" w:sz="4"/>
-              <w:right w:val="single" w:color="CCCCCC" w:sz="4"/>
-            </w:tcBorders>
-            <w:shd w:fill="F5F5F8" w:val="clear"/>
-            <w:tcMar>
-              <w:top w:type="dxa" w:w="60"/>
-              <w:left w:type="dxa" w:w="120"/>
-              <w:bottom w:type="dxa" w:w="60"/>
-              <w:right w:type="dxa" w:w="120"/>
-            </w:tcMar>
-          </w:tcPr>
-          <w:p>
-            <w:pPr>
-              <w:spacing w:after="0"/>
-            </w:pPr>
-            <w:r>
-              <w:rPr>
-                <w:rFonts w:ascii="Arial" w:cs="Arial" w:eastAsia="Arial" w:hAnsi="Arial"/>
-                <w:b/>
-                <w:bCs/>
-                <w:color w:val="1A1A2E"/>
-                <w:sz w:val="19"/>
-                <w:szCs w:val="19"/>
-              </w:rPr>
-              <w:t xml:space="preserve">Interface utilisateur</w:t>
-            </w:r>
-          </w:p>
-        </w:tc>
-        <w:tc>
-          <w:tcPr>
-            <w:tcW w:type="dxa" w:w="3800"/>
-            <w:tcBorders>
-              <w:top w:val="single" w:color="CCCCCC" w:sz="4"/>
-              <w:left w:val="single" w:color="CCCCCC" w:sz="4"/>
-              <w:bottom w:val="single" w:color="CCCCCC" w:sz="4"/>
-              <w:right w:val="single" w:color="CCCCCC" w:sz="4"/>
-            </w:tcBorders>
-            <w:shd w:fill="F5F5F8" w:val="clear"/>
-            <w:tcMar>
-              <w:top w:type="dxa" w:w="60"/>
-              <w:left w:type="dxa" w:w="120"/>
-              <w:bottom w:type="dxa" w:w="60"/>
-              <w:right w:type="dxa" w:w="120"/>
-            </w:tcMar>
-          </w:tcPr>
-          <w:p>
-            <w:pPr>
-              <w:spacing w:after="0"/>
-            </w:pPr>
-            <w:r>
-              <w:rPr>
-                <w:rFonts w:ascii="Arial" w:cs="Arial" w:eastAsia="Arial" w:hAnsi="Arial"/>
-                <w:color w:val="1A1A2E"/>
-                <w:sz w:val="19"/>
-                <w:szCs w:val="19"/>
-              </w:rPr>
-              <w:t xml:space="preserve">Streamlit (rapide) ou Next.js (prod). Affichage sources avec highlights, sélecteurs filtres metadata, export PDF des réponses.</w:t>
-            </w:r>
-          </w:p>
-        </w:tc>
-        <w:tc>
-          <w:tcPr>
-            <w:tcW w:type="dxa" w:w="2160"/>
-            <w:tcBorders>
-              <w:top w:val="single" w:color="CCCCCC" w:sz="4"/>
-              <w:left w:val="single" w:color="CCCCCC" w:sz="4"/>
-              <w:bottom w:val="single" w:color="CCCCCC" w:sz="4"/>
-              <w:right w:val="single" w:color="CCCCCC" w:sz="4"/>
-            </w:tcBorders>
-            <w:shd w:fill="F5F5F8" w:val="clear"/>
-            <w:tcMar>
-              <w:top w:type="dxa" w:w="60"/>
-              <w:left w:type="dxa" w:w="120"/>
-              <w:bottom w:type="dxa" w:w="60"/>
-              <w:right w:type="dxa" w:w="120"/>
-            </w:tcMar>
-          </w:tcPr>
-          <w:p>
-            <w:pPr>
-              <w:spacing w:after="0"/>
-            </w:pPr>
-            <w:r>
-              <w:rPr>
-                <w:rFonts w:ascii="Arial" w:cs="Arial" w:eastAsia="Arial" w:hAnsi="Arial"/>
-                <w:color w:val="1A1A2E"/>
-                <w:sz w:val="19"/>
-                <w:szCs w:val="19"/>
-              </w:rPr>
-              <w:t xml:space="preserve">Utilisabilité DPO/juristes</w:t>
-            </w:r>
-          </w:p>
-        </w:tc>
-      </w:tr>
-      <w:tr>
-        <w:tc>
-          <w:tcPr>
-            <w:tcW w:type="dxa" w:w="1600"/>
-            <w:tcBorders>
-              <w:top w:val="single" w:color="CCCCCC" w:sz="4"/>
-              <w:left w:val="single" w:color="CCCCCC" w:sz="4"/>
-              <w:bottom w:val="single" w:color="CCCCCC" w:sz="4"/>
-              <w:right w:val="single" w:color="CCCCCC" w:sz="4"/>
-            </w:tcBorders>
-            <w:shd w:fill="FFFFFF" w:val="clear"/>
-            <w:tcMar>
-              <w:top w:type="dxa" w:w="60"/>
-              <w:left w:type="dxa" w:w="120"/>
-              <w:bottom w:type="dxa" w:w="60"/>
-              <w:right w:type="dxa" w:w="120"/>
-            </w:tcMar>
-          </w:tcPr>
-          <w:p>
-            <w:pPr>
-              <w:spacing w:after="0"/>
-            </w:pPr>
-            <w:r>
-              <w:rPr>
-                <w:rFonts w:ascii="Arial" w:cs="Arial" w:eastAsia="Arial" w:hAnsi="Arial"/>
-                <w:color w:val="1A1A2E"/>
-                <w:sz w:val="19"/>
-                <w:szCs w:val="19"/>
-              </w:rPr>
-              <w:t xml:space="preserve">3 — Moyen terme</w:t>
-            </w:r>
-          </w:p>
-        </w:tc>
-        <w:tc>
-          <w:tcPr>
-            <w:tcW w:type="dxa" w:w="2000"/>
-            <w:tcBorders>
-              <w:top w:val="single" w:color="CCCCCC" w:sz="4"/>
-              <w:left w:val="single" w:color="CCCCCC" w:sz="4"/>
-              <w:bottom w:val="single" w:color="CCCCCC" w:sz="4"/>
-              <w:right w:val="single" w:color="CCCCCC" w:sz="4"/>
-            </w:tcBorders>
-            <w:shd w:fill="FFFFFF" w:val="clear"/>
-            <w:tcMar>
-              <w:top w:type="dxa" w:w="60"/>
-              <w:left w:type="dxa" w:w="120"/>
-              <w:bottom w:type="dxa" w:w="60"/>
-              <w:right w:type="dxa" w:w="120"/>
-            </w:tcMar>
-          </w:tcPr>
-          <w:p>
-            <w:pPr>
-              <w:spacing w:after="0"/>
-            </w:pPr>
-            <w:r>
-              <w:rPr>
-                <w:rFonts w:ascii="Arial" w:cs="Arial" w:eastAsia="Arial" w:hAnsi="Arial"/>
-                <w:b/>
-                <w:bCs/>
-                <w:color w:val="1A1A2E"/>
-                <w:sz w:val="19"/>
-                <w:szCs w:val="19"/>
-              </w:rPr>
-              <w:t xml:space="preserve">Déploiement Cloud Run</w:t>
-            </w:r>
-          </w:p>
-        </w:tc>
-        <w:tc>
-          <w:tcPr>
-            <w:tcW w:type="dxa" w:w="3800"/>
-            <w:tcBorders>
-              <w:top w:val="single" w:color="CCCCCC" w:sz="4"/>
-              <w:left w:val="single" w:color="CCCCCC" w:sz="4"/>
-              <w:bottom w:val="single" w:color="CCCCCC" w:sz="4"/>
-              <w:right w:val="single" w:color="CCCCCC" w:sz="4"/>
-            </w:tcBorders>
-            <w:shd w:fill="FFFFFF" w:val="clear"/>
-            <w:tcMar>
-              <w:top w:type="dxa" w:w="60"/>
-              <w:left w:type="dxa" w:w="120"/>
-              <w:bottom w:type="dxa" w:w="60"/>
-              <w:right w:type="dxa" w:w="120"/>
-            </w:tcMar>
-          </w:tcPr>
-          <w:p>
-            <w:pPr>
-              <w:spacing w:after="0"/>
-            </w:pPr>
-            <w:r>
-              <w:rPr>
-                <w:rFonts w:ascii="Arial" w:cs="Arial" w:eastAsia="Arial" w:hAnsi="Arial"/>
-                <w:color w:val="1A1A2E"/>
-                <w:sz w:val="19"/>
-                <w:szCs w:val="19"/>
-              </w:rPr>
-              <w:t xml:space="preserve">Auth JWT, rate limiting (slowapi), HTTPS, monitoring Datadog/Grafana, logs structurés JSON.</w:t>
-            </w:r>
-          </w:p>
-        </w:tc>
-        <w:tc>
-          <w:tcPr>
-            <w:tcW w:type="dxa" w:w="2160"/>
-            <w:tcBorders>
-              <w:top w:val="single" w:color="CCCCCC" w:sz="4"/>
-              <w:left w:val="single" w:color="CCCCCC" w:sz="4"/>
-              <w:bottom w:val="single" w:color="CCCCCC" w:sz="4"/>
-              <w:right w:val="single" w:color="CCCCCC" w:sz="4"/>
-            </w:tcBorders>
-            <w:shd w:fill="FFFFFF" w:val="clear"/>
-            <w:tcMar>
-              <w:top w:type="dxa" w:w="60"/>
-              <w:left w:type="dxa" w:w="120"/>
-              <w:bottom w:type="dxa" w:w="60"/>
-              <w:right w:type="dxa" w:w="120"/>
-            </w:tcMar>
-          </w:tcPr>
-          <w:p>
-            <w:pPr>
-              <w:spacing w:after="0"/>
-            </w:pPr>
-            <w:r>
-              <w:rPr>
-                <w:rFonts w:ascii="Arial" w:cs="Arial" w:eastAsia="Arial" w:hAnsi="Arial"/>
-                <w:color w:val="1A1A2E"/>
-                <w:sz w:val="19"/>
-                <w:szCs w:val="19"/>
-              </w:rPr>
-              <w:t xml:space="preserve">Production publique</w:t>
-            </w:r>
-          </w:p>
-        </w:tc>
-      </w:tr>
-      <w:tr>
-        <w:tc>
-          <w:tcPr>
-            <w:tcW w:type="dxa" w:w="1600"/>
-            <w:tcBorders>
-              <w:top w:val="single" w:color="CCCCCC" w:sz="4"/>
-              <w:left w:val="single" w:color="CCCCCC" w:sz="4"/>
-              <w:bottom w:val="single" w:color="CCCCCC" w:sz="4"/>
-              <w:right w:val="single" w:color="CCCCCC" w:sz="4"/>
-            </w:tcBorders>
-            <w:shd w:fill="F5F5F8" w:val="clear"/>
-            <w:tcMar>
-              <w:top w:type="dxa" w:w="60"/>
-              <w:left w:type="dxa" w:w="120"/>
-              <w:bottom w:type="dxa" w:w="60"/>
-              <w:right w:type="dxa" w:w="120"/>
-            </w:tcMar>
-          </w:tcPr>
-          <w:p>
-            <w:pPr>
-              <w:spacing w:after="0"/>
-            </w:pPr>
-            <w:r>
-              <w:rPr>
-                <w:rFonts w:ascii="Arial" w:cs="Arial" w:eastAsia="Arial" w:hAnsi="Arial"/>
-                <w:color w:val="1A1A2E"/>
-                <w:sz w:val="19"/>
-                <w:szCs w:val="19"/>
-              </w:rPr>
-              <w:t xml:space="preserve">4 — Long terme</w:t>
-            </w:r>
-          </w:p>
-        </w:tc>
-        <w:tc>
-          <w:tcPr>
-            <w:tcW w:type="dxa" w:w="2000"/>
-            <w:tcBorders>
-              <w:top w:val="single" w:color="CCCCCC" w:sz="4"/>
-              <w:left w:val="single" w:color="CCCCCC" w:sz="4"/>
-              <w:bottom w:val="single" w:color="CCCCCC" w:sz="4"/>
-              <w:right w:val="single" w:color="CCCCCC" w:sz="4"/>
-            </w:tcBorders>
-            <w:shd w:fill="F5F5F8" w:val="clear"/>
-            <w:tcMar>
-              <w:top w:type="dxa" w:w="60"/>
-              <w:left w:type="dxa" w:w="120"/>
-              <w:bottom w:type="dxa" w:w="60"/>
-              <w:right w:type="dxa" w:w="120"/>
-            </w:tcMar>
-          </w:tcPr>
-          <w:p>
-            <w:pPr>
-              <w:spacing w:after="0"/>
-            </w:pPr>
-            <w:r>
-              <w:rPr>
-                <w:rFonts w:ascii="Arial" w:cs="Arial" w:eastAsia="Arial" w:hAnsi="Arial"/>
-                <w:b/>
-                <w:bCs/>
-                <w:color w:val="1A1A2E"/>
-                <w:sz w:val="19"/>
-                <w:szCs w:val="19"/>
-              </w:rPr>
-              <w:t xml:space="preserve">Fine-tuning embeddings</w:t>
-            </w:r>
-          </w:p>
-        </w:tc>
-        <w:tc>
-          <w:tcPr>
-            <w:tcW w:type="dxa" w:w="3800"/>
-            <w:tcBorders>
-              <w:top w:val="single" w:color="CCCCCC" w:sz="4"/>
-              <w:left w:val="single" w:color="CCCCCC" w:sz="4"/>
-              <w:bottom w:val="single" w:color="CCCCCC" w:sz="4"/>
-              <w:right w:val="single" w:color="CCCCCC" w:sz="4"/>
-            </w:tcBorders>
-            <w:shd w:fill="F5F5F8" w:val="clear"/>
-            <w:tcMar>
-              <w:top w:type="dxa" w:w="60"/>
-              <w:left w:type="dxa" w:w="120"/>
-              <w:bottom w:type="dxa" w:w="60"/>
-              <w:right w:type="dxa" w:w="120"/>
-            </w:tcMar>
-          </w:tcPr>
-          <w:p>
-            <w:pPr>
-              <w:spacing w:after="0"/>
-            </w:pPr>
-            <w:r>
-              <w:rPr>
-                <w:rFonts w:ascii="Arial" w:cs="Arial" w:eastAsia="Arial" w:hAnsi="Arial"/>
-                <w:color w:val="1A1A2E"/>
-                <w:sz w:val="19"/>
-                <w:szCs w:val="19"/>
-              </w:rPr>
-              <w:t xml:space="preserve">Dataset de paires (question, article pertinent) sur le corpus EU. Fine-tuner all-MiniLM sur notre domaine. Gain attendu : +5-10% recall.</w:t>
-            </w:r>
-          </w:p>
-        </w:tc>
-        <w:tc>
-          <w:tcPr>
-            <w:tcW w:type="dxa" w:w="2160"/>
-            <w:tcBorders>
-              <w:top w:val="single" w:color="CCCCCC" w:sz="4"/>
-              <w:left w:val="single" w:color="CCCCCC" w:sz="4"/>
-              <w:bottom w:val="single" w:color="CCCCCC" w:sz="4"/>
-              <w:right w:val="single" w:color="CCCCCC" w:sz="4"/>
-            </w:tcBorders>
-            <w:shd w:fill="F5F5F8" w:val="clear"/>
-            <w:tcMar>
-              <w:top w:type="dxa" w:w="60"/>
-              <w:left w:type="dxa" w:w="120"/>
-              <w:bottom w:type="dxa" w:w="60"/>
-              <w:right w:type="dxa" w:w="120"/>
-            </w:tcMar>
-          </w:tcPr>
-          <w:p>
-            <w:pPr>
-              <w:spacing w:after="0"/>
-            </w:pPr>
-            <w:r>
-              <w:rPr>
-                <w:rFonts w:ascii="Arial" w:cs="Arial" w:eastAsia="Arial" w:hAnsi="Arial"/>
-                <w:color w:val="1A1A2E"/>
-                <w:sz w:val="19"/>
-                <w:szCs w:val="19"/>
-              </w:rPr>
-              <w:t xml:space="preserve">Recall potentiel &gt;105%</w:t>
+                <w:color w:val="1A5276"/>
+                <w:sz w:val="20"/>
+                <w:szCs w:val="20"/>
+              </w:rPr>
+              <w:t>Document séparé : roadmap.html</w:t>
+            </w:r>
+          </w:p>
+          <w:p>
+            <w:pPr>
+              <w:spacing w:after="0"/>
+            </w:pPr>
+            <w:r>
+              <w:rPr>
+                <w:rFonts w:ascii="Arial" w:cs="Arial" w:hAnsi="Arial"/>
+                <w:color w:val="1A1A2E"/>
+                <w:sz w:val="20"/>
+                <w:szCs w:val="20"/>
+              </w:rPr>
+              <w:t xml:space="preserve">Le plan de développement vers un déploiement professionnel est documenté dans le fichier roadmap.html. Il couvre 10 étapes priorisées : Auth JWT, rate limiting, audit log, disclaimer légal, hallucination guardrail, frontend, corpus update pipeline, tests unitaires, CONTRIBUTING.md, et monitoring cloud. Coût total : ~0€.</w:t>
             </w:r>
           </w:p>
         </w:tc>
       </w:tr>
     </w:tbl>
+    <w:p>
+      <w:pPr>
+        <w:spacing w:after="120"/>
+      </w:pPr>
+    </w:p>
     <w:sectPr>
       <w:headerReference w:type="default" r:id="rId6"/>
       <w:footerReference w:type="default" r:id="rId7"/>

</xml_diff>

<commit_message>
docs: update README + docs v4.0 — guardrail, faithfulness, full pipeline
</commit_message>
<xml_diff>
--- a/docs/AI_Legal_Platform_Documentation.docx
+++ b/docs/AI_Legal_Platform_Documentation.docx
@@ -14951,6 +14951,1159 @@
                 <w:szCs w:val="19"/>
               </w:rPr>
               <w:t xml:space="preserve">Exécuté avant la query expansion, l'embedding, et la génération LLM. HTTP 400 immédiat si injection détectée. Zéro coût API. Log : [INJECTION BLOCKED] Pattern détecté : ...</w:t>
+            </w:r>
+          </w:p>
+        </w:tc>
+      </w:tr>
+    </w:tbl>
+    <w:p>
+      <w:r>
+        <w:br w:type="page"/>
+      </w:r>
+    </w:p>
+    <w:p>
+      <w:pPr>
+        <w:spacing w:after="60"/>
+      </w:pPr>
+      <w:r>
+        <w:rPr>
+          <w:rFonts w:ascii="Arial" w:cs="Arial" w:hAnsi="Arial"/>
+          <w:b/>
+          <w:color w:val="1E3A5F"/>
+          <w:sz w:val="28"/>
+          <w:szCs w:val="28"/>
+        </w:rPr>
+        <w:t xml:space="preserve">07b  Étape 7b — Hallucination Guardrail</w:t>
+      </w:r>
+    </w:p>
+    <w:p>
+      <w:pPr>
+        <w:spacing w:after="120"/>
+      </w:pPr>
+      <w:r>
+        <w:rPr>
+          <w:rFonts w:ascii="Arial" w:cs="Arial" w:hAnsi="Arial"/>
+          <w:i/>
+          <w:color w:val="7F8C8D"/>
+          <w:sz w:val="18"/>
+          <w:szCs w:val="18"/>
+        </w:rPr>
+        <w:t>Sources fantômes · Deux niveaux · LOW warning + disclaimer · HIGH HTTP 503 bloquant</w:t>
+      </w:r>
+    </w:p>
+    <w:p>
+      <w:pPr>
+        <w:spacing w:after="100" w:before="200"/>
+      </w:pPr>
+      <w:r>
+        <w:rPr>
+          <w:rFonts w:ascii="Arial" w:cs="Arial" w:hAnsi="Arial"/>
+          <w:b/>
+          <w:color w:val="C9A84C"/>
+          <w:sz w:val="22"/>
+          <w:szCs w:val="22"/>
+        </w:rPr>
+        <w:t>Pourquoi un guardrail ? — La limite de la règle INTERDIT</w:t>
+      </w:r>
+    </w:p>
+    <w:p>
+      <w:pPr>
+        <w:spacing w:after="100"/>
+      </w:pPr>
+      <w:r>
+        <w:rPr>
+          <w:rFonts w:ascii="Arial" w:cs="Arial" w:hAnsi="Arial"/>
+          <w:color w:val="1A1A2E"/>
+          <w:sz w:val="20"/>
+          <w:szCs w:val="20"/>
+        </w:rPr>
+        <w:t xml:space="preserve">Le patch du prompt v1.1 (règle INTERDIT) a amélioré la faithfulness de 87.4% à 88.5%. Mais il ne résout pas tout : Claude peut respecter la règle sur le contenu des affirmations et pourtant citer un numéro de source qui n'existe pas. C'est le problème des sources fantômes.</w:t>
+      </w:r>
+    </w:p>
+    <w:tbl>
+      <w:tblPr>
+        <w:tblW w:type="dxa" w:w="9360"/>
+        <w:tblBorders>
+          <w:top w:val="single" w:color="A93226" w:sz="4"/>
+          <w:left w:val="single" w:color="A93226" w:sz="8"/>
+          <w:bottom w:val="single" w:color="A93226" w:sz="4"/>
+          <w:right w:val="single" w:color="A93226" w:sz="4"/>
+        </w:tblBorders>
+      </w:tblPr>
+      <w:tblGrid>
+        <w:gridCol w:w="9360"/>
+      </w:tblGrid>
+      <w:tr>
+        <w:tc>
+          <w:tcPr>
+            <w:shd w:fill="FDEDEC" w:val="clear"/>
+            <w:tcMar>
+              <w:top w:type="dxa" w:w="100"/>
+              <w:left w:type="dxa" w:w="200"/>
+              <w:bottom w:type="dxa" w:w="100"/>
+              <w:right w:type="dxa" w:w="200"/>
+            </w:tcMar>
+          </w:tcPr>
+          <w:p>
+            <w:pPr>
+              <w:spacing w:after="40"/>
+            </w:pPr>
+            <w:r>
+              <w:rPr>
+                <w:rFonts w:ascii="Arial" w:cs="Arial" w:hAnsi="Arial"/>
+                <w:b/>
+                <w:caps/>
+                <w:color w:val="A93226"/>
+                <w:sz w:val="17"/>
+                <w:szCs w:val="17"/>
+              </w:rPr>
+              <w:t>LE PROBLÈME — SOURCE FANTÔME</w:t>
+            </w:r>
+          </w:p>
+          <w:p>
+            <w:pPr>
+              <w:spacing w:after="0"/>
+            </w:pPr>
+            <w:r>
+              <w:rPr>
+                <w:rFonts w:ascii="Arial" w:cs="Arial" w:hAnsi="Arial"/>
+                <w:color w:val="1A1A2E"/>
+                <w:sz w:val="19"/>
+                <w:szCs w:val="19"/>
+              </w:rPr>
+              <w:t xml:space="preserve">Claude reçoit k=5 chunks numérotés [SOURCE 1] à [SOURCE 5]. Sa réponse contient '...comme le précise [SOURCE 7]...'. [SOURCE 7] n'existe pas. Ce n'est pas une hallucination de contenu — l'information peut être correcte — mais la traçabilité est rompue. Le client ne peut pas vérifier [SOURCE 7] dans notre corpus.</w:t>
+            </w:r>
+          </w:p>
+        </w:tc>
+      </w:tr>
+    </w:tbl>
+    <w:p>
+      <w:pPr>
+        <w:spacing w:after="120"/>
+      </w:pPr>
+    </w:p>
+    <w:tbl>
+      <w:tblPr>
+        <w:tblW w:type="dxa" w:w="9360"/>
+        <w:tblBorders>
+          <w:top w:val="single" w:color="C9A84C" w:sz="4"/>
+          <w:left w:val="single" w:color="C9A84C" w:sz="8"/>
+          <w:bottom w:val="single" w:color="C9A84C" w:sz="4"/>
+          <w:right w:val="single" w:color="C9A84C" w:sz="4"/>
+        </w:tblBorders>
+      </w:tblPr>
+      <w:tblGrid>
+        <w:gridCol w:w="9360"/>
+      </w:tblGrid>
+      <w:tr>
+        <w:tc>
+          <w:tcPr>
+            <w:shd w:fill="FEF9E7" w:val="clear"/>
+            <w:tcMar>
+              <w:top w:type="dxa" w:w="100"/>
+              <w:left w:type="dxa" w:w="200"/>
+              <w:bottom w:type="dxa" w:w="100"/>
+              <w:right w:type="dxa" w:w="200"/>
+            </w:tcMar>
+          </w:tcPr>
+          <w:p>
+            <w:pPr>
+              <w:spacing w:after="40"/>
+            </w:pPr>
+            <w:r>
+              <w:rPr>
+                <w:rFonts w:ascii="Arial" w:cs="Arial" w:hAnsi="Arial"/>
+                <w:b/>
+                <w:caps/>
+                <w:color w:val="7D6608"/>
+                <w:sz w:val="17"/>
+                <w:szCs w:val="17"/>
+              </w:rPr>
+              <w:t>POURQUOI ÇA ARRIVE</w:t>
+            </w:r>
+          </w:p>
+          <w:p>
+            <w:pPr>
+              <w:spacing w:after="0"/>
+            </w:pPr>
+            <w:r>
+              <w:rPr>
+                <w:rFonts w:ascii="Arial" w:cs="Arial" w:hAnsi="Arial"/>
+                <w:color w:val="1A1A2E"/>
+                <w:sz w:val="19"/>
+                <w:szCs w:val="19"/>
+              </w:rPr>
+              <w:t xml:space="preserve">Claude connaît le GDPR par coeur. Il peut avoir l'information correcte en mémoire, la citer, et lui attribuer un numéro de source qui 'devrait' être là — mais qui dépasse k. C'est une erreur de bookkeeping du modèle, pas un mensonge. La réponse est souvent exacte, mais la traçabilité est rompue.</w:t>
+            </w:r>
+          </w:p>
+        </w:tc>
+      </w:tr>
+    </w:tbl>
+    <w:p>
+      <w:pPr>
+        <w:spacing w:after="120"/>
+      </w:pPr>
+    </w:p>
+    <w:tbl>
+      <w:tblPr>
+        <w:tblW w:type="dxa" w:w="9360"/>
+        <w:tblBorders>
+          <w:top w:val="single" w:color="1A5276" w:sz="4"/>
+          <w:left w:val="single" w:color="1A5276" w:sz="8"/>
+          <w:bottom w:val="single" w:color="1A5276" w:sz="4"/>
+          <w:right w:val="single" w:color="1A5276" w:sz="4"/>
+        </w:tblBorders>
+      </w:tblPr>
+      <w:tblGrid>
+        <w:gridCol w:w="9360"/>
+      </w:tblGrid>
+      <w:tr>
+        <w:tc>
+          <w:tcPr>
+            <w:shd w:fill="EBF5FB" w:val="clear"/>
+            <w:tcMar>
+              <w:top w:type="dxa" w:w="100"/>
+              <w:left w:type="dxa" w:w="200"/>
+              <w:bottom w:type="dxa" w:w="100"/>
+              <w:right w:type="dxa" w:w="200"/>
+            </w:tcMar>
+          </w:tcPr>
+          <w:p>
+            <w:pPr>
+              <w:spacing w:after="40"/>
+            </w:pPr>
+            <w:r>
+              <w:rPr>
+                <w:rFonts w:ascii="Arial" w:cs="Arial" w:hAnsi="Arial"/>
+                <w:b/>
+                <w:caps/>
+                <w:color w:val="1A5276"/>
+                <w:sz w:val="17"/>
+                <w:szCs w:val="17"/>
+              </w:rPr>
+              <w:t>DISTINCTION ESSENTIELLE — DEUX TYPES DE PROBLÈMES</w:t>
+            </w:r>
+          </w:p>
+          <w:p>
+            <w:pPr>
+              <w:spacing w:after="0"/>
+            </w:pPr>
+            <w:r>
+              <w:rPr>
+                <w:rFonts w:ascii="Arial" w:cs="Arial" w:hAnsi="Arial"/>
+                <w:color w:val="1A1A2E"/>
+                <w:sz w:val="19"/>
+                <w:szCs w:val="19"/>
+              </w:rPr>
+              <w:t xml:space="preserve">Type A — Sources fantômes : [SOURCE X] avec X &gt; k. Ce que détecte ce guardrail. Coût zéro, ~0ms. Exemple : [SOURCE 7] cité alors que k=5.   |   Type B — Fidélité sémantique : [SOURCE 2] cité mais contenu ne supporte pas le claim. Couvert par le pipeline LLM-as-judge. Coût ~$0.02/req — non adapté à chaque /search. Ce guardrail ne couvre pas ce cas.</w:t>
+            </w:r>
+          </w:p>
+        </w:tc>
+      </w:tr>
+    </w:tbl>
+    <w:p>
+      <w:pPr>
+        <w:spacing w:after="120"/>
+      </w:pPr>
+    </w:p>
+    <w:p>
+      <w:pPr>
+        <w:spacing w:after="100" w:before="200"/>
+      </w:pPr>
+      <w:r>
+        <w:rPr>
+          <w:rFonts w:ascii="Arial" w:cs="Arial" w:hAnsi="Arial"/>
+          <w:b/>
+          <w:color w:val="C9A84C"/>
+          <w:sz w:val="22"/>
+          <w:szCs w:val="22"/>
+        </w:rPr>
+        <w:t>Design — Deux niveaux de sévérité</w:t>
+      </w:r>
+    </w:p>
+    <w:p>
+      <w:pPr>
+        <w:spacing w:after="80"/>
+      </w:pPr>
+      <w:r>
+        <w:rPr>
+          <w:rFonts w:ascii="Arial" w:cs="Arial" w:hAnsi="Arial"/>
+          <w:color w:val="1A1A2E"/>
+          <w:sz w:val="20"/>
+          <w:szCs w:val="20"/>
+        </w:rPr>
+        <w:t xml:space="preserve">Pourquoi ne pas tout bloquer dès 1 source fantôme ? Parce qu'un seul fantôme peut être un simple off-by-one du modèle (citer [SOURCE 6] au lieu de [SOURCE 5] par décalage de comptage). Ce n'est pas la même gravité que citer [SOURCE 12] avec k=5. Deux niveaux permettent de graduer la réponse.</w:t>
+      </w:r>
+    </w:p>
+    <w:p>
+      <w:pPr>
+        <w:spacing w:after="40"/>
+        <w:ind w:left="360"/>
+      </w:pPr>
+      <w:r>
+        <w:rPr>
+          <w:rFonts w:ascii="Arial" w:cs="Arial" w:hAnsi="Arial"/>
+          <w:color w:val="1A1A2E"/>
+          <w:sz w:val="19"/>
+          <w:szCs w:val="19"/>
+        </w:rPr>
+        <w:t xml:space="preserve">•  LOW — 1 source fantôme : probable erreur mineure. Réponse retournée avec disclaimer ajouté. Warning log. UX préservée.</w:t>
+      </w:r>
+    </w:p>
+    <w:p>
+      <w:pPr>
+        <w:spacing w:after="40"/>
+        <w:ind w:left="360"/>
+      </w:pPr>
+      <w:r>
+        <w:rPr>
+          <w:rFonts w:ascii="Arial" w:cs="Arial" w:hAnsi="Arial"/>
+          <w:color w:val="1A1A2E"/>
+          <w:sz w:val="19"/>
+          <w:szCs w:val="19"/>
+        </w:rPr>
+        <w:t xml:space="preserve">•  HIGH — 2+ sources fantômes : le modèle s'est affranchi massivement des sources. Réponse bloquée, HTTP 503. Le client peut relancer (LLMs non-déterministes) ou augmenter k.</w:t>
+      </w:r>
+    </w:p>
+    <w:p>
+      <w:pPr>
+        <w:spacing w:after="40"/>
+        <w:ind w:left="360"/>
+      </w:pPr>
+      <w:r>
+        <w:rPr>
+          <w:rFonts w:ascii="Arial" w:cs="Arial" w:hAnsi="Arial"/>
+          <w:color w:val="1A1A2E"/>
+          <w:sz w:val="19"/>
+          <w:szCs w:val="19"/>
+        </w:rPr>
+        <w:t xml:space="preserve">•  Pourquoi 503 et non 500 ? Le service se déclare incapable de garantir la traçabilité pour cette réponse. Pas un crash serveur — une décision délibérée.</w:t>
+      </w:r>
+    </w:p>
+    <w:p>
+      <w:pPr>
+        <w:spacing w:after="120"/>
+      </w:pPr>
+    </w:p>
+    <w:p>
+      <w:pPr>
+        <w:spacing w:after="100" w:before="200"/>
+      </w:pPr>
+      <w:r>
+        <w:rPr>
+          <w:rFonts w:ascii="Arial" w:cs="Arial" w:hAnsi="Arial"/>
+          <w:b/>
+          <w:color w:val="C9A84C"/>
+          <w:sz w:val="22"/>
+          <w:szCs w:val="22"/>
+        </w:rPr>
+        <w:t>Implémentation — check_hallucination_guardrail()</w:t>
+      </w:r>
+    </w:p>
+    <w:p>
+      <w:pPr>
+        <w:spacing w:after="80"/>
+      </w:pPr>
+      <w:r>
+        <w:rPr>
+          <w:rFonts w:ascii="Arial" w:cs="Arial" w:hAnsi="Arial"/>
+          <w:color w:val="1A1A2E"/>
+          <w:sz w:val="20"/>
+          <w:szCs w:val="20"/>
+        </w:rPr>
+        <w:t xml:space="preserve">La fonction prend la réponse brute de Claude et le nombre de chunks réellement fournis après reranking. Elle extrait tous les [SOURCE X] par regex, compare chaque numéro à la plage [1, n_chunks], et retourne un dict avec sévérité, liste des fantômes, et réponse patchée (None si HIGH).</w:t>
+      </w:r>
+    </w:p>
+    <w:tbl>
+      <w:tblPr>
+        <w:tblW w:type="dxa" w:w="9360"/>
+        <w:tblBorders>
+          <w:top w:val="single" w:color="C9A84C" w:sz="4"/>
+          <w:left w:val="single" w:color="C9A84C" w:sz="4"/>
+          <w:bottom w:val="single" w:color="C9A84C" w:sz="4"/>
+          <w:right w:val="single" w:color="C9A84C" w:sz="4"/>
+        </w:tblBorders>
+      </w:tblPr>
+      <w:tblGrid>
+        <w:gridCol w:w="9360"/>
+      </w:tblGrid>
+      <w:tr>
+        <w:tc>
+          <w:tcPr>
+            <w:shd w:fill="C9A84C" w:val="clear"/>
+            <w:tcMar>
+              <w:top w:type="dxa" w:w="60"/>
+              <w:left w:type="dxa" w:w="200"/>
+              <w:bottom w:type="dxa" w:w="60"/>
+              <w:right w:type="dxa" w:w="200"/>
+            </w:tcMar>
+          </w:tcPr>
+          <w:p>
+            <w:r>
+              <w:rPr>
+                <w:rFonts w:ascii="Courier New" w:cs="Courier New" w:hAnsi="Courier New"/>
+                <w:b/>
+                <w:color w:val="1A1A1A"/>
+                <w:sz w:val="16"/>
+                <w:szCs w:val="16"/>
+              </w:rPr>
+              <w:t>api/search.py — check_hallucination_guardrail() — logique core</w:t>
+            </w:r>
+          </w:p>
+        </w:tc>
+      </w:tr>
+      <w:tr>
+        <w:tc>
+          <w:tcPr>
+            <w:shd w:fill="1A1A2E" w:val="clear"/>
+            <w:tcMar>
+              <w:top w:type="dxa" w:w="20"/>
+              <w:left w:type="dxa" w:w="200"/>
+              <w:bottom w:type="dxa" w:w="20"/>
+              <w:right w:type="dxa" w:w="200"/>
+            </w:tcMar>
+          </w:tcPr>
+          <w:p>
+            <w:pPr>
+              <w:spacing w:after="0"/>
+            </w:pPr>
+            <w:r>
+              <w:rPr>
+                <w:rFonts w:ascii="Courier New" w:cs="Courier New" w:hAnsi="Courier New"/>
+                <w:color w:val="888888"/>
+                <w:sz w:val="17"/>
+                <w:szCs w:val="17"/>
+              </w:rPr>
+              <w:t xml:space="preserve"># Extrait tous les [SOURCE X] — uniquement les entiers</w:t>
+            </w:r>
+          </w:p>
+        </w:tc>
+      </w:tr>
+      <w:tr>
+        <w:tc>
+          <w:tcPr>
+            <w:shd w:fill="1A1A2E" w:val="clear"/>
+            <w:tcMar>
+              <w:top w:type="dxa" w:w="20"/>
+              <w:left w:type="dxa" w:w="200"/>
+              <w:bottom w:type="dxa" w:w="20"/>
+              <w:right w:type="dxa" w:w="200"/>
+            </w:tcMar>
+          </w:tcPr>
+          <w:p>
+            <w:pPr>
+              <w:spacing w:after="0"/>
+            </w:pPr>
+            <w:r>
+              <w:rPr>
+                <w:rFonts w:ascii="Courier New" w:cs="Courier New" w:hAnsi="Courier New"/>
+                <w:color w:val="CCCCCC"/>
+                <w:sz w:val="17"/>
+                <w:szCs w:val="17"/>
+              </w:rPr>
+              <w:t xml:space="preserve">cited = [int(x) for x in re.findall(PATTERN, response)]</w:t>
+            </w:r>
+          </w:p>
+        </w:tc>
+      </w:tr>
+      <w:tr>
+        <w:tc>
+          <w:tcPr>
+            <w:shd w:fill="1A1A2E" w:val="clear"/>
+            <w:tcMar>
+              <w:top w:type="dxa" w:w="20"/>
+              <w:left w:type="dxa" w:w="200"/>
+              <w:bottom w:type="dxa" w:w="20"/>
+              <w:right w:type="dxa" w:w="200"/>
+            </w:tcMar>
+          </w:tcPr>
+          <w:p>
+            <w:pPr>
+              <w:spacing w:after="0"/>
+            </w:pPr>
+            <w:r>
+              <w:rPr>
+                <w:rFonts w:ascii="Courier New" w:cs="Courier New" w:hAnsi="Courier New"/>
+                <w:color w:val="888888"/>
+                <w:sz w:val="17"/>
+                <w:szCs w:val="17"/>
+              </w:rPr>
+              <w:t xml:space="preserve"/>
+            </w:r>
+          </w:p>
+        </w:tc>
+      </w:tr>
+      <w:tr>
+        <w:tc>
+          <w:tcPr>
+            <w:shd w:fill="1A1A2E" w:val="clear"/>
+            <w:tcMar>
+              <w:top w:type="dxa" w:w="20"/>
+              <w:left w:type="dxa" w:w="200"/>
+              <w:bottom w:type="dxa" w:w="20"/>
+              <w:right w:type="dxa" w:w="200"/>
+            </w:tcMar>
+          </w:tcPr>
+          <w:p>
+            <w:pPr>
+              <w:spacing w:after="0"/>
+            </w:pPr>
+            <w:r>
+              <w:rPr>
+                <w:rFonts w:ascii="Courier New" w:cs="Courier New" w:hAnsi="Courier New"/>
+                <w:color w:val="888888"/>
+                <w:sz w:val="17"/>
+                <w:szCs w:val="17"/>
+              </w:rPr>
+              <w:t xml:space="preserve"># Fantomes = hors plage [1, n_chunks]  (SOURCE 0 aussi fantome)</w:t>
+            </w:r>
+          </w:p>
+        </w:tc>
+      </w:tr>
+      <w:tr>
+        <w:tc>
+          <w:tcPr>
+            <w:shd w:fill="1A1A2E" w:val="clear"/>
+            <w:tcMar>
+              <w:top w:type="dxa" w:w="20"/>
+              <w:left w:type="dxa" w:w="200"/>
+              <w:bottom w:type="dxa" w:w="20"/>
+              <w:right w:type="dxa" w:w="200"/>
+            </w:tcMar>
+          </w:tcPr>
+          <w:p>
+            <w:pPr>
+              <w:spacing w:after="0"/>
+            </w:pPr>
+            <w:r>
+              <w:rPr>
+                <w:rFonts w:ascii="Courier New" w:cs="Courier New" w:hAnsi="Courier New"/>
+                <w:color w:val="CCCCCC"/>
+                <w:sz w:val="17"/>
+                <w:szCs w:val="17"/>
+              </w:rPr>
+              <w:t xml:space="preserve">ghosts = sorted([x for x in set(cited) if x &lt; 1 or x &gt; n_chunks])</w:t>
+            </w:r>
+          </w:p>
+        </w:tc>
+      </w:tr>
+      <w:tr>
+        <w:tc>
+          <w:tcPr>
+            <w:shd w:fill="1A1A2E" w:val="clear"/>
+            <w:tcMar>
+              <w:top w:type="dxa" w:w="20"/>
+              <w:left w:type="dxa" w:w="200"/>
+              <w:bottom w:type="dxa" w:w="20"/>
+              <w:right w:type="dxa" w:w="200"/>
+            </w:tcMar>
+          </w:tcPr>
+          <w:p>
+            <w:pPr>
+              <w:spacing w:after="0"/>
+            </w:pPr>
+            <w:r>
+              <w:rPr>
+                <w:rFonts w:ascii="Courier New" w:cs="Courier New" w:hAnsi="Courier New"/>
+                <w:color w:val="888888"/>
+                <w:sz w:val="17"/>
+                <w:szCs w:val="17"/>
+              </w:rPr>
+              <w:t xml:space="preserve"/>
+            </w:r>
+          </w:p>
+        </w:tc>
+      </w:tr>
+      <w:tr>
+        <w:tc>
+          <w:tcPr>
+            <w:shd w:fill="1A1A2E" w:val="clear"/>
+            <w:tcMar>
+              <w:top w:type="dxa" w:w="20"/>
+              <w:left w:type="dxa" w:w="200"/>
+              <w:bottom w:type="dxa" w:w="20"/>
+              <w:right w:type="dxa" w:w="200"/>
+            </w:tcMar>
+          </w:tcPr>
+          <w:p>
+            <w:pPr>
+              <w:spacing w:after="0"/>
+            </w:pPr>
+            <w:r>
+              <w:rPr>
+                <w:rFonts w:ascii="Courier New" w:cs="Courier New" w:hAnsi="Courier New"/>
+                <w:color w:val="888888"/>
+                <w:sz w:val="17"/>
+                <w:szCs w:val="17"/>
+              </w:rPr>
+              <w:t xml:space="preserve"># Deux seuils : HIGH &gt;= 2, LOW == 1</w:t>
+            </w:r>
+          </w:p>
+        </w:tc>
+      </w:tr>
+      <w:tr>
+        <w:tc>
+          <w:tcPr>
+            <w:shd w:fill="1A1A2E" w:val="clear"/>
+            <w:tcMar>
+              <w:top w:type="dxa" w:w="20"/>
+              <w:left w:type="dxa" w:w="200"/>
+              <w:bottom w:type="dxa" w:w="20"/>
+              <w:right w:type="dxa" w:w="200"/>
+            </w:tcMar>
+          </w:tcPr>
+          <w:p>
+            <w:pPr>
+              <w:spacing w:after="0"/>
+            </w:pPr>
+            <w:r>
+              <w:rPr>
+                <w:rFonts w:ascii="Courier New" w:cs="Courier New" w:hAnsi="Courier New"/>
+                <w:color w:val="E07C3A"/>
+                <w:sz w:val="17"/>
+                <w:szCs w:val="17"/>
+              </w:rPr>
+              <w:t xml:space="preserve">if len(ghosts) &gt;= 2:   # HIGH — bloquer</w:t>
+            </w:r>
+          </w:p>
+        </w:tc>
+      </w:tr>
+      <w:tr>
+        <w:tc>
+          <w:tcPr>
+            <w:shd w:fill="1A1A2E" w:val="clear"/>
+            <w:tcMar>
+              <w:top w:type="dxa" w:w="20"/>
+              <w:left w:type="dxa" w:w="200"/>
+              <w:bottom w:type="dxa" w:w="20"/>
+              <w:right w:type="dxa" w:w="200"/>
+            </w:tcMar>
+          </w:tcPr>
+          <w:p>
+            <w:pPr>
+              <w:spacing w:after="0"/>
+            </w:pPr>
+            <w:r>
+              <w:rPr>
+                <w:rFonts w:ascii="Courier New" w:cs="Courier New" w:hAnsi="Courier New"/>
+                <w:color w:val="E07C3A"/>
+                <w:sz w:val="17"/>
+                <w:szCs w:val="17"/>
+              </w:rPr>
+              <w:t xml:space="preserve">    return {"severity": "high", "response_patched": None, ...}</w:t>
+            </w:r>
+          </w:p>
+        </w:tc>
+      </w:tr>
+      <w:tr>
+        <w:tc>
+          <w:tcPr>
+            <w:shd w:fill="1A1A2E" w:val="clear"/>
+            <w:tcMar>
+              <w:top w:type="dxa" w:w="20"/>
+              <w:left w:type="dxa" w:w="200"/>
+              <w:bottom w:type="dxa" w:w="20"/>
+              <w:right w:type="dxa" w:w="200"/>
+            </w:tcMar>
+          </w:tcPr>
+          <w:p>
+            <w:pPr>
+              <w:spacing w:after="0"/>
+            </w:pPr>
+            <w:r>
+              <w:rPr>
+                <w:rFonts w:ascii="Courier New" w:cs="Courier New" w:hAnsi="Courier New"/>
+                <w:color w:val="4CAF50"/>
+                <w:sz w:val="17"/>
+                <w:szCs w:val="17"/>
+              </w:rPr>
+              <w:t xml:space="preserve">elif len(ghosts) == 1: # LOW — disclaimer</w:t>
+            </w:r>
+          </w:p>
+        </w:tc>
+      </w:tr>
+      <w:tr>
+        <w:tc>
+          <w:tcPr>
+            <w:shd w:fill="1A1A2E" w:val="clear"/>
+            <w:tcMar>
+              <w:top w:type="dxa" w:w="20"/>
+              <w:left w:type="dxa" w:w="200"/>
+              <w:bottom w:type="dxa" w:w="20"/>
+              <w:right w:type="dxa" w:w="200"/>
+            </w:tcMar>
+          </w:tcPr>
+          <w:p>
+            <w:pPr>
+              <w:spacing w:after="0"/>
+            </w:pPr>
+            <w:r>
+              <w:rPr>
+                <w:rFonts w:ascii="Courier New" w:cs="Courier New" w:hAnsi="Courier New"/>
+                <w:color w:val="4CAF50"/>
+                <w:sz w:val="17"/>
+                <w:szCs w:val="17"/>
+              </w:rPr>
+              <w:t xml:space="preserve">    return {"severity": "low", "response_patched": response + DISCLAIMER}</w:t>
+            </w:r>
+          </w:p>
+        </w:tc>
+      </w:tr>
+      <w:tr>
+        <w:tc>
+          <w:tcPr>
+            <w:shd w:fill="1A1A2E" w:val="clear"/>
+            <w:tcMar>
+              <w:top w:type="dxa" w:w="20"/>
+              <w:left w:type="dxa" w:w="200"/>
+              <w:bottom w:type="dxa" w:w="20"/>
+              <w:right w:type="dxa" w:w="200"/>
+            </w:tcMar>
+          </w:tcPr>
+          <w:p>
+            <w:pPr>
+              <w:spacing w:after="0"/>
+            </w:pPr>
+            <w:r>
+              <w:rPr>
+                <w:rFonts w:ascii="Courier New" w:cs="Courier New" w:hAnsi="Courier New"/>
+                <w:color w:val="888888"/>
+                <w:sz w:val="17"/>
+                <w:szCs w:val="17"/>
+              </w:rPr>
+              <w:t xml:space="preserve">else:                  # OK — aucun fantome</w:t>
+            </w:r>
+          </w:p>
+        </w:tc>
+      </w:tr>
+      <w:tr>
+        <w:tc>
+          <w:tcPr>
+            <w:shd w:fill="1A1A2E" w:val="clear"/>
+            <w:tcMar>
+              <w:top w:type="dxa" w:w="20"/>
+              <w:left w:type="dxa" w:w="200"/>
+              <w:bottom w:type="dxa" w:w="20"/>
+              <w:right w:type="dxa" w:w="200"/>
+            </w:tcMar>
+          </w:tcPr>
+          <w:p>
+            <w:pPr>
+              <w:spacing w:after="0"/>
+            </w:pPr>
+            <w:r>
+              <w:rPr>
+                <w:rFonts w:ascii="Courier New" w:cs="Courier New" w:hAnsi="Courier New"/>
+                <w:color w:val="888888"/>
+                <w:sz w:val="17"/>
+                <w:szCs w:val="17"/>
+              </w:rPr>
+              <w:t xml:space="preserve">    return {"severity": "ok", "flagged": False, ...}</w:t>
+            </w:r>
+          </w:p>
+        </w:tc>
+      </w:tr>
+    </w:tbl>
+    <w:p>
+      <w:pPr>
+        <w:spacing w:after="120"/>
+      </w:pPr>
+    </w:p>
+    <w:p>
+      <w:pPr>
+        <w:spacing w:after="100" w:before="200"/>
+      </w:pPr>
+      <w:r>
+        <w:rPr>
+          <w:rFonts w:ascii="Arial" w:cs="Arial" w:hAnsi="Arial"/>
+          <w:b/>
+          <w:color w:val="C9A84C"/>
+          <w:sz w:val="22"/>
+          <w:szCs w:val="22"/>
+        </w:rPr>
+        <w:t>Intégration dans le pipeline</w:t>
+      </w:r>
+    </w:p>
+    <w:p>
+      <w:pPr>
+        <w:spacing w:after="80"/>
+      </w:pPr>
+      <w:r>
+        <w:rPr>
+          <w:rFonts w:ascii="Arial" w:cs="Arial" w:hAnsi="Arial"/>
+          <w:color w:val="1A1A2E"/>
+          <w:sz w:val="20"/>
+          <w:szCs w:val="20"/>
+        </w:rPr>
+        <w:t xml:space="preserve">Le guardrail est appelé dans generate_answer() juste après la réponse Claude. La fonction retourne maintenant 4 valeurs (anciennement 3) — le dict guardrail est propagé jusqu'à l'endpoint search() qui gère le cas HIGH avec une HTTPException 503.</w:t>
+      </w:r>
+    </w:p>
+    <w:tbl>
+      <w:tblPr>
+        <w:tblW w:type="dxa" w:w="9360"/>
+        <w:tblBorders>
+          <w:top w:val="single" w:color="C9A84C" w:sz="4"/>
+          <w:left w:val="single" w:color="C9A84C" w:sz="4"/>
+          <w:bottom w:val="single" w:color="C9A84C" w:sz="4"/>
+          <w:right w:val="single" w:color="C9A84C" w:sz="4"/>
+        </w:tblBorders>
+      </w:tblPr>
+      <w:tblGrid>
+        <w:gridCol w:w="9360"/>
+      </w:tblGrid>
+      <w:tr>
+        <w:tc>
+          <w:tcPr>
+            <w:shd w:fill="C9A84C" w:val="clear"/>
+            <w:tcMar>
+              <w:top w:type="dxa" w:w="60"/>
+              <w:left w:type="dxa" w:w="200"/>
+              <w:bottom w:type="dxa" w:w="60"/>
+              <w:right w:type="dxa" w:w="200"/>
+            </w:tcMar>
+          </w:tcPr>
+          <w:p>
+            <w:r>
+              <w:rPr>
+                <w:rFonts w:ascii="Courier New" w:cs="Courier New" w:hAnsi="Courier New"/>
+                <w:b/>
+                <w:color w:val="1A1A1A"/>
+                <w:sz w:val="16"/>
+                <w:szCs w:val="16"/>
+              </w:rPr>
+              <w:t>api/search.py — Intégration search() et generate_answer()</w:t>
+            </w:r>
+          </w:p>
+        </w:tc>
+      </w:tr>
+      <w:tr>
+        <w:tc>
+          <w:tcPr>
+            <w:shd w:fill="1A1A2E" w:val="clear"/>
+            <w:tcMar>
+              <w:top w:type="dxa" w:w="20"/>
+              <w:left w:type="dxa" w:w="200"/>
+              <w:bottom w:type="dxa" w:w="20"/>
+              <w:right w:type="dxa" w:w="200"/>
+            </w:tcMar>
+          </w:tcPr>
+          <w:p>
+            <w:pPr>
+              <w:spacing w:after="0"/>
+            </w:pPr>
+            <w:r>
+              <w:rPr>
+                <w:rFonts w:ascii="Courier New" w:cs="Courier New" w:hAnsi="Courier New"/>
+                <w:color w:val="888888"/>
+                <w:sz w:val="17"/>
+                <w:szCs w:val="17"/>
+              </w:rPr>
+              <w:t xml:space="preserve"># Dans generate_answer() — apres answer = message.content[0].text</w:t>
+            </w:r>
+          </w:p>
+        </w:tc>
+      </w:tr>
+      <w:tr>
+        <w:tc>
+          <w:tcPr>
+            <w:shd w:fill="1A1A2E" w:val="clear"/>
+            <w:tcMar>
+              <w:top w:type="dxa" w:w="20"/>
+              <w:left w:type="dxa" w:w="200"/>
+              <w:bottom w:type="dxa" w:w="20"/>
+              <w:right w:type="dxa" w:w="200"/>
+            </w:tcMar>
+          </w:tcPr>
+          <w:p>
+            <w:pPr>
+              <w:spacing w:after="0"/>
+            </w:pPr>
+            <w:r>
+              <w:rPr>
+                <w:rFonts w:ascii="Courier New" w:cs="Courier New" w:hAnsi="Courier New"/>
+                <w:color w:val="CCCCCC"/>
+                <w:sz w:val="17"/>
+                <w:szCs w:val="17"/>
+              </w:rPr>
+              <w:t xml:space="preserve">guardrail = check_hallucination_guardrail(answer, len(chunks), language)</w:t>
+            </w:r>
+          </w:p>
+        </w:tc>
+      </w:tr>
+      <w:tr>
+        <w:tc>
+          <w:tcPr>
+            <w:shd w:fill="1A1A2E" w:val="clear"/>
+            <w:tcMar>
+              <w:top w:type="dxa" w:w="20"/>
+              <w:left w:type="dxa" w:w="200"/>
+              <w:bottom w:type="dxa" w:w="20"/>
+              <w:right w:type="dxa" w:w="200"/>
+            </w:tcMar>
+          </w:tcPr>
+          <w:p>
+            <w:pPr>
+              <w:spacing w:after="0"/>
+            </w:pPr>
+            <w:r>
+              <w:rPr>
+                <w:rFonts w:ascii="Courier New" w:cs="Courier New" w:hAnsi="Courier New"/>
+                <w:color w:val="CCCCCC"/>
+                <w:sz w:val="17"/>
+                <w:szCs w:val="17"/>
+              </w:rPr>
+              <w:t xml:space="preserve">if guardrail['flagged']: logger.warning(guardrail['detail'])</w:t>
+            </w:r>
+          </w:p>
+        </w:tc>
+      </w:tr>
+      <w:tr>
+        <w:tc>
+          <w:tcPr>
+            <w:shd w:fill="1A1A2E" w:val="clear"/>
+            <w:tcMar>
+              <w:top w:type="dxa" w:w="20"/>
+              <w:left w:type="dxa" w:w="200"/>
+              <w:bottom w:type="dxa" w:w="20"/>
+              <w:right w:type="dxa" w:w="200"/>
+            </w:tcMar>
+          </w:tcPr>
+          <w:p>
+            <w:pPr>
+              <w:spacing w:after="0"/>
+            </w:pPr>
+            <w:r>
+              <w:rPr>
+                <w:rFonts w:ascii="Courier New" w:cs="Courier New" w:hAnsi="Courier New"/>
+                <w:color w:val="CCCCCC"/>
+                <w:sz w:val="17"/>
+                <w:szCs w:val="17"/>
+              </w:rPr>
+              <w:t xml:space="preserve">answer = guardrail['response_patched'] or answer</w:t>
+            </w:r>
+          </w:p>
+        </w:tc>
+      </w:tr>
+      <w:tr>
+        <w:tc>
+          <w:tcPr>
+            <w:shd w:fill="1A1A2E" w:val="clear"/>
+            <w:tcMar>
+              <w:top w:type="dxa" w:w="20"/>
+              <w:left w:type="dxa" w:w="200"/>
+              <w:bottom w:type="dxa" w:w="20"/>
+              <w:right w:type="dxa" w:w="200"/>
+            </w:tcMar>
+          </w:tcPr>
+          <w:p>
+            <w:pPr>
+              <w:spacing w:after="0"/>
+            </w:pPr>
+            <w:r>
+              <w:rPr>
+                <w:rFonts w:ascii="Courier New" w:cs="Courier New" w:hAnsi="Courier New"/>
+                <w:color w:val="CCCCCC"/>
+                <w:sz w:val="17"/>
+                <w:szCs w:val="17"/>
+              </w:rPr>
+              <w:t xml:space="preserve">return answer, citations, model_id, guardrail  # 4 valeurs</w:t>
+            </w:r>
+          </w:p>
+        </w:tc>
+      </w:tr>
+      <w:tr>
+        <w:tc>
+          <w:tcPr>
+            <w:shd w:fill="1A1A2E" w:val="clear"/>
+            <w:tcMar>
+              <w:top w:type="dxa" w:w="20"/>
+              <w:left w:type="dxa" w:w="200"/>
+              <w:bottom w:type="dxa" w:w="20"/>
+              <w:right w:type="dxa" w:w="200"/>
+            </w:tcMar>
+          </w:tcPr>
+          <w:p>
+            <w:pPr>
+              <w:spacing w:after="0"/>
+            </w:pPr>
+            <w:r>
+              <w:rPr>
+                <w:rFonts w:ascii="Courier New" w:cs="Courier New" w:hAnsi="Courier New"/>
+                <w:color w:val="888888"/>
+                <w:sz w:val="17"/>
+                <w:szCs w:val="17"/>
+              </w:rPr>
+              <w:t xml:space="preserve"/>
+            </w:r>
+          </w:p>
+        </w:tc>
+      </w:tr>
+      <w:tr>
+        <w:tc>
+          <w:tcPr>
+            <w:shd w:fill="1A1A2E" w:val="clear"/>
+            <w:tcMar>
+              <w:top w:type="dxa" w:w="20"/>
+              <w:left w:type="dxa" w:w="200"/>
+              <w:bottom w:type="dxa" w:w="20"/>
+              <w:right w:type="dxa" w:w="200"/>
+            </w:tcMar>
+          </w:tcPr>
+          <w:p>
+            <w:pPr>
+              <w:spacing w:after="0"/>
+            </w:pPr>
+            <w:r>
+              <w:rPr>
+                <w:rFonts w:ascii="Courier New" w:cs="Courier New" w:hAnsi="Courier New"/>
+                <w:color w:val="888888"/>
+                <w:sz w:val="17"/>
+                <w:szCs w:val="17"/>
+              </w:rPr>
+              <w:t xml:space="preserve"># Dans search() — gestion HIGH uniquement</w:t>
+            </w:r>
+          </w:p>
+        </w:tc>
+      </w:tr>
+      <w:tr>
+        <w:tc>
+          <w:tcPr>
+            <w:shd w:fill="1A1A2E" w:val="clear"/>
+            <w:tcMar>
+              <w:top w:type="dxa" w:w="20"/>
+              <w:left w:type="dxa" w:w="200"/>
+              <w:bottom w:type="dxa" w:w="20"/>
+              <w:right w:type="dxa" w:w="200"/>
+            </w:tcMar>
+          </w:tcPr>
+          <w:p>
+            <w:pPr>
+              <w:spacing w:after="0"/>
+            </w:pPr>
+            <w:r>
+              <w:rPr>
+                <w:rFonts w:ascii="Courier New" w:cs="Courier New" w:hAnsi="Courier New"/>
+                <w:color w:val="CCCCCC"/>
+                <w:sz w:val="17"/>
+                <w:szCs w:val="17"/>
+              </w:rPr>
+              <w:t xml:space="preserve">answer, citations, model_used, guardrail = await generate_answer(...)</w:t>
+            </w:r>
+          </w:p>
+        </w:tc>
+      </w:tr>
+      <w:tr>
+        <w:tc>
+          <w:tcPr>
+            <w:shd w:fill="1A1A2E" w:val="clear"/>
+            <w:tcMar>
+              <w:top w:type="dxa" w:w="20"/>
+              <w:left w:type="dxa" w:w="200"/>
+              <w:bottom w:type="dxa" w:w="20"/>
+              <w:right w:type="dxa" w:w="200"/>
+            </w:tcMar>
+          </w:tcPr>
+          <w:p>
+            <w:pPr>
+              <w:spacing w:after="0"/>
+            </w:pPr>
+            <w:r>
+              <w:rPr>
+                <w:rFonts w:ascii="Courier New" w:cs="Courier New" w:hAnsi="Courier New"/>
+                <w:color w:val="E07C3A"/>
+                <w:sz w:val="17"/>
+                <w:szCs w:val="17"/>
+              </w:rPr>
+              <w:t xml:space="preserve">if guardrail['severity'] == 'high':</w:t>
+            </w:r>
+          </w:p>
+        </w:tc>
+      </w:tr>
+      <w:tr>
+        <w:tc>
+          <w:tcPr>
+            <w:shd w:fill="1A1A2E" w:val="clear"/>
+            <w:tcMar>
+              <w:top w:type="dxa" w:w="20"/>
+              <w:left w:type="dxa" w:w="200"/>
+              <w:bottom w:type="dxa" w:w="20"/>
+              <w:right w:type="dxa" w:w="200"/>
+            </w:tcMar>
+          </w:tcPr>
+          <w:p>
+            <w:pPr>
+              <w:spacing w:after="0"/>
+            </w:pPr>
+            <w:r>
+              <w:rPr>
+                <w:rFonts w:ascii="Courier New" w:cs="Courier New" w:hAnsi="Courier New"/>
+                <w:color w:val="E07C3A"/>
+                <w:sz w:val="17"/>
+                <w:szCs w:val="17"/>
+              </w:rPr>
+              <w:t xml:space="preserve">    raise HTTPException(status_code=503, detail="Reponse non conforme...")</w:t>
+            </w:r>
+          </w:p>
+        </w:tc>
+      </w:tr>
+    </w:tbl>
+    <w:p>
+      <w:pPr>
+        <w:spacing w:after="120"/>
+      </w:pPr>
+    </w:p>
+    <w:tbl>
+      <w:tblPr>
+        <w:tblW w:type="dxa" w:w="9360"/>
+        <w:tblBorders>
+          <w:top w:val="single" w:color="7D6608" w:sz="4"/>
+          <w:left w:val="single" w:color="7D6608" w:sz="8"/>
+          <w:bottom w:val="single" w:color="7D6608" w:sz="4"/>
+          <w:right w:val="single" w:color="7D6608" w:sz="4"/>
+        </w:tblBorders>
+      </w:tblPr>
+      <w:tblGrid>
+        <w:gridCol w:w="9360"/>
+      </w:tblGrid>
+      <w:tr>
+        <w:tc>
+          <w:tcPr>
+            <w:shd w:fill="FFF8E1" w:val="clear"/>
+            <w:tcMar>
+              <w:top w:type="dxa" w:w="100"/>
+              <w:left w:type="dxa" w:w="200"/>
+              <w:bottom w:type="dxa" w:w="100"/>
+              <w:right w:type="dxa" w:w="200"/>
+            </w:tcMar>
+          </w:tcPr>
+          <w:p>
+            <w:pPr>
+              <w:spacing w:after="40"/>
+            </w:pPr>
+            <w:r>
+              <w:rPr>
+                <w:rFonts w:ascii="Arial" w:cs="Arial" w:hAnsi="Arial"/>
+                <w:b/>
+                <w:caps/>
+                <w:color w:val="7D6608"/>
+                <w:sz w:val="17"/>
+                <w:szCs w:val="17"/>
+              </w:rPr>
+              <w:t>LIMITES — CE QUE CE GUARDRAIL NE COUVRE PAS VOLONTAIREMENT</w:t>
+            </w:r>
+          </w:p>
+          <w:p>
+            <w:pPr>
+              <w:spacing w:after="0"/>
+            </w:pPr>
+            <w:r>
+              <w:rPr>
+                <w:rFonts w:ascii="Arial" w:cs="Arial" w:hAnsi="Arial"/>
+                <w:color w:val="1A1A2E"/>
+                <w:sz w:val="19"/>
+                <w:szCs w:val="19"/>
+              </w:rPr>
+              <w:t xml:space="preserve">Fidélité sémantique (Type B) : si Claude cite [SOURCE 2] correctement mais que le contenu ne supporte pas le claim, non détecté ici. Couvert par LLM-as-judge. | Citations texte libre : 'Article 17 du GDPR' sans [SOURCE X] non intercepté. Rare avec notre prompt. | Mode fallback : guardrail skippé (réponse fallback ne contient pas de [SOURCE X]).</w:t>
             </w:r>
           </w:p>
         </w:tc>

</xml_diff>

<commit_message>
docs: v5.0 — section auth JWT complete, glossaire profane, rate limiting
</commit_message>
<xml_diff>
--- a/docs/AI_Legal_Platform_Documentation.docx
+++ b/docs/AI_Legal_Platform_Documentation.docx
@@ -17632,6 +17632,3904 @@
         <w:br w:type="page"/>
       </w:r>
     </w:p>
+    <w:p>
+      <w:pPr>
+        <w:spacing w:after="60"/>
+      </w:pPr>
+      <w:r>
+        <w:rPr>
+          <w:rFonts w:ascii="Arial" w:cs="Arial" w:hAnsi="Arial"/>
+          <w:b/>
+          <w:color w:val="1E3A5F"/>
+          <w:sz w:val="28"/>
+          <w:szCs w:val="28"/>
+        </w:rPr>
+        <w:t xml:space="preserve">09  Authentification JWT &amp; Rate Limiting</w:t>
+      </w:r>
+    </w:p>
+    <w:p>
+      <w:pPr>
+        <w:spacing w:after="120"/>
+      </w:pPr>
+      <w:r>
+        <w:rPr>
+          <w:rFonts w:ascii="Arial" w:cs="Arial" w:hAnsi="Arial"/>
+          <w:i/>
+          <w:color w:val="7F8C8D"/>
+          <w:sz w:val="18"/>
+          <w:szCs w:val="18"/>
+        </w:rPr>
+        <w:t>Sécurité · Qui peut appeler l'API · JWT HS256 · API Keys · Fenêtre glissante · HTTP 401/429</w:t>
+      </w:r>
+    </w:p>
+    <w:p>
+      <w:pPr>
+        <w:spacing w:after="100" w:before="200"/>
+      </w:pPr>
+      <w:r>
+        <w:rPr>
+          <w:rFonts w:ascii="Arial" w:cs="Arial" w:hAnsi="Arial"/>
+          <w:b/>
+          <w:color w:val="C9A84C"/>
+          <w:sz w:val="22"/>
+          <w:szCs w:val="22"/>
+        </w:rPr>
+        <w:t>Pourquoi protéger l'API ? — Le problème concret</w:t>
+      </w:r>
+    </w:p>
+    <w:p>
+      <w:pPr>
+        <w:spacing w:after="100"/>
+      </w:pPr>
+      <w:r>
+        <w:rPr>
+          <w:rFonts w:ascii="Arial" w:cs="Arial" w:hAnsi="Arial"/>
+          <w:color w:val="1A1A2E"/>
+          <w:sz w:val="20"/>
+          <w:szCs w:val="20"/>
+        </w:rPr>
+        <w:t xml:space="preserve">Avant cette étape, l'API était entièrement ouverte. N'importe qui qui connaissait l'URL pouvait appeler /search. Chaque appel coûte environ $0.015 en crédits Anthropic. Un bot automatique envoyant 1000 requêtes en 10 minutes = $15 de facture en quelques minutes, sans qu'on puisse l'arrêter.</w:t>
+      </w:r>
+    </w:p>
+    <w:p>
+      <w:pPr>
+        <w:spacing w:after="80"/>
+      </w:pPr>
+      <w:r>
+        <w:rPr>
+          <w:rFonts w:ascii="Arial" w:cs="Arial" w:hAnsi="Arial"/>
+          <w:color w:val="1A1A2E"/>
+          <w:sz w:val="20"/>
+          <w:szCs w:val="20"/>
+        </w:rPr>
+        <w:t xml:space="preserve">Ce module ajoute deux verrous : QUI peut entrer (authentification) et COMBIEN DE FOIS (rate limiting). Sans badge valide → HTTP 401 refusé. Trop de requêtes → HTTP 429 ralentissement.</w:t>
+      </w:r>
+    </w:p>
+    <w:p>
+      <w:pPr>
+        <w:spacing w:after="80"/>
+      </w:pPr>
+    </w:p>
+    <w:p>
+      <w:pPr>
+        <w:spacing w:after="100" w:before="200"/>
+      </w:pPr>
+      <w:r>
+        <w:rPr>
+          <w:rFonts w:ascii="Arial" w:cs="Arial" w:hAnsi="Arial"/>
+          <w:b/>
+          <w:color w:val="C9A84C"/>
+          <w:sz w:val="22"/>
+          <w:szCs w:val="22"/>
+        </w:rPr>
+        <w:t>Glossaire — Définir les termes avant de continuer</w:t>
+      </w:r>
+    </w:p>
+    <w:p>
+      <w:pPr>
+        <w:spacing w:after="60"/>
+      </w:pPr>
+      <w:r>
+        <w:rPr>
+          <w:rFonts w:ascii="Arial" w:cs="Arial" w:hAnsi="Arial"/>
+          <w:color w:val="1A1A2E"/>
+          <w:sz w:val="20"/>
+          <w:szCs w:val="20"/>
+        </w:rPr>
+        <w:t xml:space="preserve">Ce module introduit beaucoup de termes techniques. Voici chacun expliqué simplement.</w:t>
+      </w:r>
+    </w:p>
+    <w:tbl>
+      <w:tblPr>
+        <w:tblW w:type="dxa" w:w="9360"/>
+        <w:tblBorders>
+          <w:top w:val="none" w:color="FFFFFF" w:sz="0"/>
+          <w:left w:val="none" w:color="FFFFFF" w:sz="0"/>
+          <w:bottom w:val="single" w:color="E0E0E0" w:sz="2"/>
+          <w:right w:val="none" w:color="FFFFFF" w:sz="0"/>
+          <w:insideH w:val="none" w:color="FFFFFF" w:sz="0"/>
+          <w:insideV w:val="none" w:color="FFFFFF" w:sz="0"/>
+        </w:tblBorders>
+      </w:tblPr>
+      <w:tblGrid>
+        <w:gridCol w:w="2200"/>
+        <w:gridCol w:w="7160"/>
+      </w:tblGrid>
+      <w:tr>
+        <w:tc>
+          <w:tcPr>
+            <w:tcW w:type="dxa" w:w="2200"/>
+            <w:shd w:fill="F5F5F8" w:val="clear"/>
+            <w:tcMar>
+              <w:top w:type="dxa" w:w="80"/>
+              <w:left w:type="dxa" w:w="120"/>
+              <w:bottom w:type="dxa" w:w="80"/>
+              <w:right w:type="dxa" w:w="120"/>
+            </w:tcMar>
+          </w:tcPr>
+          <w:p>
+            <w:r>
+              <w:rPr>
+                <w:rFonts w:ascii="Arial" w:cs="Arial" w:hAnsi="Arial"/>
+                <w:b/>
+                <w:color w:val="1E3A5F"/>
+                <w:sz w:val="19"/>
+                <w:szCs w:val="19"/>
+              </w:rPr>
+              <w:t>Authentification</w:t>
+            </w:r>
+          </w:p>
+        </w:tc>
+        <w:tc>
+          <w:tcPr>
+            <w:tcW w:type="dxa" w:w="7160"/>
+            <w:tcMar>
+              <w:top w:type="dxa" w:w="80"/>
+              <w:left w:type="dxa" w:w="160"/>
+              <w:bottom w:type="dxa" w:w="80"/>
+              <w:right w:type="dxa" w:w="120"/>
+            </w:tcMar>
+          </w:tcPr>
+          <w:p>
+            <w:r>
+              <w:rPr>
+                <w:rFonts w:ascii="Arial" w:cs="Arial" w:hAnsi="Arial"/>
+                <w:color w:val="1A1A2E"/>
+                <w:sz w:val="19"/>
+                <w:szCs w:val="19"/>
+              </w:rPr>
+              <w:t xml:space="preserve">Répondre à 'Qui es-tu ?'. Vérifie l'identité de celui qui appelle l'API. Analogie : montrer sa carte d'identité à l'entrée d'un bâtiment.</w:t>
+            </w:r>
+          </w:p>
+        </w:tc>
+      </w:tr>
+    </w:tbl>
+    <w:tbl>
+      <w:tblPr>
+        <w:tblW w:type="dxa" w:w="9360"/>
+        <w:tblBorders>
+          <w:top w:val="none" w:color="FFFFFF" w:sz="0"/>
+          <w:left w:val="none" w:color="FFFFFF" w:sz="0"/>
+          <w:bottom w:val="single" w:color="E0E0E0" w:sz="2"/>
+          <w:right w:val="none" w:color="FFFFFF" w:sz="0"/>
+          <w:insideH w:val="none" w:color="FFFFFF" w:sz="0"/>
+          <w:insideV w:val="none" w:color="FFFFFF" w:sz="0"/>
+        </w:tblBorders>
+      </w:tblPr>
+      <w:tblGrid>
+        <w:gridCol w:w="2200"/>
+        <w:gridCol w:w="7160"/>
+      </w:tblGrid>
+      <w:tr>
+        <w:tc>
+          <w:tcPr>
+            <w:tcW w:type="dxa" w:w="2200"/>
+            <w:shd w:fill="F5F5F8" w:val="clear"/>
+            <w:tcMar>
+              <w:top w:type="dxa" w:w="80"/>
+              <w:left w:type="dxa" w:w="120"/>
+              <w:bottom w:type="dxa" w:w="80"/>
+              <w:right w:type="dxa" w:w="120"/>
+            </w:tcMar>
+          </w:tcPr>
+          <w:p>
+            <w:r>
+              <w:rPr>
+                <w:rFonts w:ascii="Arial" w:cs="Arial" w:hAnsi="Arial"/>
+                <w:b/>
+                <w:color w:val="1E3A5F"/>
+                <w:sz w:val="19"/>
+                <w:szCs w:val="19"/>
+              </w:rPr>
+              <w:t>Autorisation</w:t>
+            </w:r>
+          </w:p>
+        </w:tc>
+        <w:tc>
+          <w:tcPr>
+            <w:tcW w:type="dxa" w:w="7160"/>
+            <w:tcMar>
+              <w:top w:type="dxa" w:w="80"/>
+              <w:left w:type="dxa" w:w="160"/>
+              <w:bottom w:type="dxa" w:w="80"/>
+              <w:right w:type="dxa" w:w="120"/>
+            </w:tcMar>
+          </w:tcPr>
+          <w:p>
+            <w:r>
+              <w:rPr>
+                <w:rFonts w:ascii="Arial" w:cs="Arial" w:hAnsi="Arial"/>
+                <w:color w:val="1A1A2E"/>
+                <w:sz w:val="19"/>
+                <w:szCs w:val="19"/>
+              </w:rPr>
+              <w:t xml:space="preserve">Répondre à 'Qu'as-tu le droit de faire ?'. Distinct de l'authentification : on peut être identifié mais n'avoir accès qu'à certains endpoints (plans demo/cabinet/admin).</w:t>
+            </w:r>
+          </w:p>
+        </w:tc>
+      </w:tr>
+    </w:tbl>
+    <w:tbl>
+      <w:tblPr>
+        <w:tblW w:type="dxa" w:w="9360"/>
+        <w:tblBorders>
+          <w:top w:val="none" w:color="FFFFFF" w:sz="0"/>
+          <w:left w:val="none" w:color="FFFFFF" w:sz="0"/>
+          <w:bottom w:val="single" w:color="E0E0E0" w:sz="2"/>
+          <w:right w:val="none" w:color="FFFFFF" w:sz="0"/>
+          <w:insideH w:val="none" w:color="FFFFFF" w:sz="0"/>
+          <w:insideV w:val="none" w:color="FFFFFF" w:sz="0"/>
+        </w:tblBorders>
+      </w:tblPr>
+      <w:tblGrid>
+        <w:gridCol w:w="2200"/>
+        <w:gridCol w:w="7160"/>
+      </w:tblGrid>
+      <w:tr>
+        <w:tc>
+          <w:tcPr>
+            <w:tcW w:type="dxa" w:w="2200"/>
+            <w:shd w:fill="F5F5F8" w:val="clear"/>
+            <w:tcMar>
+              <w:top w:type="dxa" w:w="80"/>
+              <w:left w:type="dxa" w:w="120"/>
+              <w:bottom w:type="dxa" w:w="80"/>
+              <w:right w:type="dxa" w:w="120"/>
+            </w:tcMar>
+          </w:tcPr>
+          <w:p>
+            <w:r>
+              <w:rPr>
+                <w:rFonts w:ascii="Arial" w:cs="Arial" w:hAnsi="Arial"/>
+                <w:b/>
+                <w:color w:val="1E3A5F"/>
+                <w:sz w:val="19"/>
+                <w:szCs w:val="19"/>
+              </w:rPr>
+              <w:t>Token</w:t>
+            </w:r>
+          </w:p>
+        </w:tc>
+        <w:tc>
+          <w:tcPr>
+            <w:tcW w:type="dxa" w:w="7160"/>
+            <w:tcMar>
+              <w:top w:type="dxa" w:w="80"/>
+              <w:left w:type="dxa" w:w="160"/>
+              <w:bottom w:type="dxa" w:w="80"/>
+              <w:right w:type="dxa" w:w="120"/>
+            </w:tcMar>
+          </w:tcPr>
+          <w:p>
+            <w:r>
+              <w:rPr>
+                <w:rFonts w:ascii="Arial" w:cs="Arial" w:hAnsi="Arial"/>
+                <w:color w:val="1A1A2E"/>
+                <w:sz w:val="19"/>
+                <w:szCs w:val="19"/>
+              </w:rPr>
+              <w:t xml:space="preserve">Jeton numérique — une longue chaîne de caractères qui prouve l'identité. Analogie : le ticket de vestiaire d'un restaurant. Tu le présentes à chaque requête au lieu de re-saisir ton mot de passe.</w:t>
+            </w:r>
+          </w:p>
+        </w:tc>
+      </w:tr>
+    </w:tbl>
+    <w:tbl>
+      <w:tblPr>
+        <w:tblW w:type="dxa" w:w="9360"/>
+        <w:tblBorders>
+          <w:top w:val="none" w:color="FFFFFF" w:sz="0"/>
+          <w:left w:val="none" w:color="FFFFFF" w:sz="0"/>
+          <w:bottom w:val="single" w:color="E0E0E0" w:sz="2"/>
+          <w:right w:val="none" w:color="FFFFFF" w:sz="0"/>
+          <w:insideH w:val="none" w:color="FFFFFF" w:sz="0"/>
+          <w:insideV w:val="none" w:color="FFFFFF" w:sz="0"/>
+        </w:tblBorders>
+      </w:tblPr>
+      <w:tblGrid>
+        <w:gridCol w:w="2200"/>
+        <w:gridCol w:w="7160"/>
+      </w:tblGrid>
+      <w:tr>
+        <w:tc>
+          <w:tcPr>
+            <w:tcW w:type="dxa" w:w="2200"/>
+            <w:shd w:fill="F5F5F8" w:val="clear"/>
+            <w:tcMar>
+              <w:top w:type="dxa" w:w="80"/>
+              <w:left w:type="dxa" w:w="120"/>
+              <w:bottom w:type="dxa" w:w="80"/>
+              <w:right w:type="dxa" w:w="120"/>
+            </w:tcMar>
+          </w:tcPr>
+          <w:p>
+            <w:r>
+              <w:rPr>
+                <w:rFonts w:ascii="Arial" w:cs="Arial" w:hAnsi="Arial"/>
+                <w:b/>
+                <w:color w:val="1E3A5F"/>
+                <w:sz w:val="19"/>
+                <w:szCs w:val="19"/>
+              </w:rPr>
+              <w:t>JWT</w:t>
+            </w:r>
+          </w:p>
+        </w:tc>
+        <w:tc>
+          <w:tcPr>
+            <w:tcW w:type="dxa" w:w="7160"/>
+            <w:tcMar>
+              <w:top w:type="dxa" w:w="80"/>
+              <w:left w:type="dxa" w:w="160"/>
+              <w:bottom w:type="dxa" w:w="80"/>
+              <w:right w:type="dxa" w:w="120"/>
+            </w:tcMar>
+          </w:tcPr>
+          <w:p>
+            <w:r>
+              <w:rPr>
+                <w:rFonts w:ascii="Arial" w:cs="Arial" w:hAnsi="Arial"/>
+                <w:color w:val="1A1A2E"/>
+                <w:sz w:val="19"/>
+                <w:szCs w:val="19"/>
+              </w:rPr>
+              <w:t xml:space="preserve">JSON Web Token — un type de token SIGNÉ CRYPTOGRAPHIQUEMENT. Il contient qui tu es, quand il expire, ton plan, + une signature prouvant qu'il est authentique. Personne ne peut le falsifier sans la clé secrète du serveur.</w:t>
+            </w:r>
+          </w:p>
+        </w:tc>
+      </w:tr>
+    </w:tbl>
+    <w:tbl>
+      <w:tblPr>
+        <w:tblW w:type="dxa" w:w="9360"/>
+        <w:tblBorders>
+          <w:top w:val="none" w:color="FFFFFF" w:sz="0"/>
+          <w:left w:val="none" w:color="FFFFFF" w:sz="0"/>
+          <w:bottom w:val="single" w:color="E0E0E0" w:sz="2"/>
+          <w:right w:val="none" w:color="FFFFFF" w:sz="0"/>
+          <w:insideH w:val="none" w:color="FFFFFF" w:sz="0"/>
+          <w:insideV w:val="none" w:color="FFFFFF" w:sz="0"/>
+        </w:tblBorders>
+      </w:tblPr>
+      <w:tblGrid>
+        <w:gridCol w:w="2200"/>
+        <w:gridCol w:w="7160"/>
+      </w:tblGrid>
+      <w:tr>
+        <w:tc>
+          <w:tcPr>
+            <w:tcW w:type="dxa" w:w="2200"/>
+            <w:shd w:fill="F5F5F8" w:val="clear"/>
+            <w:tcMar>
+              <w:top w:type="dxa" w:w="80"/>
+              <w:left w:type="dxa" w:w="120"/>
+              <w:bottom w:type="dxa" w:w="80"/>
+              <w:right w:type="dxa" w:w="120"/>
+            </w:tcMar>
+          </w:tcPr>
+          <w:p>
+            <w:r>
+              <w:rPr>
+                <w:rFonts w:ascii="Arial" w:cs="Arial" w:hAnsi="Arial"/>
+                <w:b/>
+                <w:color w:val="1E3A5F"/>
+                <w:sz w:val="19"/>
+                <w:szCs w:val="19"/>
+              </w:rPr>
+              <w:t>API Key</w:t>
+            </w:r>
+          </w:p>
+        </w:tc>
+        <w:tc>
+          <w:tcPr>
+            <w:tcW w:type="dxa" w:w="7160"/>
+            <w:tcMar>
+              <w:top w:type="dxa" w:w="80"/>
+              <w:left w:type="dxa" w:w="160"/>
+              <w:bottom w:type="dxa" w:w="80"/>
+              <w:right w:type="dxa" w:w="120"/>
+            </w:tcMar>
+          </w:tcPr>
+          <w:p>
+            <w:r>
+              <w:rPr>
+                <w:rFonts w:ascii="Arial" w:cs="Arial" w:hAnsi="Arial"/>
+                <w:color w:val="1A1A2E"/>
+                <w:sz w:val="19"/>
+                <w:szCs w:val="19"/>
+              </w:rPr>
+              <w:t xml:space="preserve">Clé secrète statique — une longue chaîne aléatoire partagée entre deux systèmes. Plus simple que le JWT. Idéal pour les intégrations machine-à-machine où un humain ne se connecte pas.</w:t>
+            </w:r>
+          </w:p>
+        </w:tc>
+      </w:tr>
+    </w:tbl>
+    <w:tbl>
+      <w:tblPr>
+        <w:tblW w:type="dxa" w:w="9360"/>
+        <w:tblBorders>
+          <w:top w:val="none" w:color="FFFFFF" w:sz="0"/>
+          <w:left w:val="none" w:color="FFFFFF" w:sz="0"/>
+          <w:bottom w:val="single" w:color="E0E0E0" w:sz="2"/>
+          <w:right w:val="none" w:color="FFFFFF" w:sz="0"/>
+          <w:insideH w:val="none" w:color="FFFFFF" w:sz="0"/>
+          <w:insideV w:val="none" w:color="FFFFFF" w:sz="0"/>
+        </w:tblBorders>
+      </w:tblPr>
+      <w:tblGrid>
+        <w:gridCol w:w="2200"/>
+        <w:gridCol w:w="7160"/>
+      </w:tblGrid>
+      <w:tr>
+        <w:tc>
+          <w:tcPr>
+            <w:tcW w:type="dxa" w:w="2200"/>
+            <w:shd w:fill="F5F5F8" w:val="clear"/>
+            <w:tcMar>
+              <w:top w:type="dxa" w:w="80"/>
+              <w:left w:type="dxa" w:w="120"/>
+              <w:bottom w:type="dxa" w:w="80"/>
+              <w:right w:type="dxa" w:w="120"/>
+            </w:tcMar>
+          </w:tcPr>
+          <w:p>
+            <w:r>
+              <w:rPr>
+                <w:rFonts w:ascii="Arial" w:cs="Arial" w:hAnsi="Arial"/>
+                <w:b/>
+                <w:color w:val="1E3A5F"/>
+                <w:sz w:val="19"/>
+                <w:szCs w:val="19"/>
+              </w:rPr>
+              <w:t>Rate Limiting</w:t>
+            </w:r>
+          </w:p>
+        </w:tc>
+        <w:tc>
+          <w:tcPr>
+            <w:tcW w:type="dxa" w:w="7160"/>
+            <w:tcMar>
+              <w:top w:type="dxa" w:w="80"/>
+              <w:left w:type="dxa" w:w="160"/>
+              <w:bottom w:type="dxa" w:w="80"/>
+              <w:right w:type="dxa" w:w="120"/>
+            </w:tcMar>
+          </w:tcPr>
+          <w:p>
+            <w:r>
+              <w:rPr>
+                <w:rFonts w:ascii="Arial" w:cs="Arial" w:hAnsi="Arial"/>
+                <w:color w:val="1A1A2E"/>
+                <w:sz w:val="19"/>
+                <w:szCs w:val="19"/>
+              </w:rPr>
+              <w:t xml:space="preserve">Limiter le nombre de requêtes dans un intervalle de temps. Analogie : le portique d'un musée. Tu as un billet valide (token), mais tu ne peux pas rentrer et sortir 50 fois par heure.</w:t>
+            </w:r>
+          </w:p>
+        </w:tc>
+      </w:tr>
+    </w:tbl>
+    <w:tbl>
+      <w:tblPr>
+        <w:tblW w:type="dxa" w:w="9360"/>
+        <w:tblBorders>
+          <w:top w:val="none" w:color="FFFFFF" w:sz="0"/>
+          <w:left w:val="none" w:color="FFFFFF" w:sz="0"/>
+          <w:bottom w:val="single" w:color="E0E0E0" w:sz="2"/>
+          <w:right w:val="none" w:color="FFFFFF" w:sz="0"/>
+          <w:insideH w:val="none" w:color="FFFFFF" w:sz="0"/>
+          <w:insideV w:val="none" w:color="FFFFFF" w:sz="0"/>
+        </w:tblBorders>
+      </w:tblPr>
+      <w:tblGrid>
+        <w:gridCol w:w="2200"/>
+        <w:gridCol w:w="7160"/>
+      </w:tblGrid>
+      <w:tr>
+        <w:tc>
+          <w:tcPr>
+            <w:tcW w:type="dxa" w:w="2200"/>
+            <w:shd w:fill="F5F5F8" w:val="clear"/>
+            <w:tcMar>
+              <w:top w:type="dxa" w:w="80"/>
+              <w:left w:type="dxa" w:w="120"/>
+              <w:bottom w:type="dxa" w:w="80"/>
+              <w:right w:type="dxa" w:w="120"/>
+            </w:tcMar>
+          </w:tcPr>
+          <w:p>
+            <w:r>
+              <w:rPr>
+                <w:rFonts w:ascii="Arial" w:cs="Arial" w:hAnsi="Arial"/>
+                <w:b/>
+                <w:color w:val="1E3A5F"/>
+                <w:sz w:val="19"/>
+                <w:szCs w:val="19"/>
+              </w:rPr>
+              <w:t>Stateless</w:t>
+            </w:r>
+          </w:p>
+        </w:tc>
+        <w:tc>
+          <w:tcPr>
+            <w:tcW w:type="dxa" w:w="7160"/>
+            <w:tcMar>
+              <w:top w:type="dxa" w:w="80"/>
+              <w:left w:type="dxa" w:w="160"/>
+              <w:bottom w:type="dxa" w:w="80"/>
+              <w:right w:type="dxa" w:w="120"/>
+            </w:tcMar>
+          </w:tcPr>
+          <w:p>
+            <w:r>
+              <w:rPr>
+                <w:rFonts w:ascii="Arial" w:cs="Arial" w:hAnsi="Arial"/>
+                <w:color w:val="1A1A2E"/>
+                <w:sz w:val="19"/>
+                <w:szCs w:val="19"/>
+              </w:rPr>
+              <w:t xml:space="preserve">Sans état côté serveur. Le JWT est stateless : toutes les infos sont dans le token lui-même. Le serveur vérifie juste la signature sans base de données. Plus rapide et scalable qu'une session classique.</w:t>
+            </w:r>
+          </w:p>
+        </w:tc>
+      </w:tr>
+    </w:tbl>
+    <w:tbl>
+      <w:tblPr>
+        <w:tblW w:type="dxa" w:w="9360"/>
+        <w:tblBorders>
+          <w:top w:val="none" w:color="FFFFFF" w:sz="0"/>
+          <w:left w:val="none" w:color="FFFFFF" w:sz="0"/>
+          <w:bottom w:val="single" w:color="E0E0E0" w:sz="2"/>
+          <w:right w:val="none" w:color="FFFFFF" w:sz="0"/>
+          <w:insideH w:val="none" w:color="FFFFFF" w:sz="0"/>
+          <w:insideV w:val="none" w:color="FFFFFF" w:sz="0"/>
+        </w:tblBorders>
+      </w:tblPr>
+      <w:tblGrid>
+        <w:gridCol w:w="2200"/>
+        <w:gridCol w:w="7160"/>
+      </w:tblGrid>
+      <w:tr>
+        <w:tc>
+          <w:tcPr>
+            <w:tcW w:type="dxa" w:w="2200"/>
+            <w:shd w:fill="F5F5F8" w:val="clear"/>
+            <w:tcMar>
+              <w:top w:type="dxa" w:w="80"/>
+              <w:left w:type="dxa" w:w="120"/>
+              <w:bottom w:type="dxa" w:w="80"/>
+              <w:right w:type="dxa" w:w="120"/>
+            </w:tcMar>
+          </w:tcPr>
+          <w:p>
+            <w:r>
+              <w:rPr>
+                <w:rFonts w:ascii="Arial" w:cs="Arial" w:hAnsi="Arial"/>
+                <w:b/>
+                <w:color w:val="1E3A5F"/>
+                <w:sz w:val="19"/>
+                <w:szCs w:val="19"/>
+              </w:rPr>
+              <w:t>HS256</w:t>
+            </w:r>
+          </w:p>
+        </w:tc>
+        <w:tc>
+          <w:tcPr>
+            <w:tcW w:type="dxa" w:w="7160"/>
+            <w:tcMar>
+              <w:top w:type="dxa" w:w="80"/>
+              <w:left w:type="dxa" w:w="160"/>
+              <w:bottom w:type="dxa" w:w="80"/>
+              <w:right w:type="dxa" w:w="120"/>
+            </w:tcMar>
+          </w:tcPr>
+          <w:p>
+            <w:r>
+              <w:rPr>
+                <w:rFonts w:ascii="Arial" w:cs="Arial" w:hAnsi="Arial"/>
+                <w:color w:val="1A1A2E"/>
+                <w:sz w:val="19"/>
+                <w:szCs w:val="19"/>
+              </w:rPr>
+              <w:t xml:space="preserve">HMAC-SHA256 — l'algorithme qui crée la signature du JWT. Prend le contenu + la clé secrète → produit une empreinte unique. Comme un sceau de cire : ne peut être reproduit qu'avec le bon cachet.</w:t>
+            </w:r>
+          </w:p>
+        </w:tc>
+      </w:tr>
+    </w:tbl>
+    <w:p>
+      <w:pPr>
+        <w:spacing w:after="100"/>
+      </w:pPr>
+    </w:p>
+    <w:tbl>
+      <w:tblPr>
+        <w:tblW w:type="dxa" w:w="9360"/>
+        <w:tblBorders>
+          <w:top w:val="single" w:color="1A5276" w:sz="4"/>
+          <w:left w:val="single" w:color="1A5276" w:sz="8"/>
+          <w:bottom w:val="single" w:color="1A5276" w:sz="4"/>
+          <w:right w:val="single" w:color="1A5276" w:sz="4"/>
+        </w:tblBorders>
+      </w:tblPr>
+      <w:tblGrid>
+        <w:gridCol w:w="9360"/>
+      </w:tblGrid>
+      <w:tr>
+        <w:tc>
+          <w:tcPr>
+            <w:shd w:fill="EBF5FB" w:val="clear"/>
+            <w:tcMar>
+              <w:top w:type="dxa" w:w="100"/>
+              <w:left w:type="dxa" w:w="200"/>
+              <w:bottom w:type="dxa" w:w="100"/>
+              <w:right w:type="dxa" w:w="200"/>
+            </w:tcMar>
+          </w:tcPr>
+          <w:p>
+            <w:pPr>
+              <w:spacing w:after="40"/>
+            </w:pPr>
+            <w:r>
+              <w:rPr>
+                <w:rFonts w:ascii="Arial" w:cs="Arial" w:hAnsi="Arial"/>
+                <w:b/>
+                <w:caps/>
+                <w:color w:val="1A5276"/>
+                <w:sz w:val="17"/>
+                <w:szCs w:val="17"/>
+              </w:rPr>
+              <w:t>ANALOGIE GLOBALE — LE SYSTÈME DE BADGE D'UNE ENTREPRISE</w:t>
+            </w:r>
+          </w:p>
+          <w:p>
+            <w:pPr>
+              <w:spacing w:after="0"/>
+            </w:pPr>
+            <w:r>
+              <w:rPr>
+                <w:rFonts w:ascii="Arial" w:cs="Arial" w:hAnsi="Arial"/>
+                <w:color w:val="1A1A2E"/>
+                <w:sz w:val="19"/>
+                <w:szCs w:val="19"/>
+              </w:rPr>
+              <w:t xml:space="preserve">Imagine l'API comme un immeuble de bureaux. SANS BADGE = tu ne peux pas entrer (HTTP 401). BADGE VALIDE = tu peux entrer, le badge enregistre ton passage. TROP D'ENTRÉES EN 1 MINUTE = le portique se bloque (HTTP 429). BADGE EXPIRÉ = retourne à l'accueil en chercher un nouveau. Le badge contient ton nom, ton service, sa date d'expiration — c'est exactement ce que contient un JWT.</w:t>
+            </w:r>
+          </w:p>
+        </w:tc>
+      </w:tr>
+    </w:tbl>
+    <w:p>
+      <w:pPr>
+        <w:spacing w:after="100"/>
+      </w:pPr>
+    </w:p>
+    <w:p>
+      <w:pPr>
+        <w:spacing w:after="100" w:before="200"/>
+      </w:pPr>
+      <w:r>
+        <w:rPr>
+          <w:rFonts w:ascii="Arial" w:cs="Arial" w:hAnsi="Arial"/>
+          <w:b/>
+          <w:color w:val="C9A84C"/>
+          <w:sz w:val="22"/>
+          <w:szCs w:val="22"/>
+        </w:rPr>
+        <w:t>Anatomie d'un JWT — Comment il est construit</w:t>
+      </w:r>
+    </w:p>
+    <w:p>
+      <w:pPr>
+        <w:spacing w:after="60"/>
+      </w:pPr>
+      <w:r>
+        <w:rPr>
+          <w:rFonts w:ascii="Arial" w:cs="Arial" w:hAnsi="Arial"/>
+          <w:color w:val="1A1A2E"/>
+          <w:sz w:val="20"/>
+          <w:szCs w:val="20"/>
+        </w:rPr>
+        <w:t xml:space="preserve">Un JWT = 3 parties encodées, séparées par des points. Il ressemble à une longue chaîne incompréhensible, mais contient des informations lisibles une fois décodées.</w:t>
+      </w:r>
+    </w:p>
+    <w:tbl>
+      <w:tblPr>
+        <w:tblW w:type="dxa" w:w="9360"/>
+        <w:tblBorders>
+          <w:top w:val="single" w:color="C9A84C" w:sz="4"/>
+          <w:left w:val="single" w:color="C9A84C" w:sz="4"/>
+          <w:bottom w:val="single" w:color="C9A84C" w:sz="4"/>
+          <w:right w:val="single" w:color="C9A84C" w:sz="4"/>
+        </w:tblBorders>
+      </w:tblPr>
+      <w:tblGrid>
+        <w:gridCol w:w="9360"/>
+      </w:tblGrid>
+      <w:tr>
+        <w:tc>
+          <w:tcPr>
+            <w:shd w:fill="C9A84C" w:val="clear"/>
+            <w:tcMar>
+              <w:top w:type="dxa" w:w="60"/>
+              <w:left w:type="dxa" w:w="200"/>
+              <w:bottom w:type="dxa" w:w="60"/>
+              <w:right w:type="dxa" w:w="200"/>
+            </w:tcMar>
+          </w:tcPr>
+          <w:p>
+            <w:r>
+              <w:rPr>
+                <w:rFonts w:ascii="Courier New" w:cs="Courier New" w:hAnsi="Courier New"/>
+                <w:b/>
+                <w:color w:val="1A1A1A"/>
+                <w:sz w:val="16"/>
+                <w:szCs w:val="16"/>
+              </w:rPr>
+              <w:t>Structure d'un JWT — 3 parties</w:t>
+            </w:r>
+          </w:p>
+        </w:tc>
+      </w:tr>
+      <w:tr>
+        <w:tc>
+          <w:tcPr>
+            <w:shd w:fill="1A1A2E" w:val="clear"/>
+            <w:tcMar>
+              <w:top w:type="dxa" w:w="20"/>
+              <w:left w:type="dxa" w:w="200"/>
+              <w:bottom w:type="dxa" w:w="20"/>
+              <w:right w:type="dxa" w:w="200"/>
+            </w:tcMar>
+          </w:tcPr>
+          <w:p>
+            <w:pPr>
+              <w:spacing w:after="0"/>
+            </w:pPr>
+            <w:r>
+              <w:rPr>
+                <w:rFonts w:ascii="Courier New" w:cs="Courier New" w:hAnsi="Courier New"/>
+                <w:color w:val="888888"/>
+                <w:sz w:val="17"/>
+                <w:szCs w:val="17"/>
+              </w:rPr>
+              <w:t xml:space="preserve">Un JWT = HEADER.PAYLOAD.SIGNATURE</w:t>
+            </w:r>
+          </w:p>
+        </w:tc>
+      </w:tr>
+      <w:tr>
+        <w:tc>
+          <w:tcPr>
+            <w:shd w:fill="1A1A2E" w:val="clear"/>
+            <w:tcMar>
+              <w:top w:type="dxa" w:w="20"/>
+              <w:left w:type="dxa" w:w="200"/>
+              <w:bottom w:type="dxa" w:w="20"/>
+              <w:right w:type="dxa" w:w="200"/>
+            </w:tcMar>
+          </w:tcPr>
+          <w:p>
+            <w:pPr>
+              <w:spacing w:after="0"/>
+            </w:pPr>
+            <w:r>
+              <w:rPr>
+                <w:rFonts w:ascii="Courier New" w:cs="Courier New" w:hAnsi="Courier New"/>
+                <w:color w:val="888888"/>
+                <w:sz w:val="17"/>
+                <w:szCs w:val="17"/>
+              </w:rPr>
+              <w:t xml:space="preserve"/>
+            </w:r>
+          </w:p>
+        </w:tc>
+      </w:tr>
+      <w:tr>
+        <w:tc>
+          <w:tcPr>
+            <w:shd w:fill="1A1A2E" w:val="clear"/>
+            <w:tcMar>
+              <w:top w:type="dxa" w:w="20"/>
+              <w:left w:type="dxa" w:w="200"/>
+              <w:bottom w:type="dxa" w:w="20"/>
+              <w:right w:type="dxa" w:w="200"/>
+            </w:tcMar>
+          </w:tcPr>
+          <w:p>
+            <w:pPr>
+              <w:spacing w:after="0"/>
+            </w:pPr>
+            <w:r>
+              <w:rPr>
+                <w:rFonts w:ascii="Courier New" w:cs="Courier New" w:hAnsi="Courier New"/>
+                <w:color w:val="C9A84C"/>
+                <w:sz w:val="17"/>
+                <w:szCs w:val="17"/>
+              </w:rPr>
+              <w:t xml:space="preserve">PARTIE 1 — Header : algorithme utilisé</w:t>
+            </w:r>
+          </w:p>
+        </w:tc>
+      </w:tr>
+      <w:tr>
+        <w:tc>
+          <w:tcPr>
+            <w:shd w:fill="1A1A2E" w:val="clear"/>
+            <w:tcMar>
+              <w:top w:type="dxa" w:w="20"/>
+              <w:left w:type="dxa" w:w="200"/>
+              <w:bottom w:type="dxa" w:w="20"/>
+              <w:right w:type="dxa" w:w="200"/>
+            </w:tcMar>
+          </w:tcPr>
+          <w:p>
+            <w:pPr>
+              <w:spacing w:after="0"/>
+            </w:pPr>
+            <w:r>
+              <w:rPr>
+                <w:rFonts w:ascii="Courier New" w:cs="Courier New" w:hAnsi="Courier New"/>
+                <w:color w:val="CCCCCC"/>
+                <w:sz w:val="17"/>
+                <w:szCs w:val="17"/>
+              </w:rPr>
+              <w:t xml:space="preserve">  {"alg": "HS256", "typ": "JWT"}</w:t>
+            </w:r>
+          </w:p>
+        </w:tc>
+      </w:tr>
+      <w:tr>
+        <w:tc>
+          <w:tcPr>
+            <w:shd w:fill="1A1A2E" w:val="clear"/>
+            <w:tcMar>
+              <w:top w:type="dxa" w:w="20"/>
+              <w:left w:type="dxa" w:w="200"/>
+              <w:bottom w:type="dxa" w:w="20"/>
+              <w:right w:type="dxa" w:w="200"/>
+            </w:tcMar>
+          </w:tcPr>
+          <w:p>
+            <w:pPr>
+              <w:spacing w:after="0"/>
+            </w:pPr>
+            <w:r>
+              <w:rPr>
+                <w:rFonts w:ascii="Courier New" w:cs="Courier New" w:hAnsi="Courier New"/>
+                <w:color w:val="888888"/>
+                <w:sz w:val="17"/>
+                <w:szCs w:val="17"/>
+              </w:rPr>
+              <w:t xml:space="preserve"/>
+            </w:r>
+          </w:p>
+        </w:tc>
+      </w:tr>
+      <w:tr>
+        <w:tc>
+          <w:tcPr>
+            <w:shd w:fill="1A1A2E" w:val="clear"/>
+            <w:tcMar>
+              <w:top w:type="dxa" w:w="20"/>
+              <w:left w:type="dxa" w:w="200"/>
+              <w:bottom w:type="dxa" w:w="20"/>
+              <w:right w:type="dxa" w:w="200"/>
+            </w:tcMar>
+          </w:tcPr>
+          <w:p>
+            <w:pPr>
+              <w:spacing w:after="0"/>
+            </w:pPr>
+            <w:r>
+              <w:rPr>
+                <w:rFonts w:ascii="Courier New" w:cs="Courier New" w:hAnsi="Courier New"/>
+                <w:color w:val="4CAF50"/>
+                <w:sz w:val="17"/>
+                <w:szCs w:val="17"/>
+              </w:rPr>
+              <w:t xml:space="preserve">PARTIE 2 — Payload : les donnees (qui tu es)</w:t>
+            </w:r>
+          </w:p>
+        </w:tc>
+      </w:tr>
+      <w:tr>
+        <w:tc>
+          <w:tcPr>
+            <w:shd w:fill="1A1A2E" w:val="clear"/>
+            <w:tcMar>
+              <w:top w:type="dxa" w:w="20"/>
+              <w:left w:type="dxa" w:w="200"/>
+              <w:bottom w:type="dxa" w:w="20"/>
+              <w:right w:type="dxa" w:w="200"/>
+            </w:tcMar>
+          </w:tcPr>
+          <w:p>
+            <w:pPr>
+              <w:spacing w:after="0"/>
+            </w:pPr>
+            <w:r>
+              <w:rPr>
+                <w:rFonts w:ascii="Courier New" w:cs="Courier New" w:hAnsi="Courier New"/>
+                <w:color w:val="CCCCCC"/>
+                <w:sz w:val="17"/>
+                <w:szCs w:val="17"/>
+              </w:rPr>
+              <w:t xml:space="preserve">  {"sub": "demo@cabinet.fr",  ← qui tu es</w:t>
+            </w:r>
+          </w:p>
+        </w:tc>
+      </w:tr>
+      <w:tr>
+        <w:tc>
+          <w:tcPr>
+            <w:shd w:fill="1A1A2E" w:val="clear"/>
+            <w:tcMar>
+              <w:top w:type="dxa" w:w="20"/>
+              <w:left w:type="dxa" w:w="200"/>
+              <w:bottom w:type="dxa" w:w="20"/>
+              <w:right w:type="dxa" w:w="200"/>
+            </w:tcMar>
+          </w:tcPr>
+          <w:p>
+            <w:pPr>
+              <w:spacing w:after="0"/>
+            </w:pPr>
+            <w:r>
+              <w:rPr>
+                <w:rFonts w:ascii="Courier New" w:cs="Courier New" w:hAnsi="Courier New"/>
+                <w:color w:val="CCCCCC"/>
+                <w:sz w:val="17"/>
+                <w:szCs w:val="17"/>
+              </w:rPr>
+              <w:t xml:space="preserve">   "plan": "cabinet",          ← ton plan tarifaire</w:t>
+            </w:r>
+          </w:p>
+        </w:tc>
+      </w:tr>
+      <w:tr>
+        <w:tc>
+          <w:tcPr>
+            <w:shd w:fill="1A1A2E" w:val="clear"/>
+            <w:tcMar>
+              <w:top w:type="dxa" w:w="20"/>
+              <w:left w:type="dxa" w:w="200"/>
+              <w:bottom w:type="dxa" w:w="20"/>
+              <w:right w:type="dxa" w:w="200"/>
+            </w:tcMar>
+          </w:tcPr>
+          <w:p>
+            <w:pPr>
+              <w:spacing w:after="0"/>
+            </w:pPr>
+            <w:r>
+              <w:rPr>
+                <w:rFonts w:ascii="Courier New" w:cs="Courier New" w:hAnsi="Courier New"/>
+                <w:color w:val="CCCCCC"/>
+                <w:sz w:val="17"/>
+                <w:szCs w:val="17"/>
+              </w:rPr>
+              <w:t xml:space="preserve">   "client": "Cabinet Demo",   ← ton nom lisible</w:t>
+            </w:r>
+          </w:p>
+        </w:tc>
+      </w:tr>
+      <w:tr>
+        <w:tc>
+          <w:tcPr>
+            <w:shd w:fill="1A1A2E" w:val="clear"/>
+            <w:tcMar>
+              <w:top w:type="dxa" w:w="20"/>
+              <w:left w:type="dxa" w:w="200"/>
+              <w:bottom w:type="dxa" w:w="20"/>
+              <w:right w:type="dxa" w:w="200"/>
+            </w:tcMar>
+          </w:tcPr>
+          <w:p>
+            <w:pPr>
+              <w:spacing w:after="0"/>
+            </w:pPr>
+            <w:r>
+              <w:rPr>
+                <w:rFonts w:ascii="Courier New" w:cs="Courier New" w:hAnsi="Courier New"/>
+                <w:color w:val="CCCCCC"/>
+                <w:sz w:val="17"/>
+                <w:szCs w:val="17"/>
+              </w:rPr>
+              <w:t xml:space="preserve">   "is_admin": false,           ← es-tu admin ?</w:t>
+            </w:r>
+          </w:p>
+        </w:tc>
+      </w:tr>
+      <w:tr>
+        <w:tc>
+          <w:tcPr>
+            <w:shd w:fill="1A1A2E" w:val="clear"/>
+            <w:tcMar>
+              <w:top w:type="dxa" w:w="20"/>
+              <w:left w:type="dxa" w:w="200"/>
+              <w:bottom w:type="dxa" w:w="20"/>
+              <w:right w:type="dxa" w:w="200"/>
+            </w:tcMar>
+          </w:tcPr>
+          <w:p>
+            <w:pPr>
+              <w:spacing w:after="0"/>
+            </w:pPr>
+            <w:r>
+              <w:rPr>
+                <w:rFonts w:ascii="Courier New" w:cs="Courier New" w:hAnsi="Courier New"/>
+                <w:color w:val="CCCCCC"/>
+                <w:sz w:val="17"/>
+                <w:szCs w:val="17"/>
+              </w:rPr>
+              <w:t xml:space="preserve">   "exp": 1710003600,           ← quand il expire</w:t>
+            </w:r>
+          </w:p>
+        </w:tc>
+      </w:tr>
+      <w:tr>
+        <w:tc>
+          <w:tcPr>
+            <w:shd w:fill="1A1A2E" w:val="clear"/>
+            <w:tcMar>
+              <w:top w:type="dxa" w:w="20"/>
+              <w:left w:type="dxa" w:w="200"/>
+              <w:bottom w:type="dxa" w:w="20"/>
+              <w:right w:type="dxa" w:w="200"/>
+            </w:tcMar>
+          </w:tcPr>
+          <w:p>
+            <w:pPr>
+              <w:spacing w:after="0"/>
+            </w:pPr>
+            <w:r>
+              <w:rPr>
+                <w:rFonts w:ascii="Courier New" w:cs="Courier New" w:hAnsi="Courier New"/>
+                <w:color w:val="CCCCCC"/>
+                <w:sz w:val="17"/>
+                <w:szCs w:val="17"/>
+              </w:rPr>
+              <w:t xml:space="preserve">   "iat": 1710000000}           ← quand il a ete cree</w:t>
+            </w:r>
+          </w:p>
+        </w:tc>
+      </w:tr>
+      <w:tr>
+        <w:tc>
+          <w:tcPr>
+            <w:shd w:fill="1A1A2E" w:val="clear"/>
+            <w:tcMar>
+              <w:top w:type="dxa" w:w="20"/>
+              <w:left w:type="dxa" w:w="200"/>
+              <w:bottom w:type="dxa" w:w="20"/>
+              <w:right w:type="dxa" w:w="200"/>
+            </w:tcMar>
+          </w:tcPr>
+          <w:p>
+            <w:pPr>
+              <w:spacing w:after="0"/>
+            </w:pPr>
+            <w:r>
+              <w:rPr>
+                <w:rFonts w:ascii="Courier New" w:cs="Courier New" w:hAnsi="Courier New"/>
+                <w:color w:val="888888"/>
+                <w:sz w:val="17"/>
+                <w:szCs w:val="17"/>
+              </w:rPr>
+              <w:t xml:space="preserve"/>
+            </w:r>
+          </w:p>
+        </w:tc>
+      </w:tr>
+      <w:tr>
+        <w:tc>
+          <w:tcPr>
+            <w:shd w:fill="1A1A2E" w:val="clear"/>
+            <w:tcMar>
+              <w:top w:type="dxa" w:w="20"/>
+              <w:left w:type="dxa" w:w="200"/>
+              <w:bottom w:type="dxa" w:w="20"/>
+              <w:right w:type="dxa" w:w="200"/>
+            </w:tcMar>
+          </w:tcPr>
+          <w:p>
+            <w:pPr>
+              <w:spacing w:after="0"/>
+            </w:pPr>
+            <w:r>
+              <w:rPr>
+                <w:rFonts w:ascii="Courier New" w:cs="Courier New" w:hAnsi="Courier New"/>
+                <w:color w:val="E07C3A"/>
+                <w:sz w:val="17"/>
+                <w:szCs w:val="17"/>
+              </w:rPr>
+              <w:t xml:space="preserve">PARTIE 3 — Signature : la cle anti-falsification</w:t>
+            </w:r>
+          </w:p>
+        </w:tc>
+      </w:tr>
+      <w:tr>
+        <w:tc>
+          <w:tcPr>
+            <w:shd w:fill="1A1A2E" w:val="clear"/>
+            <w:tcMar>
+              <w:top w:type="dxa" w:w="20"/>
+              <w:left w:type="dxa" w:w="200"/>
+              <w:bottom w:type="dxa" w:w="20"/>
+              <w:right w:type="dxa" w:w="200"/>
+            </w:tcMar>
+          </w:tcPr>
+          <w:p>
+            <w:pPr>
+              <w:spacing w:after="0"/>
+            </w:pPr>
+            <w:r>
+              <w:rPr>
+                <w:rFonts w:ascii="Courier New" w:cs="Courier New" w:hAnsi="Courier New"/>
+                <w:color w:val="CCCCCC"/>
+                <w:sz w:val="17"/>
+                <w:szCs w:val="17"/>
+              </w:rPr>
+              <w:t xml:space="preserve">  HMAC_SHA256(header + payload, CLE_SECRETE_SERVEUR)</w:t>
+            </w:r>
+          </w:p>
+        </w:tc>
+      </w:tr>
+      <w:tr>
+        <w:tc>
+          <w:tcPr>
+            <w:shd w:fill="1A1A2E" w:val="clear"/>
+            <w:tcMar>
+              <w:top w:type="dxa" w:w="20"/>
+              <w:left w:type="dxa" w:w="200"/>
+              <w:bottom w:type="dxa" w:w="20"/>
+              <w:right w:type="dxa" w:w="200"/>
+            </w:tcMar>
+          </w:tcPr>
+          <w:p>
+            <w:pPr>
+              <w:spacing w:after="0"/>
+            </w:pPr>
+            <w:r>
+              <w:rPr>
+                <w:rFonts w:ascii="Courier New" w:cs="Courier New" w:hAnsi="Courier New"/>
+                <w:color w:val="888888"/>
+                <w:sz w:val="17"/>
+                <w:szCs w:val="17"/>
+              </w:rPr>
+              <w:t xml:space="preserve">  → Si quelqu'un modifie le payload, la signature</w:t>
+            </w:r>
+          </w:p>
+        </w:tc>
+      </w:tr>
+      <w:tr>
+        <w:tc>
+          <w:tcPr>
+            <w:shd w:fill="1A1A2E" w:val="clear"/>
+            <w:tcMar>
+              <w:top w:type="dxa" w:w="20"/>
+              <w:left w:type="dxa" w:w="200"/>
+              <w:bottom w:type="dxa" w:w="20"/>
+              <w:right w:type="dxa" w:w="200"/>
+            </w:tcMar>
+          </w:tcPr>
+          <w:p>
+            <w:pPr>
+              <w:spacing w:after="0"/>
+            </w:pPr>
+            <w:r>
+              <w:rPr>
+                <w:rFonts w:ascii="Courier New" w:cs="Courier New" w:hAnsi="Courier New"/>
+                <w:color w:val="888888"/>
+                <w:sz w:val="17"/>
+                <w:szCs w:val="17"/>
+              </w:rPr>
+              <w:t xml:space="preserve">    ne correspond plus → token rejeté (HTTP 401)</w:t>
+            </w:r>
+          </w:p>
+        </w:tc>
+      </w:tr>
+    </w:tbl>
+    <w:p>
+      <w:pPr>
+        <w:spacing w:after="100"/>
+      </w:pPr>
+    </w:p>
+    <w:p>
+      <w:pPr>
+        <w:spacing w:after="100" w:before="200"/>
+      </w:pPr>
+      <w:r>
+        <w:rPr>
+          <w:rFonts w:ascii="Arial" w:cs="Arial" w:hAnsi="Arial"/>
+          <w:b/>
+          <w:color w:val="C9A84C"/>
+          <w:sz w:val="22"/>
+          <w:szCs w:val="22"/>
+        </w:rPr>
+        <w:t>Flux d'une requête authentifiée — Étape par étape</w:t>
+      </w:r>
+    </w:p>
+    <w:p>
+      <w:pPr>
+        <w:spacing w:after="60"/>
+      </w:pPr>
+      <w:r>
+        <w:rPr>
+          <w:rFonts w:ascii="Arial" w:cs="Arial" w:hAnsi="Arial"/>
+          <w:color w:val="1A1A2E"/>
+          <w:sz w:val="20"/>
+          <w:szCs w:val="20"/>
+        </w:rPr>
+        <w:t xml:space="preserve">Voici exactement ce qui se passe depuis le moment où un client demande un token jusqu'à ce qu'il reçoive une réponse juridique.</w:t>
+      </w:r>
+    </w:p>
+    <w:tbl>
+      <w:tblPr>
+        <w:tblW w:type="dxa" w:w="9360"/>
+        <w:tblBorders>
+          <w:top w:val="none" w:color="FFFFFF" w:sz="0"/>
+          <w:left w:val="none" w:color="FFFFFF" w:sz="0"/>
+          <w:bottom w:val="none" w:color="FFFFFF" w:sz="0"/>
+          <w:right w:val="none" w:color="FFFFFF" w:sz="0"/>
+          <w:insideH w:val="none" w:color="FFFFFF" w:sz="0"/>
+          <w:insideV w:val="none" w:color="FFFFFF" w:sz="0"/>
+        </w:tblBorders>
+      </w:tblPr>
+      <w:tblGrid>
+        <w:gridCol w:w="600"/>
+        <w:gridCol w:w="8760"/>
+      </w:tblGrid>
+      <w:tr>
+        <w:tc>
+          <w:tcPr>
+            <w:tcW w:type="dxa" w:w="600"/>
+            <w:shd w:fill="1E3A5F" w:val="clear"/>
+            <w:tcMar>
+              <w:top w:type="dxa" w:w="80"/>
+              <w:left w:type="dxa" w:w="80"/>
+              <w:bottom w:type="dxa" w:w="80"/>
+              <w:right w:type="dxa" w:w="80"/>
+            </w:tcMar>
+          </w:tcPr>
+          <w:p>
+            <w:pPr>
+              <w:jc w:val="center"/>
+            </w:pPr>
+            <w:r>
+              <w:rPr>
+                <w:rFonts w:ascii="Courier New" w:cs="Courier New" w:hAnsi="Courier New"/>
+                <w:b/>
+                <w:color w:val="C9A84C"/>
+                <w:sz w:val="24"/>
+                <w:szCs w:val="24"/>
+              </w:rPr>
+              <w:t>1</w:t>
+            </w:r>
+          </w:p>
+        </w:tc>
+        <w:tc>
+          <w:tcPr>
+            <w:tcW w:type="dxa" w:w="8760"/>
+            <w:tcMar>
+              <w:top w:type="dxa" w:w="80"/>
+              <w:left w:type="dxa" w:w="200"/>
+              <w:bottom w:type="dxa" w:w="80"/>
+              <w:right w:type="dxa" w:w="80"/>
+            </w:tcMar>
+          </w:tcPr>
+          <w:p>
+            <w:pPr>
+              <w:spacing w:after="40"/>
+            </w:pPr>
+            <w:r>
+              <w:rPr>
+                <w:rFonts w:ascii="Arial" w:cs="Arial" w:hAnsi="Arial"/>
+                <w:b/>
+                <w:color w:val="1E3A5F"/>
+                <w:sz w:val="20"/>
+                <w:szCs w:val="20"/>
+              </w:rPr>
+              <w:t xml:space="preserve">Client demande un token — POST /auth/token</w:t>
+            </w:r>
+          </w:p>
+          <w:p>
+            <w:pPr>
+              <w:spacing w:after="0"/>
+            </w:pPr>
+            <w:r>
+              <w:rPr>
+                <w:rFonts w:ascii="Arial" w:cs="Arial" w:hAnsi="Arial"/>
+                <w:color w:val="555577"/>
+                <w:sz w:val="18"/>
+                <w:szCs w:val="18"/>
+              </w:rPr>
+              <w:t xml:space="preserve">L'utilisateur envoie son email + mot de passe UNE SEULE FOIS. Le serveur vérifie et génère un JWT signé valable 60 minutes. Le client reçoit le token et le conserve — il ne renvoie plus jamais le mot de passe.</w:t>
+            </w:r>
+          </w:p>
+        </w:tc>
+      </w:tr>
+    </w:tbl>
+    <w:p>
+      <w:pPr>
+        <w:spacing w:after="40"/>
+      </w:pPr>
+    </w:p>
+    <w:tbl>
+      <w:tblPr>
+        <w:tblW w:type="dxa" w:w="9360"/>
+        <w:tblBorders>
+          <w:top w:val="none" w:color="FFFFFF" w:sz="0"/>
+          <w:left w:val="none" w:color="FFFFFF" w:sz="0"/>
+          <w:bottom w:val="none" w:color="FFFFFF" w:sz="0"/>
+          <w:right w:val="none" w:color="FFFFFF" w:sz="0"/>
+          <w:insideH w:val="none" w:color="FFFFFF" w:sz="0"/>
+          <w:insideV w:val="none" w:color="FFFFFF" w:sz="0"/>
+        </w:tblBorders>
+      </w:tblPr>
+      <w:tblGrid>
+        <w:gridCol w:w="600"/>
+        <w:gridCol w:w="8760"/>
+      </w:tblGrid>
+      <w:tr>
+        <w:tc>
+          <w:tcPr>
+            <w:tcW w:type="dxa" w:w="600"/>
+            <w:shd w:fill="1E3A5F" w:val="clear"/>
+            <w:tcMar>
+              <w:top w:type="dxa" w:w="80"/>
+              <w:left w:type="dxa" w:w="80"/>
+              <w:bottom w:type="dxa" w:w="80"/>
+              <w:right w:type="dxa" w:w="80"/>
+            </w:tcMar>
+          </w:tcPr>
+          <w:p>
+            <w:pPr>
+              <w:jc w:val="center"/>
+            </w:pPr>
+            <w:r>
+              <w:rPr>
+                <w:rFonts w:ascii="Courier New" w:cs="Courier New" w:hAnsi="Courier New"/>
+                <w:b/>
+                <w:color w:val="C9A84C"/>
+                <w:sz w:val="24"/>
+                <w:szCs w:val="24"/>
+              </w:rPr>
+              <w:t>2</w:t>
+            </w:r>
+          </w:p>
+        </w:tc>
+        <w:tc>
+          <w:tcPr>
+            <w:tcW w:type="dxa" w:w="8760"/>
+            <w:tcMar>
+              <w:top w:type="dxa" w:w="80"/>
+              <w:left w:type="dxa" w:w="200"/>
+              <w:bottom w:type="dxa" w:w="80"/>
+              <w:right w:type="dxa" w:w="80"/>
+            </w:tcMar>
+          </w:tcPr>
+          <w:p>
+            <w:pPr>
+              <w:spacing w:after="40"/>
+            </w:pPr>
+            <w:r>
+              <w:rPr>
+                <w:rFonts w:ascii="Arial" w:cs="Arial" w:hAnsi="Arial"/>
+                <w:b/>
+                <w:color w:val="1E3A5F"/>
+                <w:sz w:val="20"/>
+                <w:szCs w:val="20"/>
+              </w:rPr>
+              <w:t xml:space="preserve">Client envoie le token sur chaque requête</w:t>
+            </w:r>
+          </w:p>
+          <w:p>
+            <w:pPr>
+              <w:spacing w:after="0"/>
+            </w:pPr>
+            <w:r>
+              <w:rPr>
+                <w:rFonts w:ascii="Arial" w:cs="Arial" w:hAnsi="Arial"/>
+                <w:color w:val="555577"/>
+                <w:sz w:val="18"/>
+                <w:szCs w:val="18"/>
+              </w:rPr>
+              <w:t xml:space="preserve">Le token est envoyé dans le header HTTP 'Authorization: Bearer eyJ...'. Le mot 'Bearer' signifie littéralement 'porteur du token'. C'est une convention standard (RFC 6750).</w:t>
+            </w:r>
+          </w:p>
+        </w:tc>
+      </w:tr>
+    </w:tbl>
+    <w:p>
+      <w:pPr>
+        <w:spacing w:after="40"/>
+      </w:pPr>
+    </w:p>
+    <w:tbl>
+      <w:tblPr>
+        <w:tblW w:type="dxa" w:w="9360"/>
+        <w:tblBorders>
+          <w:top w:val="none" w:color="FFFFFF" w:sz="0"/>
+          <w:left w:val="none" w:color="FFFFFF" w:sz="0"/>
+          <w:bottom w:val="none" w:color="FFFFFF" w:sz="0"/>
+          <w:right w:val="none" w:color="FFFFFF" w:sz="0"/>
+          <w:insideH w:val="none" w:color="FFFFFF" w:sz="0"/>
+          <w:insideV w:val="none" w:color="FFFFFF" w:sz="0"/>
+        </w:tblBorders>
+      </w:tblPr>
+      <w:tblGrid>
+        <w:gridCol w:w="600"/>
+        <w:gridCol w:w="8760"/>
+      </w:tblGrid>
+      <w:tr>
+        <w:tc>
+          <w:tcPr>
+            <w:tcW w:type="dxa" w:w="600"/>
+            <w:shd w:fill="1E3A5F" w:val="clear"/>
+            <w:tcMar>
+              <w:top w:type="dxa" w:w="80"/>
+              <w:left w:type="dxa" w:w="80"/>
+              <w:bottom w:type="dxa" w:w="80"/>
+              <w:right w:type="dxa" w:w="80"/>
+            </w:tcMar>
+          </w:tcPr>
+          <w:p>
+            <w:pPr>
+              <w:jc w:val="center"/>
+            </w:pPr>
+            <w:r>
+              <w:rPr>
+                <w:rFonts w:ascii="Courier New" w:cs="Courier New" w:hAnsi="Courier New"/>
+                <w:b/>
+                <w:color w:val="C9A84C"/>
+                <w:sz w:val="24"/>
+                <w:szCs w:val="24"/>
+              </w:rPr>
+              <w:t>3</w:t>
+            </w:r>
+          </w:p>
+        </w:tc>
+        <w:tc>
+          <w:tcPr>
+            <w:tcW w:type="dxa" w:w="8760"/>
+            <w:tcMar>
+              <w:top w:type="dxa" w:w="80"/>
+              <w:left w:type="dxa" w:w="200"/>
+              <w:bottom w:type="dxa" w:w="80"/>
+              <w:right w:type="dxa" w:w="80"/>
+            </w:tcMar>
+          </w:tcPr>
+          <w:p>
+            <w:pPr>
+              <w:spacing w:after="40"/>
+            </w:pPr>
+            <w:r>
+              <w:rPr>
+                <w:rFonts w:ascii="Arial" w:cs="Arial" w:hAnsi="Arial"/>
+                <w:b/>
+                <w:color w:val="1E3A5F"/>
+                <w:sz w:val="20"/>
+                <w:szCs w:val="20"/>
+              </w:rPr>
+              <w:t xml:space="preserve">Serveur vérifie la signature du JWT</w:t>
+            </w:r>
+          </w:p>
+          <w:p>
+            <w:pPr>
+              <w:spacing w:after="0"/>
+            </w:pPr>
+            <w:r>
+              <w:rPr>
+                <w:rFonts w:ascii="Arial" w:cs="Arial" w:hAnsi="Arial"/>
+                <w:color w:val="555577"/>
+                <w:sz w:val="18"/>
+                <w:szCs w:val="18"/>
+              </w:rPr>
+              <w:t xml:space="preserve">FastAPI appelle get_current_user() AVANT d'exécuter search(). Cette fonction décode le JWT, recalcule la signature avec la clé secrète, vérifie qu'elle correspond. Si le token a été modifié ou est expiré → HTTP 401, la requête n'atteint jamais le pipeline RAG.</w:t>
+            </w:r>
+          </w:p>
+        </w:tc>
+      </w:tr>
+    </w:tbl>
+    <w:p>
+      <w:pPr>
+        <w:spacing w:after="40"/>
+      </w:pPr>
+    </w:p>
+    <w:tbl>
+      <w:tblPr>
+        <w:tblW w:type="dxa" w:w="9360"/>
+        <w:tblBorders>
+          <w:top w:val="none" w:color="FFFFFF" w:sz="0"/>
+          <w:left w:val="none" w:color="FFFFFF" w:sz="0"/>
+          <w:bottom w:val="none" w:color="FFFFFF" w:sz="0"/>
+          <w:right w:val="none" w:color="FFFFFF" w:sz="0"/>
+          <w:insideH w:val="none" w:color="FFFFFF" w:sz="0"/>
+          <w:insideV w:val="none" w:color="FFFFFF" w:sz="0"/>
+        </w:tblBorders>
+      </w:tblPr>
+      <w:tblGrid>
+        <w:gridCol w:w="600"/>
+        <w:gridCol w:w="8760"/>
+      </w:tblGrid>
+      <w:tr>
+        <w:tc>
+          <w:tcPr>
+            <w:tcW w:type="dxa" w:w="600"/>
+            <w:shd w:fill="1E3A5F" w:val="clear"/>
+            <w:tcMar>
+              <w:top w:type="dxa" w:w="80"/>
+              <w:left w:type="dxa" w:w="80"/>
+              <w:bottom w:type="dxa" w:w="80"/>
+              <w:right w:type="dxa" w:w="80"/>
+            </w:tcMar>
+          </w:tcPr>
+          <w:p>
+            <w:pPr>
+              <w:jc w:val="center"/>
+            </w:pPr>
+            <w:r>
+              <w:rPr>
+                <w:rFonts w:ascii="Courier New" w:cs="Courier New" w:hAnsi="Courier New"/>
+                <w:b/>
+                <w:color w:val="C9A84C"/>
+                <w:sz w:val="24"/>
+                <w:szCs w:val="24"/>
+              </w:rPr>
+              <w:t>4</w:t>
+            </w:r>
+          </w:p>
+        </w:tc>
+        <w:tc>
+          <w:tcPr>
+            <w:tcW w:type="dxa" w:w="8760"/>
+            <w:tcMar>
+              <w:top w:type="dxa" w:w="80"/>
+              <w:left w:type="dxa" w:w="200"/>
+              <w:bottom w:type="dxa" w:w="80"/>
+              <w:right w:type="dxa" w:w="80"/>
+            </w:tcMar>
+          </w:tcPr>
+          <w:p>
+            <w:pPr>
+              <w:spacing w:after="40"/>
+            </w:pPr>
+            <w:r>
+              <w:rPr>
+                <w:rFonts w:ascii="Arial" w:cs="Arial" w:hAnsi="Arial"/>
+                <w:b/>
+                <w:color w:val="1E3A5F"/>
+                <w:sz w:val="20"/>
+                <w:szCs w:val="20"/>
+              </w:rPr>
+              <w:t xml:space="preserve">Rate limiting — vérification de la fréquence</w:t>
+            </w:r>
+          </w:p>
+          <w:p>
+            <w:pPr>
+              <w:spacing w:after="0"/>
+            </w:pPr>
+            <w:r>
+              <w:rPr>
+                <w:rFonts w:ascii="Arial" w:cs="Arial" w:hAnsi="Arial"/>
+                <w:color w:val="555577"/>
+                <w:sz w:val="18"/>
+                <w:szCs w:val="18"/>
+              </w:rPr>
+              <w:t xml:space="preserve">Après validation du token, le système vérifie combien de requêtes ce client a envoyé dans la dernière minute. Si la limite est dépassée → HTTP 429 avec un header Retry-After indiquant dans combien de secondes réessayer.</w:t>
+            </w:r>
+          </w:p>
+        </w:tc>
+      </w:tr>
+    </w:tbl>
+    <w:p>
+      <w:pPr>
+        <w:spacing w:after="40"/>
+      </w:pPr>
+    </w:p>
+    <w:tbl>
+      <w:tblPr>
+        <w:tblW w:type="dxa" w:w="9360"/>
+        <w:tblBorders>
+          <w:top w:val="none" w:color="FFFFFF" w:sz="0"/>
+          <w:left w:val="none" w:color="FFFFFF" w:sz="0"/>
+          <w:bottom w:val="none" w:color="FFFFFF" w:sz="0"/>
+          <w:right w:val="none" w:color="FFFFFF" w:sz="0"/>
+          <w:insideH w:val="none" w:color="FFFFFF" w:sz="0"/>
+          <w:insideV w:val="none" w:color="FFFFFF" w:sz="0"/>
+        </w:tblBorders>
+      </w:tblPr>
+      <w:tblGrid>
+        <w:gridCol w:w="600"/>
+        <w:gridCol w:w="8760"/>
+      </w:tblGrid>
+      <w:tr>
+        <w:tc>
+          <w:tcPr>
+            <w:tcW w:type="dxa" w:w="600"/>
+            <w:shd w:fill="1E3A5F" w:val="clear"/>
+            <w:tcMar>
+              <w:top w:type="dxa" w:w="80"/>
+              <w:left w:type="dxa" w:w="80"/>
+              <w:bottom w:type="dxa" w:w="80"/>
+              <w:right w:type="dxa" w:w="80"/>
+            </w:tcMar>
+          </w:tcPr>
+          <w:p>
+            <w:pPr>
+              <w:jc w:val="center"/>
+            </w:pPr>
+            <w:r>
+              <w:rPr>
+                <w:rFonts w:ascii="Courier New" w:cs="Courier New" w:hAnsi="Courier New"/>
+                <w:b/>
+                <w:color w:val="C9A84C"/>
+                <w:sz w:val="24"/>
+                <w:szCs w:val="24"/>
+              </w:rPr>
+              <w:t>5</w:t>
+            </w:r>
+          </w:p>
+        </w:tc>
+        <w:tc>
+          <w:tcPr>
+            <w:tcW w:type="dxa" w:w="8760"/>
+            <w:tcMar>
+              <w:top w:type="dxa" w:w="80"/>
+              <w:left w:type="dxa" w:w="200"/>
+              <w:bottom w:type="dxa" w:w="80"/>
+              <w:right w:type="dxa" w:w="80"/>
+            </w:tcMar>
+          </w:tcPr>
+          <w:p>
+            <w:pPr>
+              <w:spacing w:after="40"/>
+            </w:pPr>
+            <w:r>
+              <w:rPr>
+                <w:rFonts w:ascii="Arial" w:cs="Arial" w:hAnsi="Arial"/>
+                <w:b/>
+                <w:color w:val="1E3A5F"/>
+                <w:sz w:val="20"/>
+                <w:szCs w:val="20"/>
+              </w:rPr>
+              <w:t xml:space="preserve">Pipeline RAG exécuté normalement</w:t>
+            </w:r>
+          </w:p>
+          <w:p>
+            <w:pPr>
+              <w:spacing w:after="0"/>
+            </w:pPr>
+            <w:r>
+              <w:rPr>
+                <w:rFonts w:ascii="Arial" w:cs="Arial" w:hAnsi="Arial"/>
+                <w:color w:val="555577"/>
+                <w:sz w:val="18"/>
+                <w:szCs w:val="18"/>
+              </w:rPr>
+              <w:t xml:space="preserve">Si tout est OK, la requête passe au pipeline RAG habituel : injection defense → query expansion → FAISS → reranking → Claude → guardrail.</w:t>
+            </w:r>
+          </w:p>
+        </w:tc>
+      </w:tr>
+    </w:tbl>
+    <w:p>
+      <w:pPr>
+        <w:spacing w:after="40"/>
+      </w:pPr>
+    </w:p>
+    <w:p>
+      <w:pPr>
+        <w:spacing w:after="80"/>
+      </w:pPr>
+    </w:p>
+    <w:p>
+      <w:pPr>
+        <w:spacing w:after="100" w:before="200"/>
+      </w:pPr>
+      <w:r>
+        <w:rPr>
+          <w:rFonts w:ascii="Arial" w:cs="Arial" w:hAnsi="Arial"/>
+          <w:b/>
+          <w:color w:val="C9A84C"/>
+          <w:sz w:val="22"/>
+          <w:szCs w:val="22"/>
+        </w:rPr>
+        <w:t>Rate Limiting — Fenêtre glissante vs fenêtre fixe</w:t>
+      </w:r>
+    </w:p>
+    <w:p>
+      <w:pPr>
+        <w:spacing w:after="80"/>
+      </w:pPr>
+      <w:r>
+        <w:rPr>
+          <w:rFonts w:ascii="Arial" w:cs="Arial" w:hAnsi="Arial"/>
+          <w:color w:val="1A1A2E"/>
+          <w:sz w:val="20"/>
+          <w:szCs w:val="20"/>
+        </w:rPr>
+        <w:t xml:space="preserve">Pourquoi pas une simple limite fixe ? Parce qu'elle est contournable. Exemple : avec une limite de 30 req/minute réinitialisée à chaque heure, un attaquant peut envoyer 30 req à 00h59 et 30 req à 01h01 — soit 60 requêtes en 2 secondes. C'est le 'burst at boundary'.</w:t>
+      </w:r>
+    </w:p>
+    <w:tbl>
+      <w:tblPr>
+        <w:tblW w:type="dxa" w:w="9360"/>
+        <w:tblBorders>
+          <w:top w:val="single" w:color="1E8449" w:sz="4"/>
+          <w:left w:val="single" w:color="1E8449" w:sz="8"/>
+          <w:bottom w:val="single" w:color="1E8449" w:sz="4"/>
+          <w:right w:val="single" w:color="1E8449" w:sz="4"/>
+        </w:tblBorders>
+      </w:tblPr>
+      <w:tblGrid>
+        <w:gridCol w:w="9360"/>
+      </w:tblGrid>
+      <w:tr>
+        <w:tc>
+          <w:tcPr>
+            <w:shd w:fill="EAFAF1" w:val="clear"/>
+            <w:tcMar>
+              <w:top w:type="dxa" w:w="100"/>
+              <w:left w:type="dxa" w:w="200"/>
+              <w:bottom w:type="dxa" w:w="100"/>
+              <w:right w:type="dxa" w:w="200"/>
+            </w:tcMar>
+          </w:tcPr>
+          <w:p>
+            <w:pPr>
+              <w:spacing w:after="40"/>
+            </w:pPr>
+            <w:r>
+              <w:rPr>
+                <w:rFonts w:ascii="Arial" w:cs="Arial" w:hAnsi="Arial"/>
+                <w:b/>
+                <w:caps/>
+                <w:color w:val="1E8449"/>
+                <w:sz w:val="17"/>
+                <w:szCs w:val="17"/>
+              </w:rPr>
+              <w:t>FENÊTRE GLISSANTE — NOTRE IMPLÉMENTATION</w:t>
+            </w:r>
+          </w:p>
+          <w:p>
+            <w:pPr>
+              <w:spacing w:after="0"/>
+            </w:pPr>
+            <w:r>
+              <w:rPr>
+                <w:rFonts w:ascii="Arial" w:cs="Arial" w:hAnsi="Arial"/>
+                <w:color w:val="1A1A2E"/>
+                <w:sz w:val="19"/>
+                <w:szCs w:val="19"/>
+              </w:rPr>
+              <w:t xml:space="preserve">On regarde les 60 DERNIÈRES SECONDES à chaque requête, peu importe quand. Si 30 requêtes ont été envoyées dans les 60 dernières secondes → bloqué. Pas de burst possible. Algorithme : (1) Supprimer les timestamps plus vieux que 60s. (2) Compter ce qui reste. (3) Si &gt;= limite → HTTP 429 + Retry-After. (4) Sinon → enregistrer le timestamp + laisser passer.</w:t>
+            </w:r>
+          </w:p>
+        </w:tc>
+      </w:tr>
+    </w:tbl>
+    <w:p>
+      <w:pPr>
+        <w:spacing w:after="80"/>
+      </w:pPr>
+    </w:p>
+    <w:p>
+      <w:pPr>
+        <w:spacing w:after="100" w:before="200"/>
+      </w:pPr>
+      <w:r>
+        <w:rPr>
+          <w:rFonts w:ascii="Arial" w:cs="Arial" w:hAnsi="Arial"/>
+          <w:b/>
+          <w:color w:val="C9A84C"/>
+          <w:sz w:val="22"/>
+          <w:szCs w:val="22"/>
+        </w:rPr>
+        <w:t>Plans et limites configurés</w:t>
+      </w:r>
+    </w:p>
+    <w:tbl>
+      <w:tblPr>
+        <w:tblW w:type="dxa" w:w="9360"/>
+        <w:tblBorders>
+          <w:top w:val="single" w:color="1E3A5F" w:sz="4"/>
+          <w:left w:val="single" w:color="1E3A5F" w:sz="4"/>
+          <w:bottom w:val="single" w:color="1E3A5F" w:sz="4"/>
+          <w:right w:val="single" w:color="1E3A5F" w:sz="4"/>
+          <w:insideH w:val="single" w:color="CCCCCC" w:sz="2"/>
+          <w:insideV w:val="single" w:color="CCCCCC" w:sz="2"/>
+        </w:tblBorders>
+      </w:tblPr>
+      <w:tblGrid>
+        <w:gridCol w:w="1200"/>
+        <w:gridCol w:w="1200"/>
+        <w:gridCol w:w="1500"/>
+        <w:gridCol w:w="2500"/>
+        <w:gridCol w:w="2960"/>
+      </w:tblGrid>
+      <w:tr>
+        <w:tc>
+          <w:tcPr>
+            <w:tcW w:type="dxa" w:w="1200"/>
+            <w:shd w:fill="1E3A5F" w:val="clear"/>
+            <w:tcMar>
+              <w:top w:type="dxa" w:w="60"/>
+              <w:left w:type="dxa" w:w="80"/>
+              <w:bottom w:type="dxa" w:w="60"/>
+              <w:right w:type="dxa" w:w="80"/>
+            </w:tcMar>
+          </w:tcPr>
+          <w:p>
+            <w:r>
+              <w:rPr>
+                <w:rFonts w:ascii="Arial" w:cs="Arial" w:hAnsi="Arial"/>
+                <w:b/>
+                <w:bCs/>
+                <w:color w:val="FFFFFF"/>
+                <w:sz w:val="17"/>
+                <w:szCs w:val="17"/>
+              </w:rPr>
+              <w:t xml:space="preserve">Plan</w:t>
+            </w:r>
+          </w:p>
+        </w:tc>
+        <w:tc>
+          <w:tcPr>
+            <w:tcW w:type="dxa" w:w="1200"/>
+            <w:shd w:fill="1E3A5F" w:val="clear"/>
+            <w:tcMar>
+              <w:top w:type="dxa" w:w="60"/>
+              <w:left w:type="dxa" w:w="80"/>
+              <w:bottom w:type="dxa" w:w="60"/>
+              <w:right w:type="dxa" w:w="80"/>
+            </w:tcMar>
+          </w:tcPr>
+          <w:p>
+            <w:r>
+              <w:rPr>
+                <w:rFonts w:ascii="Arial" w:cs="Arial" w:hAnsi="Arial"/>
+                <w:b/>
+                <w:bCs/>
+                <w:color w:val="FFFFFF"/>
+                <w:sz w:val="17"/>
+                <w:szCs w:val="17"/>
+              </w:rPr>
+              <w:t xml:space="preserve">Limite</w:t>
+            </w:r>
+          </w:p>
+        </w:tc>
+        <w:tc>
+          <w:tcPr>
+            <w:tcW w:type="dxa" w:w="1500"/>
+            <w:shd w:fill="1E3A5F" w:val="clear"/>
+            <w:tcMar>
+              <w:top w:type="dxa" w:w="60"/>
+              <w:left w:type="dxa" w:w="80"/>
+              <w:bottom w:type="dxa" w:w="60"/>
+              <w:right w:type="dxa" w:w="80"/>
+            </w:tcMar>
+          </w:tcPr>
+          <w:p>
+            <w:r>
+              <w:rPr>
+                <w:rFonts w:ascii="Arial" w:cs="Arial" w:hAnsi="Arial"/>
+                <w:b/>
+                <w:bCs/>
+                <w:color w:val="FFFFFF"/>
+                <w:sz w:val="17"/>
+                <w:szCs w:val="17"/>
+              </w:rPr>
+              <w:t xml:space="preserve">Fenêtre</w:t>
+            </w:r>
+          </w:p>
+        </w:tc>
+        <w:tc>
+          <w:tcPr>
+            <w:tcW w:type="dxa" w:w="2500"/>
+            <w:shd w:fill="1E3A5F" w:val="clear"/>
+            <w:tcMar>
+              <w:top w:type="dxa" w:w="60"/>
+              <w:left w:type="dxa" w:w="80"/>
+              <w:bottom w:type="dxa" w:w="60"/>
+              <w:right w:type="dxa" w:w="80"/>
+            </w:tcMar>
+          </w:tcPr>
+          <w:p>
+            <w:r>
+              <w:rPr>
+                <w:rFonts w:ascii="Arial" w:cs="Arial" w:hAnsi="Arial"/>
+                <w:b/>
+                <w:bCs/>
+                <w:color w:val="FFFFFF"/>
+                <w:sz w:val="17"/>
+                <w:szCs w:val="17"/>
+              </w:rPr>
+              <w:t xml:space="preserve">Utilisateurs</w:t>
+            </w:r>
+          </w:p>
+        </w:tc>
+        <w:tc>
+          <w:tcPr>
+            <w:tcW w:type="dxa" w:w="2960"/>
+            <w:shd w:fill="1E3A5F" w:val="clear"/>
+            <w:tcMar>
+              <w:top w:type="dxa" w:w="60"/>
+              <w:left w:type="dxa" w:w="80"/>
+              <w:bottom w:type="dxa" w:w="60"/>
+              <w:right w:type="dxa" w:w="80"/>
+            </w:tcMar>
+          </w:tcPr>
+          <w:p>
+            <w:r>
+              <w:rPr>
+                <w:rFonts w:ascii="Arial" w:cs="Arial" w:hAnsi="Arial"/>
+                <w:b/>
+                <w:bCs/>
+                <w:color w:val="FFFFFF"/>
+                <w:sz w:val="17"/>
+                <w:szCs w:val="17"/>
+              </w:rPr>
+              <w:t xml:space="preserve">Comment obtenir</w:t>
+            </w:r>
+          </w:p>
+        </w:tc>
+      </w:tr>
+      <w:tr>
+        <w:tc>
+          <w:tcPr>
+            <w:tcW w:type="dxa" w:w="1200"/>
+            <w:shd w:fill="FFF8E1" w:val="clear"/>
+            <w:tcMar>
+              <w:top w:type="dxa" w:w="60"/>
+              <w:left w:type="dxa" w:w="80"/>
+              <w:bottom w:type="dxa" w:w="60"/>
+              <w:right w:type="dxa" w:w="80"/>
+            </w:tcMar>
+          </w:tcPr>
+          <w:p>
+            <w:r>
+              <w:rPr>
+                <w:rFonts w:ascii="Arial" w:cs="Arial" w:hAnsi="Arial"/>
+                <w:color w:val="1A1A2E"/>
+                <w:sz w:val="17"/>
+                <w:szCs w:val="17"/>
+              </w:rPr>
+              <w:t xml:space="preserve">demo</w:t>
+            </w:r>
+          </w:p>
+        </w:tc>
+        <w:tc>
+          <w:tcPr>
+            <w:tcW w:type="dxa" w:w="1200"/>
+            <w:shd w:fill="FFF8E1" w:val="clear"/>
+            <w:tcMar>
+              <w:top w:type="dxa" w:w="60"/>
+              <w:left w:type="dxa" w:w="80"/>
+              <w:bottom w:type="dxa" w:w="60"/>
+              <w:right w:type="dxa" w:w="80"/>
+            </w:tcMar>
+          </w:tcPr>
+          <w:p>
+            <w:r>
+              <w:rPr>
+                <w:rFonts w:ascii="Arial" w:cs="Arial" w:hAnsi="Arial"/>
+                <w:color w:val="1A1A2E"/>
+                <w:sz w:val="17"/>
+                <w:szCs w:val="17"/>
+              </w:rPr>
+              <w:t xml:space="preserve">10 req / min</w:t>
+            </w:r>
+          </w:p>
+        </w:tc>
+        <w:tc>
+          <w:tcPr>
+            <w:tcW w:type="dxa" w:w="1500"/>
+            <w:shd w:fill="FFF8E1" w:val="clear"/>
+            <w:tcMar>
+              <w:top w:type="dxa" w:w="60"/>
+              <w:left w:type="dxa" w:w="80"/>
+              <w:bottom w:type="dxa" w:w="60"/>
+              <w:right w:type="dxa" w:w="80"/>
+            </w:tcMar>
+          </w:tcPr>
+          <w:p>
+            <w:r>
+              <w:rPr>
+                <w:rFonts w:ascii="Arial" w:cs="Arial" w:hAnsi="Arial"/>
+                <w:color w:val="1A1A2E"/>
+                <w:sz w:val="17"/>
+                <w:szCs w:val="17"/>
+              </w:rPr>
+              <w:t xml:space="preserve">60 secondes</w:t>
+            </w:r>
+          </w:p>
+        </w:tc>
+        <w:tc>
+          <w:tcPr>
+            <w:tcW w:type="dxa" w:w="2500"/>
+            <w:shd w:fill="FFF8E1" w:val="clear"/>
+            <w:tcMar>
+              <w:top w:type="dxa" w:w="60"/>
+              <w:left w:type="dxa" w:w="80"/>
+              <w:bottom w:type="dxa" w:w="60"/>
+              <w:right w:type="dxa" w:w="80"/>
+            </w:tcMar>
+          </w:tcPr>
+          <w:p>
+            <w:r>
+              <w:rPr>
+                <w:rFonts w:ascii="Arial" w:cs="Arial" w:hAnsi="Arial"/>
+                <w:color w:val="1A1A2E"/>
+                <w:sz w:val="17"/>
+                <w:szCs w:val="17"/>
+              </w:rPr>
+              <w:t xml:space="preserve">Demos publiques, tests rapides</w:t>
+            </w:r>
+          </w:p>
+        </w:tc>
+        <w:tc>
+          <w:tcPr>
+            <w:tcW w:type="dxa" w:w="2960"/>
+            <w:shd w:fill="FFF8E1" w:val="clear"/>
+            <w:tcMar>
+              <w:top w:type="dxa" w:w="60"/>
+              <w:left w:type="dxa" w:w="80"/>
+              <w:bottom w:type="dxa" w:w="60"/>
+              <w:right w:type="dxa" w:w="80"/>
+            </w:tcMar>
+          </w:tcPr>
+          <w:p>
+            <w:r>
+              <w:rPr>
+                <w:rFonts w:ascii="Arial" w:cs="Arial" w:hAnsi="Arial"/>
+                <w:color w:val="1A1A2E"/>
+                <w:sz w:val="17"/>
+                <w:szCs w:val="17"/>
+              </w:rPr>
+              <w:t xml:space="preserve">POST /auth/token/demo — sans credentials</w:t>
+            </w:r>
+          </w:p>
+        </w:tc>
+      </w:tr>
+      <w:tr>
+        <w:tc>
+          <w:tcPr>
+            <w:tcW w:type="dxa" w:w="1200"/>
+            <w:shd w:fill="FFFFFF" w:val="clear"/>
+            <w:tcMar>
+              <w:top w:type="dxa" w:w="60"/>
+              <w:left w:type="dxa" w:w="80"/>
+              <w:bottom w:type="dxa" w:w="60"/>
+              <w:right w:type="dxa" w:w="80"/>
+            </w:tcMar>
+          </w:tcPr>
+          <w:p>
+            <w:r>
+              <w:rPr>
+                <w:rFonts w:ascii="Arial" w:cs="Arial" w:hAnsi="Arial"/>
+                <w:color w:val="1A1A2E"/>
+                <w:sz w:val="17"/>
+                <w:szCs w:val="17"/>
+              </w:rPr>
+              <w:t xml:space="preserve">cabinet</w:t>
+            </w:r>
+          </w:p>
+        </w:tc>
+        <w:tc>
+          <w:tcPr>
+            <w:tcW w:type="dxa" w:w="1200"/>
+            <w:shd w:fill="FFFFFF" w:val="clear"/>
+            <w:tcMar>
+              <w:top w:type="dxa" w:w="60"/>
+              <w:left w:type="dxa" w:w="80"/>
+              <w:bottom w:type="dxa" w:w="60"/>
+              <w:right w:type="dxa" w:w="80"/>
+            </w:tcMar>
+          </w:tcPr>
+          <w:p>
+            <w:r>
+              <w:rPr>
+                <w:rFonts w:ascii="Arial" w:cs="Arial" w:hAnsi="Arial"/>
+                <w:color w:val="1A1A2E"/>
+                <w:sz w:val="17"/>
+                <w:szCs w:val="17"/>
+              </w:rPr>
+              <w:t xml:space="preserve">30 req / min</w:t>
+            </w:r>
+          </w:p>
+        </w:tc>
+        <w:tc>
+          <w:tcPr>
+            <w:tcW w:type="dxa" w:w="1500"/>
+            <w:shd w:fill="FFFFFF" w:val="clear"/>
+            <w:tcMar>
+              <w:top w:type="dxa" w:w="60"/>
+              <w:left w:type="dxa" w:w="80"/>
+              <w:bottom w:type="dxa" w:w="60"/>
+              <w:right w:type="dxa" w:w="80"/>
+            </w:tcMar>
+          </w:tcPr>
+          <w:p>
+            <w:r>
+              <w:rPr>
+                <w:rFonts w:ascii="Arial" w:cs="Arial" w:hAnsi="Arial"/>
+                <w:color w:val="1A1A2E"/>
+                <w:sz w:val="17"/>
+                <w:szCs w:val="17"/>
+              </w:rPr>
+              <w:t xml:space="preserve">60 secondes</w:t>
+            </w:r>
+          </w:p>
+        </w:tc>
+        <w:tc>
+          <w:tcPr>
+            <w:tcW w:type="dxa" w:w="2500"/>
+            <w:shd w:fill="FFFFFF" w:val="clear"/>
+            <w:tcMar>
+              <w:top w:type="dxa" w:w="60"/>
+              <w:left w:type="dxa" w:w="80"/>
+              <w:bottom w:type="dxa" w:w="60"/>
+              <w:right w:type="dxa" w:w="80"/>
+            </w:tcMar>
+          </w:tcPr>
+          <w:p>
+            <w:r>
+              <w:rPr>
+                <w:rFonts w:ascii="Arial" w:cs="Arial" w:hAnsi="Arial"/>
+                <w:color w:val="1A1A2E"/>
+                <w:sz w:val="17"/>
+                <w:szCs w:val="17"/>
+              </w:rPr>
+              <w:t xml:space="preserve">Clients cabinet — usage normal</w:t>
+            </w:r>
+          </w:p>
+        </w:tc>
+        <w:tc>
+          <w:tcPr>
+            <w:tcW w:type="dxa" w:w="2960"/>
+            <w:shd w:fill="FFFFFF" w:val="clear"/>
+            <w:tcMar>
+              <w:top w:type="dxa" w:w="60"/>
+              <w:left w:type="dxa" w:w="80"/>
+              <w:bottom w:type="dxa" w:w="60"/>
+              <w:right w:type="dxa" w:w="80"/>
+            </w:tcMar>
+          </w:tcPr>
+          <w:p>
+            <w:r>
+              <w:rPr>
+                <w:rFonts w:ascii="Arial" w:cs="Arial" w:hAnsi="Arial"/>
+                <w:color w:val="1A1A2E"/>
+                <w:sz w:val="17"/>
+                <w:szCs w:val="17"/>
+              </w:rPr>
+              <w:t xml:space="preserve">POST /auth/token avec email + password</w:t>
+            </w:r>
+          </w:p>
+        </w:tc>
+      </w:tr>
+      <w:tr>
+        <w:tc>
+          <w:tcPr>
+            <w:tcW w:type="dxa" w:w="1200"/>
+            <w:shd w:fill="FFF8E1" w:val="clear"/>
+            <w:tcMar>
+              <w:top w:type="dxa" w:w="60"/>
+              <w:left w:type="dxa" w:w="80"/>
+              <w:bottom w:type="dxa" w:w="60"/>
+              <w:right w:type="dxa" w:w="80"/>
+            </w:tcMar>
+          </w:tcPr>
+          <w:p>
+            <w:r>
+              <w:rPr>
+                <w:rFonts w:ascii="Arial" w:cs="Arial" w:hAnsi="Arial"/>
+                <w:color w:val="1A1A2E"/>
+                <w:sz w:val="17"/>
+                <w:szCs w:val="17"/>
+              </w:rPr>
+              <w:t xml:space="preserve">admin</w:t>
+            </w:r>
+          </w:p>
+        </w:tc>
+        <w:tc>
+          <w:tcPr>
+            <w:tcW w:type="dxa" w:w="1200"/>
+            <w:shd w:fill="FFF8E1" w:val="clear"/>
+            <w:tcMar>
+              <w:top w:type="dxa" w:w="60"/>
+              <w:left w:type="dxa" w:w="80"/>
+              <w:bottom w:type="dxa" w:w="60"/>
+              <w:right w:type="dxa" w:w="80"/>
+            </w:tcMar>
+          </w:tcPr>
+          <w:p>
+            <w:r>
+              <w:rPr>
+                <w:rFonts w:ascii="Arial" w:cs="Arial" w:hAnsi="Arial"/>
+                <w:color w:val="1A1A2E"/>
+                <w:sz w:val="17"/>
+                <w:szCs w:val="17"/>
+              </w:rPr>
+              <w:t xml:space="preserve">200 req / min</w:t>
+            </w:r>
+          </w:p>
+        </w:tc>
+        <w:tc>
+          <w:tcPr>
+            <w:tcW w:type="dxa" w:w="1500"/>
+            <w:shd w:fill="FFF8E1" w:val="clear"/>
+            <w:tcMar>
+              <w:top w:type="dxa" w:w="60"/>
+              <w:left w:type="dxa" w:w="80"/>
+              <w:bottom w:type="dxa" w:w="60"/>
+              <w:right w:type="dxa" w:w="80"/>
+            </w:tcMar>
+          </w:tcPr>
+          <w:p>
+            <w:r>
+              <w:rPr>
+                <w:rFonts w:ascii="Arial" w:cs="Arial" w:hAnsi="Arial"/>
+                <w:color w:val="1A1A2E"/>
+                <w:sz w:val="17"/>
+                <w:szCs w:val="17"/>
+              </w:rPr>
+              <w:t xml:space="preserve">60 secondes</w:t>
+            </w:r>
+          </w:p>
+        </w:tc>
+        <w:tc>
+          <w:tcPr>
+            <w:tcW w:type="dxa" w:w="2500"/>
+            <w:shd w:fill="FFF8E1" w:val="clear"/>
+            <w:tcMar>
+              <w:top w:type="dxa" w:w="60"/>
+              <w:left w:type="dxa" w:w="80"/>
+              <w:bottom w:type="dxa" w:w="60"/>
+              <w:right w:type="dxa" w:w="80"/>
+            </w:tcMar>
+          </w:tcPr>
+          <w:p>
+            <w:r>
+              <w:rPr>
+                <w:rFonts w:ascii="Arial" w:cs="Arial" w:hAnsi="Arial"/>
+                <w:color w:val="1A1A2E"/>
+                <w:sz w:val="17"/>
+                <w:szCs w:val="17"/>
+              </w:rPr>
+              <w:t xml:space="preserve">Developpement, tests de charge</w:t>
+            </w:r>
+          </w:p>
+        </w:tc>
+        <w:tc>
+          <w:tcPr>
+            <w:tcW w:type="dxa" w:w="2960"/>
+            <w:shd w:fill="FFF8E1" w:val="clear"/>
+            <w:tcMar>
+              <w:top w:type="dxa" w:w="60"/>
+              <w:left w:type="dxa" w:w="80"/>
+              <w:bottom w:type="dxa" w:w="60"/>
+              <w:right w:type="dxa" w:w="80"/>
+            </w:tcMar>
+          </w:tcPr>
+          <w:p>
+            <w:r>
+              <w:rPr>
+                <w:rFonts w:ascii="Arial" w:cs="Arial" w:hAnsi="Arial"/>
+                <w:color w:val="1A1A2E"/>
+                <w:sz w:val="17"/>
+                <w:szCs w:val="17"/>
+              </w:rPr>
+              <w:t xml:space="preserve">POST /auth/token avec compte admin</w:t>
+            </w:r>
+          </w:p>
+        </w:tc>
+      </w:tr>
+    </w:tbl>
+    <w:p>
+      <w:pPr>
+        <w:spacing w:after="80"/>
+      </w:pPr>
+    </w:p>
+    <w:p>
+      <w:pPr>
+        <w:spacing w:after="100" w:before="200"/>
+      </w:pPr>
+      <w:r>
+        <w:rPr>
+          <w:rFonts w:ascii="Arial" w:cs="Arial" w:hAnsi="Arial"/>
+          <w:b/>
+          <w:color w:val="C9A84C"/>
+          <w:sz w:val="22"/>
+          <w:szCs w:val="22"/>
+        </w:rPr>
+        <w:t>Commandes curl — Guide de test complet</w:t>
+      </w:r>
+    </w:p>
+    <w:tbl>
+      <w:tblPr>
+        <w:tblW w:type="dxa" w:w="9360"/>
+        <w:tblBorders>
+          <w:top w:val="single" w:color="C9A84C" w:sz="4"/>
+          <w:left w:val="single" w:color="C9A84C" w:sz="4"/>
+          <w:bottom w:val="single" w:color="C9A84C" w:sz="4"/>
+          <w:right w:val="single" w:color="C9A84C" w:sz="4"/>
+        </w:tblBorders>
+      </w:tblPr>
+      <w:tblGrid>
+        <w:gridCol w:w="9360"/>
+      </w:tblGrid>
+      <w:tr>
+        <w:tc>
+          <w:tcPr>
+            <w:shd w:fill="C9A84C" w:val="clear"/>
+            <w:tcMar>
+              <w:top w:type="dxa" w:w="60"/>
+              <w:left w:type="dxa" w:w="200"/>
+              <w:bottom w:type="dxa" w:w="60"/>
+              <w:right w:type="dxa" w:w="200"/>
+            </w:tcMar>
+          </w:tcPr>
+          <w:p>
+            <w:r>
+              <w:rPr>
+                <w:rFonts w:ascii="Courier New" w:cs="Courier New" w:hAnsi="Courier New"/>
+                <w:b/>
+                <w:color w:val="1A1A1A"/>
+                <w:sz w:val="16"/>
+                <w:szCs w:val="16"/>
+              </w:rPr>
+              <w:t>bash — Tester l'authentification</w:t>
+            </w:r>
+          </w:p>
+        </w:tc>
+      </w:tr>
+      <w:tr>
+        <w:tc>
+          <w:tcPr>
+            <w:shd w:fill="1A1A2E" w:val="clear"/>
+            <w:tcMar>
+              <w:top w:type="dxa" w:w="20"/>
+              <w:left w:type="dxa" w:w="200"/>
+              <w:bottom w:type="dxa" w:w="20"/>
+              <w:right w:type="dxa" w:w="200"/>
+            </w:tcMar>
+          </w:tcPr>
+          <w:p>
+            <w:pPr>
+              <w:spacing w:after="0"/>
+            </w:pPr>
+            <w:r>
+              <w:rPr>
+                <w:rFonts w:ascii="Courier New" w:cs="Courier New" w:hAnsi="Courier New"/>
+                <w:color w:val="888888"/>
+                <w:sz w:val="17"/>
+                <w:szCs w:val="17"/>
+              </w:rPr>
+              <w:t xml:space="preserve"># Etape 1 — Obtenir un token de demo (sans credentials)</w:t>
+            </w:r>
+          </w:p>
+        </w:tc>
+      </w:tr>
+      <w:tr>
+        <w:tc>
+          <w:tcPr>
+            <w:shd w:fill="1A1A2E" w:val="clear"/>
+            <w:tcMar>
+              <w:top w:type="dxa" w:w="20"/>
+              <w:left w:type="dxa" w:w="200"/>
+              <w:bottom w:type="dxa" w:w="20"/>
+              <w:right w:type="dxa" w:w="200"/>
+            </w:tcMar>
+          </w:tcPr>
+          <w:p>
+            <w:pPr>
+              <w:spacing w:after="0"/>
+            </w:pPr>
+            <w:r>
+              <w:rPr>
+                <w:rFonts w:ascii="Courier New" w:cs="Courier New" w:hAnsi="Courier New"/>
+                <w:color w:val="4CAF50"/>
+                <w:sz w:val="17"/>
+                <w:szCs w:val="17"/>
+              </w:rPr>
+              <w:t xml:space="preserve">curl -X POST http://localhost:8000/auth/token/demo</w:t>
+            </w:r>
+          </w:p>
+        </w:tc>
+      </w:tr>
+      <w:tr>
+        <w:tc>
+          <w:tcPr>
+            <w:shd w:fill="1A1A2E" w:val="clear"/>
+            <w:tcMar>
+              <w:top w:type="dxa" w:w="20"/>
+              <w:left w:type="dxa" w:w="200"/>
+              <w:bottom w:type="dxa" w:w="20"/>
+              <w:right w:type="dxa" w:w="200"/>
+            </w:tcMar>
+          </w:tcPr>
+          <w:p>
+            <w:pPr>
+              <w:spacing w:after="0"/>
+            </w:pPr>
+            <w:r>
+              <w:rPr>
+                <w:rFonts w:ascii="Courier New" w:cs="Courier New" w:hAnsi="Courier New"/>
+                <w:color w:val="888888"/>
+                <w:sz w:val="17"/>
+                <w:szCs w:val="17"/>
+              </w:rPr>
+              <w:t xml:space="preserve"># Reponse : {access_token: 'eyJ...', expires_in: 3600}</w:t>
+            </w:r>
+          </w:p>
+        </w:tc>
+      </w:tr>
+      <w:tr>
+        <w:tc>
+          <w:tcPr>
+            <w:shd w:fill="1A1A2E" w:val="clear"/>
+            <w:tcMar>
+              <w:top w:type="dxa" w:w="20"/>
+              <w:left w:type="dxa" w:w="200"/>
+              <w:bottom w:type="dxa" w:w="20"/>
+              <w:right w:type="dxa" w:w="200"/>
+            </w:tcMar>
+          </w:tcPr>
+          <w:p>
+            <w:pPr>
+              <w:spacing w:after="0"/>
+            </w:pPr>
+            <w:r>
+              <w:rPr>
+                <w:rFonts w:ascii="Courier New" w:cs="Courier New" w:hAnsi="Courier New"/>
+                <w:color w:val="888888"/>
+                <w:sz w:val="17"/>
+                <w:szCs w:val="17"/>
+              </w:rPr>
+              <w:t xml:space="preserve"/>
+            </w:r>
+          </w:p>
+        </w:tc>
+      </w:tr>
+      <w:tr>
+        <w:tc>
+          <w:tcPr>
+            <w:shd w:fill="1A1A2E" w:val="clear"/>
+            <w:tcMar>
+              <w:top w:type="dxa" w:w="20"/>
+              <w:left w:type="dxa" w:w="200"/>
+              <w:bottom w:type="dxa" w:w="20"/>
+              <w:right w:type="dxa" w:w="200"/>
+            </w:tcMar>
+          </w:tcPr>
+          <w:p>
+            <w:pPr>
+              <w:spacing w:after="0"/>
+            </w:pPr>
+            <w:r>
+              <w:rPr>
+                <w:rFonts w:ascii="Courier New" w:cs="Courier New" w:hAnsi="Courier New"/>
+                <w:color w:val="888888"/>
+                <w:sz w:val="17"/>
+                <w:szCs w:val="17"/>
+              </w:rPr>
+              <w:t xml:space="preserve"># Etape 2 — Obtenir un token avec credentials</w:t>
+            </w:r>
+          </w:p>
+        </w:tc>
+      </w:tr>
+      <w:tr>
+        <w:tc>
+          <w:tcPr>
+            <w:shd w:fill="1A1A2E" w:val="clear"/>
+            <w:tcMar>
+              <w:top w:type="dxa" w:w="20"/>
+              <w:left w:type="dxa" w:w="200"/>
+              <w:bottom w:type="dxa" w:w="20"/>
+              <w:right w:type="dxa" w:w="200"/>
+            </w:tcMar>
+          </w:tcPr>
+          <w:p>
+            <w:pPr>
+              <w:spacing w:after="0"/>
+            </w:pPr>
+            <w:r>
+              <w:rPr>
+                <w:rFonts w:ascii="Courier New" w:cs="Courier New" w:hAnsi="Courier New"/>
+                <w:color w:val="4CAF50"/>
+                <w:sz w:val="17"/>
+                <w:szCs w:val="17"/>
+              </w:rPr>
+              <w:t xml:space="preserve">curl -X POST http://localhost:8000/auth/token \</w:t>
+            </w:r>
+          </w:p>
+        </w:tc>
+      </w:tr>
+      <w:tr>
+        <w:tc>
+          <w:tcPr>
+            <w:shd w:fill="1A1A2E" w:val="clear"/>
+            <w:tcMar>
+              <w:top w:type="dxa" w:w="20"/>
+              <w:left w:type="dxa" w:w="200"/>
+              <w:bottom w:type="dxa" w:w="20"/>
+              <w:right w:type="dxa" w:w="200"/>
+            </w:tcMar>
+          </w:tcPr>
+          <w:p>
+            <w:pPr>
+              <w:spacing w:after="0"/>
+            </w:pPr>
+            <w:r>
+              <w:rPr>
+                <w:rFonts w:ascii="Courier New" w:cs="Courier New" w:hAnsi="Courier New"/>
+                <w:color w:val="4CAF50"/>
+                <w:sz w:val="17"/>
+                <w:szCs w:val="17"/>
+              </w:rPr>
+              <w:t xml:space="preserve">  -H "Content-Type: application/json" \</w:t>
+            </w:r>
+          </w:p>
+        </w:tc>
+      </w:tr>
+      <w:tr>
+        <w:tc>
+          <w:tcPr>
+            <w:shd w:fill="1A1A2E" w:val="clear"/>
+            <w:tcMar>
+              <w:top w:type="dxa" w:w="20"/>
+              <w:left w:type="dxa" w:w="200"/>
+              <w:bottom w:type="dxa" w:w="20"/>
+              <w:right w:type="dxa" w:w="200"/>
+            </w:tcMar>
+          </w:tcPr>
+          <w:p>
+            <w:pPr>
+              <w:spacing w:after="0"/>
+            </w:pPr>
+            <w:r>
+              <w:rPr>
+                <w:rFonts w:ascii="Courier New" w:cs="Courier New" w:hAnsi="Courier New"/>
+                <w:color w:val="4CAF50"/>
+                <w:sz w:val="17"/>
+                <w:szCs w:val="17"/>
+              </w:rPr>
+              <w:t xml:space="preserve">  -d '{"email": "demo@cabinet.fr", "password": "demo1234"}'</w:t>
+            </w:r>
+          </w:p>
+        </w:tc>
+      </w:tr>
+      <w:tr>
+        <w:tc>
+          <w:tcPr>
+            <w:shd w:fill="1A1A2E" w:val="clear"/>
+            <w:tcMar>
+              <w:top w:type="dxa" w:w="20"/>
+              <w:left w:type="dxa" w:w="200"/>
+              <w:bottom w:type="dxa" w:w="20"/>
+              <w:right w:type="dxa" w:w="200"/>
+            </w:tcMar>
+          </w:tcPr>
+          <w:p>
+            <w:pPr>
+              <w:spacing w:after="0"/>
+            </w:pPr>
+            <w:r>
+              <w:rPr>
+                <w:rFonts w:ascii="Courier New" w:cs="Courier New" w:hAnsi="Courier New"/>
+                <w:color w:val="888888"/>
+                <w:sz w:val="17"/>
+                <w:szCs w:val="17"/>
+              </w:rPr>
+              <w:t xml:space="preserve"/>
+            </w:r>
+          </w:p>
+        </w:tc>
+      </w:tr>
+      <w:tr>
+        <w:tc>
+          <w:tcPr>
+            <w:shd w:fill="1A1A2E" w:val="clear"/>
+            <w:tcMar>
+              <w:top w:type="dxa" w:w="20"/>
+              <w:left w:type="dxa" w:w="200"/>
+              <w:bottom w:type="dxa" w:w="20"/>
+              <w:right w:type="dxa" w:w="200"/>
+            </w:tcMar>
+          </w:tcPr>
+          <w:p>
+            <w:pPr>
+              <w:spacing w:after="0"/>
+            </w:pPr>
+            <w:r>
+              <w:rPr>
+                <w:rFonts w:ascii="Courier New" w:cs="Courier New" w:hAnsi="Courier New"/>
+                <w:color w:val="888888"/>
+                <w:sz w:val="17"/>
+                <w:szCs w:val="17"/>
+              </w:rPr>
+              <w:t xml:space="preserve"># Etape 3 — Utiliser le token sur /search</w:t>
+            </w:r>
+          </w:p>
+        </w:tc>
+      </w:tr>
+      <w:tr>
+        <w:tc>
+          <w:tcPr>
+            <w:shd w:fill="1A1A2E" w:val="clear"/>
+            <w:tcMar>
+              <w:top w:type="dxa" w:w="20"/>
+              <w:left w:type="dxa" w:w="200"/>
+              <w:bottom w:type="dxa" w:w="20"/>
+              <w:right w:type="dxa" w:w="200"/>
+            </w:tcMar>
+          </w:tcPr>
+          <w:p>
+            <w:pPr>
+              <w:spacing w:after="0"/>
+            </w:pPr>
+            <w:r>
+              <w:rPr>
+                <w:rFonts w:ascii="Courier New" w:cs="Courier New" w:hAnsi="Courier New"/>
+                <w:color w:val="4CAF50"/>
+                <w:sz w:val="17"/>
+                <w:szCs w:val="17"/>
+              </w:rPr>
+              <w:t xml:space="preserve">curl -X POST http://localhost:8000/api/v1/search \</w:t>
+            </w:r>
+          </w:p>
+        </w:tc>
+      </w:tr>
+      <w:tr>
+        <w:tc>
+          <w:tcPr>
+            <w:shd w:fill="1A1A2E" w:val="clear"/>
+            <w:tcMar>
+              <w:top w:type="dxa" w:w="20"/>
+              <w:left w:type="dxa" w:w="200"/>
+              <w:bottom w:type="dxa" w:w="20"/>
+              <w:right w:type="dxa" w:w="200"/>
+            </w:tcMar>
+          </w:tcPr>
+          <w:p>
+            <w:pPr>
+              <w:spacing w:after="0"/>
+            </w:pPr>
+            <w:r>
+              <w:rPr>
+                <w:rFonts w:ascii="Courier New" w:cs="Courier New" w:hAnsi="Courier New"/>
+                <w:color w:val="4CAF50"/>
+                <w:sz w:val="17"/>
+                <w:szCs w:val="17"/>
+              </w:rPr>
+              <w:t xml:space="preserve">  -H "Authorization: Bearer eyJ..." \</w:t>
+            </w:r>
+          </w:p>
+        </w:tc>
+      </w:tr>
+      <w:tr>
+        <w:tc>
+          <w:tcPr>
+            <w:shd w:fill="1A1A2E" w:val="clear"/>
+            <w:tcMar>
+              <w:top w:type="dxa" w:w="20"/>
+              <w:left w:type="dxa" w:w="200"/>
+              <w:bottom w:type="dxa" w:w="20"/>
+              <w:right w:type="dxa" w:w="200"/>
+            </w:tcMar>
+          </w:tcPr>
+          <w:p>
+            <w:pPr>
+              <w:spacing w:after="0"/>
+            </w:pPr>
+            <w:r>
+              <w:rPr>
+                <w:rFonts w:ascii="Courier New" w:cs="Courier New" w:hAnsi="Courier New"/>
+                <w:color w:val="4CAF50"/>
+                <w:sz w:val="17"/>
+                <w:szCs w:val="17"/>
+              </w:rPr>
+              <w:t xml:space="preserve">  -H "Content-Type: application/json" \</w:t>
+            </w:r>
+          </w:p>
+        </w:tc>
+      </w:tr>
+      <w:tr>
+        <w:tc>
+          <w:tcPr>
+            <w:shd w:fill="1A1A2E" w:val="clear"/>
+            <w:tcMar>
+              <w:top w:type="dxa" w:w="20"/>
+              <w:left w:type="dxa" w:w="200"/>
+              <w:bottom w:type="dxa" w:w="20"/>
+              <w:right w:type="dxa" w:w="200"/>
+            </w:tcMar>
+          </w:tcPr>
+          <w:p>
+            <w:pPr>
+              <w:spacing w:after="0"/>
+            </w:pPr>
+            <w:r>
+              <w:rPr>
+                <w:rFonts w:ascii="Courier New" w:cs="Courier New" w:hAnsi="Courier New"/>
+                <w:color w:val="4CAF50"/>
+                <w:sz w:val="17"/>
+                <w:szCs w:val="17"/>
+              </w:rPr>
+              <w:t xml:space="preserve">  -d '{"question": "GDPR controller obligations?", "k": 5}'</w:t>
+            </w:r>
+          </w:p>
+        </w:tc>
+      </w:tr>
+      <w:tr>
+        <w:tc>
+          <w:tcPr>
+            <w:shd w:fill="1A1A2E" w:val="clear"/>
+            <w:tcMar>
+              <w:top w:type="dxa" w:w="20"/>
+              <w:left w:type="dxa" w:w="200"/>
+              <w:bottom w:type="dxa" w:w="20"/>
+              <w:right w:type="dxa" w:w="200"/>
+            </w:tcMar>
+          </w:tcPr>
+          <w:p>
+            <w:pPr>
+              <w:spacing w:after="0"/>
+            </w:pPr>
+            <w:r>
+              <w:rPr>
+                <w:rFonts w:ascii="Courier New" w:cs="Courier New" w:hAnsi="Courier New"/>
+                <w:color w:val="888888"/>
+                <w:sz w:val="17"/>
+                <w:szCs w:val="17"/>
+              </w:rPr>
+              <w:t xml:space="preserve"/>
+            </w:r>
+          </w:p>
+        </w:tc>
+      </w:tr>
+      <w:tr>
+        <w:tc>
+          <w:tcPr>
+            <w:shd w:fill="1A1A2E" w:val="clear"/>
+            <w:tcMar>
+              <w:top w:type="dxa" w:w="20"/>
+              <w:left w:type="dxa" w:w="200"/>
+              <w:bottom w:type="dxa" w:w="20"/>
+              <w:right w:type="dxa" w:w="200"/>
+            </w:tcMar>
+          </w:tcPr>
+          <w:p>
+            <w:pPr>
+              <w:spacing w:after="0"/>
+            </w:pPr>
+            <w:r>
+              <w:rPr>
+                <w:rFonts w:ascii="Courier New" w:cs="Courier New" w:hAnsi="Courier New"/>
+                <w:color w:val="888888"/>
+                <w:sz w:val="17"/>
+                <w:szCs w:val="17"/>
+              </w:rPr>
+              <w:t xml:space="preserve"># Etape 4 — Verifier son token (debug)</w:t>
+            </w:r>
+          </w:p>
+        </w:tc>
+      </w:tr>
+      <w:tr>
+        <w:tc>
+          <w:tcPr>
+            <w:shd w:fill="1A1A2E" w:val="clear"/>
+            <w:tcMar>
+              <w:top w:type="dxa" w:w="20"/>
+              <w:left w:type="dxa" w:w="200"/>
+              <w:bottom w:type="dxa" w:w="20"/>
+              <w:right w:type="dxa" w:w="200"/>
+            </w:tcMar>
+          </w:tcPr>
+          <w:p>
+            <w:pPr>
+              <w:spacing w:after="0"/>
+            </w:pPr>
+            <w:r>
+              <w:rPr>
+                <w:rFonts w:ascii="Courier New" w:cs="Courier New" w:hAnsi="Courier New"/>
+                <w:color w:val="4CAF50"/>
+                <w:sz w:val="17"/>
+                <w:szCs w:val="17"/>
+              </w:rPr>
+              <w:t xml:space="preserve">curl http://localhost:8000/auth/me -H "Authorization: Bearer eyJ..."</w:t>
+            </w:r>
+          </w:p>
+        </w:tc>
+      </w:tr>
+      <w:tr>
+        <w:tc>
+          <w:tcPr>
+            <w:shd w:fill="1A1A2E" w:val="clear"/>
+            <w:tcMar>
+              <w:top w:type="dxa" w:w="20"/>
+              <w:left w:type="dxa" w:w="200"/>
+              <w:bottom w:type="dxa" w:w="20"/>
+              <w:right w:type="dxa" w:w="200"/>
+            </w:tcMar>
+          </w:tcPr>
+          <w:p>
+            <w:pPr>
+              <w:spacing w:after="0"/>
+            </w:pPr>
+            <w:r>
+              <w:rPr>
+                <w:rFonts w:ascii="Courier New" w:cs="Courier New" w:hAnsi="Courier New"/>
+                <w:color w:val="888888"/>
+                <w:sz w:val="17"/>
+                <w:szCs w:val="17"/>
+              </w:rPr>
+              <w:t xml:space="preserve"># Reponse : {plan, rate_limit_max_requests, rate_limit_window_seconds}</w:t>
+            </w:r>
+          </w:p>
+        </w:tc>
+      </w:tr>
+    </w:tbl>
+    <w:p>
+      <w:pPr>
+        <w:spacing w:after="80"/>
+      </w:pPr>
+    </w:p>
+    <w:p>
+      <w:pPr>
+        <w:spacing w:after="100" w:before="200"/>
+      </w:pPr>
+      <w:r>
+        <w:rPr>
+          <w:rFonts w:ascii="Arial" w:cs="Arial" w:hAnsi="Arial"/>
+          <w:b/>
+          <w:color w:val="C9A84C"/>
+          <w:sz w:val="22"/>
+          <w:szCs w:val="22"/>
+        </w:rPr>
+        <w:t>Codes HTTP retournés — Ce qu'ils signifient</w:t>
+      </w:r>
+    </w:p>
+    <w:tbl>
+      <w:tblPr>
+        <w:tblW w:type="dxa" w:w="9360"/>
+        <w:tblBorders>
+          <w:top w:val="single" w:color="1E3A5F" w:sz="4"/>
+          <w:left w:val="single" w:color="1E3A5F" w:sz="4"/>
+          <w:bottom w:val="single" w:color="1E3A5F" w:sz="4"/>
+          <w:right w:val="single" w:color="1E3A5F" w:sz="4"/>
+          <w:insideH w:val="single" w:color="CCCCCC" w:sz="2"/>
+          <w:insideV w:val="single" w:color="CCCCCC" w:sz="2"/>
+        </w:tblBorders>
+      </w:tblPr>
+      <w:tblGrid>
+        <w:gridCol w:w="600"/>
+        <w:gridCol w:w="1600"/>
+        <w:gridCol w:w="3780"/>
+        <w:gridCol w:w="3380"/>
+      </w:tblGrid>
+      <w:tr>
+        <w:tc>
+          <w:tcPr>
+            <w:tcW w:type="dxa" w:w="600"/>
+            <w:shd w:fill="1E3A5F" w:val="clear"/>
+            <w:tcMar>
+              <w:top w:type="dxa" w:w="60"/>
+              <w:left w:type="dxa" w:w="80"/>
+              <w:bottom w:type="dxa" w:w="60"/>
+              <w:right w:type="dxa" w:w="80"/>
+            </w:tcMar>
+          </w:tcPr>
+          <w:p>
+            <w:r>
+              <w:rPr>
+                <w:rFonts w:ascii="Arial" w:cs="Arial" w:hAnsi="Arial"/>
+                <w:b/>
+                <w:color w:val="FFFFFF"/>
+                <w:sz w:val="17"/>
+                <w:szCs w:val="17"/>
+              </w:rPr>
+              <w:t>Code</w:t>
+            </w:r>
+          </w:p>
+        </w:tc>
+        <w:tc>
+          <w:tcPr>
+            <w:tcW w:type="dxa" w:w="1600"/>
+            <w:shd w:fill="1E3A5F" w:val="clear"/>
+            <w:tcMar>
+              <w:top w:type="dxa" w:w="60"/>
+              <w:left w:type="dxa" w:w="80"/>
+              <w:bottom w:type="dxa" w:w="60"/>
+              <w:right w:type="dxa" w:w="80"/>
+            </w:tcMar>
+          </w:tcPr>
+          <w:p>
+            <w:r>
+              <w:rPr>
+                <w:rFonts w:ascii="Arial" w:cs="Arial" w:hAnsi="Arial"/>
+                <w:b/>
+                <w:color w:val="FFFFFF"/>
+                <w:sz w:val="17"/>
+                <w:szCs w:val="17"/>
+              </w:rPr>
+              <w:t>Nom</w:t>
+            </w:r>
+          </w:p>
+        </w:tc>
+        <w:tc>
+          <w:tcPr>
+            <w:tcW w:type="dxa" w:w="3780"/>
+            <w:shd w:fill="1E3A5F" w:val="clear"/>
+            <w:tcMar>
+              <w:top w:type="dxa" w:w="60"/>
+              <w:left w:type="dxa" w:w="80"/>
+              <w:bottom w:type="dxa" w:w="60"/>
+              <w:right w:type="dxa" w:w="80"/>
+            </w:tcMar>
+          </w:tcPr>
+          <w:p>
+            <w:r>
+              <w:rPr>
+                <w:rFonts w:ascii="Arial" w:cs="Arial" w:hAnsi="Arial"/>
+                <w:b/>
+                <w:color w:val="FFFFFF"/>
+                <w:sz w:val="17"/>
+                <w:szCs w:val="17"/>
+              </w:rPr>
+              <w:t>Quand</w:t>
+            </w:r>
+          </w:p>
+        </w:tc>
+        <w:tc>
+          <w:tcPr>
+            <w:tcW w:type="dxa" w:w="3380"/>
+            <w:shd w:fill="1E3A5F" w:val="clear"/>
+            <w:tcMar>
+              <w:top w:type="dxa" w:w="60"/>
+              <w:left w:type="dxa" w:w="80"/>
+              <w:bottom w:type="dxa" w:w="60"/>
+              <w:right w:type="dxa" w:w="80"/>
+            </w:tcMar>
+          </w:tcPr>
+          <w:p>
+            <w:r>
+              <w:rPr>
+                <w:rFonts w:ascii="Arial" w:cs="Arial" w:hAnsi="Arial"/>
+                <w:b/>
+                <w:color w:val="FFFFFF"/>
+                <w:sz w:val="17"/>
+                <w:szCs w:val="17"/>
+              </w:rPr>
+              <w:t>Que faire</w:t>
+            </w:r>
+          </w:p>
+        </w:tc>
+      </w:tr>
+      <w:tr>
+        <w:tc>
+          <w:tcPr>
+            <w:tcW w:type="dxa" w:w="600"/>
+            <w:tcMar>
+              <w:top w:type="dxa" w:w="60"/>
+              <w:left w:type="dxa" w:w="80"/>
+              <w:bottom w:type="dxa" w:w="60"/>
+              <w:right w:type="dxa" w:w="80"/>
+            </w:tcMar>
+          </w:tcPr>
+          <w:p>
+            <w:r>
+              <w:rPr>
+                <w:rFonts w:ascii="Courier New" w:cs="Courier New" w:hAnsi="Courier New"/>
+                <w:b/>
+                <w:color w:val="1E8449"/>
+                <w:sz w:val="18"/>
+                <w:szCs w:val="18"/>
+              </w:rPr>
+              <w:t>200</w:t>
+            </w:r>
+          </w:p>
+        </w:tc>
+        <w:tc>
+          <w:tcPr>
+            <w:tcW w:type="dxa" w:w="1600"/>
+            <w:tcMar>
+              <w:top w:type="dxa" w:w="60"/>
+              <w:left w:type="dxa" w:w="80"/>
+              <w:bottom w:type="dxa" w:w="60"/>
+              <w:right w:type="dxa" w:w="80"/>
+            </w:tcMar>
+          </w:tcPr>
+          <w:p>
+            <w:r>
+              <w:rPr>
+                <w:rFonts w:ascii="Arial" w:cs="Arial" w:hAnsi="Arial"/>
+                <w:b/>
+                <w:color w:val="1A1A2E"/>
+                <w:sz w:val="17"/>
+                <w:szCs w:val="17"/>
+              </w:rPr>
+              <w:t>OK</w:t>
+            </w:r>
+          </w:p>
+        </w:tc>
+        <w:tc>
+          <w:tcPr>
+            <w:tcW w:type="dxa" w:w="3780"/>
+            <w:tcMar>
+              <w:top w:type="dxa" w:w="60"/>
+              <w:left w:type="dxa" w:w="80"/>
+              <w:bottom w:type="dxa" w:w="60"/>
+              <w:right w:type="dxa" w:w="80"/>
+            </w:tcMar>
+          </w:tcPr>
+          <w:p>
+            <w:r>
+              <w:rPr>
+                <w:rFonts w:ascii="Arial" w:cs="Arial" w:hAnsi="Arial"/>
+                <w:color w:val="555577"/>
+                <w:sz w:val="17"/>
+                <w:szCs w:val="17"/>
+              </w:rPr>
+              <w:t xml:space="preserve">Token valide, limite OK, reponse generee</w:t>
+            </w:r>
+          </w:p>
+        </w:tc>
+        <w:tc>
+          <w:tcPr>
+            <w:tcW w:type="dxa" w:w="3380"/>
+            <w:tcMar>
+              <w:top w:type="dxa" w:w="60"/>
+              <w:left w:type="dxa" w:w="80"/>
+              <w:bottom w:type="dxa" w:w="60"/>
+              <w:right w:type="dxa" w:w="80"/>
+            </w:tcMar>
+          </w:tcPr>
+          <w:p>
+            <w:r>
+              <w:rPr>
+                <w:rFonts w:ascii="Arial" w:cs="Arial" w:hAnsi="Arial"/>
+                <w:color w:val="1A1A2E"/>
+                <w:sz w:val="17"/>
+                <w:szCs w:val="17"/>
+              </w:rPr>
+              <w:t xml:space="preserve">Utiliser la reponse normalement</w:t>
+            </w:r>
+          </w:p>
+        </w:tc>
+      </w:tr>
+      <w:tr>
+        <w:tc>
+          <w:tcPr>
+            <w:tcW w:type="dxa" w:w="600"/>
+            <w:tcMar>
+              <w:top w:type="dxa" w:w="60"/>
+              <w:left w:type="dxa" w:w="80"/>
+              <w:bottom w:type="dxa" w:w="60"/>
+              <w:right w:type="dxa" w:w="80"/>
+            </w:tcMar>
+          </w:tcPr>
+          <w:p>
+            <w:r>
+              <w:rPr>
+                <w:rFonts w:ascii="Courier New" w:cs="Courier New" w:hAnsi="Courier New"/>
+                <w:b/>
+                <w:color w:val="E07C3A"/>
+                <w:sz w:val="18"/>
+                <w:szCs w:val="18"/>
+              </w:rPr>
+              <w:t>401</w:t>
+            </w:r>
+          </w:p>
+        </w:tc>
+        <w:tc>
+          <w:tcPr>
+            <w:tcW w:type="dxa" w:w="1600"/>
+            <w:tcMar>
+              <w:top w:type="dxa" w:w="60"/>
+              <w:left w:type="dxa" w:w="80"/>
+              <w:bottom w:type="dxa" w:w="60"/>
+              <w:right w:type="dxa" w:w="80"/>
+            </w:tcMar>
+          </w:tcPr>
+          <w:p>
+            <w:r>
+              <w:rPr>
+                <w:rFonts w:ascii="Arial" w:cs="Arial" w:hAnsi="Arial"/>
+                <w:b/>
+                <w:color w:val="1A1A2E"/>
+                <w:sz w:val="17"/>
+                <w:szCs w:val="17"/>
+              </w:rPr>
+              <w:t>Unauthorized</w:t>
+            </w:r>
+          </w:p>
+        </w:tc>
+        <w:tc>
+          <w:tcPr>
+            <w:tcW w:type="dxa" w:w="3780"/>
+            <w:tcMar>
+              <w:top w:type="dxa" w:w="60"/>
+              <w:left w:type="dxa" w:w="80"/>
+              <w:bottom w:type="dxa" w:w="60"/>
+              <w:right w:type="dxa" w:w="80"/>
+            </w:tcMar>
+          </w:tcPr>
+          <w:p>
+            <w:r>
+              <w:rPr>
+                <w:rFonts w:ascii="Arial" w:cs="Arial" w:hAnsi="Arial"/>
+                <w:color w:val="555577"/>
+                <w:sz w:val="17"/>
+                <w:szCs w:val="17"/>
+              </w:rPr>
+              <w:t xml:space="preserve">Token absent, invalide ou expire</w:t>
+            </w:r>
+          </w:p>
+        </w:tc>
+        <w:tc>
+          <w:tcPr>
+            <w:tcW w:type="dxa" w:w="3380"/>
+            <w:tcMar>
+              <w:top w:type="dxa" w:w="60"/>
+              <w:left w:type="dxa" w:w="80"/>
+              <w:bottom w:type="dxa" w:w="60"/>
+              <w:right w:type="dxa" w:w="80"/>
+            </w:tcMar>
+          </w:tcPr>
+          <w:p>
+            <w:r>
+              <w:rPr>
+                <w:rFonts w:ascii="Arial" w:cs="Arial" w:hAnsi="Arial"/>
+                <w:color w:val="1A1A2E"/>
+                <w:sz w:val="17"/>
+                <w:szCs w:val="17"/>
+              </w:rPr>
+              <w:t xml:space="preserve">Re-demander un token via /auth/token</w:t>
+            </w:r>
+          </w:p>
+        </w:tc>
+      </w:tr>
+      <w:tr>
+        <w:tc>
+          <w:tcPr>
+            <w:tcW w:type="dxa" w:w="600"/>
+            <w:tcMar>
+              <w:top w:type="dxa" w:w="60"/>
+              <w:left w:type="dxa" w:w="80"/>
+              <w:bottom w:type="dxa" w:w="60"/>
+              <w:right w:type="dxa" w:w="80"/>
+            </w:tcMar>
+          </w:tcPr>
+          <w:p>
+            <w:r>
+              <w:rPr>
+                <w:rFonts w:ascii="Courier New" w:cs="Courier New" w:hAnsi="Courier New"/>
+                <w:b/>
+                <w:color w:val="E07C3A"/>
+                <w:sz w:val="18"/>
+                <w:szCs w:val="18"/>
+              </w:rPr>
+              <w:t>403</w:t>
+            </w:r>
+          </w:p>
+        </w:tc>
+        <w:tc>
+          <w:tcPr>
+            <w:tcW w:type="dxa" w:w="1600"/>
+            <w:tcMar>
+              <w:top w:type="dxa" w:w="60"/>
+              <w:left w:type="dxa" w:w="80"/>
+              <w:bottom w:type="dxa" w:w="60"/>
+              <w:right w:type="dxa" w:w="80"/>
+            </w:tcMar>
+          </w:tcPr>
+          <w:p>
+            <w:r>
+              <w:rPr>
+                <w:rFonts w:ascii="Arial" w:cs="Arial" w:hAnsi="Arial"/>
+                <w:b/>
+                <w:color w:val="1A1A2E"/>
+                <w:sz w:val="17"/>
+                <w:szCs w:val="17"/>
+              </w:rPr>
+              <w:t>Forbidden</w:t>
+            </w:r>
+          </w:p>
+        </w:tc>
+        <w:tc>
+          <w:tcPr>
+            <w:tcW w:type="dxa" w:w="3780"/>
+            <w:tcMar>
+              <w:top w:type="dxa" w:w="60"/>
+              <w:left w:type="dxa" w:w="80"/>
+              <w:bottom w:type="dxa" w:w="60"/>
+              <w:right w:type="dxa" w:w="80"/>
+            </w:tcMar>
+          </w:tcPr>
+          <w:p>
+            <w:r>
+              <w:rPr>
+                <w:rFonts w:ascii="Arial" w:cs="Arial" w:hAnsi="Arial"/>
+                <w:color w:val="555577"/>
+                <w:sz w:val="17"/>
+                <w:szCs w:val="17"/>
+              </w:rPr>
+              <w:t xml:space="preserve">Token valide mais droits insuffisants (ex: admin requis)</w:t>
+            </w:r>
+          </w:p>
+        </w:tc>
+        <w:tc>
+          <w:tcPr>
+            <w:tcW w:type="dxa" w:w="3380"/>
+            <w:tcMar>
+              <w:top w:type="dxa" w:w="60"/>
+              <w:left w:type="dxa" w:w="80"/>
+              <w:bottom w:type="dxa" w:w="60"/>
+              <w:right w:type="dxa" w:w="80"/>
+            </w:tcMar>
+          </w:tcPr>
+          <w:p>
+            <w:r>
+              <w:rPr>
+                <w:rFonts w:ascii="Arial" w:cs="Arial" w:hAnsi="Arial"/>
+                <w:color w:val="1A1A2E"/>
+                <w:sz w:val="17"/>
+                <w:szCs w:val="17"/>
+              </w:rPr>
+              <w:t xml:space="preserve">Contacter l'admin pour changer le plan</w:t>
+            </w:r>
+          </w:p>
+        </w:tc>
+      </w:tr>
+      <w:tr>
+        <w:tc>
+          <w:tcPr>
+            <w:tcW w:type="dxa" w:w="600"/>
+            <w:tcMar>
+              <w:top w:type="dxa" w:w="60"/>
+              <w:left w:type="dxa" w:w="80"/>
+              <w:bottom w:type="dxa" w:w="60"/>
+              <w:right w:type="dxa" w:w="80"/>
+            </w:tcMar>
+          </w:tcPr>
+          <w:p>
+            <w:r>
+              <w:rPr>
+                <w:rFonts w:ascii="Courier New" w:cs="Courier New" w:hAnsi="Courier New"/>
+                <w:b/>
+                <w:color w:val="E07C3A"/>
+                <w:sz w:val="18"/>
+                <w:szCs w:val="18"/>
+              </w:rPr>
+              <w:t>429</w:t>
+            </w:r>
+          </w:p>
+        </w:tc>
+        <w:tc>
+          <w:tcPr>
+            <w:tcW w:type="dxa" w:w="1600"/>
+            <w:tcMar>
+              <w:top w:type="dxa" w:w="60"/>
+              <w:left w:type="dxa" w:w="80"/>
+              <w:bottom w:type="dxa" w:w="60"/>
+              <w:right w:type="dxa" w:w="80"/>
+            </w:tcMar>
+          </w:tcPr>
+          <w:p>
+            <w:r>
+              <w:rPr>
+                <w:rFonts w:ascii="Arial" w:cs="Arial" w:hAnsi="Arial"/>
+                <w:b/>
+                <w:color w:val="1A1A2E"/>
+                <w:sz w:val="17"/>
+                <w:szCs w:val="17"/>
+              </w:rPr>
+              <w:t>Too Many Requests</w:t>
+            </w:r>
+          </w:p>
+        </w:tc>
+        <w:tc>
+          <w:tcPr>
+            <w:tcW w:type="dxa" w:w="3780"/>
+            <w:tcMar>
+              <w:top w:type="dxa" w:w="60"/>
+              <w:left w:type="dxa" w:w="80"/>
+              <w:bottom w:type="dxa" w:w="60"/>
+              <w:right w:type="dxa" w:w="80"/>
+            </w:tcMar>
+          </w:tcPr>
+          <w:p>
+            <w:r>
+              <w:rPr>
+                <w:rFonts w:ascii="Arial" w:cs="Arial" w:hAnsi="Arial"/>
+                <w:color w:val="555577"/>
+                <w:sz w:val="17"/>
+                <w:szCs w:val="17"/>
+              </w:rPr>
+              <w:t xml:space="preserve">Limite de frequence depassee</w:t>
+            </w:r>
+          </w:p>
+        </w:tc>
+        <w:tc>
+          <w:tcPr>
+            <w:tcW w:type="dxa" w:w="3380"/>
+            <w:tcMar>
+              <w:top w:type="dxa" w:w="60"/>
+              <w:left w:type="dxa" w:w="80"/>
+              <w:bottom w:type="dxa" w:w="60"/>
+              <w:right w:type="dxa" w:w="80"/>
+            </w:tcMar>
+          </w:tcPr>
+          <w:p>
+            <w:r>
+              <w:rPr>
+                <w:rFonts w:ascii="Arial" w:cs="Arial" w:hAnsi="Arial"/>
+                <w:color w:val="1A1A2E"/>
+                <w:sz w:val="17"/>
+                <w:szCs w:val="17"/>
+              </w:rPr>
+              <w:t xml:space="preserve">Attendre X secondes (header Retry-After)</w:t>
+            </w:r>
+          </w:p>
+        </w:tc>
+      </w:tr>
+    </w:tbl>
+    <w:p>
+      <w:pPr>
+        <w:spacing w:after="80"/>
+      </w:pPr>
+    </w:p>
+    <w:tbl>
+      <w:tblPr>
+        <w:tblW w:type="dxa" w:w="9360"/>
+        <w:tblBorders>
+          <w:top w:val="single" w:color="C9A84C" w:sz="4"/>
+          <w:left w:val="single" w:color="C9A84C" w:sz="8"/>
+          <w:bottom w:val="single" w:color="C9A84C" w:sz="4"/>
+          <w:right w:val="single" w:color="C9A84C" w:sz="4"/>
+        </w:tblBorders>
+      </w:tblPr>
+      <w:tblGrid>
+        <w:gridCol w:w="9360"/>
+      </w:tblGrid>
+      <w:tr>
+        <w:tc>
+          <w:tcPr>
+            <w:shd w:fill="FFF8E1" w:val="clear"/>
+            <w:tcMar>
+              <w:top w:type="dxa" w:w="100"/>
+              <w:left w:type="dxa" w:w="200"/>
+              <w:bottom w:type="dxa" w:w="100"/>
+              <w:right w:type="dxa" w:w="200"/>
+            </w:tcMar>
+          </w:tcPr>
+          <w:p>
+            <w:pPr>
+              <w:spacing w:after="40"/>
+            </w:pPr>
+            <w:r>
+              <w:rPr>
+                <w:rFonts w:ascii="Arial" w:cs="Arial" w:hAnsi="Arial"/>
+                <w:b/>
+                <w:caps/>
+                <w:color w:val="7D6608"/>
+                <w:sz w:val="17"/>
+                <w:szCs w:val="17"/>
+              </w:rPr>
+              <w:t>LIMITES DE L'IMPLÉMENTATION ACTUELLE — CE QUI MANQUE POUR LA PRODUCTION</w:t>
+            </w:r>
+          </w:p>
+          <w:p>
+            <w:pPr>
+              <w:spacing w:after="0"/>
+            </w:pPr>
+            <w:r>
+              <w:rPr>
+                <w:rFonts w:ascii="Arial" w:cs="Arial" w:hAnsi="Arial"/>
+                <w:color w:val="1A1A2E"/>
+                <w:sz w:val="19"/>
+                <w:szCs w:val="19"/>
+              </w:rPr>
+              <w:t xml:space="preserve">STOCKAGE EN MÉMOIRE : les compteurs rate limiting sont dans la RAM. Si le serveur redémarre, les compteurs sont remis à zéro. En production : migrer vers Redis (base de données en mémoire partagée entre instances). MOTS DE PASSE HARDCODES : les comptes demo/admin sont dans le code. En production : base PostgreSQL avec mots de passe hashés en bcrypt. PAS DE REFRESH TOKEN : quand le token expire (60 min), l'utilisateur doit se reconnecter. HTTPS OBLIGATOIRE EN PRODUCTION : en HTTP, le token transite en clair dans les headers.</w:t>
+            </w:r>
+          </w:p>
+        </w:tc>
+      </w:tr>
+    </w:tbl>
+    <w:p>
+      <w:pPr>
+        <w:spacing w:after="80"/>
+      </w:pPr>
+    </w:p>
+    <w:p>
+      <w:pPr>
+        <w:spacing w:after="100" w:before="200"/>
+      </w:pPr>
+      <w:r>
+        <w:rPr>
+          <w:rFonts w:ascii="Arial" w:cs="Arial" w:hAnsi="Arial"/>
+          <w:b/>
+          <w:color w:val="C9A84C"/>
+          <w:sz w:val="22"/>
+          <w:szCs w:val="22"/>
+        </w:rPr>
+        <w:t>Fichiers créés ou modifiés</w:t>
+      </w:r>
+    </w:p>
+    <w:tbl>
+      <w:tblPr>
+        <w:tblW w:type="dxa" w:w="9360"/>
+        <w:tblBorders>
+          <w:top w:val="single" w:color="1E3A5F" w:sz="4"/>
+          <w:left w:val="single" w:color="1E3A5F" w:sz="4"/>
+          <w:bottom w:val="single" w:color="1E3A5F" w:sz="4"/>
+          <w:right w:val="single" w:color="1E3A5F" w:sz="4"/>
+          <w:insideH w:val="single" w:color="CCCCCC" w:sz="2"/>
+          <w:insideV w:val="single" w:color="CCCCCC" w:sz="2"/>
+        </w:tblBorders>
+      </w:tblPr>
+      <w:tblGrid>
+        <w:gridCol w:w="2200"/>
+        <w:gridCol w:w="1200"/>
+        <w:gridCol w:w="5960"/>
+      </w:tblGrid>
+      <w:tr>
+        <w:tc>
+          <w:tcPr>
+            <w:tcW w:type="dxa" w:w="2200"/>
+            <w:shd w:fill="1E3A5F" w:val="clear"/>
+            <w:tcMar>
+              <w:top w:type="dxa" w:w="60"/>
+              <w:left w:type="dxa" w:w="80"/>
+              <w:bottom w:type="dxa" w:w="60"/>
+              <w:right w:type="dxa" w:w="80"/>
+            </w:tcMar>
+          </w:tcPr>
+          <w:p>
+            <w:r>
+              <w:rPr>
+                <w:rFonts w:ascii="Arial" w:cs="Arial" w:hAnsi="Arial"/>
+                <w:b/>
+                <w:color w:val="FFFFFF"/>
+                <w:sz w:val="17"/>
+                <w:szCs w:val="17"/>
+              </w:rPr>
+              <w:t>Fichier</w:t>
+            </w:r>
+          </w:p>
+        </w:tc>
+        <w:tc>
+          <w:tcPr>
+            <w:tcW w:type="dxa" w:w="1200"/>
+            <w:shd w:fill="1E3A5F" w:val="clear"/>
+            <w:tcMar>
+              <w:top w:type="dxa" w:w="60"/>
+              <w:left w:type="dxa" w:w="80"/>
+              <w:bottom w:type="dxa" w:w="60"/>
+              <w:right w:type="dxa" w:w="80"/>
+            </w:tcMar>
+          </w:tcPr>
+          <w:p>
+            <w:r>
+              <w:rPr>
+                <w:rFonts w:ascii="Arial" w:cs="Arial" w:hAnsi="Arial"/>
+                <w:b/>
+                <w:color w:val="FFFFFF"/>
+                <w:sz w:val="17"/>
+                <w:szCs w:val="17"/>
+              </w:rPr>
+              <w:t>Action</w:t>
+            </w:r>
+          </w:p>
+        </w:tc>
+        <w:tc>
+          <w:tcPr>
+            <w:tcW w:type="dxa" w:w="5960"/>
+            <w:shd w:fill="1E3A5F" w:val="clear"/>
+            <w:tcMar>
+              <w:top w:type="dxa" w:w="60"/>
+              <w:left w:type="dxa" w:w="80"/>
+              <w:bottom w:type="dxa" w:w="60"/>
+              <w:right w:type="dxa" w:w="80"/>
+            </w:tcMar>
+          </w:tcPr>
+          <w:p>
+            <w:r>
+              <w:rPr>
+                <w:rFonts w:ascii="Arial" w:cs="Arial" w:hAnsi="Arial"/>
+                <w:b/>
+                <w:color w:val="FFFFFF"/>
+                <w:sz w:val="17"/>
+                <w:szCs w:val="17"/>
+              </w:rPr>
+              <w:t>Contenu</w:t>
+            </w:r>
+          </w:p>
+        </w:tc>
+      </w:tr>
+      <w:tr>
+        <w:tc>
+          <w:tcPr>
+            <w:tcW w:type="dxa" w:w="2200"/>
+            <w:tcMar>
+              <w:top w:type="dxa" w:w="60"/>
+              <w:left w:type="dxa" w:w="80"/>
+              <w:bottom w:type="dxa" w:w="60"/>
+              <w:right w:type="dxa" w:w="80"/>
+            </w:tcMar>
+          </w:tcPr>
+          <w:p>
+            <w:r>
+              <w:rPr>
+                <w:rFonts w:ascii="Courier New" w:cs="Courier New" w:hAnsi="Courier New"/>
+                <w:color w:val="1E3A5F"/>
+                <w:sz w:val="17"/>
+                <w:szCs w:val="17"/>
+              </w:rPr>
+              <w:t>api/auth.py</w:t>
+            </w:r>
+          </w:p>
+        </w:tc>
+        <w:tc>
+          <w:tcPr>
+            <w:tcW w:type="dxa" w:w="1200"/>
+            <w:shd w:fill="EAFAF1" w:val="clear"/>
+            <w:tcMar>
+              <w:top w:type="dxa" w:w="60"/>
+              <w:left w:type="dxa" w:w="80"/>
+              <w:bottom w:type="dxa" w:w="60"/>
+              <w:right w:type="dxa" w:w="80"/>
+            </w:tcMar>
+          </w:tcPr>
+          <w:p>
+            <w:r>
+              <w:rPr>
+                <w:rFonts w:ascii="Arial" w:cs="Arial" w:hAnsi="Arial"/>
+                <w:b/>
+                <w:color w:val="1E8449"/>
+                <w:sz w:val="17"/>
+                <w:szCs w:val="17"/>
+              </w:rPr>
+              <w:t>NOUVEAU</w:t>
+            </w:r>
+          </w:p>
+        </w:tc>
+        <w:tc>
+          <w:tcPr>
+            <w:tcW w:type="dxa" w:w="5960"/>
+            <w:tcMar>
+              <w:top w:type="dxa" w:w="60"/>
+              <w:left w:type="dxa" w:w="80"/>
+              <w:bottom w:type="dxa" w:w="60"/>
+              <w:right w:type="dxa" w:w="80"/>
+            </w:tcMar>
+          </w:tcPr>
+          <w:p>
+            <w:r>
+              <w:rPr>
+                <w:rFonts w:ascii="Arial" w:cs="Arial" w:hAnsi="Arial"/>
+                <w:color w:val="555577"/>
+                <w:sz w:val="17"/>
+                <w:szCs w:val="17"/>
+              </w:rPr>
+              <w:t xml:space="preserve">Toute la logique : JWT, API keys, rate limiting, dépendances FastAPI</w:t>
+            </w:r>
+          </w:p>
+        </w:tc>
+      </w:tr>
+      <w:tr>
+        <w:tc>
+          <w:tcPr>
+            <w:tcW w:type="dxa" w:w="2200"/>
+            <w:tcMar>
+              <w:top w:type="dxa" w:w="60"/>
+              <w:left w:type="dxa" w:w="80"/>
+              <w:bottom w:type="dxa" w:w="60"/>
+              <w:right w:type="dxa" w:w="80"/>
+            </w:tcMar>
+          </w:tcPr>
+          <w:p>
+            <w:r>
+              <w:rPr>
+                <w:rFonts w:ascii="Courier New" w:cs="Courier New" w:hAnsi="Courier New"/>
+                <w:color w:val="1E3A5F"/>
+                <w:sz w:val="17"/>
+                <w:szCs w:val="17"/>
+              </w:rPr>
+              <w:t>api/auth_router.py</w:t>
+            </w:r>
+          </w:p>
+        </w:tc>
+        <w:tc>
+          <w:tcPr>
+            <w:tcW w:type="dxa" w:w="1200"/>
+            <w:shd w:fill="EAFAF1" w:val="clear"/>
+            <w:tcMar>
+              <w:top w:type="dxa" w:w="60"/>
+              <w:left w:type="dxa" w:w="80"/>
+              <w:bottom w:type="dxa" w:w="60"/>
+              <w:right w:type="dxa" w:w="80"/>
+            </w:tcMar>
+          </w:tcPr>
+          <w:p>
+            <w:r>
+              <w:rPr>
+                <w:rFonts w:ascii="Arial" w:cs="Arial" w:hAnsi="Arial"/>
+                <w:b/>
+                <w:color w:val="1E8449"/>
+                <w:sz w:val="17"/>
+                <w:szCs w:val="17"/>
+              </w:rPr>
+              <w:t>NOUVEAU</w:t>
+            </w:r>
+          </w:p>
+        </w:tc>
+        <w:tc>
+          <w:tcPr>
+            <w:tcW w:type="dxa" w:w="5960"/>
+            <w:tcMar>
+              <w:top w:type="dxa" w:w="60"/>
+              <w:left w:type="dxa" w:w="80"/>
+              <w:bottom w:type="dxa" w:w="60"/>
+              <w:right w:type="dxa" w:w="80"/>
+            </w:tcMar>
+          </w:tcPr>
+          <w:p>
+            <w:r>
+              <w:rPr>
+                <w:rFonts w:ascii="Arial" w:cs="Arial" w:hAnsi="Arial"/>
+                <w:color w:val="555577"/>
+                <w:sz w:val="17"/>
+                <w:szCs w:val="17"/>
+              </w:rPr>
+              <w:t xml:space="preserve">Endpoints : POST /auth/token, GET /auth/me, POST /auth/token/demo</w:t>
+            </w:r>
+          </w:p>
+        </w:tc>
+      </w:tr>
+      <w:tr>
+        <w:tc>
+          <w:tcPr>
+            <w:tcW w:type="dxa" w:w="2200"/>
+            <w:tcMar>
+              <w:top w:type="dxa" w:w="60"/>
+              <w:left w:type="dxa" w:w="80"/>
+              <w:bottom w:type="dxa" w:w="60"/>
+              <w:right w:type="dxa" w:w="80"/>
+            </w:tcMar>
+          </w:tcPr>
+          <w:p>
+            <w:r>
+              <w:rPr>
+                <w:rFonts w:ascii="Courier New" w:cs="Courier New" w:hAnsi="Courier New"/>
+                <w:color w:val="1E3A5F"/>
+                <w:sz w:val="17"/>
+                <w:szCs w:val="17"/>
+              </w:rPr>
+              <w:t>api/main.py</w:t>
+            </w:r>
+          </w:p>
+        </w:tc>
+        <w:tc>
+          <w:tcPr>
+            <w:tcW w:type="dxa" w:w="1200"/>
+            <w:shd w:fill="FFF3E0" w:val="clear"/>
+            <w:tcMar>
+              <w:top w:type="dxa" w:w="60"/>
+              <w:left w:type="dxa" w:w="80"/>
+              <w:bottom w:type="dxa" w:w="60"/>
+              <w:right w:type="dxa" w:w="80"/>
+            </w:tcMar>
+          </w:tcPr>
+          <w:p>
+            <w:r>
+              <w:rPr>
+                <w:rFonts w:ascii="Arial" w:cs="Arial" w:hAnsi="Arial"/>
+                <w:b/>
+                <w:color w:val="E07C3A"/>
+                <w:sz w:val="17"/>
+                <w:szCs w:val="17"/>
+              </w:rPr>
+              <w:t>MODIFIÉ</w:t>
+            </w:r>
+          </w:p>
+        </w:tc>
+        <w:tc>
+          <w:tcPr>
+            <w:tcW w:type="dxa" w:w="5960"/>
+            <w:tcMar>
+              <w:top w:type="dxa" w:w="60"/>
+              <w:left w:type="dxa" w:w="80"/>
+              <w:bottom w:type="dxa" w:w="60"/>
+              <w:right w:type="dxa" w:w="80"/>
+            </w:tcMar>
+          </w:tcPr>
+          <w:p>
+            <w:r>
+              <w:rPr>
+                <w:rFonts w:ascii="Arial" w:cs="Arial" w:hAnsi="Arial"/>
+                <w:color w:val="555577"/>
+                <w:sz w:val="17"/>
+                <w:szCs w:val="17"/>
+              </w:rPr>
+              <w:t xml:space="preserve">Import + enregistrement du router auth. Avertissement si JWT_SECRET_KEY manquante.</w:t>
+            </w:r>
+          </w:p>
+        </w:tc>
+      </w:tr>
+      <w:tr>
+        <w:tc>
+          <w:tcPr>
+            <w:tcW w:type="dxa" w:w="2200"/>
+            <w:tcMar>
+              <w:top w:type="dxa" w:w="60"/>
+              <w:left w:type="dxa" w:w="80"/>
+              <w:bottom w:type="dxa" w:w="60"/>
+              <w:right w:type="dxa" w:w="80"/>
+            </w:tcMar>
+          </w:tcPr>
+          <w:p>
+            <w:r>
+              <w:rPr>
+                <w:rFonts w:ascii="Courier New" w:cs="Courier New" w:hAnsi="Courier New"/>
+                <w:color w:val="1E3A5F"/>
+                <w:sz w:val="17"/>
+                <w:szCs w:val="17"/>
+              </w:rPr>
+              <w:t>api/search.py</w:t>
+            </w:r>
+          </w:p>
+        </w:tc>
+        <w:tc>
+          <w:tcPr>
+            <w:tcW w:type="dxa" w:w="1200"/>
+            <w:shd w:fill="FFF3E0" w:val="clear"/>
+            <w:tcMar>
+              <w:top w:type="dxa" w:w="60"/>
+              <w:left w:type="dxa" w:w="80"/>
+              <w:bottom w:type="dxa" w:w="60"/>
+              <w:right w:type="dxa" w:w="80"/>
+            </w:tcMar>
+          </w:tcPr>
+          <w:p>
+            <w:r>
+              <w:rPr>
+                <w:rFonts w:ascii="Arial" w:cs="Arial" w:hAnsi="Arial"/>
+                <w:b/>
+                <w:color w:val="E07C3A"/>
+                <w:sz w:val="17"/>
+                <w:szCs w:val="17"/>
+              </w:rPr>
+              <w:t>MODIFIÉ</w:t>
+            </w:r>
+          </w:p>
+        </w:tc>
+        <w:tc>
+          <w:tcPr>
+            <w:tcW w:type="dxa" w:w="5960"/>
+            <w:tcMar>
+              <w:top w:type="dxa" w:w="60"/>
+              <w:left w:type="dxa" w:w="80"/>
+              <w:bottom w:type="dxa" w:w="60"/>
+              <w:right w:type="dxa" w:w="80"/>
+            </w:tcMar>
+          </w:tcPr>
+          <w:p>
+            <w:r>
+              <w:rPr>
+                <w:rFonts w:ascii="Arial" w:cs="Arial" w:hAnsi="Arial"/>
+                <w:color w:val="555577"/>
+                <w:sz w:val="17"/>
+                <w:szCs w:val="17"/>
+              </w:rPr>
+              <w:t xml:space="preserve">Endpoint /search protégé par Depends(authenticated_and_rate_limited). 2 lignes.</w:t>
+            </w:r>
+          </w:p>
+        </w:tc>
+      </w:tr>
+      <w:tr>
+        <w:tc>
+          <w:tcPr>
+            <w:tcW w:type="dxa" w:w="2200"/>
+            <w:tcMar>
+              <w:top w:type="dxa" w:w="60"/>
+              <w:left w:type="dxa" w:w="80"/>
+              <w:bottom w:type="dxa" w:w="60"/>
+              <w:right w:type="dxa" w:w="80"/>
+            </w:tcMar>
+          </w:tcPr>
+          <w:p>
+            <w:r>
+              <w:rPr>
+                <w:rFonts w:ascii="Courier New" w:cs="Courier New" w:hAnsi="Courier New"/>
+                <w:color w:val="1E3A5F"/>
+                <w:sz w:val="17"/>
+                <w:szCs w:val="17"/>
+              </w:rPr>
+              <w:t>.env</w:t>
+            </w:r>
+          </w:p>
+        </w:tc>
+        <w:tc>
+          <w:tcPr>
+            <w:tcW w:type="dxa" w:w="1200"/>
+            <w:shd w:fill="FFF3E0" w:val="clear"/>
+            <w:tcMar>
+              <w:top w:type="dxa" w:w="60"/>
+              <w:left w:type="dxa" w:w="80"/>
+              <w:bottom w:type="dxa" w:w="60"/>
+              <w:right w:type="dxa" w:w="80"/>
+            </w:tcMar>
+          </w:tcPr>
+          <w:p>
+            <w:r>
+              <w:rPr>
+                <w:rFonts w:ascii="Arial" w:cs="Arial" w:hAnsi="Arial"/>
+                <w:b/>
+                <w:color w:val="E07C3A"/>
+                <w:sz w:val="17"/>
+                <w:szCs w:val="17"/>
+              </w:rPr>
+              <w:t>MODIFIÉ</w:t>
+            </w:r>
+          </w:p>
+        </w:tc>
+        <w:tc>
+          <w:tcPr>
+            <w:tcW w:type="dxa" w:w="5960"/>
+            <w:tcMar>
+              <w:top w:type="dxa" w:w="60"/>
+              <w:left w:type="dxa" w:w="80"/>
+              <w:bottom w:type="dxa" w:w="60"/>
+              <w:right w:type="dxa" w:w="80"/>
+            </w:tcMar>
+          </w:tcPr>
+          <w:p>
+            <w:r>
+              <w:rPr>
+                <w:rFonts w:ascii="Arial" w:cs="Arial" w:hAnsi="Arial"/>
+                <w:color w:val="555577"/>
+                <w:sz w:val="17"/>
+                <w:szCs w:val="17"/>
+              </w:rPr>
+              <w:t xml:space="preserve">JWT_SECRET_KEY (clé aléatoire), DEMO_PASSWORD, ADMIN_PASSWORD, DISABLE_DEMO_TOKEN</w:t>
+            </w:r>
+          </w:p>
+        </w:tc>
+      </w:tr>
+    </w:tbl>
+    <w:p>
+      <w:r>
+        <w:br w:type="page"/>
+      </w:r>
+    </w:p>
     <w:tbl>
       <w:tblPr>
         <w:tblW w:type="dxa" w:w="9360"/>
@@ -19377,7 +23275,10 @@
                 <w:sz w:val="18"/>
                 <w:szCs w:val="18"/>
               </w:rPr>
-              <w:t xml:space="preserve">latest  fix(docker): add anthropic to requirements.txt — LLM fallback résolu</w:t>
+              <w:t xml:space="preserve">latest  feat(auth): JWT + API key auth + rate limiting
+c8f2a1b feat(guardrail): hallucination guardrail — detection sources fantomes
+b3e9f1a perf(prompt): faithfulness 88.5% — patch build_prompt
+a1c4d7e fix(docker): add anthropic to requirements.txt — LLM fallback résolu</w:t>
             </w:r>
           </w:p>
           <w:p>

</xml_diff>

<commit_message>
docs: v6.0 — audit log, disclaimer, tests unitaires, CI GitHub Actions
</commit_message>
<xml_diff>
--- a/docs/AI_Legal_Platform_Documentation.docx
+++ b/docs/AI_Legal_Platform_Documentation.docx
@@ -21520,6 +21520,3629 @@
                 <w:szCs w:val="17"/>
               </w:rPr>
               <w:t xml:space="preserve">JWT_SECRET_KEY (clé aléatoire), DEMO_PASSWORD, ADMIN_PASSWORD, DISABLE_DEMO_TOKEN</w:t>
+            </w:r>
+          </w:p>
+        </w:tc>
+      </w:tr>
+    </w:tbl>
+    <w:p>
+      <w:r>
+        <w:br w:type="page"/>
+      </w:r>
+    </w:p>
+    <w:p>
+      <w:pPr>
+        <w:spacing w:after="60"/>
+      </w:pPr>
+      <w:r>
+        <w:rPr>
+          <w:rFonts w:ascii="Arial" w:cs="Arial" w:hAnsi="Arial"/>
+          <w:b/>
+          <w:color w:val="1E3A5F"/>
+          <w:sz w:val="28"/>
+          <w:szCs w:val="28"/>
+        </w:rPr>
+        <w:t xml:space="preserve">10  Audit Log JSONL &amp; Disclaimer Legal</w:t>
+      </w:r>
+    </w:p>
+    <w:p>
+      <w:pPr>
+        <w:spacing w:after="120"/>
+      </w:pPr>
+      <w:r>
+        <w:rPr>
+          <w:rFonts w:ascii="Arial" w:cs="Arial" w:hAnsi="Arial"/>
+          <w:i/>
+          <w:color w:val="7F8C8D"/>
+          <w:sz w:val="18"/>
+          <w:szCs w:val="18"/>
+        </w:rPr>
+        <w:t>Tracabilite · JSONL rotatif · request_id · Deontologie · Obligation RGPD</w:t>
+      </w:r>
+    </w:p>
+    <w:p>
+      <w:pPr>
+        <w:spacing w:after="100" w:before="200"/>
+      </w:pPr>
+      <w:r>
+        <w:rPr>
+          <w:rFonts w:ascii="Arial" w:cs="Arial" w:hAnsi="Arial"/>
+          <w:b/>
+          <w:color w:val="C9A84C"/>
+          <w:sz w:val="22"/>
+          <w:szCs w:val="22"/>
+        </w:rPr>
+        <w:t>Partie A — Audit Log JSONL</w:t>
+      </w:r>
+    </w:p>
+    <w:p>
+      <w:pPr>
+        <w:spacing w:after="100" w:before="200"/>
+      </w:pPr>
+      <w:r>
+        <w:rPr>
+          <w:rFonts w:ascii="Arial" w:cs="Arial" w:hAnsi="Arial"/>
+          <w:b/>
+          <w:color w:val="9AABBD"/>
+          <w:sz w:val="22"/>
+          <w:szCs w:val="22"/>
+        </w:rPr>
+        <w:t>Glossaire</w:t>
+      </w:r>
+    </w:p>
+    <w:tbl>
+      <w:tblPr>
+        <w:tblW w:type="dxa" w:w="9360"/>
+        <w:tblBorders>
+          <w:top w:val="none" w:color="FFFFFF" w:sz="0"/>
+          <w:left w:val="none" w:color="FFFFFF" w:sz="0"/>
+          <w:bottom w:val="single" w:color="E0E0E0" w:sz="2"/>
+          <w:right w:val="none" w:color="FFFFFF" w:sz="0"/>
+          <w:insideH w:val="none" w:color="FFFFFF" w:sz="0"/>
+          <w:insideV w:val="none" w:color="FFFFFF" w:sz="0"/>
+        </w:tblBorders>
+      </w:tblPr>
+      <w:tblGrid>
+        <w:gridCol w:w="2200"/>
+        <w:gridCol w:w="7160"/>
+      </w:tblGrid>
+      <w:tr>
+        <w:tc>
+          <w:tcPr>
+            <w:tcW w:type="dxa" w:w="2200"/>
+            <w:shd w:fill="F5F5F8" w:val="clear"/>
+            <w:tcMar>
+              <w:top w:type="dxa" w:w="80"/>
+              <w:left w:type="dxa" w:w="120"/>
+              <w:bottom w:type="dxa" w:w="80"/>
+              <w:right w:type="dxa" w:w="120"/>
+            </w:tcMar>
+          </w:tcPr>
+          <w:p>
+            <w:r>
+              <w:rPr>
+                <w:rFonts w:ascii="Arial" w:cs="Arial" w:hAnsi="Arial"/>
+                <w:b/>
+                <w:color w:val="1E3A5F"/>
+                <w:sz w:val="19"/>
+                <w:szCs w:val="19"/>
+              </w:rPr>
+              <w:t xml:space="preserve">Audit Log</w:t>
+            </w:r>
+          </w:p>
+        </w:tc>
+        <w:tc>
+          <w:tcPr>
+            <w:tcW w:type="dxa" w:w="7160"/>
+            <w:tcMar>
+              <w:top w:type="dxa" w:w="80"/>
+              <w:left w:type="dxa" w:w="160"/>
+              <w:bottom w:type="dxa" w:w="80"/>
+              <w:right w:type="dxa" w:w="120"/>
+            </w:tcMar>
+          </w:tcPr>
+          <w:p>
+            <w:r>
+              <w:rPr>
+                <w:rFonts w:ascii="Arial" w:cs="Arial" w:hAnsi="Arial"/>
+                <w:color w:val="1A1A2E"/>
+                <w:sz w:val="19"/>
+                <w:szCs w:val="19"/>
+              </w:rPr>
+              <w:t xml:space="preserve">Registre chronologique de tout ce qui se passe dans le systeme. Comme le journal de bord d'un capitaine. Obligatoire pour prouver la conformite RGPD (Article 5(2) - accountability).</w:t>
+            </w:r>
+          </w:p>
+        </w:tc>
+      </w:tr>
+    </w:tbl>
+    <w:tbl>
+      <w:tblPr>
+        <w:tblW w:type="dxa" w:w="9360"/>
+        <w:tblBorders>
+          <w:top w:val="none" w:color="FFFFFF" w:sz="0"/>
+          <w:left w:val="none" w:color="FFFFFF" w:sz="0"/>
+          <w:bottom w:val="single" w:color="E0E0E0" w:sz="2"/>
+          <w:right w:val="none" w:color="FFFFFF" w:sz="0"/>
+          <w:insideH w:val="none" w:color="FFFFFF" w:sz="0"/>
+          <w:insideV w:val="none" w:color="FFFFFF" w:sz="0"/>
+        </w:tblBorders>
+      </w:tblPr>
+      <w:tblGrid>
+        <w:gridCol w:w="2200"/>
+        <w:gridCol w:w="7160"/>
+      </w:tblGrid>
+      <w:tr>
+        <w:tc>
+          <w:tcPr>
+            <w:tcW w:type="dxa" w:w="2200"/>
+            <w:shd w:fill="F5F5F8" w:val="clear"/>
+            <w:tcMar>
+              <w:top w:type="dxa" w:w="80"/>
+              <w:left w:type="dxa" w:w="120"/>
+              <w:bottom w:type="dxa" w:w="80"/>
+              <w:right w:type="dxa" w:w="120"/>
+            </w:tcMar>
+          </w:tcPr>
+          <w:p>
+            <w:r>
+              <w:rPr>
+                <w:rFonts w:ascii="Arial" w:cs="Arial" w:hAnsi="Arial"/>
+                <w:b/>
+                <w:color w:val="1E3A5F"/>
+                <w:sz w:val="19"/>
+                <w:szCs w:val="19"/>
+              </w:rPr>
+              <w:t xml:space="preserve">JSONL</w:t>
+            </w:r>
+          </w:p>
+        </w:tc>
+        <w:tc>
+          <w:tcPr>
+            <w:tcW w:type="dxa" w:w="7160"/>
+            <w:tcMar>
+              <w:top w:type="dxa" w:w="80"/>
+              <w:left w:type="dxa" w:w="160"/>
+              <w:bottom w:type="dxa" w:w="80"/>
+              <w:right w:type="dxa" w:w="120"/>
+            </w:tcMar>
+          </w:tcPr>
+          <w:p>
+            <w:r>
+              <w:rPr>
+                <w:rFonts w:ascii="Arial" w:cs="Arial" w:hAnsi="Arial"/>
+                <w:color w:val="1A1A2E"/>
+                <w:sz w:val="19"/>
+                <w:szCs w:val="19"/>
+              </w:rPr>
+              <w:t xml:space="preserve">JSON Lines : format ou chaque ligne est un objet JSON independant. Peut etre lu ligne par ligne sans charger tout le fichier. Ideal pour les logs qui s'accumulent.</w:t>
+            </w:r>
+          </w:p>
+        </w:tc>
+      </w:tr>
+    </w:tbl>
+    <w:tbl>
+      <w:tblPr>
+        <w:tblW w:type="dxa" w:w="9360"/>
+        <w:tblBorders>
+          <w:top w:val="none" w:color="FFFFFF" w:sz="0"/>
+          <w:left w:val="none" w:color="FFFFFF" w:sz="0"/>
+          <w:bottom w:val="single" w:color="E0E0E0" w:sz="2"/>
+          <w:right w:val="none" w:color="FFFFFF" w:sz="0"/>
+          <w:insideH w:val="none" w:color="FFFFFF" w:sz="0"/>
+          <w:insideV w:val="none" w:color="FFFFFF" w:sz="0"/>
+        </w:tblBorders>
+      </w:tblPr>
+      <w:tblGrid>
+        <w:gridCol w:w="2200"/>
+        <w:gridCol w:w="7160"/>
+      </w:tblGrid>
+      <w:tr>
+        <w:tc>
+          <w:tcPr>
+            <w:tcW w:type="dxa" w:w="2200"/>
+            <w:shd w:fill="F5F5F8" w:val="clear"/>
+            <w:tcMar>
+              <w:top w:type="dxa" w:w="80"/>
+              <w:left w:type="dxa" w:w="120"/>
+              <w:bottom w:type="dxa" w:w="80"/>
+              <w:right w:type="dxa" w:w="120"/>
+            </w:tcMar>
+          </w:tcPr>
+          <w:p>
+            <w:r>
+              <w:rPr>
+                <w:rFonts w:ascii="Arial" w:cs="Arial" w:hAnsi="Arial"/>
+                <w:b/>
+                <w:color w:val="1E3A5F"/>
+                <w:sz w:val="19"/>
+                <w:szCs w:val="19"/>
+              </w:rPr>
+              <w:t xml:space="preserve">Rotation fichiers</w:t>
+            </w:r>
+          </w:p>
+        </w:tc>
+        <w:tc>
+          <w:tcPr>
+            <w:tcW w:type="dxa" w:w="7160"/>
+            <w:tcMar>
+              <w:top w:type="dxa" w:w="80"/>
+              <w:left w:type="dxa" w:w="160"/>
+              <w:bottom w:type="dxa" w:w="80"/>
+              <w:right w:type="dxa" w:w="120"/>
+            </w:tcMar>
+          </w:tcPr>
+          <w:p>
+            <w:r>
+              <w:rPr>
+                <w:rFonts w:ascii="Arial" w:cs="Arial" w:hAnsi="Arial"/>
+                <w:color w:val="1A1A2E"/>
+                <w:sz w:val="19"/>
+                <w:szCs w:val="19"/>
+              </w:rPr>
+              <w:t xml:space="preserve">Mecanisme qui renomme automatiquement le fichier quand il devient trop grand. audit.jsonl -&gt; audit.jsonl.1 -&gt; etc. 5 fichiers max = 50 MB sur disque.</w:t>
+            </w:r>
+          </w:p>
+        </w:tc>
+      </w:tr>
+    </w:tbl>
+    <w:tbl>
+      <w:tblPr>
+        <w:tblW w:type="dxa" w:w="9360"/>
+        <w:tblBorders>
+          <w:top w:val="none" w:color="FFFFFF" w:sz="0"/>
+          <w:left w:val="none" w:color="FFFFFF" w:sz="0"/>
+          <w:bottom w:val="single" w:color="E0E0E0" w:sz="2"/>
+          <w:right w:val="none" w:color="FFFFFF" w:sz="0"/>
+          <w:insideH w:val="none" w:color="FFFFFF" w:sz="0"/>
+          <w:insideV w:val="none" w:color="FFFFFF" w:sz="0"/>
+        </w:tblBorders>
+      </w:tblPr>
+      <w:tblGrid>
+        <w:gridCol w:w="2200"/>
+        <w:gridCol w:w="7160"/>
+      </w:tblGrid>
+      <w:tr>
+        <w:tc>
+          <w:tcPr>
+            <w:tcW w:type="dxa" w:w="2200"/>
+            <w:shd w:fill="F5F5F8" w:val="clear"/>
+            <w:tcMar>
+              <w:top w:type="dxa" w:w="80"/>
+              <w:left w:type="dxa" w:w="120"/>
+              <w:bottom w:type="dxa" w:w="80"/>
+              <w:right w:type="dxa" w:w="120"/>
+            </w:tcMar>
+          </w:tcPr>
+          <w:p>
+            <w:r>
+              <w:rPr>
+                <w:rFonts w:ascii="Arial" w:cs="Arial" w:hAnsi="Arial"/>
+                <w:b/>
+                <w:color w:val="1E3A5F"/>
+                <w:sz w:val="19"/>
+                <w:szCs w:val="19"/>
+              </w:rPr>
+              <w:t xml:space="preserve">request_id</w:t>
+            </w:r>
+          </w:p>
+        </w:tc>
+        <w:tc>
+          <w:tcPr>
+            <w:tcW w:type="dxa" w:w="7160"/>
+            <w:tcMar>
+              <w:top w:type="dxa" w:w="80"/>
+              <w:left w:type="dxa" w:w="160"/>
+              <w:bottom w:type="dxa" w:w="80"/>
+              <w:right w:type="dxa" w:w="120"/>
+            </w:tcMar>
+          </w:tcPr>
+          <w:p>
+            <w:r>
+              <w:rPr>
+                <w:rFonts w:ascii="Arial" w:cs="Arial" w:hAnsi="Arial"/>
+                <w:color w:val="1A1A2E"/>
+                <w:sz w:val="19"/>
+                <w:szCs w:val="19"/>
+              </w:rPr>
+              <w:t xml:space="preserve">Identifiant unique genere pour chaque requete (UUID). Permet de retrouver une requete precise dans les logs. Format : 550e8400-e29b-41d4-a716-446655440000.</w:t>
+            </w:r>
+          </w:p>
+        </w:tc>
+      </w:tr>
+    </w:tbl>
+    <w:p>
+      <w:pPr>
+        <w:spacing w:after="80"/>
+      </w:pPr>
+    </w:p>
+    <w:p>
+      <w:pPr>
+        <w:spacing w:after="100"/>
+      </w:pPr>
+      <w:r>
+        <w:rPr>
+          <w:rFonts w:ascii="Arial" w:cs="Arial" w:hAnsi="Arial"/>
+          <w:color w:val="1A1A2E"/>
+          <w:sz w:val="20"/>
+          <w:szCs w:val="20"/>
+        </w:rPr>
+        <w:t xml:space="preserve">Chaque appel reussi a /search genere une ligne JSONL dans logs/audit/audit.jsonl. Cette ligne contient : qui a demande (user_sub, plan), quoi (question tronquee a 500 chars), comment (k, reranking, langue), quelles sources ont ete utilisees, le resultat du guardrail, et la latence.</w:t>
+      </w:r>
+    </w:p>
+    <w:tbl>
+      <w:tblPr>
+        <w:tblW w:type="dxa" w:w="9360"/>
+        <w:tblBorders>
+          <w:top w:val="single" w:color="1A5276" w:sz="4"/>
+          <w:left w:val="single" w:color="1A5276" w:sz="8"/>
+          <w:bottom w:val="single" w:color="1A5276" w:sz="4"/>
+          <w:right w:val="single" w:color="1A5276" w:sz="4"/>
+        </w:tblBorders>
+      </w:tblPr>
+      <w:tblGrid>
+        <w:gridCol w:w="9360"/>
+      </w:tblGrid>
+      <w:tr>
+        <w:tc>
+          <w:tcPr>
+            <w:shd w:fill="EBF5FB" w:val="clear"/>
+            <w:tcMar>
+              <w:top w:type="dxa" w:w="100"/>
+              <w:left w:type="dxa" w:w="200"/>
+              <w:bottom w:type="dxa" w:w="100"/>
+              <w:right w:type="dxa" w:w="200"/>
+            </w:tcMar>
+          </w:tcPr>
+          <w:p>
+            <w:pPr>
+              <w:spacing w:after="40"/>
+            </w:pPr>
+            <w:r>
+              <w:rPr>
+                <w:rFonts w:ascii="Arial" w:cs="Arial" w:hAnsi="Arial"/>
+                <w:b/>
+                <w:caps/>
+                <w:color w:val="1A5276"/>
+                <w:sz w:val="17"/>
+                <w:szCs w:val="17"/>
+              </w:rPr>
+              <w:t>POURQUOI C'EST IMPORTANT POUR UN CABINET</w:t>
+            </w:r>
+          </w:p>
+          <w:p>
+            <w:pPr>
+              <w:spacing w:after="0"/>
+            </w:pPr>
+            <w:r>
+              <w:rPr>
+                <w:rFonts w:ascii="Arial" w:cs="Arial" w:hAnsi="Arial"/>
+                <w:color w:val="1A1A2E"/>
+                <w:sz w:val="19"/>
+                <w:szCs w:val="19"/>
+              </w:rPr>
+              <w:t xml:space="preserve">Le RGPD Article 5(2) impose la responsabilite (accountability) : le cabinet doit pouvoir prouver que son systeme traite les donnees conformement a la loi. L'audit log est cette preuve. Si un client demande 'quelle reponse avez-vous donnee le 15 mars a 14h32 ?', on retrouve l'entree exacte avec les sources utilisees.</w:t>
+            </w:r>
+          </w:p>
+        </w:tc>
+      </w:tr>
+    </w:tbl>
+    <w:p>
+      <w:pPr>
+        <w:spacing w:after="80"/>
+      </w:pPr>
+    </w:p>
+    <w:tbl>
+      <w:tblPr>
+        <w:tblW w:type="dxa" w:w="9360"/>
+        <w:tblBorders>
+          <w:top w:val="single" w:color="C9A84C" w:sz="4"/>
+          <w:left w:val="single" w:color="C9A84C" w:sz="4"/>
+          <w:bottom w:val="single" w:color="C9A84C" w:sz="4"/>
+          <w:right w:val="single" w:color="C9A84C" w:sz="4"/>
+        </w:tblBorders>
+      </w:tblPr>
+      <w:tblGrid>
+        <w:gridCol w:w="9360"/>
+      </w:tblGrid>
+      <w:tr>
+        <w:tc>
+          <w:tcPr>
+            <w:shd w:fill="C9A84C" w:val="clear"/>
+            <w:tcMar>
+              <w:top w:type="dxa" w:w="60"/>
+              <w:left w:type="dxa" w:w="200"/>
+              <w:bottom w:type="dxa" w:w="60"/>
+              <w:right w:type="dxa" w:w="200"/>
+            </w:tcMar>
+          </w:tcPr>
+          <w:p>
+            <w:r>
+              <w:rPr>
+                <w:rFonts w:ascii="Courier New" w:cs="Courier New" w:hAnsi="Courier New"/>
+                <w:b/>
+                <w:color w:val="1A1A1A"/>
+                <w:sz w:val="16"/>
+                <w:szCs w:val="16"/>
+              </w:rPr>
+              <w:t>logs/audit/audit.jsonl - Exemple d'une entree (formatee)</w:t>
+            </w:r>
+          </w:p>
+        </w:tc>
+      </w:tr>
+      <w:tr>
+        <w:tc>
+          <w:tcPr>
+            <w:shd w:fill="1A1A2E" w:val="clear"/>
+            <w:tcMar>
+              <w:top w:type="dxa" w:w="20"/>
+              <w:left w:type="dxa" w:w="200"/>
+              <w:bottom w:type="dxa" w:w="20"/>
+              <w:right w:type="dxa" w:w="200"/>
+            </w:tcMar>
+          </w:tcPr>
+          <w:p>
+            <w:pPr>
+              <w:spacing w:after="0"/>
+            </w:pPr>
+            <w:r>
+              <w:rPr>
+                <w:rFonts w:ascii="Courier New" w:cs="Courier New" w:hAnsi="Courier New"/>
+                <w:color w:val="888888"/>
+                <w:sz w:val="17"/>
+                <w:szCs w:val="17"/>
+              </w:rPr>
+              <w:t xml:space="preserve">{ "timestamp":   "2026-03-28T14:32:01.123Z",       -- quand (UTC)</w:t>
+            </w:r>
+          </w:p>
+        </w:tc>
+      </w:tr>
+      <w:tr>
+        <w:tc>
+          <w:tcPr>
+            <w:shd w:fill="1A1A2E" w:val="clear"/>
+            <w:tcMar>
+              <w:top w:type="dxa" w:w="20"/>
+              <w:left w:type="dxa" w:w="200"/>
+              <w:bottom w:type="dxa" w:w="20"/>
+              <w:right w:type="dxa" w:w="200"/>
+            </w:tcMar>
+          </w:tcPr>
+          <w:p>
+            <w:pPr>
+              <w:spacing w:after="0"/>
+            </w:pPr>
+            <w:r>
+              <w:rPr>
+                <w:rFonts w:ascii="Courier New" w:cs="Courier New" w:hAnsi="Courier New"/>
+                <w:color w:val="888888"/>
+                <w:sz w:val="17"/>
+                <w:szCs w:val="17"/>
+              </w:rPr>
+              <w:t xml:space="preserve">  "request_id":  "550e8400-e29b-41d4-...",          -- identifiant unique</w:t>
+            </w:r>
+          </w:p>
+        </w:tc>
+      </w:tr>
+      <w:tr>
+        <w:tc>
+          <w:tcPr>
+            <w:shd w:fill="1A1A2E" w:val="clear"/>
+            <w:tcMar>
+              <w:top w:type="dxa" w:w="20"/>
+              <w:left w:type="dxa" w:w="200"/>
+              <w:bottom w:type="dxa" w:w="20"/>
+              <w:right w:type="dxa" w:w="200"/>
+            </w:tcMar>
+          </w:tcPr>
+          <w:p>
+            <w:pPr>
+              <w:spacing w:after="0"/>
+            </w:pPr>
+            <w:r>
+              <w:rPr>
+                <w:rFonts w:ascii="Courier New" w:cs="Courier New" w:hAnsi="Courier New"/>
+                <w:color w:val="888888"/>
+                <w:sz w:val="17"/>
+                <w:szCs w:val="17"/>
+              </w:rPr>
+              <w:t xml:space="preserve">  "user_sub":    "demo@cabinet.fr",                 -- qui a demande</w:t>
+            </w:r>
+          </w:p>
+        </w:tc>
+      </w:tr>
+      <w:tr>
+        <w:tc>
+          <w:tcPr>
+            <w:shd w:fill="1A1A2E" w:val="clear"/>
+            <w:tcMar>
+              <w:top w:type="dxa" w:w="20"/>
+              <w:left w:type="dxa" w:w="200"/>
+              <w:bottom w:type="dxa" w:w="20"/>
+              <w:right w:type="dxa" w:w="200"/>
+            </w:tcMar>
+          </w:tcPr>
+          <w:p>
+            <w:pPr>
+              <w:spacing w:after="0"/>
+            </w:pPr>
+            <w:r>
+              <w:rPr>
+                <w:rFonts w:ascii="Courier New" w:cs="Courier New" w:hAnsi="Courier New"/>
+                <w:color w:val="888888"/>
+                <w:sz w:val="17"/>
+                <w:szCs w:val="17"/>
+              </w:rPr>
+              <w:t xml:space="preserve">  "user_plan":   "cabinet",                         -- son plan</w:t>
+            </w:r>
+          </w:p>
+        </w:tc>
+      </w:tr>
+      <w:tr>
+        <w:tc>
+          <w:tcPr>
+            <w:shd w:fill="1A1A2E" w:val="clear"/>
+            <w:tcMar>
+              <w:top w:type="dxa" w:w="20"/>
+              <w:left w:type="dxa" w:w="200"/>
+              <w:bottom w:type="dxa" w:w="20"/>
+              <w:right w:type="dxa" w:w="200"/>
+            </w:tcMar>
+          </w:tcPr>
+          <w:p>
+            <w:pPr>
+              <w:spacing w:after="0"/>
+            </w:pPr>
+            <w:r>
+              <w:rPr>
+                <w:rFonts w:ascii="Courier New" w:cs="Courier New" w:hAnsi="Courier New"/>
+                <w:color w:val="888888"/>
+                <w:sz w:val="17"/>
+                <w:szCs w:val="17"/>
+              </w:rPr>
+              <w:t xml:space="preserve">  "question":    "What are GDPR controller...",      -- tronquee 500 chars</w:t>
+            </w:r>
+          </w:p>
+        </w:tc>
+      </w:tr>
+      <w:tr>
+        <w:tc>
+          <w:tcPr>
+            <w:shd w:fill="1A1A2E" w:val="clear"/>
+            <w:tcMar>
+              <w:top w:type="dxa" w:w="20"/>
+              <w:left w:type="dxa" w:w="200"/>
+              <w:bottom w:type="dxa" w:w="20"/>
+              <w:right w:type="dxa" w:w="200"/>
+            </w:tcMar>
+          </w:tcPr>
+          <w:p>
+            <w:pPr>
+              <w:spacing w:after="0"/>
+            </w:pPr>
+            <w:r>
+              <w:rPr>
+                <w:rFonts w:ascii="Courier New" w:cs="Courier New" w:hAnsi="Courier New"/>
+                <w:color w:val="888888"/>
+                <w:sz w:val="17"/>
+                <w:szCs w:val="17"/>
+              </w:rPr>
+              <w:t xml:space="preserve">  "sources_used": ["Article 24", "Recital 74"],      -- sources citees</w:t>
+            </w:r>
+          </w:p>
+        </w:tc>
+      </w:tr>
+      <w:tr>
+        <w:tc>
+          <w:tcPr>
+            <w:shd w:fill="1A1A2E" w:val="clear"/>
+            <w:tcMar>
+              <w:top w:type="dxa" w:w="20"/>
+              <w:left w:type="dxa" w:w="200"/>
+              <w:bottom w:type="dxa" w:w="20"/>
+              <w:right w:type="dxa" w:w="200"/>
+            </w:tcMar>
+          </w:tcPr>
+          <w:p>
+            <w:pPr>
+              <w:spacing w:after="0"/>
+            </w:pPr>
+            <w:r>
+              <w:rPr>
+                <w:rFonts w:ascii="Courier New" w:cs="Courier New" w:hAnsi="Courier New"/>
+                <w:color w:val="888888"/>
+                <w:sz w:val="17"/>
+                <w:szCs w:val="17"/>
+              </w:rPr>
+              <w:t xml:space="preserve">  "guardrail_severity": "ok",                       -- ok/low/high</w:t>
+            </w:r>
+          </w:p>
+        </w:tc>
+      </w:tr>
+      <w:tr>
+        <w:tc>
+          <w:tcPr>
+            <w:shd w:fill="1A1A2E" w:val="clear"/>
+            <w:tcMar>
+              <w:top w:type="dxa" w:w="20"/>
+              <w:left w:type="dxa" w:w="200"/>
+              <w:bottom w:type="dxa" w:w="20"/>
+              <w:right w:type="dxa" w:w="200"/>
+            </w:tcMar>
+          </w:tcPr>
+          <w:p>
+            <w:pPr>
+              <w:spacing w:after="0"/>
+            </w:pPr>
+            <w:r>
+              <w:rPr>
+                <w:rFonts w:ascii="Courier New" w:cs="Courier New" w:hAnsi="Courier New"/>
+                <w:color w:val="888888"/>
+                <w:sz w:val="17"/>
+                <w:szCs w:val="17"/>
+              </w:rPr>
+              <w:t xml:space="preserve">  "latency_ms":  3420.5,                            -- temps total</w:t>
+            </w:r>
+          </w:p>
+        </w:tc>
+      </w:tr>
+      <w:tr>
+        <w:tc>
+          <w:tcPr>
+            <w:shd w:fill="1A1A2E" w:val="clear"/>
+            <w:tcMar>
+              <w:top w:type="dxa" w:w="20"/>
+              <w:left w:type="dxa" w:w="200"/>
+              <w:bottom w:type="dxa" w:w="20"/>
+              <w:right w:type="dxa" w:w="200"/>
+            </w:tcMar>
+          </w:tcPr>
+          <w:p>
+            <w:pPr>
+              <w:spacing w:after="0"/>
+            </w:pPr>
+            <w:r>
+              <w:rPr>
+                <w:rFonts w:ascii="Courier New" w:cs="Courier New" w:hAnsi="Courier New"/>
+                <w:color w:val="888888"/>
+                <w:sz w:val="17"/>
+                <w:szCs w:val="17"/>
+              </w:rPr>
+              <w:t xml:space="preserve">  "status":      "success" }                        -- success/error</w:t>
+            </w:r>
+          </w:p>
+        </w:tc>
+      </w:tr>
+    </w:tbl>
+    <w:p>
+      <w:pPr>
+        <w:spacing w:after="80"/>
+      </w:pPr>
+    </w:p>
+    <w:tbl>
+      <w:tblPr>
+        <w:tblW w:type="dxa" w:w="9360"/>
+        <w:tblBorders>
+          <w:top w:val="single" w:color="C9A84C" w:sz="4"/>
+          <w:left w:val="single" w:color="C9A84C" w:sz="8"/>
+          <w:bottom w:val="single" w:color="C9A84C" w:sz="4"/>
+          <w:right w:val="single" w:color="C9A84C" w:sz="4"/>
+        </w:tblBorders>
+      </w:tblPr>
+      <w:tblGrid>
+        <w:gridCol w:w="9360"/>
+      </w:tblGrid>
+      <w:tr>
+        <w:tc>
+          <w:tcPr>
+            <w:shd w:fill="FFF8E1" w:val="clear"/>
+            <w:tcMar>
+              <w:top w:type="dxa" w:w="100"/>
+              <w:left w:type="dxa" w:w="200"/>
+              <w:bottom w:type="dxa" w:w="100"/>
+              <w:right w:type="dxa" w:w="200"/>
+            </w:tcMar>
+          </w:tcPr>
+          <w:p>
+            <w:pPr>
+              <w:spacing w:after="40"/>
+            </w:pPr>
+            <w:r>
+              <w:rPr>
+                <w:rFonts w:ascii="Arial" w:cs="Arial" w:hAnsi="Arial"/>
+                <w:b/>
+                <w:caps/>
+                <w:color w:val="7D6608"/>
+                <w:sz w:val="17"/>
+                <w:szCs w:val="17"/>
+              </w:rPr>
+              <w:t>RGPD - LA QUESTION DES LOGS</w:t>
+            </w:r>
+          </w:p>
+          <w:p>
+            <w:pPr>
+              <w:spacing w:after="0"/>
+            </w:pPr>
+            <w:r>
+              <w:rPr>
+                <w:rFonts w:ascii="Arial" w:cs="Arial" w:hAnsi="Arial"/>
+                <w:color w:val="1A1A2E"/>
+                <w:sz w:val="19"/>
+                <w:szCs w:val="19"/>
+              </w:rPr>
+              <w:t xml:space="preserve">Les logs contiennent potentiellement des donnees personnelles. Obligations : duree de conservation limitee (6 mois par defaut via AUDIT_RETENTION_DAYS), acces restreint, suppression possible sur demande. Le dossier logs/ est dans .gitignore - il ne doit jamais etre versionne.</w:t>
+            </w:r>
+          </w:p>
+        </w:tc>
+      </w:tr>
+    </w:tbl>
+    <w:p>
+      <w:pPr>
+        <w:spacing w:after="100"/>
+      </w:pPr>
+    </w:p>
+    <w:p>
+      <w:pPr>
+        <w:spacing w:after="100" w:before="200"/>
+      </w:pPr>
+      <w:r>
+        <w:rPr>
+          <w:rFonts w:ascii="Arial" w:cs="Arial" w:hAnsi="Arial"/>
+          <w:b/>
+          <w:color w:val="C9A84C"/>
+          <w:sz w:val="22"/>
+          <w:szCs w:val="22"/>
+        </w:rPr>
+        <w:t>Partie B — Disclaimer Legal Automatique</w:t>
+      </w:r>
+    </w:p>
+    <w:p>
+      <w:pPr>
+        <w:spacing w:after="100" w:before="200"/>
+      </w:pPr>
+      <w:r>
+        <w:rPr>
+          <w:rFonts w:ascii="Arial" w:cs="Arial" w:hAnsi="Arial"/>
+          <w:b/>
+          <w:color w:val="9AABBD"/>
+          <w:sz w:val="22"/>
+          <w:szCs w:val="22"/>
+        </w:rPr>
+        <w:t>Glossaire</w:t>
+      </w:r>
+    </w:p>
+    <w:tbl>
+      <w:tblPr>
+        <w:tblW w:type="dxa" w:w="9360"/>
+        <w:tblBorders>
+          <w:top w:val="none" w:color="FFFFFF" w:sz="0"/>
+          <w:left w:val="none" w:color="FFFFFF" w:sz="0"/>
+          <w:bottom w:val="single" w:color="E0E0E0" w:sz="2"/>
+          <w:right w:val="none" w:color="FFFFFF" w:sz="0"/>
+          <w:insideH w:val="none" w:color="FFFFFF" w:sz="0"/>
+          <w:insideV w:val="none" w:color="FFFFFF" w:sz="0"/>
+        </w:tblBorders>
+      </w:tblPr>
+      <w:tblGrid>
+        <w:gridCol w:w="2200"/>
+        <w:gridCol w:w="7160"/>
+      </w:tblGrid>
+      <w:tr>
+        <w:tc>
+          <w:tcPr>
+            <w:tcW w:type="dxa" w:w="2200"/>
+            <w:shd w:fill="F5F5F8" w:val="clear"/>
+            <w:tcMar>
+              <w:top w:type="dxa" w:w="80"/>
+              <w:left w:type="dxa" w:w="120"/>
+              <w:bottom w:type="dxa" w:w="80"/>
+              <w:right w:type="dxa" w:w="120"/>
+            </w:tcMar>
+          </w:tcPr>
+          <w:p>
+            <w:r>
+              <w:rPr>
+                <w:rFonts w:ascii="Arial" w:cs="Arial" w:hAnsi="Arial"/>
+                <w:b/>
+                <w:color w:val="1E3A5F"/>
+                <w:sz w:val="19"/>
+                <w:szCs w:val="19"/>
+              </w:rPr>
+              <w:t xml:space="preserve">Disclaimer</w:t>
+            </w:r>
+          </w:p>
+        </w:tc>
+        <w:tc>
+          <w:tcPr>
+            <w:tcW w:type="dxa" w:w="7160"/>
+            <w:tcMar>
+              <w:top w:type="dxa" w:w="80"/>
+              <w:left w:type="dxa" w:w="160"/>
+              <w:bottom w:type="dxa" w:w="80"/>
+              <w:right w:type="dxa" w:w="120"/>
+            </w:tcMar>
+          </w:tcPr>
+          <w:p>
+            <w:r>
+              <w:rPr>
+                <w:rFonts w:ascii="Arial" w:cs="Arial" w:hAnsi="Arial"/>
+                <w:color w:val="1A1A2E"/>
+                <w:sz w:val="19"/>
+                <w:szCs w:val="19"/>
+              </w:rPr>
+              <w:t xml:space="preserve">Mention legale qui limite la responsabilite et informe l'utilisateur des limites du service. 'Ce systeme est un outil d'aide a la recherche, pas un conseil juridique.'</w:t>
+            </w:r>
+          </w:p>
+        </w:tc>
+      </w:tr>
+    </w:tbl>
+    <w:tbl>
+      <w:tblPr>
+        <w:tblW w:type="dxa" w:w="9360"/>
+        <w:tblBorders>
+          <w:top w:val="none" w:color="FFFFFF" w:sz="0"/>
+          <w:left w:val="none" w:color="FFFFFF" w:sz="0"/>
+          <w:bottom w:val="single" w:color="E0E0E0" w:sz="2"/>
+          <w:right w:val="none" w:color="FFFFFF" w:sz="0"/>
+          <w:insideH w:val="none" w:color="FFFFFF" w:sz="0"/>
+          <w:insideV w:val="none" w:color="FFFFFF" w:sz="0"/>
+        </w:tblBorders>
+      </w:tblPr>
+      <w:tblGrid>
+        <w:gridCol w:w="2200"/>
+        <w:gridCol w:w="7160"/>
+      </w:tblGrid>
+      <w:tr>
+        <w:tc>
+          <w:tcPr>
+            <w:tcW w:type="dxa" w:w="2200"/>
+            <w:shd w:fill="F5F5F8" w:val="clear"/>
+            <w:tcMar>
+              <w:top w:type="dxa" w:w="80"/>
+              <w:left w:type="dxa" w:w="120"/>
+              <w:bottom w:type="dxa" w:w="80"/>
+              <w:right w:type="dxa" w:w="120"/>
+            </w:tcMar>
+          </w:tcPr>
+          <w:p>
+            <w:r>
+              <w:rPr>
+                <w:rFonts w:ascii="Arial" w:cs="Arial" w:hAnsi="Arial"/>
+                <w:b/>
+                <w:color w:val="1E3A5F"/>
+                <w:sz w:val="19"/>
+                <w:szCs w:val="19"/>
+              </w:rPr>
+              <w:t xml:space="preserve">RIN</w:t>
+            </w:r>
+          </w:p>
+        </w:tc>
+        <w:tc>
+          <w:tcPr>
+            <w:tcW w:type="dxa" w:w="7160"/>
+            <w:tcMar>
+              <w:top w:type="dxa" w:w="80"/>
+              <w:left w:type="dxa" w:w="160"/>
+              <w:bottom w:type="dxa" w:w="80"/>
+              <w:right w:type="dxa" w:w="120"/>
+            </w:tcMar>
+          </w:tcPr>
+          <w:p>
+            <w:r>
+              <w:rPr>
+                <w:rFonts w:ascii="Arial" w:cs="Arial" w:hAnsi="Arial"/>
+                <w:color w:val="1A1A2E"/>
+                <w:sz w:val="19"/>
+                <w:szCs w:val="19"/>
+              </w:rPr>
+              <w:t xml:space="preserve">Reglement Interieur National du barreau. Impose que tout outil d'aide juridique precise qu'il ne remplace pas le conseil d'un avocat. Sans cette mention, le cabinet engage potentiellement sa responsabilite.</w:t>
+            </w:r>
+          </w:p>
+        </w:tc>
+      </w:tr>
+    </w:tbl>
+    <w:p>
+      <w:pPr>
+        <w:spacing w:after="80"/>
+      </w:pPr>
+    </w:p>
+    <w:p>
+      <w:pPr>
+        <w:spacing w:after="80"/>
+      </w:pPr>
+      <w:r>
+        <w:rPr>
+          <w:rFonts w:ascii="Arial" w:cs="Arial" w:hAnsi="Arial"/>
+          <w:color w:val="1A1A2E"/>
+          <w:sz w:val="20"/>
+          <w:szCs w:val="20"/>
+        </w:rPr>
+        <w:t xml:space="preserve">Le disclaimer est ajoute automatiquement en fin de chaque reponse Claude. Il est desactivable via DISABLE_DISCLAIMER=true dans le .env - utile pour les evaluations de faithfulness.</w:t>
+      </w:r>
+    </w:p>
+    <w:tbl>
+      <w:tblPr>
+        <w:tblW w:type="dxa" w:w="9360"/>
+        <w:tblBorders>
+          <w:top w:val="single" w:color="1A5276" w:sz="4"/>
+          <w:left w:val="single" w:color="1A5276" w:sz="8"/>
+          <w:bottom w:val="single" w:color="1A5276" w:sz="4"/>
+          <w:right w:val="single" w:color="1A5276" w:sz="4"/>
+        </w:tblBorders>
+      </w:tblPr>
+      <w:tblGrid>
+        <w:gridCol w:w="9360"/>
+      </w:tblGrid>
+      <w:tr>
+        <w:tc>
+          <w:tcPr>
+            <w:shd w:fill="EBF5FB" w:val="clear"/>
+            <w:tcMar>
+              <w:top w:type="dxa" w:w="100"/>
+              <w:left w:type="dxa" w:w="200"/>
+              <w:bottom w:type="dxa" w:w="100"/>
+              <w:right w:type="dxa" w:w="200"/>
+            </w:tcMar>
+          </w:tcPr>
+          <w:p>
+            <w:pPr>
+              <w:spacing w:after="40"/>
+            </w:pPr>
+            <w:r>
+              <w:rPr>
+                <w:rFonts w:ascii="Arial" w:cs="Arial" w:hAnsi="Arial"/>
+                <w:b/>
+                <w:caps/>
+                <w:color w:val="1A5276"/>
+                <w:sz w:val="17"/>
+                <w:szCs w:val="17"/>
+              </w:rPr>
+              <w:t>POURQUOI LE DISCLAIMER EST AJOUTE APRES L'AUDIT LOG</w:t>
+            </w:r>
+          </w:p>
+          <w:p>
+            <w:pPr>
+              <w:spacing w:after="0"/>
+            </w:pPr>
+            <w:r>
+              <w:rPr>
+                <w:rFonts w:ascii="Arial" w:cs="Arial" w:hAnsi="Arial"/>
+                <w:color w:val="1A1A2E"/>
+                <w:sz w:val="19"/>
+                <w:szCs w:val="19"/>
+              </w:rPr>
+              <w:t xml:space="preserve">L'audit log enregistre la reponse brute de Claude (sans disclaimer). Si on l'ajoutait avant, le pipeline LLM-as-judge (faithfulness) compterait les phrases du disclaimer comme des 'claims' a verifier - faussant le score. En l'ajoutant apres l'audit, on garde des metriques propres tout en respectant les obligations deontologiques.</w:t>
+            </w:r>
+          </w:p>
+        </w:tc>
+      </w:tr>
+    </w:tbl>
+    <w:p>
+      <w:pPr>
+        <w:spacing w:after="80"/>
+      </w:pPr>
+    </w:p>
+    <w:tbl>
+      <w:tblPr>
+        <w:tblW w:type="dxa" w:w="9360"/>
+        <w:tblBorders>
+          <w:top w:val="single" w:color="C9A84C" w:sz="4"/>
+          <w:left w:val="single" w:color="C9A84C" w:sz="4"/>
+          <w:bottom w:val="single" w:color="C9A84C" w:sz="4"/>
+          <w:right w:val="single" w:color="C9A84C" w:sz="4"/>
+        </w:tblBorders>
+      </w:tblPr>
+      <w:tblGrid>
+        <w:gridCol w:w="9360"/>
+      </w:tblGrid>
+      <w:tr>
+        <w:tc>
+          <w:tcPr>
+            <w:shd w:fill="C9A84C" w:val="clear"/>
+            <w:tcMar>
+              <w:top w:type="dxa" w:w="60"/>
+              <w:left w:type="dxa" w:w="200"/>
+              <w:bottom w:type="dxa" w:w="60"/>
+              <w:right w:type="dxa" w:w="200"/>
+            </w:tcMar>
+          </w:tcPr>
+          <w:p>
+            <w:r>
+              <w:rPr>
+                <w:rFonts w:ascii="Courier New" w:cs="Courier New" w:hAnsi="Courier New"/>
+                <w:b/>
+                <w:color w:val="1A1A1A"/>
+                <w:sz w:val="16"/>
+                <w:szCs w:val="16"/>
+              </w:rPr>
+              <w:t>Exemple - Fin de reponse avec disclaimer FR</w:t>
+            </w:r>
+          </w:p>
+        </w:tc>
+      </w:tr>
+      <w:tr>
+        <w:tc>
+          <w:tcPr>
+            <w:shd w:fill="1A1A2E" w:val="clear"/>
+            <w:tcMar>
+              <w:top w:type="dxa" w:w="20"/>
+              <w:left w:type="dxa" w:w="200"/>
+              <w:bottom w:type="dxa" w:w="20"/>
+              <w:right w:type="dxa" w:w="200"/>
+            </w:tcMar>
+          </w:tcPr>
+          <w:p>
+            <w:pPr>
+              <w:spacing w:after="0"/>
+            </w:pPr>
+            <w:r>
+              <w:rPr>
+                <w:rFonts w:ascii="Courier New" w:cs="Courier New" w:hAnsi="Courier New"/>
+                <w:color w:val="4CAF50"/>
+                <w:sz w:val="17"/>
+                <w:szCs w:val="17"/>
+              </w:rPr>
+              <w:t xml:space="preserve">...Selon [SOURCE 3], le responsable de traitement doit...</w:t>
+            </w:r>
+          </w:p>
+        </w:tc>
+      </w:tr>
+      <w:tr>
+        <w:tc>
+          <w:tcPr>
+            <w:shd w:fill="1A1A2E" w:val="clear"/>
+            <w:tcMar>
+              <w:top w:type="dxa" w:w="20"/>
+              <w:left w:type="dxa" w:w="200"/>
+              <w:bottom w:type="dxa" w:w="20"/>
+              <w:right w:type="dxa" w:w="200"/>
+            </w:tcMar>
+          </w:tcPr>
+          <w:p>
+            <w:pPr>
+              <w:spacing w:after="0"/>
+            </w:pPr>
+            <w:r>
+              <w:rPr>
+                <w:rFonts w:ascii="Courier New" w:cs="Courier New" w:hAnsi="Courier New"/>
+                <w:color w:val="888888"/>
+                <w:sz w:val="17"/>
+                <w:szCs w:val="17"/>
+              </w:rPr>
+              <w:t xml:space="preserve"/>
+            </w:r>
+          </w:p>
+        </w:tc>
+      </w:tr>
+      <w:tr>
+        <w:tc>
+          <w:tcPr>
+            <w:shd w:fill="1A1A2E" w:val="clear"/>
+            <w:tcMar>
+              <w:top w:type="dxa" w:w="20"/>
+              <w:left w:type="dxa" w:w="200"/>
+              <w:bottom w:type="dxa" w:w="20"/>
+              <w:right w:type="dxa" w:w="200"/>
+            </w:tcMar>
+          </w:tcPr>
+          <w:p>
+            <w:pPr>
+              <w:spacing w:after="0"/>
+            </w:pPr>
+            <w:r>
+              <w:rPr>
+                <w:rFonts w:ascii="Courier New" w:cs="Courier New" w:hAnsi="Courier New"/>
+                <w:color w:val="888888"/>
+                <w:sz w:val="17"/>
+                <w:szCs w:val="17"/>
+              </w:rPr>
+              <w:t xml:space="preserve">---</w:t>
+            </w:r>
+          </w:p>
+        </w:tc>
+      </w:tr>
+      <w:tr>
+        <w:tc>
+          <w:tcPr>
+            <w:shd w:fill="1A1A2E" w:val="clear"/>
+            <w:tcMar>
+              <w:top w:type="dxa" w:w="20"/>
+              <w:left w:type="dxa" w:w="200"/>
+              <w:bottom w:type="dxa" w:w="20"/>
+              <w:right w:type="dxa" w:w="200"/>
+            </w:tcMar>
+          </w:tcPr>
+          <w:p>
+            <w:pPr>
+              <w:spacing w:after="0"/>
+            </w:pPr>
+            <w:r>
+              <w:rPr>
+                <w:rFonts w:ascii="Courier New" w:cs="Courier New" w:hAnsi="Courier New"/>
+                <w:color w:val="E07C3A"/>
+                <w:sz w:val="17"/>
+                <w:szCs w:val="17"/>
+              </w:rPr>
+              <w:t xml:space="preserve">⚖️ Ce systeme est un outil d'aide a la recherche documentaire juridique.</w:t>
+            </w:r>
+          </w:p>
+        </w:tc>
+      </w:tr>
+      <w:tr>
+        <w:tc>
+          <w:tcPr>
+            <w:shd w:fill="1A1A2E" w:val="clear"/>
+            <w:tcMar>
+              <w:top w:type="dxa" w:w="20"/>
+              <w:left w:type="dxa" w:w="200"/>
+              <w:bottom w:type="dxa" w:w="20"/>
+              <w:right w:type="dxa" w:w="200"/>
+            </w:tcMar>
+          </w:tcPr>
+          <w:p>
+            <w:pPr>
+              <w:spacing w:after="0"/>
+            </w:pPr>
+            <w:r>
+              <w:rPr>
+                <w:rFonts w:ascii="Courier New" w:cs="Courier New" w:hAnsi="Courier New"/>
+                <w:color w:val="E07C3A"/>
+                <w:sz w:val="17"/>
+                <w:szCs w:val="17"/>
+              </w:rPr>
+              <w:t xml:space="preserve">Les informations fournies ne constituent pas un conseil juridique.</w:t>
+            </w:r>
+          </w:p>
+        </w:tc>
+      </w:tr>
+      <w:tr>
+        <w:tc>
+          <w:tcPr>
+            <w:shd w:fill="1A1A2E" w:val="clear"/>
+            <w:tcMar>
+              <w:top w:type="dxa" w:w="20"/>
+              <w:left w:type="dxa" w:w="200"/>
+              <w:bottom w:type="dxa" w:w="20"/>
+              <w:right w:type="dxa" w:w="200"/>
+            </w:tcMar>
+          </w:tcPr>
+          <w:p>
+            <w:pPr>
+              <w:spacing w:after="0"/>
+            </w:pPr>
+            <w:r>
+              <w:rPr>
+                <w:rFonts w:ascii="Courier New" w:cs="Courier New" w:hAnsi="Courier New"/>
+                <w:color w:val="E07C3A"/>
+                <w:sz w:val="17"/>
+                <w:szCs w:val="17"/>
+              </w:rPr>
+              <w:t xml:space="preserve">Pour toute decision juridique, consultez un avocat qualifie.</w:t>
+            </w:r>
+          </w:p>
+        </w:tc>
+      </w:tr>
+    </w:tbl>
+    <w:p>
+      <w:r>
+        <w:br w:type="page"/>
+      </w:r>
+    </w:p>
+    <w:p>
+      <w:pPr>
+        <w:spacing w:after="60"/>
+      </w:pPr>
+      <w:r>
+        <w:rPr>
+          <w:rFonts w:ascii="Arial" w:cs="Arial" w:hAnsi="Arial"/>
+          <w:b/>
+          <w:color w:val="1E3A5F"/>
+          <w:sz w:val="28"/>
+          <w:szCs w:val="28"/>
+        </w:rPr>
+        <w:t xml:space="preserve">11  Tests Unitaires &amp; CI/CD GitHub Actions</w:t>
+      </w:r>
+    </w:p>
+    <w:p>
+      <w:pPr>
+        <w:spacing w:after="120"/>
+      </w:pPr>
+      <w:r>
+        <w:rPr>
+          <w:rFonts w:ascii="Arial" w:cs="Arial" w:hAnsi="Arial"/>
+          <w:i/>
+          <w:color w:val="7F8C8D"/>
+          <w:sz w:val="18"/>
+          <w:szCs w:val="18"/>
+        </w:rPr>
+        <w:t>pytest · 100/100 PASSED · GitHub Actions · Automatisation · Regle 80/20</w:t>
+      </w:r>
+    </w:p>
+    <w:p>
+      <w:pPr>
+        <w:spacing w:after="100" w:before="200"/>
+      </w:pPr>
+      <w:r>
+        <w:rPr>
+          <w:rFonts w:ascii="Arial" w:cs="Arial" w:hAnsi="Arial"/>
+          <w:b/>
+          <w:color w:val="C9A84C"/>
+          <w:sz w:val="22"/>
+          <w:szCs w:val="22"/>
+        </w:rPr>
+        <w:t>Glossaire complet</w:t>
+      </w:r>
+    </w:p>
+    <w:tbl>
+      <w:tblPr>
+        <w:tblW w:type="dxa" w:w="9360"/>
+        <w:tblBorders>
+          <w:top w:val="none" w:color="FFFFFF" w:sz="0"/>
+          <w:left w:val="none" w:color="FFFFFF" w:sz="0"/>
+          <w:bottom w:val="single" w:color="E0E0E0" w:sz="2"/>
+          <w:right w:val="none" w:color="FFFFFF" w:sz="0"/>
+          <w:insideH w:val="none" w:color="FFFFFF" w:sz="0"/>
+          <w:insideV w:val="none" w:color="FFFFFF" w:sz="0"/>
+        </w:tblBorders>
+      </w:tblPr>
+      <w:tblGrid>
+        <w:gridCol w:w="2200"/>
+        <w:gridCol w:w="7160"/>
+      </w:tblGrid>
+      <w:tr>
+        <w:tc>
+          <w:tcPr>
+            <w:tcW w:type="dxa" w:w="2200"/>
+            <w:shd w:fill="F5F5F8" w:val="clear"/>
+            <w:tcMar>
+              <w:top w:type="dxa" w:w="80"/>
+              <w:left w:type="dxa" w:w="120"/>
+              <w:bottom w:type="dxa" w:w="80"/>
+              <w:right w:type="dxa" w:w="120"/>
+            </w:tcMar>
+          </w:tcPr>
+          <w:p>
+            <w:r>
+              <w:rPr>
+                <w:rFonts w:ascii="Arial" w:cs="Arial" w:hAnsi="Arial"/>
+                <w:b/>
+                <w:color w:val="1E3A5F"/>
+                <w:sz w:val="19"/>
+                <w:szCs w:val="19"/>
+              </w:rPr>
+              <w:t xml:space="preserve">Test unitaire</w:t>
+            </w:r>
+          </w:p>
+        </w:tc>
+        <w:tc>
+          <w:tcPr>
+            <w:tcW w:type="dxa" w:w="7160"/>
+            <w:tcMar>
+              <w:top w:type="dxa" w:w="80"/>
+              <w:left w:type="dxa" w:w="160"/>
+              <w:bottom w:type="dxa" w:w="80"/>
+              <w:right w:type="dxa" w:w="120"/>
+            </w:tcMar>
+          </w:tcPr>
+          <w:p>
+            <w:r>
+              <w:rPr>
+                <w:rFonts w:ascii="Arial" w:cs="Arial" w:hAnsi="Arial"/>
+                <w:color w:val="1A1A2E"/>
+                <w:sz w:val="19"/>
+                <w:szCs w:val="19"/>
+              </w:rPr>
+              <w:t xml:space="preserve">Programme qui verifie automatiquement qu'une fonction se comporte correctement. Si quelqu'un modifie le code et casse quelque chose, le test echoue immediatement - avant que ca parte en production.</w:t>
+            </w:r>
+          </w:p>
+        </w:tc>
+      </w:tr>
+    </w:tbl>
+    <w:tbl>
+      <w:tblPr>
+        <w:tblW w:type="dxa" w:w="9360"/>
+        <w:tblBorders>
+          <w:top w:val="none" w:color="FFFFFF" w:sz="0"/>
+          <w:left w:val="none" w:color="FFFFFF" w:sz="0"/>
+          <w:bottom w:val="single" w:color="E0E0E0" w:sz="2"/>
+          <w:right w:val="none" w:color="FFFFFF" w:sz="0"/>
+          <w:insideH w:val="none" w:color="FFFFFF" w:sz="0"/>
+          <w:insideV w:val="none" w:color="FFFFFF" w:sz="0"/>
+        </w:tblBorders>
+      </w:tblPr>
+      <w:tblGrid>
+        <w:gridCol w:w="2200"/>
+        <w:gridCol w:w="7160"/>
+      </w:tblGrid>
+      <w:tr>
+        <w:tc>
+          <w:tcPr>
+            <w:tcW w:type="dxa" w:w="2200"/>
+            <w:shd w:fill="F5F5F8" w:val="clear"/>
+            <w:tcMar>
+              <w:top w:type="dxa" w:w="80"/>
+              <w:left w:type="dxa" w:w="120"/>
+              <w:bottom w:type="dxa" w:w="80"/>
+              <w:right w:type="dxa" w:w="120"/>
+            </w:tcMar>
+          </w:tcPr>
+          <w:p>
+            <w:r>
+              <w:rPr>
+                <w:rFonts w:ascii="Arial" w:cs="Arial" w:hAnsi="Arial"/>
+                <w:b/>
+                <w:color w:val="1E3A5F"/>
+                <w:sz w:val="19"/>
+                <w:szCs w:val="19"/>
+              </w:rPr>
+              <w:t xml:space="preserve">pytest</w:t>
+            </w:r>
+          </w:p>
+        </w:tc>
+        <w:tc>
+          <w:tcPr>
+            <w:tcW w:type="dxa" w:w="7160"/>
+            <w:tcMar>
+              <w:top w:type="dxa" w:w="80"/>
+              <w:left w:type="dxa" w:w="160"/>
+              <w:bottom w:type="dxa" w:w="80"/>
+              <w:right w:type="dxa" w:w="120"/>
+            </w:tcMar>
+          </w:tcPr>
+          <w:p>
+            <w:r>
+              <w:rPr>
+                <w:rFonts w:ascii="Arial" w:cs="Arial" w:hAnsi="Arial"/>
+                <w:color w:val="1A1A2E"/>
+                <w:sz w:val="19"/>
+                <w:szCs w:val="19"/>
+              </w:rPr>
+              <w:t xml:space="preserve">L'outil Python standard pour ecrire et lancer des tests. Il trouve automatiquement tous les fichiers test_*.py et lance les fonctions test_*(). Affiche quels tests passent (PASSED) ou echouent (FAILED).</w:t>
+            </w:r>
+          </w:p>
+        </w:tc>
+      </w:tr>
+    </w:tbl>
+    <w:tbl>
+      <w:tblPr>
+        <w:tblW w:type="dxa" w:w="9360"/>
+        <w:tblBorders>
+          <w:top w:val="none" w:color="FFFFFF" w:sz="0"/>
+          <w:left w:val="none" w:color="FFFFFF" w:sz="0"/>
+          <w:bottom w:val="single" w:color="E0E0E0" w:sz="2"/>
+          <w:right w:val="none" w:color="FFFFFF" w:sz="0"/>
+          <w:insideH w:val="none" w:color="FFFFFF" w:sz="0"/>
+          <w:insideV w:val="none" w:color="FFFFFF" w:sz="0"/>
+        </w:tblBorders>
+      </w:tblPr>
+      <w:tblGrid>
+        <w:gridCol w:w="2200"/>
+        <w:gridCol w:w="7160"/>
+      </w:tblGrid>
+      <w:tr>
+        <w:tc>
+          <w:tcPr>
+            <w:tcW w:type="dxa" w:w="2200"/>
+            <w:shd w:fill="F5F5F8" w:val="clear"/>
+            <w:tcMar>
+              <w:top w:type="dxa" w:w="80"/>
+              <w:left w:type="dxa" w:w="120"/>
+              <w:bottom w:type="dxa" w:w="80"/>
+              <w:right w:type="dxa" w:w="120"/>
+            </w:tcMar>
+          </w:tcPr>
+          <w:p>
+            <w:r>
+              <w:rPr>
+                <w:rFonts w:ascii="Arial" w:cs="Arial" w:hAnsi="Arial"/>
+                <w:b/>
+                <w:color w:val="1E3A5F"/>
+                <w:sz w:val="19"/>
+                <w:szCs w:val="19"/>
+              </w:rPr>
+              <w:t xml:space="preserve">CI/CD</w:t>
+            </w:r>
+          </w:p>
+        </w:tc>
+        <w:tc>
+          <w:tcPr>
+            <w:tcW w:type="dxa" w:w="7160"/>
+            <w:tcMar>
+              <w:top w:type="dxa" w:w="80"/>
+              <w:left w:type="dxa" w:w="160"/>
+              <w:bottom w:type="dxa" w:w="80"/>
+              <w:right w:type="dxa" w:w="120"/>
+            </w:tcMar>
+          </w:tcPr>
+          <w:p>
+            <w:r>
+              <w:rPr>
+                <w:rFonts w:ascii="Arial" w:cs="Arial" w:hAnsi="Arial"/>
+                <w:color w:val="1A1A2E"/>
+                <w:sz w:val="19"/>
+                <w:szCs w:val="19"/>
+              </w:rPr>
+              <w:t xml:space="preserve">Continuous Integration / Continuous Deployment. CI = chaque push declenche des tests automatiques. CD = si les tests passent, le code est deploye. Ici on fait la CI.</w:t>
+            </w:r>
+          </w:p>
+        </w:tc>
+      </w:tr>
+    </w:tbl>
+    <w:tbl>
+      <w:tblPr>
+        <w:tblW w:type="dxa" w:w="9360"/>
+        <w:tblBorders>
+          <w:top w:val="none" w:color="FFFFFF" w:sz="0"/>
+          <w:left w:val="none" w:color="FFFFFF" w:sz="0"/>
+          <w:bottom w:val="single" w:color="E0E0E0" w:sz="2"/>
+          <w:right w:val="none" w:color="FFFFFF" w:sz="0"/>
+          <w:insideH w:val="none" w:color="FFFFFF" w:sz="0"/>
+          <w:insideV w:val="none" w:color="FFFFFF" w:sz="0"/>
+        </w:tblBorders>
+      </w:tblPr>
+      <w:tblGrid>
+        <w:gridCol w:w="2200"/>
+        <w:gridCol w:w="7160"/>
+      </w:tblGrid>
+      <w:tr>
+        <w:tc>
+          <w:tcPr>
+            <w:tcW w:type="dxa" w:w="2200"/>
+            <w:shd w:fill="F5F5F8" w:val="clear"/>
+            <w:tcMar>
+              <w:top w:type="dxa" w:w="80"/>
+              <w:left w:type="dxa" w:w="120"/>
+              <w:bottom w:type="dxa" w:w="80"/>
+              <w:right w:type="dxa" w:w="120"/>
+            </w:tcMar>
+          </w:tcPr>
+          <w:p>
+            <w:r>
+              <w:rPr>
+                <w:rFonts w:ascii="Arial" w:cs="Arial" w:hAnsi="Arial"/>
+                <w:b/>
+                <w:color w:val="1E3A5F"/>
+                <w:sz w:val="19"/>
+                <w:szCs w:val="19"/>
+              </w:rPr>
+              <w:t xml:space="preserve">GitHub Actions</w:t>
+            </w:r>
+          </w:p>
+        </w:tc>
+        <w:tc>
+          <w:tcPr>
+            <w:tcW w:type="dxa" w:w="7160"/>
+            <w:tcMar>
+              <w:top w:type="dxa" w:w="80"/>
+              <w:left w:type="dxa" w:w="160"/>
+              <w:bottom w:type="dxa" w:w="80"/>
+              <w:right w:type="dxa" w:w="120"/>
+            </w:tcMar>
+          </w:tcPr>
+          <w:p>
+            <w:r>
+              <w:rPr>
+                <w:rFonts w:ascii="Arial" w:cs="Arial" w:hAnsi="Arial"/>
+                <w:color w:val="1A1A2E"/>
+                <w:sz w:val="19"/>
+                <w:szCs w:val="19"/>
+              </w:rPr>
+              <w:t xml:space="preserve">Service de GitHub qui execute automatiquement des commandes sur un serveur distant a chaque push. On definit les etapes dans un fichier YAML. Gratuit pour les repos publics.</w:t>
+            </w:r>
+          </w:p>
+        </w:tc>
+      </w:tr>
+    </w:tbl>
+    <w:tbl>
+      <w:tblPr>
+        <w:tblW w:type="dxa" w:w="9360"/>
+        <w:tblBorders>
+          <w:top w:val="none" w:color="FFFFFF" w:sz="0"/>
+          <w:left w:val="none" w:color="FFFFFF" w:sz="0"/>
+          <w:bottom w:val="single" w:color="E0E0E0" w:sz="2"/>
+          <w:right w:val="none" w:color="FFFFFF" w:sz="0"/>
+          <w:insideH w:val="none" w:color="FFFFFF" w:sz="0"/>
+          <w:insideV w:val="none" w:color="FFFFFF" w:sz="0"/>
+        </w:tblBorders>
+      </w:tblPr>
+      <w:tblGrid>
+        <w:gridCol w:w="2200"/>
+        <w:gridCol w:w="7160"/>
+      </w:tblGrid>
+      <w:tr>
+        <w:tc>
+          <w:tcPr>
+            <w:tcW w:type="dxa" w:w="2200"/>
+            <w:shd w:fill="F5F5F8" w:val="clear"/>
+            <w:tcMar>
+              <w:top w:type="dxa" w:w="80"/>
+              <w:left w:type="dxa" w:w="120"/>
+              <w:bottom w:type="dxa" w:w="80"/>
+              <w:right w:type="dxa" w:w="120"/>
+            </w:tcMar>
+          </w:tcPr>
+          <w:p>
+            <w:r>
+              <w:rPr>
+                <w:rFonts w:ascii="Arial" w:cs="Arial" w:hAnsi="Arial"/>
+                <w:b/>
+                <w:color w:val="1E3A5F"/>
+                <w:sz w:val="19"/>
+                <w:szCs w:val="19"/>
+              </w:rPr>
+              <w:t xml:space="preserve">Workflow YAML</w:t>
+            </w:r>
+          </w:p>
+        </w:tc>
+        <w:tc>
+          <w:tcPr>
+            <w:tcW w:type="dxa" w:w="7160"/>
+            <w:tcMar>
+              <w:top w:type="dxa" w:w="80"/>
+              <w:left w:type="dxa" w:w="160"/>
+              <w:bottom w:type="dxa" w:w="80"/>
+              <w:right w:type="dxa" w:w="120"/>
+            </w:tcMar>
+          </w:tcPr>
+          <w:p>
+            <w:r>
+              <w:rPr>
+                <w:rFonts w:ascii="Arial" w:cs="Arial" w:hAnsi="Arial"/>
+                <w:color w:val="1A1A2E"/>
+                <w:sz w:val="19"/>
+                <w:szCs w:val="19"/>
+              </w:rPr>
+              <w:t xml:space="preserve">Fichier .github/workflows/tests.yml qui decrit quoi faire et quand. 'A chaque push sur main : installer Python, installer les deps, lancer pytest.'</w:t>
+            </w:r>
+          </w:p>
+        </w:tc>
+      </w:tr>
+    </w:tbl>
+    <w:tbl>
+      <w:tblPr>
+        <w:tblW w:type="dxa" w:w="9360"/>
+        <w:tblBorders>
+          <w:top w:val="none" w:color="FFFFFF" w:sz="0"/>
+          <w:left w:val="none" w:color="FFFFFF" w:sz="0"/>
+          <w:bottom w:val="single" w:color="E0E0E0" w:sz="2"/>
+          <w:right w:val="none" w:color="FFFFFF" w:sz="0"/>
+          <w:insideH w:val="none" w:color="FFFFFF" w:sz="0"/>
+          <w:insideV w:val="none" w:color="FFFFFF" w:sz="0"/>
+        </w:tblBorders>
+      </w:tblPr>
+      <w:tblGrid>
+        <w:gridCol w:w="2200"/>
+        <w:gridCol w:w="7160"/>
+      </w:tblGrid>
+      <w:tr>
+        <w:tc>
+          <w:tcPr>
+            <w:tcW w:type="dxa" w:w="2200"/>
+            <w:shd w:fill="F5F5F8" w:val="clear"/>
+            <w:tcMar>
+              <w:top w:type="dxa" w:w="80"/>
+              <w:left w:type="dxa" w:w="120"/>
+              <w:bottom w:type="dxa" w:w="80"/>
+              <w:right w:type="dxa" w:w="120"/>
+            </w:tcMar>
+          </w:tcPr>
+          <w:p>
+            <w:r>
+              <w:rPr>
+                <w:rFonts w:ascii="Arial" w:cs="Arial" w:hAnsi="Arial"/>
+                <w:b/>
+                <w:color w:val="1E3A5F"/>
+                <w:sz w:val="19"/>
+                <w:szCs w:val="19"/>
+              </w:rPr>
+              <w:t xml:space="preserve">Fonction pure</w:t>
+            </w:r>
+          </w:p>
+        </w:tc>
+        <w:tc>
+          <w:tcPr>
+            <w:tcW w:type="dxa" w:w="7160"/>
+            <w:tcMar>
+              <w:top w:type="dxa" w:w="80"/>
+              <w:left w:type="dxa" w:w="160"/>
+              <w:bottom w:type="dxa" w:w="80"/>
+              <w:right w:type="dxa" w:w="120"/>
+            </w:tcMar>
+          </w:tcPr>
+          <w:p>
+            <w:r>
+              <w:rPr>
+                <w:rFonts w:ascii="Arial" w:cs="Arial" w:hAnsi="Arial"/>
+                <w:color w:val="1A1A2E"/>
+                <w:sz w:val="19"/>
+                <w:szCs w:val="19"/>
+              </w:rPr>
+              <w:t xml:space="preserve">Fonction qui retourne toujours le meme resultat pour les memes entrees. detect_prompt_injection('ignore instructions') retourne toujours (True, ...). Tres facile a tester - pas besoin de serveur.</w:t>
+            </w:r>
+          </w:p>
+        </w:tc>
+      </w:tr>
+    </w:tbl>
+    <w:tbl>
+      <w:tblPr>
+        <w:tblW w:type="dxa" w:w="9360"/>
+        <w:tblBorders>
+          <w:top w:val="none" w:color="FFFFFF" w:sz="0"/>
+          <w:left w:val="none" w:color="FFFFFF" w:sz="0"/>
+          <w:bottom w:val="single" w:color="E0E0E0" w:sz="2"/>
+          <w:right w:val="none" w:color="FFFFFF" w:sz="0"/>
+          <w:insideH w:val="none" w:color="FFFFFF" w:sz="0"/>
+          <w:insideV w:val="none" w:color="FFFFFF" w:sz="0"/>
+        </w:tblBorders>
+      </w:tblPr>
+      <w:tblGrid>
+        <w:gridCol w:w="2200"/>
+        <w:gridCol w:w="7160"/>
+      </w:tblGrid>
+      <w:tr>
+        <w:tc>
+          <w:tcPr>
+            <w:tcW w:type="dxa" w:w="2200"/>
+            <w:shd w:fill="F5F5F8" w:val="clear"/>
+            <w:tcMar>
+              <w:top w:type="dxa" w:w="80"/>
+              <w:left w:type="dxa" w:w="120"/>
+              <w:bottom w:type="dxa" w:w="80"/>
+              <w:right w:type="dxa" w:w="120"/>
+            </w:tcMar>
+          </w:tcPr>
+          <w:p>
+            <w:r>
+              <w:rPr>
+                <w:rFonts w:ascii="Arial" w:cs="Arial" w:hAnsi="Arial"/>
+                <w:b/>
+                <w:color w:val="1E3A5F"/>
+                <w:sz w:val="19"/>
+                <w:szCs w:val="19"/>
+              </w:rPr>
+              <w:t xml:space="preserve">Off-by-one</w:t>
+            </w:r>
+          </w:p>
+        </w:tc>
+        <w:tc>
+          <w:tcPr>
+            <w:tcW w:type="dxa" w:w="7160"/>
+            <w:tcMar>
+              <w:top w:type="dxa" w:w="80"/>
+              <w:left w:type="dxa" w:w="160"/>
+              <w:bottom w:type="dxa" w:w="80"/>
+              <w:right w:type="dxa" w:w="120"/>
+            </w:tcMar>
+          </w:tcPr>
+          <w:p>
+            <w:r>
+              <w:rPr>
+                <w:rFonts w:ascii="Arial" w:cs="Arial" w:hAnsi="Arial"/>
+                <w:color w:val="1A1A2E"/>
+                <w:sz w:val="19"/>
+                <w:szCs w:val="19"/>
+              </w:rPr>
+              <w:t xml:space="preserve">Erreur classique de programmation : une limite de 2 au lieu de 3, ou &gt;= au lieu de &gt;. Le test test_exactly_threshold_high verifie exactement la valeur limite pour eviter ce bug.</w:t>
+            </w:r>
+          </w:p>
+        </w:tc>
+      </w:tr>
+    </w:tbl>
+    <w:p>
+      <w:pPr>
+        <w:spacing w:after="80"/>
+      </w:pPr>
+    </w:p>
+    <w:p>
+      <w:pPr>
+        <w:spacing w:after="100" w:before="200"/>
+      </w:pPr>
+      <w:r>
+        <w:rPr>
+          <w:rFonts w:ascii="Arial" w:cs="Arial" w:hAnsi="Arial"/>
+          <w:b/>
+          <w:color w:val="C9A84C"/>
+          <w:sz w:val="22"/>
+          <w:szCs w:val="22"/>
+        </w:rPr>
+        <w:t>Pourquoi ecrire des tests - L'argument cabinet</w:t>
+      </w:r>
+    </w:p>
+    <w:tbl>
+      <w:tblPr>
+        <w:tblW w:type="dxa" w:w="9360"/>
+        <w:tblBorders>
+          <w:top w:val="single" w:color="A93226" w:sz="4"/>
+          <w:left w:val="single" w:color="A93226" w:sz="8"/>
+          <w:bottom w:val="single" w:color="A93226" w:sz="4"/>
+          <w:right w:val="single" w:color="A93226" w:sz="4"/>
+        </w:tblBorders>
+      </w:tblPr>
+      <w:tblGrid>
+        <w:gridCol w:w="9360"/>
+      </w:tblGrid>
+      <w:tr>
+        <w:tc>
+          <w:tcPr>
+            <w:shd w:fill="FDEDEC" w:val="clear"/>
+            <w:tcMar>
+              <w:top w:type="dxa" w:w="100"/>
+              <w:left w:type="dxa" w:w="200"/>
+              <w:bottom w:type="dxa" w:w="100"/>
+              <w:right w:type="dxa" w:w="200"/>
+            </w:tcMar>
+          </w:tcPr>
+          <w:p>
+            <w:pPr>
+              <w:spacing w:after="40"/>
+            </w:pPr>
+            <w:r>
+              <w:rPr>
+                <w:rFonts w:ascii="Arial" w:cs="Arial" w:hAnsi="Arial"/>
+                <w:b/>
+                <w:caps/>
+                <w:color w:val="A93226"/>
+                <w:sz w:val="17"/>
+                <w:szCs w:val="17"/>
+              </w:rPr>
+              <w:t>LE SCENARIO SANS TESTS</w:t>
+            </w:r>
+          </w:p>
+          <w:p>
+            <w:pPr>
+              <w:spacing w:after="0"/>
+            </w:pPr>
+            <w:r>
+              <w:rPr>
+                <w:rFonts w:ascii="Arial" w:cs="Arial" w:hAnsi="Arial"/>
+                <w:color w:val="1A1A2E"/>
+                <w:sz w:val="19"/>
+                <w:szCs w:val="19"/>
+              </w:rPr>
+              <w:t xml:space="preserve">Tu modifies check_hallucination_guardrail() pour corriger un bug. Tu testes manuellement dans le Swagger - ca a l'air de marcher. Tu commites. Deux semaines plus tard, un client se plaint que des reponses passent avec des sources fantomes. Pourquoi ? Parce que ton correctif a casse un cas limite que tu n'avais pas teste manuellement.</w:t>
+            </w:r>
+          </w:p>
+        </w:tc>
+      </w:tr>
+    </w:tbl>
+    <w:p>
+      <w:pPr>
+        <w:spacing w:after="40"/>
+      </w:pPr>
+    </w:p>
+    <w:tbl>
+      <w:tblPr>
+        <w:tblW w:type="dxa" w:w="9360"/>
+        <w:tblBorders>
+          <w:top w:val="single" w:color="1E8449" w:sz="4"/>
+          <w:left w:val="single" w:color="1E8449" w:sz="8"/>
+          <w:bottom w:val="single" w:color="1E8449" w:sz="4"/>
+          <w:right w:val="single" w:color="1E8449" w:sz="4"/>
+        </w:tblBorders>
+      </w:tblPr>
+      <w:tblGrid>
+        <w:gridCol w:w="9360"/>
+      </w:tblGrid>
+      <w:tr>
+        <w:tc>
+          <w:tcPr>
+            <w:shd w:fill="EAFAF1" w:val="clear"/>
+            <w:tcMar>
+              <w:top w:type="dxa" w:w="100"/>
+              <w:left w:type="dxa" w:w="200"/>
+              <w:bottom w:type="dxa" w:w="100"/>
+              <w:right w:type="dxa" w:w="200"/>
+            </w:tcMar>
+          </w:tcPr>
+          <w:p>
+            <w:pPr>
+              <w:spacing w:after="40"/>
+            </w:pPr>
+            <w:r>
+              <w:rPr>
+                <w:rFonts w:ascii="Arial" w:cs="Arial" w:hAnsi="Arial"/>
+                <w:b/>
+                <w:caps/>
+                <w:color w:val="1E8449"/>
+                <w:sz w:val="17"/>
+                <w:szCs w:val="17"/>
+              </w:rPr>
+              <w:t>LE SCENARIO AVEC TESTS</w:t>
+            </w:r>
+          </w:p>
+          <w:p>
+            <w:pPr>
+              <w:spacing w:after="0"/>
+            </w:pPr>
+            <w:r>
+              <w:rPr>
+                <w:rFonts w:ascii="Arial" w:cs="Arial" w:hAnsi="Arial"/>
+                <w:color w:val="1A1A2E"/>
+                <w:sz w:val="19"/>
+                <w:szCs w:val="19"/>
+              </w:rPr>
+              <w:t xml:space="preserve">Tu modifies check_hallucination_guardrail(). Tu commites. GitHub Actions lance 22 tests sur cette fonction en 0.3 secondes. Le test test_exactly_threshold_high echoue. Tu vois immediatement quel cas limite est casse, tu corriges avant de pusher. Le client ne voit jamais le bug.</w:t>
+            </w:r>
+          </w:p>
+        </w:tc>
+      </w:tr>
+    </w:tbl>
+    <w:p>
+      <w:pPr>
+        <w:spacing w:after="80"/>
+      </w:pPr>
+    </w:p>
+    <w:p>
+      <w:pPr>
+        <w:spacing w:after="100" w:before="200"/>
+      </w:pPr>
+      <w:r>
+        <w:rPr>
+          <w:rFonts w:ascii="Arial" w:cs="Arial" w:hAnsi="Arial"/>
+          <w:b/>
+          <w:color w:val="C9A84C"/>
+          <w:sz w:val="22"/>
+          <w:szCs w:val="22"/>
+        </w:rPr>
+        <w:t>Regle 80/20 - Ce qu'on teste et pourquoi</w:t>
+      </w:r>
+    </w:p>
+    <w:p>
+      <w:pPr>
+        <w:spacing w:after="60"/>
+      </w:pPr>
+      <w:r>
+        <w:rPr>
+          <w:rFonts w:ascii="Arial" w:cs="Arial" w:hAnsi="Arial"/>
+          <w:color w:val="1A1A2E"/>
+          <w:sz w:val="20"/>
+          <w:szCs w:val="20"/>
+        </w:rPr>
+        <w:t xml:space="preserve">On ne teste pas tout - ce serait trop long a ecrire et a maintenir. 20% des tests couvrent 80% des bugs potentiels. On se concentre sur :</w:t>
+      </w:r>
+    </w:p>
+    <w:p>
+      <w:pPr>
+        <w:spacing w:after="40"/>
+        <w:ind w:left="360"/>
+      </w:pPr>
+      <w:r>
+        <w:rPr>
+          <w:rFonts w:ascii="Arial" w:cs="Arial" w:hAnsi="Arial"/>
+          <w:color w:val="1A1A2E"/>
+          <w:sz w:val="19"/>
+          <w:szCs w:val="19"/>
+        </w:rPr>
+        <w:t xml:space="preserve">&amp;#x2022;  Cas limites (edge cases) : situations a la frontiere du comportement normal. n_chunks=0, token expire depuis -1 seconde, question de exactement 500 chars. C'est la que les bugs se cachent.</w:t>
+      </w:r>
+    </w:p>
+    <w:p>
+      <w:pPr>
+        <w:spacing w:after="40"/>
+        <w:ind w:left="360"/>
+      </w:pPr>
+      <w:r>
+        <w:rPr>
+          <w:rFonts w:ascii="Arial" w:cs="Arial" w:hAnsi="Arial"/>
+          <w:color w:val="1A1A2E"/>
+          <w:sz w:val="19"/>
+          <w:szCs w:val="19"/>
+        </w:rPr>
+        <w:t xml:space="preserve">&amp;#x2022;  Cas regressifs : ce qui a deja casse ou pourrait casser si on refactorise. test_ignore_in_legal_context garantit que 'ignore' dans une vraie question juridique ne bloque pas.</w:t>
+      </w:r>
+    </w:p>
+    <w:p>
+      <w:pPr>
+        <w:spacing w:after="40"/>
+        <w:ind w:left="360"/>
+      </w:pPr>
+      <w:r>
+        <w:rPr>
+          <w:rFonts w:ascii="Arial" w:cs="Arial" w:hAnsi="Arial"/>
+          <w:color w:val="1A1A2E"/>
+          <w:sz w:val="19"/>
+          <w:szCs w:val="19"/>
+        </w:rPr>
+        <w:t xml:space="preserve">&amp;#x2022;  Cas critiques metier : ce qui coute cher si ca rate. Un token expire qui passe = faille de securite. Un guardrail HIGH qui ne bloque pas = reponse non tracable envoyee a un client.</w:t>
+      </w:r>
+    </w:p>
+    <w:p>
+      <w:pPr>
+        <w:spacing w:after="80"/>
+      </w:pPr>
+    </w:p>
+    <w:p>
+      <w:pPr>
+        <w:spacing w:after="100" w:before="200"/>
+      </w:pPr>
+      <w:r>
+        <w:rPr>
+          <w:rFonts w:ascii="Arial" w:cs="Arial" w:hAnsi="Arial"/>
+          <w:b/>
+          <w:color w:val="C9A84C"/>
+          <w:sz w:val="22"/>
+          <w:szCs w:val="22"/>
+        </w:rPr>
+        <w:t>Les 4 fichiers de tests - Ce qui est teste</w:t>
+      </w:r>
+    </w:p>
+    <w:tbl>
+      <w:tblPr>
+        <w:tblW w:type="dxa" w:w="9360"/>
+        <w:tblBorders>
+          <w:top w:val="single" w:color="1E3A5F" w:sz="4"/>
+          <w:left w:val="single" w:color="1E3A5F" w:sz="4"/>
+          <w:bottom w:val="single" w:color="1E3A5F" w:sz="4"/>
+          <w:right w:val="single" w:color="1E3A5F" w:sz="4"/>
+          <w:insideH w:val="single" w:color="CCCCCC" w:sz="2"/>
+          <w:insideV w:val="single" w:color="CCCCCC" w:sz="2"/>
+        </w:tblBorders>
+      </w:tblPr>
+      <w:tblGrid>
+        <w:gridCol w:w="2400"/>
+        <w:gridCol w:w="2400"/>
+        <w:gridCol w:w="800"/>
+        <w:gridCol w:w="3760"/>
+      </w:tblGrid>
+      <w:tr>
+        <w:tc>
+          <w:tcPr>
+            <w:tcW w:type="dxa" w:w="2400"/>
+            <w:shd w:fill="1E3A5F" w:val="clear"/>
+            <w:tcMar>
+              <w:top w:type="dxa" w:w="60"/>
+              <w:left w:type="dxa" w:w="80"/>
+              <w:bottom w:type="dxa" w:w="60"/>
+              <w:right w:type="dxa" w:w="80"/>
+            </w:tcMar>
+          </w:tcPr>
+          <w:p>
+            <w:r>
+              <w:rPr>
+                <w:rFonts w:ascii="Arial" w:cs="Arial" w:hAnsi="Arial"/>
+                <w:color w:val="FFFFFF"/>
+                <w:sz w:val="17"/>
+                <w:szCs w:val="17"/>
+              </w:rPr>
+              <w:t xml:space="preserve">Fichier</w:t>
+            </w:r>
+          </w:p>
+        </w:tc>
+        <w:tc>
+          <w:tcPr>
+            <w:tcW w:type="dxa" w:w="2400"/>
+            <w:shd w:fill="1E3A5F" w:val="clear"/>
+            <w:tcMar>
+              <w:top w:type="dxa" w:w="60"/>
+              <w:left w:type="dxa" w:w="80"/>
+              <w:bottom w:type="dxa" w:w="60"/>
+              <w:right w:type="dxa" w:w="80"/>
+            </w:tcMar>
+          </w:tcPr>
+          <w:p>
+            <w:r>
+              <w:rPr>
+                <w:rFonts w:ascii="Arial" w:cs="Arial" w:hAnsi="Arial"/>
+                <w:color w:val="FFFFFF"/>
+                <w:sz w:val="17"/>
+                <w:szCs w:val="17"/>
+              </w:rPr>
+              <w:t xml:space="preserve">Teste quoi</w:t>
+            </w:r>
+          </w:p>
+        </w:tc>
+        <w:tc>
+          <w:tcPr>
+            <w:tcW w:type="dxa" w:w="800"/>
+            <w:shd w:fill="1E3A5F" w:val="clear"/>
+            <w:tcMar>
+              <w:top w:type="dxa" w:w="60"/>
+              <w:left w:type="dxa" w:w="80"/>
+              <w:bottom w:type="dxa" w:w="60"/>
+              <w:right w:type="dxa" w:w="80"/>
+            </w:tcMar>
+          </w:tcPr>
+          <w:p>
+            <w:r>
+              <w:rPr>
+                <w:rFonts w:ascii="Arial" w:cs="Arial" w:hAnsi="Arial"/>
+                <w:color w:val="FFFFFF"/>
+                <w:sz w:val="17"/>
+                <w:szCs w:val="17"/>
+              </w:rPr>
+              <w:t xml:space="preserve">Tests</w:t>
+            </w:r>
+          </w:p>
+        </w:tc>
+        <w:tc>
+          <w:tcPr>
+            <w:tcW w:type="dxa" w:w="3760"/>
+            <w:shd w:fill="1E3A5F" w:val="clear"/>
+            <w:tcMar>
+              <w:top w:type="dxa" w:w="60"/>
+              <w:left w:type="dxa" w:w="80"/>
+              <w:bottom w:type="dxa" w:w="60"/>
+              <w:right w:type="dxa" w:w="80"/>
+            </w:tcMar>
+          </w:tcPr>
+          <w:p>
+            <w:r>
+              <w:rPr>
+                <w:rFonts w:ascii="Arial" w:cs="Arial" w:hAnsi="Arial"/>
+                <w:color w:val="FFFFFF"/>
+                <w:sz w:val="17"/>
+                <w:szCs w:val="17"/>
+              </w:rPr>
+              <w:t xml:space="preserve">Pourquoi</w:t>
+            </w:r>
+          </w:p>
+        </w:tc>
+      </w:tr>
+      <w:tr>
+        <w:tc>
+          <w:tcPr>
+            <w:tcW w:type="dxa" w:w="2400"/>
+            <w:shd w:fill="FFFFFF" w:val="clear"/>
+            <w:tcMar>
+              <w:top w:type="dxa" w:w="60"/>
+              <w:left w:type="dxa" w:w="80"/>
+              <w:bottom w:type="dxa" w:w="60"/>
+              <w:right w:type="dxa" w:w="80"/>
+            </w:tcMar>
+          </w:tcPr>
+          <w:p>
+            <w:r>
+              <w:rPr>
+                <w:rFonts w:ascii="Arial" w:cs="Arial" w:hAnsi="Arial"/>
+                <w:b/>
+                <w:bCs/>
+                <w:color w:val="1A1A2E"/>
+                <w:sz w:val="17"/>
+                <w:szCs w:val="17"/>
+              </w:rPr>
+              <w:t xml:space="preserve">test_injection.py</w:t>
+            </w:r>
+          </w:p>
+        </w:tc>
+        <w:tc>
+          <w:tcPr>
+            <w:tcW w:type="dxa" w:w="2400"/>
+            <w:shd w:fill="FFFFFF" w:val="clear"/>
+            <w:tcMar>
+              <w:top w:type="dxa" w:w="60"/>
+              <w:left w:type="dxa" w:w="80"/>
+              <w:bottom w:type="dxa" w:w="60"/>
+              <w:right w:type="dxa" w:w="80"/>
+            </w:tcMar>
+          </w:tcPr>
+          <w:p>
+            <w:r>
+              <w:rPr>
+                <w:rFonts w:ascii="Arial" w:cs="Arial" w:hAnsi="Arial"/>
+                <w:color w:val="1A1A2E"/>
+                <w:sz w:val="17"/>
+                <w:szCs w:val="17"/>
+              </w:rPr>
+              <w:t xml:space="preserve">detect_prompt_injection()</w:t>
+            </w:r>
+          </w:p>
+        </w:tc>
+        <w:tc>
+          <w:tcPr>
+            <w:tcW w:type="dxa" w:w="800"/>
+            <w:shd w:fill="FFFFFF" w:val="clear"/>
+            <w:tcMar>
+              <w:top w:type="dxa" w:w="60"/>
+              <w:left w:type="dxa" w:w="80"/>
+              <w:bottom w:type="dxa" w:w="60"/>
+              <w:right w:type="dxa" w:w="80"/>
+            </w:tcMar>
+          </w:tcPr>
+          <w:p>
+            <w:r>
+              <w:rPr>
+                <w:rFonts w:ascii="Arial" w:cs="Arial" w:hAnsi="Arial"/>
+                <w:color w:val="1A1A2E"/>
+                <w:sz w:val="17"/>
+                <w:szCs w:val="17"/>
+              </w:rPr>
+              <w:t xml:space="preserve">24</w:t>
+            </w:r>
+          </w:p>
+        </w:tc>
+        <w:tc>
+          <w:tcPr>
+            <w:tcW w:type="dxa" w:w="3760"/>
+            <w:shd w:fill="FFFFFF" w:val="clear"/>
+            <w:tcMar>
+              <w:top w:type="dxa" w:w="60"/>
+              <w:left w:type="dxa" w:w="80"/>
+              <w:bottom w:type="dxa" w:w="60"/>
+              <w:right w:type="dxa" w:w="80"/>
+            </w:tcMar>
+          </w:tcPr>
+          <w:p>
+            <w:r>
+              <w:rPr>
+                <w:rFonts w:ascii="Arial" w:cs="Arial" w:hAnsi="Arial"/>
+                <w:color w:val="1A1A2E"/>
+                <w:sz w:val="17"/>
+                <w:szCs w:val="17"/>
+              </w:rPr>
+              <w:t xml:space="preserve">Faux positifs aussi dangereux que vrais positifs manques</w:t>
+            </w:r>
+          </w:p>
+        </w:tc>
+      </w:tr>
+      <w:tr>
+        <w:tc>
+          <w:tcPr>
+            <w:tcW w:type="dxa" w:w="2400"/>
+            <w:shd w:fill="F5F5F8" w:val="clear"/>
+            <w:tcMar>
+              <w:top w:type="dxa" w:w="60"/>
+              <w:left w:type="dxa" w:w="80"/>
+              <w:bottom w:type="dxa" w:w="60"/>
+              <w:right w:type="dxa" w:w="80"/>
+            </w:tcMar>
+          </w:tcPr>
+          <w:p>
+            <w:r>
+              <w:rPr>
+                <w:rFonts w:ascii="Arial" w:cs="Arial" w:hAnsi="Arial"/>
+                <w:b/>
+                <w:bCs/>
+                <w:color w:val="1A1A2E"/>
+                <w:sz w:val="17"/>
+                <w:szCs w:val="17"/>
+              </w:rPr>
+              <w:t xml:space="preserve">test_guardrail.py</w:t>
+            </w:r>
+          </w:p>
+        </w:tc>
+        <w:tc>
+          <w:tcPr>
+            <w:tcW w:type="dxa" w:w="2400"/>
+            <w:shd w:fill="F5F5F8" w:val="clear"/>
+            <w:tcMar>
+              <w:top w:type="dxa" w:w="60"/>
+              <w:left w:type="dxa" w:w="80"/>
+              <w:bottom w:type="dxa" w:w="60"/>
+              <w:right w:type="dxa" w:w="80"/>
+            </w:tcMar>
+          </w:tcPr>
+          <w:p>
+            <w:r>
+              <w:rPr>
+                <w:rFonts w:ascii="Arial" w:cs="Arial" w:hAnsi="Arial"/>
+                <w:color w:val="1A1A2E"/>
+                <w:sz w:val="17"/>
+                <w:szCs w:val="17"/>
+              </w:rPr>
+              <w:t xml:space="preserve">check_hallucination_guardrail()</w:t>
+            </w:r>
+          </w:p>
+        </w:tc>
+        <w:tc>
+          <w:tcPr>
+            <w:tcW w:type="dxa" w:w="800"/>
+            <w:shd w:fill="F5F5F8" w:val="clear"/>
+            <w:tcMar>
+              <w:top w:type="dxa" w:w="60"/>
+              <w:left w:type="dxa" w:w="80"/>
+              <w:bottom w:type="dxa" w:w="60"/>
+              <w:right w:type="dxa" w:w="80"/>
+            </w:tcMar>
+          </w:tcPr>
+          <w:p>
+            <w:r>
+              <w:rPr>
+                <w:rFonts w:ascii="Arial" w:cs="Arial" w:hAnsi="Arial"/>
+                <w:color w:val="1A1A2E"/>
+                <w:sz w:val="17"/>
+                <w:szCs w:val="17"/>
+              </w:rPr>
+              <w:t xml:space="preserve">22</w:t>
+            </w:r>
+          </w:p>
+        </w:tc>
+        <w:tc>
+          <w:tcPr>
+            <w:tcW w:type="dxa" w:w="3760"/>
+            <w:shd w:fill="F5F5F8" w:val="clear"/>
+            <w:tcMar>
+              <w:top w:type="dxa" w:w="60"/>
+              <w:left w:type="dxa" w:w="80"/>
+              <w:bottom w:type="dxa" w:w="60"/>
+              <w:right w:type="dxa" w:w="80"/>
+            </w:tcMar>
+          </w:tcPr>
+          <w:p>
+            <w:r>
+              <w:rPr>
+                <w:rFonts w:ascii="Arial" w:cs="Arial" w:hAnsi="Arial"/>
+                <w:color w:val="1A1A2E"/>
+                <w:sz w:val="17"/>
+                <w:szCs w:val="17"/>
+              </w:rPr>
+              <w:t xml:space="preserve">Seuils LOW/HIGH critiques. Test valeurs exactes pour eviter off-by-one</w:t>
+            </w:r>
+          </w:p>
+        </w:tc>
+      </w:tr>
+      <w:tr>
+        <w:tc>
+          <w:tcPr>
+            <w:tcW w:type="dxa" w:w="2400"/>
+            <w:shd w:fill="FFFFFF" w:val="clear"/>
+            <w:tcMar>
+              <w:top w:type="dxa" w:w="60"/>
+              <w:left w:type="dxa" w:w="80"/>
+              <w:bottom w:type="dxa" w:w="60"/>
+              <w:right w:type="dxa" w:w="80"/>
+            </w:tcMar>
+          </w:tcPr>
+          <w:p>
+            <w:r>
+              <w:rPr>
+                <w:rFonts w:ascii="Arial" w:cs="Arial" w:hAnsi="Arial"/>
+                <w:b/>
+                <w:bCs/>
+                <w:color w:val="1A1A2E"/>
+                <w:sz w:val="17"/>
+                <w:szCs w:val="17"/>
+              </w:rPr>
+              <w:t xml:space="preserve">test_auth.py</w:t>
+            </w:r>
+          </w:p>
+        </w:tc>
+        <w:tc>
+          <w:tcPr>
+            <w:tcW w:type="dxa" w:w="2400"/>
+            <w:shd w:fill="FFFFFF" w:val="clear"/>
+            <w:tcMar>
+              <w:top w:type="dxa" w:w="60"/>
+              <w:left w:type="dxa" w:w="80"/>
+              <w:bottom w:type="dxa" w:w="60"/>
+              <w:right w:type="dxa" w:w="80"/>
+            </w:tcMar>
+          </w:tcPr>
+          <w:p>
+            <w:r>
+              <w:rPr>
+                <w:rFonts w:ascii="Arial" w:cs="Arial" w:hAnsi="Arial"/>
+                <w:color w:val="1A1A2E"/>
+                <w:sz w:val="17"/>
+                <w:szCs w:val="17"/>
+              </w:rPr>
+              <w:t xml:space="preserve">JWT + API keys + rate limiting</w:t>
+            </w:r>
+          </w:p>
+        </w:tc>
+        <w:tc>
+          <w:tcPr>
+            <w:tcW w:type="dxa" w:w="800"/>
+            <w:shd w:fill="FFFFFF" w:val="clear"/>
+            <w:tcMar>
+              <w:top w:type="dxa" w:w="60"/>
+              <w:left w:type="dxa" w:w="80"/>
+              <w:bottom w:type="dxa" w:w="60"/>
+              <w:right w:type="dxa" w:w="80"/>
+            </w:tcMar>
+          </w:tcPr>
+          <w:p>
+            <w:r>
+              <w:rPr>
+                <w:rFonts w:ascii="Arial" w:cs="Arial" w:hAnsi="Arial"/>
+                <w:color w:val="1A1A2E"/>
+                <w:sz w:val="17"/>
+                <w:szCs w:val="17"/>
+              </w:rPr>
+              <w:t xml:space="preserve">22</w:t>
+            </w:r>
+          </w:p>
+        </w:tc>
+        <w:tc>
+          <w:tcPr>
+            <w:tcW w:type="dxa" w:w="3760"/>
+            <w:shd w:fill="FFFFFF" w:val="clear"/>
+            <w:tcMar>
+              <w:top w:type="dxa" w:w="60"/>
+              <w:left w:type="dxa" w:w="80"/>
+              <w:bottom w:type="dxa" w:w="60"/>
+              <w:right w:type="dxa" w:w="80"/>
+            </w:tcMar>
+          </w:tcPr>
+          <w:p>
+            <w:r>
+              <w:rPr>
+                <w:rFonts w:ascii="Arial" w:cs="Arial" w:hAnsi="Arial"/>
+                <w:color w:val="1A1A2E"/>
+                <w:sz w:val="17"/>
+                <w:szCs w:val="17"/>
+              </w:rPr>
+              <w:t xml:space="preserve">Securite non testable manuellement. Token expire qui passe = faille</w:t>
+            </w:r>
+          </w:p>
+        </w:tc>
+      </w:tr>
+      <w:tr>
+        <w:tc>
+          <w:tcPr>
+            <w:tcW w:type="dxa" w:w="2400"/>
+            <w:shd w:fill="F5F5F8" w:val="clear"/>
+            <w:tcMar>
+              <w:top w:type="dxa" w:w="60"/>
+              <w:left w:type="dxa" w:w="80"/>
+              <w:bottom w:type="dxa" w:w="60"/>
+              <w:right w:type="dxa" w:w="80"/>
+            </w:tcMar>
+          </w:tcPr>
+          <w:p>
+            <w:r>
+              <w:rPr>
+                <w:rFonts w:ascii="Arial" w:cs="Arial" w:hAnsi="Arial"/>
+                <w:b/>
+                <w:bCs/>
+                <w:color w:val="1A1A2E"/>
+                <w:sz w:val="17"/>
+                <w:szCs w:val="17"/>
+              </w:rPr>
+              <w:t xml:space="preserve">test_audit_disclaimer.py</w:t>
+            </w:r>
+          </w:p>
+        </w:tc>
+        <w:tc>
+          <w:tcPr>
+            <w:tcW w:type="dxa" w:w="2400"/>
+            <w:shd w:fill="F5F5F8" w:val="clear"/>
+            <w:tcMar>
+              <w:top w:type="dxa" w:w="60"/>
+              <w:left w:type="dxa" w:w="80"/>
+              <w:bottom w:type="dxa" w:w="60"/>
+              <w:right w:type="dxa" w:w="80"/>
+            </w:tcMar>
+          </w:tcPr>
+          <w:p>
+            <w:r>
+              <w:rPr>
+                <w:rFonts w:ascii="Arial" w:cs="Arial" w:hAnsi="Arial"/>
+                <w:color w:val="1A1A2E"/>
+                <w:sz w:val="17"/>
+                <w:szCs w:val="17"/>
+              </w:rPr>
+              <w:t xml:space="preserve">Audit log + disclaimer</w:t>
+            </w:r>
+          </w:p>
+        </w:tc>
+        <w:tc>
+          <w:tcPr>
+            <w:tcW w:type="dxa" w:w="800"/>
+            <w:shd w:fill="F5F5F8" w:val="clear"/>
+            <w:tcMar>
+              <w:top w:type="dxa" w:w="60"/>
+              <w:left w:type="dxa" w:w="80"/>
+              <w:bottom w:type="dxa" w:w="60"/>
+              <w:right w:type="dxa" w:w="80"/>
+            </w:tcMar>
+          </w:tcPr>
+          <w:p>
+            <w:r>
+              <w:rPr>
+                <w:rFonts w:ascii="Arial" w:cs="Arial" w:hAnsi="Arial"/>
+                <w:color w:val="1A1A2E"/>
+                <w:sz w:val="17"/>
+                <w:szCs w:val="17"/>
+              </w:rPr>
+              <w:t xml:space="preserve">27</w:t>
+            </w:r>
+          </w:p>
+        </w:tc>
+        <w:tc>
+          <w:tcPr>
+            <w:tcW w:type="dxa" w:w="3760"/>
+            <w:shd w:fill="F5F5F8" w:val="clear"/>
+            <w:tcMar>
+              <w:top w:type="dxa" w:w="60"/>
+              <w:left w:type="dxa" w:w="80"/>
+              <w:bottom w:type="dxa" w:w="60"/>
+              <w:right w:type="dxa" w:w="80"/>
+            </w:tcMar>
+          </w:tcPr>
+          <w:p>
+            <w:r>
+              <w:rPr>
+                <w:rFonts w:ascii="Arial" w:cs="Arial" w:hAnsi="Arial"/>
+                <w:color w:val="1A1A2E"/>
+                <w:sz w:val="17"/>
+                <w:szCs w:val="17"/>
+              </w:rPr>
+              <w:t xml:space="preserve">JSONL valide. Disclaimer doit mentionner 'pas un conseil juridique'</w:t>
+            </w:r>
+          </w:p>
+        </w:tc>
+      </w:tr>
+    </w:tbl>
+    <w:p>
+      <w:pPr>
+        <w:spacing w:after="80"/>
+      </w:pPr>
+    </w:p>
+    <w:p>
+      <w:pPr>
+        <w:spacing w:after="100" w:before="200"/>
+      </w:pPr>
+      <w:r>
+        <w:rPr>
+          <w:rFonts w:ascii="Arial" w:cs="Arial" w:hAnsi="Arial"/>
+          <w:b/>
+          <w:color w:val="C9A84C"/>
+          <w:sz w:val="22"/>
+          <w:szCs w:val="22"/>
+        </w:rPr>
+        <w:t>GitHub Actions - Mini cours complet</w:t>
+      </w:r>
+    </w:p>
+    <w:p>
+      <w:pPr>
+        <w:spacing w:after="80"/>
+      </w:pPr>
+      <w:r>
+        <w:rPr>
+          <w:rFonts w:ascii="Arial" w:cs="Arial" w:hAnsi="Arial"/>
+          <w:color w:val="1A1A2E"/>
+          <w:sz w:val="20"/>
+          <w:szCs w:val="20"/>
+        </w:rPr>
+        <w:t xml:space="preserve">GitHub Actions est un service integre a GitHub qui automatise des taches. A chaque push sur main, GitHub lance nos tests sur un serveur Ubuntu distant. Si un test echoue, on voit exactement lequel dans l'onglet Actions.</w:t>
+      </w:r>
+    </w:p>
+    <w:tbl>
+      <w:tblPr>
+        <w:tblW w:type="dxa" w:w="9360"/>
+        <w:tblBorders>
+          <w:top w:val="single" w:color="1A5276" w:sz="4"/>
+          <w:left w:val="single" w:color="1A5276" w:sz="8"/>
+          <w:bottom w:val="single" w:color="1A5276" w:sz="4"/>
+          <w:right w:val="single" w:color="1A5276" w:sz="4"/>
+        </w:tblBorders>
+      </w:tblPr>
+      <w:tblGrid>
+        <w:gridCol w:w="9360"/>
+      </w:tblGrid>
+      <w:tr>
+        <w:tc>
+          <w:tcPr>
+            <w:shd w:fill="EBF5FB" w:val="clear"/>
+            <w:tcMar>
+              <w:top w:type="dxa" w:w="100"/>
+              <w:left w:type="dxa" w:w="200"/>
+              <w:bottom w:type="dxa" w:w="100"/>
+              <w:right w:type="dxa" w:w="200"/>
+            </w:tcMar>
+          </w:tcPr>
+          <w:p>
+            <w:pPr>
+              <w:spacing w:after="40"/>
+            </w:pPr>
+            <w:r>
+              <w:rPr>
+                <w:rFonts w:ascii="Arial" w:cs="Arial" w:hAnsi="Arial"/>
+                <w:b/>
+                <w:caps/>
+                <w:color w:val="1A5276"/>
+                <w:sz w:val="17"/>
+                <w:szCs w:val="17"/>
+              </w:rPr>
+              <w:t>COMMENT CA MARCHE CONCRETEMENT - DE TON TERMINAL A GITHUB</w:t>
+            </w:r>
+          </w:p>
+          <w:p>
+            <w:pPr>
+              <w:spacing w:after="0"/>
+            </w:pPr>
+            <w:r>
+              <w:rPr>
+                <w:rFonts w:ascii="Arial" w:cs="Arial" w:hAnsi="Arial"/>
+                <w:color w:val="1A1A2E"/>
+                <w:sz w:val="19"/>
+                <w:szCs w:val="19"/>
+              </w:rPr>
+              <w:t xml:space="preserve">1. Tu fais git push origin main sur ton Mac. 2. GitHub recoit le code et detecte .github/workflows/tests.yml. 3. GitHub demarre une machine virtuelle Ubuntu sur ses serveurs (gratuit pour repos publics). 4. La machine execute les etapes : clone le repo, installe Python 3.12, installe les deps, lance pytest tests/ -v. 5. Resultat visible dans l'onglet Actions : vert si tous passent, rouge sinon.</w:t>
+            </w:r>
+          </w:p>
+        </w:tc>
+      </w:tr>
+    </w:tbl>
+    <w:p>
+      <w:pPr>
+        <w:spacing w:after="80"/>
+      </w:pPr>
+    </w:p>
+    <w:tbl>
+      <w:tblPr>
+        <w:tblW w:type="dxa" w:w="9360"/>
+        <w:tblBorders>
+          <w:top w:val="single" w:color="C9A84C" w:sz="4"/>
+          <w:left w:val="single" w:color="C9A84C" w:sz="4"/>
+          <w:bottom w:val="single" w:color="C9A84C" w:sz="4"/>
+          <w:right w:val="single" w:color="C9A84C" w:sz="4"/>
+        </w:tblBorders>
+      </w:tblPr>
+      <w:tblGrid>
+        <w:gridCol w:w="9360"/>
+      </w:tblGrid>
+      <w:tr>
+        <w:tc>
+          <w:tcPr>
+            <w:shd w:fill="C9A84C" w:val="clear"/>
+            <w:tcMar>
+              <w:top w:type="dxa" w:w="60"/>
+              <w:left w:type="dxa" w:w="200"/>
+              <w:bottom w:type="dxa" w:w="60"/>
+              <w:right w:type="dxa" w:w="200"/>
+            </w:tcMar>
+          </w:tcPr>
+          <w:p>
+            <w:r>
+              <w:rPr>
+                <w:rFonts w:ascii="Courier New" w:cs="Courier New" w:hAnsi="Courier New"/>
+                <w:b/>
+                <w:color w:val="1A1A1A"/>
+                <w:sz w:val="16"/>
+                <w:szCs w:val="16"/>
+              </w:rPr>
+              <w:t>.github/workflows/tests.yml - Annote ligne par ligne</w:t>
+            </w:r>
+          </w:p>
+        </w:tc>
+      </w:tr>
+      <w:tr>
+        <w:tc>
+          <w:tcPr>
+            <w:shd w:fill="1A1A2E" w:val="clear"/>
+            <w:tcMar>
+              <w:top w:type="dxa" w:w="20"/>
+              <w:left w:type="dxa" w:w="200"/>
+              <w:bottom w:type="dxa" w:w="20"/>
+              <w:right w:type="dxa" w:w="200"/>
+            </w:tcMar>
+          </w:tcPr>
+          <w:p>
+            <w:pPr>
+              <w:spacing w:after="0"/>
+            </w:pPr>
+            <w:r>
+              <w:rPr>
+                <w:rFonts w:ascii="Courier New" w:cs="Courier New" w:hAnsi="Courier New"/>
+                <w:color w:val="C9A84C"/>
+                <w:sz w:val="17"/>
+                <w:szCs w:val="17"/>
+              </w:rPr>
+              <w:t xml:space="preserve">name: Tests CI              # nom affiche dans GitHub Actions</w:t>
+            </w:r>
+          </w:p>
+        </w:tc>
+      </w:tr>
+      <w:tr>
+        <w:tc>
+          <w:tcPr>
+            <w:shd w:fill="1A1A2E" w:val="clear"/>
+            <w:tcMar>
+              <w:top w:type="dxa" w:w="20"/>
+              <w:left w:type="dxa" w:w="200"/>
+              <w:bottom w:type="dxa" w:w="20"/>
+              <w:right w:type="dxa" w:w="200"/>
+            </w:tcMar>
+          </w:tcPr>
+          <w:p>
+            <w:pPr>
+              <w:spacing w:after="0"/>
+            </w:pPr>
+            <w:r>
+              <w:rPr>
+                <w:rFonts w:ascii="Courier New" w:cs="Courier New" w:hAnsi="Courier New"/>
+                <w:color w:val="888888"/>
+                <w:sz w:val="17"/>
+                <w:szCs w:val="17"/>
+              </w:rPr>
+              <w:t xml:space="preserve"/>
+            </w:r>
+          </w:p>
+        </w:tc>
+      </w:tr>
+      <w:tr>
+        <w:tc>
+          <w:tcPr>
+            <w:shd w:fill="1A1A2E" w:val="clear"/>
+            <w:tcMar>
+              <w:top w:type="dxa" w:w="20"/>
+              <w:left w:type="dxa" w:w="200"/>
+              <w:bottom w:type="dxa" w:w="20"/>
+              <w:right w:type="dxa" w:w="200"/>
+            </w:tcMar>
+          </w:tcPr>
+          <w:p>
+            <w:pPr>
+              <w:spacing w:after="0"/>
+            </w:pPr>
+            <w:r>
+              <w:rPr>
+                <w:rFonts w:ascii="Courier New" w:cs="Courier New" w:hAnsi="Courier New"/>
+                <w:color w:val="C9A84C"/>
+                <w:sz w:val="17"/>
+                <w:szCs w:val="17"/>
+              </w:rPr>
+              <w:t xml:space="preserve">on:                          # quand declencher ce workflow</w:t>
+            </w:r>
+          </w:p>
+        </w:tc>
+      </w:tr>
+      <w:tr>
+        <w:tc>
+          <w:tcPr>
+            <w:shd w:fill="1A1A2E" w:val="clear"/>
+            <w:tcMar>
+              <w:top w:type="dxa" w:w="20"/>
+              <w:left w:type="dxa" w:w="200"/>
+              <w:bottom w:type="dxa" w:w="20"/>
+              <w:right w:type="dxa" w:w="200"/>
+            </w:tcMar>
+          </w:tcPr>
+          <w:p>
+            <w:pPr>
+              <w:spacing w:after="0"/>
+            </w:pPr>
+            <w:r>
+              <w:rPr>
+                <w:rFonts w:ascii="Courier New" w:cs="Courier New" w:hAnsi="Courier New"/>
+                <w:color w:val="CCCCCC"/>
+                <w:sz w:val="17"/>
+                <w:szCs w:val="17"/>
+              </w:rPr>
+              <w:t xml:space="preserve">  push:</w:t>
+            </w:r>
+          </w:p>
+        </w:tc>
+      </w:tr>
+      <w:tr>
+        <w:tc>
+          <w:tcPr>
+            <w:shd w:fill="1A1A2E" w:val="clear"/>
+            <w:tcMar>
+              <w:top w:type="dxa" w:w="20"/>
+              <w:left w:type="dxa" w:w="200"/>
+              <w:bottom w:type="dxa" w:w="20"/>
+              <w:right w:type="dxa" w:w="200"/>
+            </w:tcMar>
+          </w:tcPr>
+          <w:p>
+            <w:pPr>
+              <w:spacing w:after="0"/>
+            </w:pPr>
+            <w:r>
+              <w:rPr>
+                <w:rFonts w:ascii="Courier New" w:cs="Courier New" w:hAnsi="Courier New"/>
+                <w:color w:val="CCCCCC"/>
+                <w:sz w:val="17"/>
+                <w:szCs w:val="17"/>
+              </w:rPr>
+              <w:t xml:space="preserve">    branches: [ main ]        # a chaque push sur main</w:t>
+            </w:r>
+          </w:p>
+        </w:tc>
+      </w:tr>
+      <w:tr>
+        <w:tc>
+          <w:tcPr>
+            <w:shd w:fill="1A1A2E" w:val="clear"/>
+            <w:tcMar>
+              <w:top w:type="dxa" w:w="20"/>
+              <w:left w:type="dxa" w:w="200"/>
+              <w:bottom w:type="dxa" w:w="20"/>
+              <w:right w:type="dxa" w:w="200"/>
+            </w:tcMar>
+          </w:tcPr>
+          <w:p>
+            <w:pPr>
+              <w:spacing w:after="0"/>
+            </w:pPr>
+            <w:r>
+              <w:rPr>
+                <w:rFonts w:ascii="Courier New" w:cs="Courier New" w:hAnsi="Courier New"/>
+                <w:color w:val="888888"/>
+                <w:sz w:val="17"/>
+                <w:szCs w:val="17"/>
+              </w:rPr>
+              <w:t xml:space="preserve"/>
+            </w:r>
+          </w:p>
+        </w:tc>
+      </w:tr>
+      <w:tr>
+        <w:tc>
+          <w:tcPr>
+            <w:shd w:fill="1A1A2E" w:val="clear"/>
+            <w:tcMar>
+              <w:top w:type="dxa" w:w="20"/>
+              <w:left w:type="dxa" w:w="200"/>
+              <w:bottom w:type="dxa" w:w="20"/>
+              <w:right w:type="dxa" w:w="200"/>
+            </w:tcMar>
+          </w:tcPr>
+          <w:p>
+            <w:pPr>
+              <w:spacing w:after="0"/>
+            </w:pPr>
+            <w:r>
+              <w:rPr>
+                <w:rFonts w:ascii="Courier New" w:cs="Courier New" w:hAnsi="Courier New"/>
+                <w:color w:val="C9A84C"/>
+                <w:sz w:val="17"/>
+                <w:szCs w:val="17"/>
+              </w:rPr>
+              <w:t xml:space="preserve">jobs:</w:t>
+            </w:r>
+          </w:p>
+        </w:tc>
+      </w:tr>
+      <w:tr>
+        <w:tc>
+          <w:tcPr>
+            <w:shd w:fill="1A1A2E" w:val="clear"/>
+            <w:tcMar>
+              <w:top w:type="dxa" w:w="20"/>
+              <w:left w:type="dxa" w:w="200"/>
+              <w:bottom w:type="dxa" w:w="20"/>
+              <w:right w:type="dxa" w:w="200"/>
+            </w:tcMar>
+          </w:tcPr>
+          <w:p>
+            <w:pPr>
+              <w:spacing w:after="0"/>
+            </w:pPr>
+            <w:r>
+              <w:rPr>
+                <w:rFonts w:ascii="Courier New" w:cs="Courier New" w:hAnsi="Courier New"/>
+                <w:color w:val="CCCCCC"/>
+                <w:sz w:val="17"/>
+                <w:szCs w:val="17"/>
+              </w:rPr>
+              <w:t xml:space="preserve">  test:</w:t>
+            </w:r>
+          </w:p>
+        </w:tc>
+      </w:tr>
+      <w:tr>
+        <w:tc>
+          <w:tcPr>
+            <w:shd w:fill="1A1A2E" w:val="clear"/>
+            <w:tcMar>
+              <w:top w:type="dxa" w:w="20"/>
+              <w:left w:type="dxa" w:w="200"/>
+              <w:bottom w:type="dxa" w:w="20"/>
+              <w:right w:type="dxa" w:w="200"/>
+            </w:tcMar>
+          </w:tcPr>
+          <w:p>
+            <w:pPr>
+              <w:spacing w:after="0"/>
+            </w:pPr>
+            <w:r>
+              <w:rPr>
+                <w:rFonts w:ascii="Courier New" w:cs="Courier New" w:hAnsi="Courier New"/>
+                <w:color w:val="CCCCCC"/>
+                <w:sz w:val="17"/>
+                <w:szCs w:val="17"/>
+              </w:rPr>
+              <w:t xml:space="preserve">    runs-on: ubuntu-latest   # machine Ubuntu gratuite</w:t>
+            </w:r>
+          </w:p>
+        </w:tc>
+      </w:tr>
+      <w:tr>
+        <w:tc>
+          <w:tcPr>
+            <w:shd w:fill="1A1A2E" w:val="clear"/>
+            <w:tcMar>
+              <w:top w:type="dxa" w:w="20"/>
+              <w:left w:type="dxa" w:w="200"/>
+              <w:bottom w:type="dxa" w:w="20"/>
+              <w:right w:type="dxa" w:w="200"/>
+            </w:tcMar>
+          </w:tcPr>
+          <w:p>
+            <w:pPr>
+              <w:spacing w:after="0"/>
+            </w:pPr>
+            <w:r>
+              <w:rPr>
+                <w:rFonts w:ascii="Courier New" w:cs="Courier New" w:hAnsi="Courier New"/>
+                <w:color w:val="888888"/>
+                <w:sz w:val="17"/>
+                <w:szCs w:val="17"/>
+              </w:rPr>
+              <w:t xml:space="preserve"/>
+            </w:r>
+          </w:p>
+        </w:tc>
+      </w:tr>
+      <w:tr>
+        <w:tc>
+          <w:tcPr>
+            <w:shd w:fill="1A1A2E" w:val="clear"/>
+            <w:tcMar>
+              <w:top w:type="dxa" w:w="20"/>
+              <w:left w:type="dxa" w:w="200"/>
+              <w:bottom w:type="dxa" w:w="20"/>
+              <w:right w:type="dxa" w:w="200"/>
+            </w:tcMar>
+          </w:tcPr>
+          <w:p>
+            <w:pPr>
+              <w:spacing w:after="0"/>
+            </w:pPr>
+            <w:r>
+              <w:rPr>
+                <w:rFonts w:ascii="Courier New" w:cs="Courier New" w:hAnsi="Courier New"/>
+                <w:color w:val="C9A84C"/>
+                <w:sz w:val="17"/>
+                <w:szCs w:val="17"/>
+              </w:rPr>
+              <w:t xml:space="preserve">    steps:                   # etapes dans l'ordre</w:t>
+            </w:r>
+          </w:p>
+        </w:tc>
+      </w:tr>
+      <w:tr>
+        <w:tc>
+          <w:tcPr>
+            <w:shd w:fill="1A1A2E" w:val="clear"/>
+            <w:tcMar>
+              <w:top w:type="dxa" w:w="20"/>
+              <w:left w:type="dxa" w:w="200"/>
+              <w:bottom w:type="dxa" w:w="20"/>
+              <w:right w:type="dxa" w:w="200"/>
+            </w:tcMar>
+          </w:tcPr>
+          <w:p>
+            <w:pPr>
+              <w:spacing w:after="0"/>
+            </w:pPr>
+            <w:r>
+              <w:rPr>
+                <w:rFonts w:ascii="Courier New" w:cs="Courier New" w:hAnsi="Courier New"/>
+                <w:color w:val="CCCCCC"/>
+                <w:sz w:val="17"/>
+                <w:szCs w:val="17"/>
+              </w:rPr>
+              <w:t xml:space="preserve">      - uses: actions/checkout@v4     # clone le repo</w:t>
+            </w:r>
+          </w:p>
+        </w:tc>
+      </w:tr>
+      <w:tr>
+        <w:tc>
+          <w:tcPr>
+            <w:shd w:fill="1A1A2E" w:val="clear"/>
+            <w:tcMar>
+              <w:top w:type="dxa" w:w="20"/>
+              <w:left w:type="dxa" w:w="200"/>
+              <w:bottom w:type="dxa" w:w="20"/>
+              <w:right w:type="dxa" w:w="200"/>
+            </w:tcMar>
+          </w:tcPr>
+          <w:p>
+            <w:pPr>
+              <w:spacing w:after="0"/>
+            </w:pPr>
+            <w:r>
+              <w:rPr>
+                <w:rFonts w:ascii="Courier New" w:cs="Courier New" w:hAnsi="Courier New"/>
+                <w:color w:val="CCCCCC"/>
+                <w:sz w:val="17"/>
+                <w:szCs w:val="17"/>
+              </w:rPr>
+              <w:t xml:space="preserve">      - uses: actions/setup-python@v5  # installe Python 3.12</w:t>
+            </w:r>
+          </w:p>
+        </w:tc>
+      </w:tr>
+      <w:tr>
+        <w:tc>
+          <w:tcPr>
+            <w:shd w:fill="1A1A2E" w:val="clear"/>
+            <w:tcMar>
+              <w:top w:type="dxa" w:w="20"/>
+              <w:left w:type="dxa" w:w="200"/>
+              <w:bottom w:type="dxa" w:w="20"/>
+              <w:right w:type="dxa" w:w="200"/>
+            </w:tcMar>
+          </w:tcPr>
+          <w:p>
+            <w:pPr>
+              <w:spacing w:after="0"/>
+            </w:pPr>
+            <w:r>
+              <w:rPr>
+                <w:rFonts w:ascii="Courier New" w:cs="Courier New" w:hAnsi="Courier New"/>
+                <w:color w:val="888888"/>
+                <w:sz w:val="17"/>
+                <w:szCs w:val="17"/>
+              </w:rPr>
+              <w:t xml:space="preserve"/>
+            </w:r>
+          </w:p>
+        </w:tc>
+      </w:tr>
+      <w:tr>
+        <w:tc>
+          <w:tcPr>
+            <w:shd w:fill="1A1A2E" w:val="clear"/>
+            <w:tcMar>
+              <w:top w:type="dxa" w:w="20"/>
+              <w:left w:type="dxa" w:w="200"/>
+              <w:bottom w:type="dxa" w:w="20"/>
+              <w:right w:type="dxa" w:w="200"/>
+            </w:tcMar>
+          </w:tcPr>
+          <w:p>
+            <w:pPr>
+              <w:spacing w:after="0"/>
+            </w:pPr>
+            <w:r>
+              <w:rPr>
+                <w:rFonts w:ascii="Courier New" w:cs="Courier New" w:hAnsi="Courier New"/>
+                <w:color w:val="C9A84C"/>
+                <w:sz w:val="17"/>
+                <w:szCs w:val="17"/>
+              </w:rPr>
+              <w:t xml:space="preserve">      - name: Install test dependencies</w:t>
+            </w:r>
+          </w:p>
+        </w:tc>
+      </w:tr>
+      <w:tr>
+        <w:tc>
+          <w:tcPr>
+            <w:shd w:fill="1A1A2E" w:val="clear"/>
+            <w:tcMar>
+              <w:top w:type="dxa" w:w="20"/>
+              <w:left w:type="dxa" w:w="200"/>
+              <w:bottom w:type="dxa" w:w="20"/>
+              <w:right w:type="dxa" w:w="200"/>
+            </w:tcMar>
+          </w:tcPr>
+          <w:p>
+            <w:pPr>
+              <w:spacing w:after="0"/>
+            </w:pPr>
+            <w:r>
+              <w:rPr>
+                <w:rFonts w:ascii="Courier New" w:cs="Courier New" w:hAnsi="Courier New"/>
+                <w:color w:val="CCCCCC"/>
+                <w:sz w:val="17"/>
+                <w:szCs w:val="17"/>
+              </w:rPr>
+              <w:t xml:space="preserve">        run: |</w:t>
+            </w:r>
+          </w:p>
+        </w:tc>
+      </w:tr>
+      <w:tr>
+        <w:tc>
+          <w:tcPr>
+            <w:shd w:fill="1A1A2E" w:val="clear"/>
+            <w:tcMar>
+              <w:top w:type="dxa" w:w="20"/>
+              <w:left w:type="dxa" w:w="200"/>
+              <w:bottom w:type="dxa" w:w="20"/>
+              <w:right w:type="dxa" w:w="200"/>
+            </w:tcMar>
+          </w:tcPr>
+          <w:p>
+            <w:pPr>
+              <w:spacing w:after="0"/>
+            </w:pPr>
+            <w:r>
+              <w:rPr>
+                <w:rFonts w:ascii="Courier New" w:cs="Courier New" w:hAnsi="Courier New"/>
+                <w:color w:val="CCCCCC"/>
+                <w:sz w:val="17"/>
+                <w:szCs w:val="17"/>
+              </w:rPr>
+              <w:t xml:space="preserve">          pip install pytest pytest-cov  # outil de test</w:t>
+            </w:r>
+          </w:p>
+        </w:tc>
+      </w:tr>
+      <w:tr>
+        <w:tc>
+          <w:tcPr>
+            <w:shd w:fill="1A1A2E" w:val="clear"/>
+            <w:tcMar>
+              <w:top w:type="dxa" w:w="20"/>
+              <w:left w:type="dxa" w:w="200"/>
+              <w:bottom w:type="dxa" w:w="20"/>
+              <w:right w:type="dxa" w:w="200"/>
+            </w:tcMar>
+          </w:tcPr>
+          <w:p>
+            <w:pPr>
+              <w:spacing w:after="0"/>
+            </w:pPr>
+            <w:r>
+              <w:rPr>
+                <w:rFonts w:ascii="Courier New" w:cs="Courier New" w:hAnsi="Courier New"/>
+                <w:color w:val="CCCCCC"/>
+                <w:sz w:val="17"/>
+                <w:szCs w:val="17"/>
+              </w:rPr>
+              <w:t xml:space="preserve">          pip install PyJWT cryptography # auth</w:t>
+            </w:r>
+          </w:p>
+        </w:tc>
+      </w:tr>
+      <w:tr>
+        <w:tc>
+          <w:tcPr>
+            <w:shd w:fill="1A1A2E" w:val="clear"/>
+            <w:tcMar>
+              <w:top w:type="dxa" w:w="20"/>
+              <w:left w:type="dxa" w:w="200"/>
+              <w:bottom w:type="dxa" w:w="20"/>
+              <w:right w:type="dxa" w:w="200"/>
+            </w:tcMar>
+          </w:tcPr>
+          <w:p>
+            <w:pPr>
+              <w:spacing w:after="0"/>
+            </w:pPr>
+            <w:r>
+              <w:rPr>
+                <w:rFonts w:ascii="Courier New" w:cs="Courier New" w:hAnsi="Courier New"/>
+                <w:color w:val="CCCCCC"/>
+                <w:sz w:val="17"/>
+                <w:szCs w:val="17"/>
+              </w:rPr>
+              <w:t xml:space="preserve">          pip install fastapi pydantic   # framework</w:t>
+            </w:r>
+          </w:p>
+        </w:tc>
+      </w:tr>
+      <w:tr>
+        <w:tc>
+          <w:tcPr>
+            <w:shd w:fill="1A1A2E" w:val="clear"/>
+            <w:tcMar>
+              <w:top w:type="dxa" w:w="20"/>
+              <w:left w:type="dxa" w:w="200"/>
+              <w:bottom w:type="dxa" w:w="20"/>
+              <w:right w:type="dxa" w:w="200"/>
+            </w:tcMar>
+          </w:tcPr>
+          <w:p>
+            <w:pPr>
+              <w:spacing w:after="0"/>
+            </w:pPr>
+            <w:r>
+              <w:rPr>
+                <w:rFonts w:ascii="Courier New" w:cs="Courier New" w:hAnsi="Courier New"/>
+                <w:color w:val="888888"/>
+                <w:sz w:val="17"/>
+                <w:szCs w:val="17"/>
+              </w:rPr>
+              <w:t xml:space="preserve">          # NE PAS installer faiss/sentence-transformers</w:t>
+            </w:r>
+          </w:p>
+        </w:tc>
+      </w:tr>
+      <w:tr>
+        <w:tc>
+          <w:tcPr>
+            <w:shd w:fill="1A1A2E" w:val="clear"/>
+            <w:tcMar>
+              <w:top w:type="dxa" w:w="20"/>
+              <w:left w:type="dxa" w:w="200"/>
+              <w:bottom w:type="dxa" w:w="20"/>
+              <w:right w:type="dxa" w:w="200"/>
+            </w:tcMar>
+          </w:tcPr>
+          <w:p>
+            <w:pPr>
+              <w:spacing w:after="0"/>
+            </w:pPr>
+            <w:r>
+              <w:rPr>
+                <w:rFonts w:ascii="Courier New" w:cs="Courier New" w:hAnsi="Courier New"/>
+                <w:color w:val="888888"/>
+                <w:sz w:val="17"/>
+                <w:szCs w:val="17"/>
+              </w:rPr>
+              <w:t xml:space="preserve">          # -&gt; trop lourds, inutiles pour les tests unitaires</w:t>
+            </w:r>
+          </w:p>
+        </w:tc>
+      </w:tr>
+      <w:tr>
+        <w:tc>
+          <w:tcPr>
+            <w:shd w:fill="1A1A2E" w:val="clear"/>
+            <w:tcMar>
+              <w:top w:type="dxa" w:w="20"/>
+              <w:left w:type="dxa" w:w="200"/>
+              <w:bottom w:type="dxa" w:w="20"/>
+              <w:right w:type="dxa" w:w="200"/>
+            </w:tcMar>
+          </w:tcPr>
+          <w:p>
+            <w:pPr>
+              <w:spacing w:after="0"/>
+            </w:pPr>
+            <w:r>
+              <w:rPr>
+                <w:rFonts w:ascii="Courier New" w:cs="Courier New" w:hAnsi="Courier New"/>
+                <w:color w:val="888888"/>
+                <w:sz w:val="17"/>
+                <w:szCs w:val="17"/>
+              </w:rPr>
+              <w:t xml:space="preserve"/>
+            </w:r>
+          </w:p>
+        </w:tc>
+      </w:tr>
+      <w:tr>
+        <w:tc>
+          <w:tcPr>
+            <w:shd w:fill="1A1A2E" w:val="clear"/>
+            <w:tcMar>
+              <w:top w:type="dxa" w:w="20"/>
+              <w:left w:type="dxa" w:w="200"/>
+              <w:bottom w:type="dxa" w:w="20"/>
+              <w:right w:type="dxa" w:w="200"/>
+            </w:tcMar>
+          </w:tcPr>
+          <w:p>
+            <w:pPr>
+              <w:spacing w:after="0"/>
+            </w:pPr>
+            <w:r>
+              <w:rPr>
+                <w:rFonts w:ascii="Courier New" w:cs="Courier New" w:hAnsi="Courier New"/>
+                <w:color w:val="C9A84C"/>
+                <w:sz w:val="17"/>
+                <w:szCs w:val="17"/>
+              </w:rPr>
+              <w:t xml:space="preserve">      - name: Run unit tests</w:t>
+            </w:r>
+          </w:p>
+        </w:tc>
+      </w:tr>
+      <w:tr>
+        <w:tc>
+          <w:tcPr>
+            <w:shd w:fill="1A1A2E" w:val="clear"/>
+            <w:tcMar>
+              <w:top w:type="dxa" w:w="20"/>
+              <w:left w:type="dxa" w:w="200"/>
+              <w:bottom w:type="dxa" w:w="20"/>
+              <w:right w:type="dxa" w:w="200"/>
+            </w:tcMar>
+          </w:tcPr>
+          <w:p>
+            <w:pPr>
+              <w:spacing w:after="0"/>
+            </w:pPr>
+            <w:r>
+              <w:rPr>
+                <w:rFonts w:ascii="Courier New" w:cs="Courier New" w:hAnsi="Courier New"/>
+                <w:color w:val="CCCCCC"/>
+                <w:sz w:val="17"/>
+                <w:szCs w:val="17"/>
+              </w:rPr>
+              <w:t xml:space="preserve">        env:</w:t>
+            </w:r>
+          </w:p>
+        </w:tc>
+      </w:tr>
+      <w:tr>
+        <w:tc>
+          <w:tcPr>
+            <w:shd w:fill="1A1A2E" w:val="clear"/>
+            <w:tcMar>
+              <w:top w:type="dxa" w:w="20"/>
+              <w:left w:type="dxa" w:w="200"/>
+              <w:bottom w:type="dxa" w:w="20"/>
+              <w:right w:type="dxa" w:w="200"/>
+            </w:tcMar>
+          </w:tcPr>
+          <w:p>
+            <w:pPr>
+              <w:spacing w:after="0"/>
+            </w:pPr>
+            <w:r>
+              <w:rPr>
+                <w:rFonts w:ascii="Courier New" w:cs="Courier New" w:hAnsi="Courier New"/>
+                <w:color w:val="CCCCCC"/>
+                <w:sz w:val="17"/>
+                <w:szCs w:val="17"/>
+              </w:rPr>
+              <w:t xml:space="preserve">          JWT_SECRET_KEY: 'ci_test_secret...'  # jamais la vraie cle</w:t>
+            </w:r>
+          </w:p>
+        </w:tc>
+      </w:tr>
+      <w:tr>
+        <w:tc>
+          <w:tcPr>
+            <w:shd w:fill="1A1A2E" w:val="clear"/>
+            <w:tcMar>
+              <w:top w:type="dxa" w:w="20"/>
+              <w:left w:type="dxa" w:w="200"/>
+              <w:bottom w:type="dxa" w:w="20"/>
+              <w:right w:type="dxa" w:w="200"/>
+            </w:tcMar>
+          </w:tcPr>
+          <w:p>
+            <w:pPr>
+              <w:spacing w:after="0"/>
+            </w:pPr>
+            <w:r>
+              <w:rPr>
+                <w:rFonts w:ascii="Courier New" w:cs="Courier New" w:hAnsi="Courier New"/>
+                <w:color w:val="CCCCCC"/>
+                <w:sz w:val="17"/>
+                <w:szCs w:val="17"/>
+              </w:rPr>
+              <w:t xml:space="preserve">        run: python -m pytest tests/ -v --tb=short</w:t>
+            </w:r>
+          </w:p>
+        </w:tc>
+      </w:tr>
+    </w:tbl>
+    <w:p>
+      <w:pPr>
+        <w:spacing w:after="80"/>
+      </w:pPr>
+    </w:p>
+    <w:tbl>
+      <w:tblPr>
+        <w:tblW w:type="dxa" w:w="9360"/>
+        <w:tblBorders>
+          <w:top w:val="single" w:color="C9A84C" w:sz="4"/>
+          <w:left w:val="single" w:color="C9A84C" w:sz="8"/>
+          <w:bottom w:val="single" w:color="C9A84C" w:sz="4"/>
+          <w:right w:val="single" w:color="C9A84C" w:sz="4"/>
+        </w:tblBorders>
+      </w:tblPr>
+      <w:tblGrid>
+        <w:gridCol w:w="9360"/>
+      </w:tblGrid>
+      <w:tr>
+        <w:tc>
+          <w:tcPr>
+            <w:shd w:fill="FFF8E1" w:val="clear"/>
+            <w:tcMar>
+              <w:top w:type="dxa" w:w="100"/>
+              <w:left w:type="dxa" w:w="200"/>
+              <w:bottom w:type="dxa" w:w="100"/>
+              <w:right w:type="dxa" w:w="200"/>
+            </w:tcMar>
+          </w:tcPr>
+          <w:p>
+            <w:pPr>
+              <w:spacing w:after="40"/>
+            </w:pPr>
+            <w:r>
+              <w:rPr>
+                <w:rFonts w:ascii="Arial" w:cs="Arial" w:hAnsi="Arial"/>
+                <w:b/>
+                <w:caps/>
+                <w:color w:val="7D6608"/>
+                <w:sz w:val="17"/>
+                <w:szCs w:val="17"/>
+              </w:rPr>
+              <w:t>POURQUOI ON N'INSTALLE PAS requirements.txt COMPLET EN CI</w:t>
+            </w:r>
+          </w:p>
+          <w:p>
+            <w:pPr>
+              <w:spacing w:after="0"/>
+            </w:pPr>
+            <w:r>
+              <w:rPr>
+                <w:rFonts w:ascii="Arial" w:cs="Arial" w:hAnsi="Arial"/>
+                <w:color w:val="1A1A2E"/>
+                <w:sz w:val="19"/>
+                <w:szCs w:val="19"/>
+              </w:rPr>
+              <w:t xml:space="preserve">Le requirements.txt complet inclut faiss-cpu, sentence-transformers et torch - packages qui pesent plusieurs gigaoctets et prennent 5-10 minutes a installer. Les tests unitaires n'utilisent pas ces packages - ils testent uniquement des fonctions pures. On installe seulement pytest, PyJWT, fastapi et pydantic.</w:t>
+            </w:r>
+          </w:p>
+        </w:tc>
+      </w:tr>
+    </w:tbl>
+    <w:p>
+      <w:pPr>
+        <w:spacing w:after="80"/>
+      </w:pPr>
+    </w:p>
+    <w:tbl>
+      <w:tblPr>
+        <w:tblW w:type="dxa" w:w="9360"/>
+        <w:tblBorders>
+          <w:top w:val="single" w:color="C9A84C" w:sz="4"/>
+          <w:left w:val="single" w:color="C9A84C" w:sz="4"/>
+          <w:bottom w:val="single" w:color="C9A84C" w:sz="4"/>
+          <w:right w:val="single" w:color="C9A84C" w:sz="4"/>
+        </w:tblBorders>
+      </w:tblPr>
+      <w:tblGrid>
+        <w:gridCol w:w="9360"/>
+      </w:tblGrid>
+      <w:tr>
+        <w:tc>
+          <w:tcPr>
+            <w:shd w:fill="C9A84C" w:val="clear"/>
+            <w:tcMar>
+              <w:top w:type="dxa" w:w="60"/>
+              <w:left w:type="dxa" w:w="200"/>
+              <w:bottom w:type="dxa" w:w="60"/>
+              <w:right w:type="dxa" w:w="200"/>
+            </w:tcMar>
+          </w:tcPr>
+          <w:p>
+            <w:r>
+              <w:rPr>
+                <w:rFonts w:ascii="Courier New" w:cs="Courier New" w:hAnsi="Courier New"/>
+                <w:b/>
+                <w:color w:val="1A1A1A"/>
+                <w:sz w:val="16"/>
+                <w:szCs w:val="16"/>
+              </w:rPr>
+              <w:t>Resultat CI - GitHub Actions - 100/100 PASSED</w:t>
+            </w:r>
+          </w:p>
+        </w:tc>
+      </w:tr>
+      <w:tr>
+        <w:tc>
+          <w:tcPr>
+            <w:shd w:fill="1A1A2E" w:val="clear"/>
+            <w:tcMar>
+              <w:top w:type="dxa" w:w="20"/>
+              <w:left w:type="dxa" w:w="200"/>
+              <w:bottom w:type="dxa" w:w="20"/>
+              <w:right w:type="dxa" w:w="200"/>
+            </w:tcMar>
+          </w:tcPr>
+          <w:p>
+            <w:pPr>
+              <w:spacing w:after="0"/>
+            </w:pPr>
+            <w:r>
+              <w:rPr>
+                <w:rFonts w:ascii="Courier New" w:cs="Courier New" w:hAnsi="Courier New"/>
+                <w:color w:val="CCCCCC"/>
+                <w:sz w:val="17"/>
+                <w:szCs w:val="17"/>
+              </w:rPr>
+              <w:t xml:space="preserve">platform linux -- Python 3.12.13 · pytest 9.0.2</w:t>
+            </w:r>
+          </w:p>
+        </w:tc>
+      </w:tr>
+      <w:tr>
+        <w:tc>
+          <w:tcPr>
+            <w:shd w:fill="1A1A2E" w:val="clear"/>
+            <w:tcMar>
+              <w:top w:type="dxa" w:w="20"/>
+              <w:left w:type="dxa" w:w="200"/>
+              <w:bottom w:type="dxa" w:w="20"/>
+              <w:right w:type="dxa" w:w="200"/>
+            </w:tcMar>
+          </w:tcPr>
+          <w:p>
+            <w:pPr>
+              <w:spacing w:after="0"/>
+            </w:pPr>
+            <w:r>
+              <w:rPr>
+                <w:rFonts w:ascii="Courier New" w:cs="Courier New" w:hAnsi="Courier New"/>
+                <w:color w:val="CCCCCC"/>
+                <w:sz w:val="17"/>
+                <w:szCs w:val="17"/>
+              </w:rPr>
+              <w:t xml:space="preserve">collected 100 items</w:t>
+            </w:r>
+          </w:p>
+        </w:tc>
+      </w:tr>
+      <w:tr>
+        <w:tc>
+          <w:tcPr>
+            <w:shd w:fill="1A1A2E" w:val="clear"/>
+            <w:tcMar>
+              <w:top w:type="dxa" w:w="20"/>
+              <w:left w:type="dxa" w:w="200"/>
+              <w:bottom w:type="dxa" w:w="20"/>
+              <w:right w:type="dxa" w:w="200"/>
+            </w:tcMar>
+          </w:tcPr>
+          <w:p>
+            <w:pPr>
+              <w:spacing w:after="0"/>
+            </w:pPr>
+            <w:r>
+              <w:rPr>
+                <w:rFonts w:ascii="Courier New" w:cs="Courier New" w:hAnsi="Courier New"/>
+                <w:color w:val="888888"/>
+                <w:sz w:val="17"/>
+                <w:szCs w:val="17"/>
+              </w:rPr>
+              <w:t xml:space="preserve"/>
+            </w:r>
+          </w:p>
+        </w:tc>
+      </w:tr>
+      <w:tr>
+        <w:tc>
+          <w:tcPr>
+            <w:shd w:fill="1A1A2E" w:val="clear"/>
+            <w:tcMar>
+              <w:top w:type="dxa" w:w="20"/>
+              <w:left w:type="dxa" w:w="200"/>
+              <w:bottom w:type="dxa" w:w="20"/>
+              <w:right w:type="dxa" w:w="200"/>
+            </w:tcMar>
+          </w:tcPr>
+          <w:p>
+            <w:pPr>
+              <w:spacing w:after="0"/>
+            </w:pPr>
+            <w:r>
+              <w:rPr>
+                <w:rFonts w:ascii="Courier New" w:cs="Courier New" w:hAnsi="Courier New"/>
+                <w:color w:val="4CAF50"/>
+                <w:sz w:val="17"/>
+                <w:szCs w:val="17"/>
+              </w:rPr>
+              <w:t xml:space="preserve">tests/test_audit_disclaimer.py  ........................... 27 passed</w:t>
+            </w:r>
+          </w:p>
+        </w:tc>
+      </w:tr>
+      <w:tr>
+        <w:tc>
+          <w:tcPr>
+            <w:shd w:fill="1A1A2E" w:val="clear"/>
+            <w:tcMar>
+              <w:top w:type="dxa" w:w="20"/>
+              <w:left w:type="dxa" w:w="200"/>
+              <w:bottom w:type="dxa" w:w="20"/>
+              <w:right w:type="dxa" w:w="200"/>
+            </w:tcMar>
+          </w:tcPr>
+          <w:p>
+            <w:pPr>
+              <w:spacing w:after="0"/>
+            </w:pPr>
+            <w:r>
+              <w:rPr>
+                <w:rFonts w:ascii="Courier New" w:cs="Courier New" w:hAnsi="Courier New"/>
+                <w:color w:val="4CAF50"/>
+                <w:sz w:val="17"/>
+                <w:szCs w:val="17"/>
+              </w:rPr>
+              <w:t xml:space="preserve">tests/test_auth.py              ...................... 22 passed</w:t>
+            </w:r>
+          </w:p>
+        </w:tc>
+      </w:tr>
+      <w:tr>
+        <w:tc>
+          <w:tcPr>
+            <w:shd w:fill="1A1A2E" w:val="clear"/>
+            <w:tcMar>
+              <w:top w:type="dxa" w:w="20"/>
+              <w:left w:type="dxa" w:w="200"/>
+              <w:bottom w:type="dxa" w:w="20"/>
+              <w:right w:type="dxa" w:w="200"/>
+            </w:tcMar>
+          </w:tcPr>
+          <w:p>
+            <w:pPr>
+              <w:spacing w:after="0"/>
+            </w:pPr>
+            <w:r>
+              <w:rPr>
+                <w:rFonts w:ascii="Courier New" w:cs="Courier New" w:hAnsi="Courier New"/>
+                <w:color w:val="4CAF50"/>
+                <w:sz w:val="17"/>
+                <w:szCs w:val="17"/>
+              </w:rPr>
+              <w:t xml:space="preserve">tests/test_guardrail.py         ...................... 22 passed</w:t>
+            </w:r>
+          </w:p>
+        </w:tc>
+      </w:tr>
+      <w:tr>
+        <w:tc>
+          <w:tcPr>
+            <w:shd w:fill="1A1A2E" w:val="clear"/>
+            <w:tcMar>
+              <w:top w:type="dxa" w:w="20"/>
+              <w:left w:type="dxa" w:w="200"/>
+              <w:bottom w:type="dxa" w:w="20"/>
+              <w:right w:type="dxa" w:w="200"/>
+            </w:tcMar>
+          </w:tcPr>
+          <w:p>
+            <w:pPr>
+              <w:spacing w:after="0"/>
+            </w:pPr>
+            <w:r>
+              <w:rPr>
+                <w:rFonts w:ascii="Courier New" w:cs="Courier New" w:hAnsi="Courier New"/>
+                <w:color w:val="4CAF50"/>
+                <w:sz w:val="17"/>
+                <w:szCs w:val="17"/>
+              </w:rPr>
+              <w:t xml:space="preserve">tests/test_injection.py         ........................ 24 passed</w:t>
+            </w:r>
+          </w:p>
+        </w:tc>
+      </w:tr>
+      <w:tr>
+        <w:tc>
+          <w:tcPr>
+            <w:shd w:fill="1A1A2E" w:val="clear"/>
+            <w:tcMar>
+              <w:top w:type="dxa" w:w="20"/>
+              <w:left w:type="dxa" w:w="200"/>
+              <w:bottom w:type="dxa" w:w="20"/>
+              <w:right w:type="dxa" w:w="200"/>
+            </w:tcMar>
+          </w:tcPr>
+          <w:p>
+            <w:pPr>
+              <w:spacing w:after="0"/>
+            </w:pPr>
+            <w:r>
+              <w:rPr>
+                <w:rFonts w:ascii="Courier New" w:cs="Courier New" w:hAnsi="Courier New"/>
+                <w:color w:val="888888"/>
+                <w:sz w:val="17"/>
+                <w:szCs w:val="17"/>
+              </w:rPr>
+              <w:t xml:space="preserve"/>
+            </w:r>
+          </w:p>
+        </w:tc>
+      </w:tr>
+      <w:tr>
+        <w:tc>
+          <w:tcPr>
+            <w:shd w:fill="1A1A2E" w:val="clear"/>
+            <w:tcMar>
+              <w:top w:type="dxa" w:w="20"/>
+              <w:left w:type="dxa" w:w="200"/>
+              <w:bottom w:type="dxa" w:w="20"/>
+              <w:right w:type="dxa" w:w="200"/>
+            </w:tcMar>
+          </w:tcPr>
+          <w:p>
+            <w:pPr>
+              <w:spacing w:after="0"/>
+            </w:pPr>
+            <w:r>
+              <w:rPr>
+                <w:rFonts w:ascii="Courier New" w:cs="Courier New" w:hAnsi="Courier New"/>
+                <w:color w:val="4CAF50"/>
+                <w:sz w:val="17"/>
+                <w:szCs w:val="17"/>
+              </w:rPr>
+              <w:t xml:space="preserve">========================= 100 passed in 1.69s =========================</w:t>
             </w:r>
           </w:p>
         </w:tc>

</xml_diff>

<commit_message>
docs: v7.0 — sections audit log, tests CI, frontend Lex AI
</commit_message>
<xml_diff>
--- a/docs/AI_Legal_Platform_Documentation.docx
+++ b/docs/AI_Legal_Platform_Documentation.docx
@@ -21557,7 +21557,7 @@
           <w:sz w:val="18"/>
           <w:szCs w:val="18"/>
         </w:rPr>
-        <w:t>Tracabilite · JSONL rotatif · request_id · Deontologie · Obligation RGPD</w:t>
+        <w:t>Tracabilite -- JSONL rotatif -- request_id -- Deontologie -- RGPD</w:t>
       </w:r>
     </w:p>
     <w:p>
@@ -21572,7 +21572,7 @@
           <w:sz w:val="22"/>
           <w:szCs w:val="22"/>
         </w:rPr>
-        <w:t>Partie A — Audit Log JSONL</w:t>
+        <w:t>Partie A -- Audit Log JSONL</w:t>
       </w:r>
     </w:p>
     <w:p>
@@ -21649,7 +21649,7 @@
                 <w:sz w:val="19"/>
                 <w:szCs w:val="19"/>
               </w:rPr>
-              <w:t xml:space="preserve">Registre chronologique de tout ce qui se passe dans le systeme. Comme le journal de bord d'un capitaine. Obligatoire pour prouver la conformite RGPD (Article 5(2) - accountability).</w:t>
+              <w:t xml:space="preserve">Registre chronologique de tout ce qui se passe dans le systeme. Obligatoire pour prouver la conformite RGPD Article 5(2) accountability.</w:t>
             </w:r>
           </w:p>
         </w:tc>
@@ -21714,7 +21714,7 @@
                 <w:sz w:val="19"/>
                 <w:szCs w:val="19"/>
               </w:rPr>
-              <w:t xml:space="preserve">JSON Lines : format ou chaque ligne est un objet JSON independant. Peut etre lu ligne par ligne sans charger tout le fichier. Ideal pour les logs qui s'accumulent.</w:t>
+              <w:t xml:space="preserve">JSON Lines : chaque ligne est un objet JSON independant. Ideal pour les logs qui s'accumulent continuellement.</w:t>
             </w:r>
           </w:p>
         </w:tc>
@@ -21779,7 +21779,7 @@
                 <w:sz w:val="19"/>
                 <w:szCs w:val="19"/>
               </w:rPr>
-              <w:t xml:space="preserve">Mecanisme qui renomme automatiquement le fichier quand il devient trop grand. audit.jsonl -&gt; audit.jsonl.1 -&gt; etc. 5 fichiers max = 50 MB sur disque.</w:t>
+              <w:t xml:space="preserve">Quand audit.jsonl depasse 10 MB, il est renomme audit.jsonl.1 automatiquement. 5 fichiers max = 50 MB sur disque.</w:t>
             </w:r>
           </w:p>
         </w:tc>
@@ -21844,7 +21844,7 @@
                 <w:sz w:val="19"/>
                 <w:szCs w:val="19"/>
               </w:rPr>
-              <w:t xml:space="preserve">Identifiant unique genere pour chaque requete (UUID). Permet de retrouver une requete precise dans les logs. Format : 550e8400-e29b-41d4-a716-446655440000.</w:t>
+              <w:t xml:space="preserve">Identifiant UUID unique par requete. Format : 550e8400-e29b-41d4-a716-446655440000.</w:t>
             </w:r>
           </w:p>
         </w:tc>
@@ -21854,20 +21854,6 @@
       <w:pPr>
         <w:spacing w:after="80"/>
       </w:pPr>
-    </w:p>
-    <w:p>
-      <w:pPr>
-        <w:spacing w:after="100"/>
-      </w:pPr>
-      <w:r>
-        <w:rPr>
-          <w:rFonts w:ascii="Arial" w:cs="Arial" w:hAnsi="Arial"/>
-          <w:color w:val="1A1A2E"/>
-          <w:sz w:val="20"/>
-          <w:szCs w:val="20"/>
-        </w:rPr>
-        <w:t xml:space="preserve">Chaque appel reussi a /search genere une ligne JSONL dans logs/audit/audit.jsonl. Cette ligne contient : qui a demande (user_sub, plan), quoi (question tronquee a 500 chars), comment (k, reranking, langue), quelles sources ont ete utilisees, le resultat du guardrail, et la latence.</w:t>
-      </w:r>
     </w:p>
     <w:tbl>
       <w:tblPr>
@@ -21920,7 +21906,7 @@
                 <w:sz w:val="19"/>
                 <w:szCs w:val="19"/>
               </w:rPr>
-              <w:t xml:space="preserve">Le RGPD Article 5(2) impose la responsabilite (accountability) : le cabinet doit pouvoir prouver que son systeme traite les donnees conformement a la loi. L'audit log est cette preuve. Si un client demande 'quelle reponse avez-vous donnee le 15 mars a 14h32 ?', on retrouve l'entree exacte avec les sources utilisees.</w:t>
+              <w:t xml:space="preserve">Le RGPD Article 5(2) impose la responsabilite : le cabinet doit prouver la conformite. Si un client demande 'quelle reponse avez-vous donnee le 15 mars a 14h32 ?', on retrouve l'entree exacte avec sources, latence et guardrail.</w:t>
             </w:r>
           </w:p>
         </w:tc>
@@ -21964,7 +21950,7 @@
                 <w:sz w:val="16"/>
                 <w:szCs w:val="16"/>
               </w:rPr>
-              <w:t>logs/audit/audit.jsonl - Exemple d'une entree (formatee)</w:t>
+              <w:t>logs/audit/audit.jsonl -- Exemple d'une entree</w:t>
             </w:r>
           </w:p>
         </w:tc>
@@ -21991,7 +21977,7 @@
                 <w:sz w:val="17"/>
                 <w:szCs w:val="17"/>
               </w:rPr>
-              <w:t xml:space="preserve">{ "timestamp":   "2026-03-28T14:32:01.123Z",       -- quand (UTC)</w:t>
+              <w:t xml:space="preserve">{ "timestamp": "2026-03-28T14:32:01Z",   -- quand</w:t>
             </w:r>
           </w:p>
         </w:tc>
@@ -22018,7 +22004,7 @@
                 <w:sz w:val="17"/>
                 <w:szCs w:val="17"/>
               </w:rPr>
-              <w:t xml:space="preserve">  "request_id":  "550e8400-e29b-41d4-...",          -- identifiant unique</w:t>
+              <w:t xml:space="preserve">  "request_id": "550e8400-e29b-...",      -- identifiant unique</w:t>
             </w:r>
           </w:p>
         </w:tc>
@@ -22045,7 +22031,7 @@
                 <w:sz w:val="17"/>
                 <w:szCs w:val="17"/>
               </w:rPr>
-              <w:t xml:space="preserve">  "user_sub":    "demo@cabinet.fr",                 -- qui a demande</w:t>
+              <w:t xml:space="preserve">  "user_sub": "demo@cabinet.fr",           -- qui a demande</w:t>
             </w:r>
           </w:p>
         </w:tc>
@@ -22072,7 +22058,7 @@
                 <w:sz w:val="17"/>
                 <w:szCs w:val="17"/>
               </w:rPr>
-              <w:t xml:space="preserve">  "user_plan":   "cabinet",                         -- son plan</w:t>
+              <w:t xml:space="preserve">  "user_plan": "cabinet",                  -- son plan</w:t>
             </w:r>
           </w:p>
         </w:tc>
@@ -22099,7 +22085,7 @@
                 <w:sz w:val="17"/>
                 <w:szCs w:val="17"/>
               </w:rPr>
-              <w:t xml:space="preserve">  "question":    "What are GDPR controller...",      -- tronquee 500 chars</w:t>
+              <w:t xml:space="preserve">  "question": "What are GDPR obligations?",</w:t>
             </w:r>
           </w:p>
         </w:tc>
@@ -22126,7 +22112,7 @@
                 <w:sz w:val="17"/>
                 <w:szCs w:val="17"/>
               </w:rPr>
-              <w:t xml:space="preserve">  "sources_used": ["Article 24", "Recital 74"],      -- sources citees</w:t>
+              <w:t xml:space="preserve">  "sources_used": ["Article 24", "Recital 74"],</w:t>
             </w:r>
           </w:p>
         </w:tc>
@@ -22153,7 +22139,7 @@
                 <w:sz w:val="17"/>
                 <w:szCs w:val="17"/>
               </w:rPr>
-              <w:t xml:space="preserve">  "guardrail_severity": "ok",                       -- ok/low/high</w:t>
+              <w:t xml:space="preserve">  "guardrail_severity": "ok",              -- ok / low / high</w:t>
             </w:r>
           </w:p>
         </w:tc>
@@ -22180,7 +22166,7 @@
                 <w:sz w:val="17"/>
                 <w:szCs w:val="17"/>
               </w:rPr>
-              <w:t xml:space="preserve">  "latency_ms":  3420.5,                            -- temps total</w:t>
+              <w:t xml:space="preserve">  "latency_ms": 3420.5,</w:t>
             </w:r>
           </w:p>
         </w:tc>
@@ -22207,7 +22193,7 @@
                 <w:sz w:val="17"/>
                 <w:szCs w:val="17"/>
               </w:rPr>
-              <w:t xml:space="preserve">  "status":      "success" }                        -- success/error</w:t>
+              <w:t xml:space="preserve">  "status": "success" }</w:t>
             </w:r>
           </w:p>
         </w:tc>
@@ -22255,7 +22241,7 @@
                 <w:sz w:val="17"/>
                 <w:szCs w:val="17"/>
               </w:rPr>
-              <w:t>RGPD - LA QUESTION DES LOGS</w:t>
+              <w:t>RGPD -- LES LOGS ET LES DONNEES PERSONNELLES</w:t>
             </w:r>
           </w:p>
           <w:p>
@@ -22269,7 +22255,7 @@
                 <w:sz w:val="19"/>
                 <w:szCs w:val="19"/>
               </w:rPr>
-              <w:t xml:space="preserve">Les logs contiennent potentiellement des donnees personnelles. Obligations : duree de conservation limitee (6 mois par defaut via AUDIT_RETENTION_DAYS), acces restreint, suppression possible sur demande. Le dossier logs/ est dans .gitignore - il ne doit jamais etre versionne.</w:t>
+              <w:t xml:space="preserve">Les logs contiennent potentiellement des donnees personnelles. Obligations : conservation 6 mois (AUDIT_RETENTION_DAYS), acces restreint, suppression possible sur demande. Le dossier logs/ est dans .gitignore -- jamais versionne.</w:t>
             </w:r>
           </w:p>
         </w:tc>
@@ -22292,22 +22278,7 @@
           <w:sz w:val="22"/>
           <w:szCs w:val="22"/>
         </w:rPr>
-        <w:t>Partie B — Disclaimer Legal Automatique</w:t>
-      </w:r>
-    </w:p>
-    <w:p>
-      <w:pPr>
-        <w:spacing w:after="100" w:before="200"/>
-      </w:pPr>
-      <w:r>
-        <w:rPr>
-          <w:rFonts w:ascii="Arial" w:cs="Arial" w:hAnsi="Arial"/>
-          <w:b/>
-          <w:color w:val="9AABBD"/>
-          <w:sz w:val="22"/>
-          <w:szCs w:val="22"/>
-        </w:rPr>
-        <w:t>Glossaire</w:t>
+        <w:t>Partie B -- Disclaimer Legal Automatique</w:t>
       </w:r>
     </w:p>
     <w:tbl>
@@ -22369,7 +22340,7 @@
                 <w:sz w:val="19"/>
                 <w:szCs w:val="19"/>
               </w:rPr>
-              <w:t xml:space="preserve">Mention legale qui limite la responsabilite et informe l'utilisateur des limites du service. 'Ce systeme est un outil d'aide a la recherche, pas un conseil juridique.'</w:t>
+              <w:t xml:space="preserve">Mention legale qui limite la responsabilite. 'Ce systeme est un outil d'aide a la recherche, pas un conseil juridique.' Obligatoire selon le RIN (Reglement Interieur National du barreau).</w:t>
             </w:r>
           </w:p>
         </w:tc>
@@ -22434,7 +22405,7 @@
                 <w:sz w:val="19"/>
                 <w:szCs w:val="19"/>
               </w:rPr>
-              <w:t xml:space="preserve">Reglement Interieur National du barreau. Impose que tout outil d'aide juridique precise qu'il ne remplace pas le conseil d'un avocat. Sans cette mention, le cabinet engage potentiellement sa responsabilite.</w:t>
+              <w:t xml:space="preserve">Reglement Interieur National du barreau francais. Impose que tout outil d'aide juridique precise qu'il ne remplace pas le conseil d'un avocat qualifie.</w:t>
             </w:r>
           </w:p>
         </w:tc>
@@ -22444,20 +22415,6 @@
       <w:pPr>
         <w:spacing w:after="80"/>
       </w:pPr>
-    </w:p>
-    <w:p>
-      <w:pPr>
-        <w:spacing w:after="80"/>
-      </w:pPr>
-      <w:r>
-        <w:rPr>
-          <w:rFonts w:ascii="Arial" w:cs="Arial" w:hAnsi="Arial"/>
-          <w:color w:val="1A1A2E"/>
-          <w:sz w:val="20"/>
-          <w:szCs w:val="20"/>
-        </w:rPr>
-        <w:t xml:space="preserve">Le disclaimer est ajoute automatiquement en fin de chaque reponse Claude. Il est desactivable via DISABLE_DISCLAIMER=true dans le .env - utile pour les evaluations de faithfulness.</w:t>
-      </w:r>
     </w:p>
     <w:tbl>
       <w:tblPr>
@@ -22510,7 +22467,7 @@
                 <w:sz w:val="19"/>
                 <w:szCs w:val="19"/>
               </w:rPr>
-              <w:t xml:space="preserve">L'audit log enregistre la reponse brute de Claude (sans disclaimer). Si on l'ajoutait avant, le pipeline LLM-as-judge (faithfulness) compterait les phrases du disclaimer comme des 'claims' a verifier - faussant le score. En l'ajoutant apres l'audit, on garde des metriques propres tout en respectant les obligations deontologiques.</w:t>
+              <w:t xml:space="preserve">L'audit log enregistre la reponse brute de Claude (sans disclaimer). Si on l'ajoutait avant, le pipeline LLM-as-judge compterait les phrases du disclaimer comme des claims a evaluer -- faussant le score faithfulness. En l'ajoutant apres, on garde des metriques propres tout en respectant les obligations deontologiques.</w:t>
             </w:r>
           </w:p>
         </w:tc>
@@ -22525,198 +22482,305 @@
       <w:tblPr>
         <w:tblW w:type="dxa" w:w="9360"/>
         <w:tblBorders>
-          <w:top w:val="single" w:color="C9A84C" w:sz="4"/>
-          <w:left w:val="single" w:color="C9A84C" w:sz="4"/>
-          <w:bottom w:val="single" w:color="C9A84C" w:sz="4"/>
-          <w:right w:val="single" w:color="C9A84C" w:sz="4"/>
+          <w:top w:val="single" w:color="1E3A5F" w:sz="4"/>
+          <w:left w:val="single" w:color="1E3A5F" w:sz="4"/>
+          <w:bottom w:val="single" w:color="1E3A5F" w:sz="4"/>
+          <w:right w:val="single" w:color="1E3A5F" w:sz="4"/>
+          <w:insideH w:val="single" w:color="CCCCCC" w:sz="2"/>
+          <w:insideV w:val="single" w:color="CCCCCC" w:sz="2"/>
         </w:tblBorders>
       </w:tblPr>
       <w:tblGrid>
-        <w:gridCol w:w="9360"/>
+        <w:gridCol w:w="2800"/>
+        <w:gridCol w:w="1400"/>
+        <w:gridCol w:w="5160"/>
       </w:tblGrid>
       <w:tr>
         <w:tc>
           <w:tcPr>
-            <w:shd w:fill="C9A84C" w:val="clear"/>
-            <w:tcMar>
-              <w:top w:type="dxa" w:w="60"/>
-              <w:left w:type="dxa" w:w="200"/>
-              <w:bottom w:type="dxa" w:w="60"/>
-              <w:right w:type="dxa" w:w="200"/>
-            </w:tcMar>
-          </w:tcPr>
-          <w:p>
-            <w:r>
-              <w:rPr>
-                <w:rFonts w:ascii="Courier New" w:cs="Courier New" w:hAnsi="Courier New"/>
+            <w:tcW w:type="dxa" w:w="2800"/>
+            <w:shd w:fill="1E3A5F" w:val="clear"/>
+            <w:tcMar>
+              <w:top w:type="dxa" w:w="60"/>
+              <w:left w:type="dxa" w:w="80"/>
+              <w:bottom w:type="dxa" w:w="60"/>
+              <w:right w:type="dxa" w:w="80"/>
+            </w:tcMar>
+          </w:tcPr>
+          <w:p>
+            <w:r>
+              <w:rPr>
+                <w:rFonts w:ascii="Arial" w:cs="Arial" w:hAnsi="Arial"/>
                 <w:b/>
-                <w:color w:val="1A1A1A"/>
-                <w:sz w:val="16"/>
-                <w:szCs w:val="16"/>
-              </w:rPr>
-              <w:t>Exemple - Fin de reponse avec disclaimer FR</w:t>
-            </w:r>
-          </w:p>
-        </w:tc>
-      </w:tr>
-      <w:tr>
-        <w:tc>
-          <w:tcPr>
-            <w:shd w:fill="1A1A2E" w:val="clear"/>
-            <w:tcMar>
-              <w:top w:type="dxa" w:w="20"/>
-              <w:left w:type="dxa" w:w="200"/>
-              <w:bottom w:type="dxa" w:w="20"/>
-              <w:right w:type="dxa" w:w="200"/>
-            </w:tcMar>
-          </w:tcPr>
-          <w:p>
-            <w:pPr>
-              <w:spacing w:after="0"/>
-            </w:pPr>
-            <w:r>
-              <w:rPr>
-                <w:rFonts w:ascii="Courier New" w:cs="Courier New" w:hAnsi="Courier New"/>
-                <w:color w:val="4CAF50"/>
+                <w:bCs/>
+                <w:color w:val="FFFFFF"/>
                 <w:sz w:val="17"/>
                 <w:szCs w:val="17"/>
               </w:rPr>
-              <w:t xml:space="preserve">...Selon [SOURCE 3], le responsable de traitement doit...</w:t>
-            </w:r>
-          </w:p>
-        </w:tc>
-      </w:tr>
-      <w:tr>
-        <w:tc>
-          <w:tcPr>
-            <w:shd w:fill="1A1A2E" w:val="clear"/>
-            <w:tcMar>
-              <w:top w:type="dxa" w:w="20"/>
-              <w:left w:type="dxa" w:w="200"/>
-              <w:bottom w:type="dxa" w:w="20"/>
-              <w:right w:type="dxa" w:w="200"/>
-            </w:tcMar>
-          </w:tcPr>
-          <w:p>
-            <w:pPr>
-              <w:spacing w:after="0"/>
-            </w:pPr>
-            <w:r>
-              <w:rPr>
-                <w:rFonts w:ascii="Courier New" w:cs="Courier New" w:hAnsi="Courier New"/>
-                <w:color w:val="888888"/>
+              <w:t xml:space="preserve">Fichier</w:t>
+            </w:r>
+          </w:p>
+        </w:tc>
+        <w:tc>
+          <w:tcPr>
+            <w:tcW w:type="dxa" w:w="1400"/>
+            <w:shd w:fill="1E3A5F" w:val="clear"/>
+            <w:tcMar>
+              <w:top w:type="dxa" w:w="60"/>
+              <w:left w:type="dxa" w:w="80"/>
+              <w:bottom w:type="dxa" w:w="60"/>
+              <w:right w:type="dxa" w:w="80"/>
+            </w:tcMar>
+          </w:tcPr>
+          <w:p>
+            <w:r>
+              <w:rPr>
+                <w:rFonts w:ascii="Arial" w:cs="Arial" w:hAnsi="Arial"/>
+                <w:b/>
+                <w:bCs/>
+                <w:color w:val="FFFFFF"/>
                 <w:sz w:val="17"/>
                 <w:szCs w:val="17"/>
               </w:rPr>
-              <w:t xml:space="preserve"/>
-            </w:r>
-          </w:p>
-        </w:tc>
-      </w:tr>
-      <w:tr>
-        <w:tc>
-          <w:tcPr>
-            <w:shd w:fill="1A1A2E" w:val="clear"/>
-            <w:tcMar>
-              <w:top w:type="dxa" w:w="20"/>
-              <w:left w:type="dxa" w:w="200"/>
-              <w:bottom w:type="dxa" w:w="20"/>
-              <w:right w:type="dxa" w:w="200"/>
-            </w:tcMar>
-          </w:tcPr>
-          <w:p>
-            <w:pPr>
-              <w:spacing w:after="0"/>
-            </w:pPr>
-            <w:r>
-              <w:rPr>
-                <w:rFonts w:ascii="Courier New" w:cs="Courier New" w:hAnsi="Courier New"/>
-                <w:color w:val="888888"/>
+              <w:t xml:space="preserve">Action</w:t>
+            </w:r>
+          </w:p>
+        </w:tc>
+        <w:tc>
+          <w:tcPr>
+            <w:tcW w:type="dxa" w:w="5160"/>
+            <w:shd w:fill="1E3A5F" w:val="clear"/>
+            <w:tcMar>
+              <w:top w:type="dxa" w:w="60"/>
+              <w:left w:type="dxa" w:w="80"/>
+              <w:bottom w:type="dxa" w:w="60"/>
+              <w:right w:type="dxa" w:w="80"/>
+            </w:tcMar>
+          </w:tcPr>
+          <w:p>
+            <w:r>
+              <w:rPr>
+                <w:rFonts w:ascii="Arial" w:cs="Arial" w:hAnsi="Arial"/>
+                <w:b/>
+                <w:bCs/>
+                <w:color w:val="FFFFFF"/>
                 <w:sz w:val="17"/>
                 <w:szCs w:val="17"/>
               </w:rPr>
-              <w:t xml:space="preserve">---</w:t>
-            </w:r>
-          </w:p>
-        </w:tc>
-      </w:tr>
-      <w:tr>
-        <w:tc>
-          <w:tcPr>
-            <w:shd w:fill="1A1A2E" w:val="clear"/>
-            <w:tcMar>
-              <w:top w:type="dxa" w:w="20"/>
-              <w:left w:type="dxa" w:w="200"/>
-              <w:bottom w:type="dxa" w:w="20"/>
-              <w:right w:type="dxa" w:w="200"/>
-            </w:tcMar>
-          </w:tcPr>
-          <w:p>
-            <w:pPr>
-              <w:spacing w:after="0"/>
-            </w:pPr>
-            <w:r>
-              <w:rPr>
-                <w:rFonts w:ascii="Courier New" w:cs="Courier New" w:hAnsi="Courier New"/>
-                <w:color w:val="E07C3A"/>
+              <w:t xml:space="preserve">Contenu</w:t>
+            </w:r>
+          </w:p>
+        </w:tc>
+      </w:tr>
+      <w:tr>
+        <w:tc>
+          <w:tcPr>
+            <w:tcW w:type="dxa" w:w="2800"/>
+            <w:shd w:fill="FFFFFF" w:val="clear"/>
+            <w:tcMar>
+              <w:top w:type="dxa" w:w="60"/>
+              <w:left w:type="dxa" w:w="80"/>
+              <w:bottom w:type="dxa" w:w="60"/>
+              <w:right w:type="dxa" w:w="80"/>
+            </w:tcMar>
+          </w:tcPr>
+          <w:p>
+            <w:r>
+              <w:rPr>
+                <w:rFonts w:ascii="Arial" w:cs="Arial" w:hAnsi="Arial"/>
+                <w:color w:val="1A1A2E"/>
                 <w:sz w:val="17"/>
                 <w:szCs w:val="17"/>
               </w:rPr>
-              <w:t xml:space="preserve">⚖️ Ce systeme est un outil d'aide a la recherche documentaire juridique.</w:t>
-            </w:r>
-          </w:p>
-        </w:tc>
-      </w:tr>
-      <w:tr>
-        <w:tc>
-          <w:tcPr>
-            <w:shd w:fill="1A1A2E" w:val="clear"/>
-            <w:tcMar>
-              <w:top w:type="dxa" w:w="20"/>
-              <w:left w:type="dxa" w:w="200"/>
-              <w:bottom w:type="dxa" w:w="20"/>
-              <w:right w:type="dxa" w:w="200"/>
-            </w:tcMar>
-          </w:tcPr>
-          <w:p>
-            <w:pPr>
-              <w:spacing w:after="0"/>
-            </w:pPr>
-            <w:r>
-              <w:rPr>
-                <w:rFonts w:ascii="Courier New" w:cs="Courier New" w:hAnsi="Courier New"/>
-                <w:color w:val="E07C3A"/>
+              <w:t xml:space="preserve">api/audit_log.py</w:t>
+            </w:r>
+          </w:p>
+        </w:tc>
+        <w:tc>
+          <w:tcPr>
+            <w:tcW w:type="dxa" w:w="1400"/>
+            <w:shd w:fill="FFFFFF" w:val="clear"/>
+            <w:tcMar>
+              <w:top w:type="dxa" w:w="60"/>
+              <w:left w:type="dxa" w:w="80"/>
+              <w:bottom w:type="dxa" w:w="60"/>
+              <w:right w:type="dxa" w:w="80"/>
+            </w:tcMar>
+          </w:tcPr>
+          <w:p>
+            <w:r>
+              <w:rPr>
+                <w:rFonts w:ascii="Arial" w:cs="Arial" w:hAnsi="Arial"/>
+                <w:color w:val="1A1A2E"/>
                 <w:sz w:val="17"/>
                 <w:szCs w:val="17"/>
               </w:rPr>
-              <w:t xml:space="preserve">Les informations fournies ne constituent pas un conseil juridique.</w:t>
-            </w:r>
-          </w:p>
-        </w:tc>
-      </w:tr>
-      <w:tr>
-        <w:tc>
-          <w:tcPr>
-            <w:shd w:fill="1A1A2E" w:val="clear"/>
-            <w:tcMar>
-              <w:top w:type="dxa" w:w="20"/>
-              <w:left w:type="dxa" w:w="200"/>
-              <w:bottom w:type="dxa" w:w="20"/>
-              <w:right w:type="dxa" w:w="200"/>
-            </w:tcMar>
-          </w:tcPr>
-          <w:p>
-            <w:pPr>
-              <w:spacing w:after="0"/>
-            </w:pPr>
-            <w:r>
-              <w:rPr>
-                <w:rFonts w:ascii="Courier New" w:cs="Courier New" w:hAnsi="Courier New"/>
-                <w:color w:val="E07C3A"/>
+              <w:t xml:space="preserve">NOUVEAU</w:t>
+            </w:r>
+          </w:p>
+        </w:tc>
+        <w:tc>
+          <w:tcPr>
+            <w:tcW w:type="dxa" w:w="5160"/>
+            <w:shd w:fill="FFFFFF" w:val="clear"/>
+            <w:tcMar>
+              <w:top w:type="dxa" w:w="60"/>
+              <w:left w:type="dxa" w:w="80"/>
+              <w:bottom w:type="dxa" w:w="60"/>
+              <w:right w:type="dxa" w:w="80"/>
+            </w:tcMar>
+          </w:tcPr>
+          <w:p>
+            <w:r>
+              <w:rPr>
+                <w:rFonts w:ascii="Arial" w:cs="Arial" w:hAnsi="Arial"/>
+                <w:color w:val="1A1A2E"/>
                 <w:sz w:val="17"/>
                 <w:szCs w:val="17"/>
               </w:rPr>
-              <w:t xml:space="preserve">Pour toute decision juridique, consultez un avocat qualifie.</w:t>
+              <w:t xml:space="preserve">JSONL rotatif, build_audit_entry(), write_audit_log(), generate_request_id()</w:t>
+            </w:r>
+          </w:p>
+        </w:tc>
+      </w:tr>
+      <w:tr>
+        <w:tc>
+          <w:tcPr>
+            <w:tcW w:type="dxa" w:w="2800"/>
+            <w:shd w:fill="F5F5F8" w:val="clear"/>
+            <w:tcMar>
+              <w:top w:type="dxa" w:w="60"/>
+              <w:left w:type="dxa" w:w="80"/>
+              <w:bottom w:type="dxa" w:w="60"/>
+              <w:right w:type="dxa" w:w="80"/>
+            </w:tcMar>
+          </w:tcPr>
+          <w:p>
+            <w:r>
+              <w:rPr>
+                <w:rFonts w:ascii="Arial" w:cs="Arial" w:hAnsi="Arial"/>
+                <w:color w:val="1A1A2E"/>
+                <w:sz w:val="17"/>
+                <w:szCs w:val="17"/>
+              </w:rPr>
+              <w:t xml:space="preserve">api/search.py</w:t>
+            </w:r>
+          </w:p>
+        </w:tc>
+        <w:tc>
+          <w:tcPr>
+            <w:tcW w:type="dxa" w:w="1400"/>
+            <w:shd w:fill="F5F5F8" w:val="clear"/>
+            <w:tcMar>
+              <w:top w:type="dxa" w:w="60"/>
+              <w:left w:type="dxa" w:w="80"/>
+              <w:bottom w:type="dxa" w:w="60"/>
+              <w:right w:type="dxa" w:w="80"/>
+            </w:tcMar>
+          </w:tcPr>
+          <w:p>
+            <w:r>
+              <w:rPr>
+                <w:rFonts w:ascii="Arial" w:cs="Arial" w:hAnsi="Arial"/>
+                <w:color w:val="1A1A2E"/>
+                <w:sz w:val="17"/>
+                <w:szCs w:val="17"/>
+              </w:rPr>
+              <w:t xml:space="preserve">MODIFIE</w:t>
+            </w:r>
+          </w:p>
+        </w:tc>
+        <w:tc>
+          <w:tcPr>
+            <w:tcW w:type="dxa" w:w="5160"/>
+            <w:shd w:fill="F5F5F8" w:val="clear"/>
+            <w:tcMar>
+              <w:top w:type="dxa" w:w="60"/>
+              <w:left w:type="dxa" w:w="80"/>
+              <w:bottom w:type="dxa" w:w="60"/>
+              <w:right w:type="dxa" w:w="80"/>
+            </w:tcMar>
+          </w:tcPr>
+          <w:p>
+            <w:r>
+              <w:rPr>
+                <w:rFonts w:ascii="Arial" w:cs="Arial" w:hAnsi="Arial"/>
+                <w:color w:val="1A1A2E"/>
+                <w:sz w:val="17"/>
+                <w:szCs w:val="17"/>
+              </w:rPr>
+              <w:t xml:space="preserve">request_id genere au debut, write_audit_log() apres succes, build_legal_disclaimer() en fin</w:t>
+            </w:r>
+          </w:p>
+        </w:tc>
+      </w:tr>
+      <w:tr>
+        <w:tc>
+          <w:tcPr>
+            <w:tcW w:type="dxa" w:w="2800"/>
+            <w:shd w:fill="FFFFFF" w:val="clear"/>
+            <w:tcMar>
+              <w:top w:type="dxa" w:w="60"/>
+              <w:left w:type="dxa" w:w="80"/>
+              <w:bottom w:type="dxa" w:w="60"/>
+              <w:right w:type="dxa" w:w="80"/>
+            </w:tcMar>
+          </w:tcPr>
+          <w:p>
+            <w:r>
+              <w:rPr>
+                <w:rFonts w:ascii="Arial" w:cs="Arial" w:hAnsi="Arial"/>
+                <w:color w:val="1A1A2E"/>
+                <w:sz w:val="17"/>
+                <w:szCs w:val="17"/>
+              </w:rPr>
+              <w:t xml:space="preserve">.env</w:t>
+            </w:r>
+          </w:p>
+        </w:tc>
+        <w:tc>
+          <w:tcPr>
+            <w:tcW w:type="dxa" w:w="1400"/>
+            <w:shd w:fill="FFFFFF" w:val="clear"/>
+            <w:tcMar>
+              <w:top w:type="dxa" w:w="60"/>
+              <w:left w:type="dxa" w:w="80"/>
+              <w:bottom w:type="dxa" w:w="60"/>
+              <w:right w:type="dxa" w:w="80"/>
+            </w:tcMar>
+          </w:tcPr>
+          <w:p>
+            <w:r>
+              <w:rPr>
+                <w:rFonts w:ascii="Arial" w:cs="Arial" w:hAnsi="Arial"/>
+                <w:color w:val="1A1A2E"/>
+                <w:sz w:val="17"/>
+                <w:szCs w:val="17"/>
+              </w:rPr>
+              <w:t xml:space="preserve">MODIFIE</w:t>
+            </w:r>
+          </w:p>
+        </w:tc>
+        <w:tc>
+          <w:tcPr>
+            <w:tcW w:type="dxa" w:w="5160"/>
+            <w:shd w:fill="FFFFFF" w:val="clear"/>
+            <w:tcMar>
+              <w:top w:type="dxa" w:w="60"/>
+              <w:left w:type="dxa" w:w="80"/>
+              <w:bottom w:type="dxa" w:w="60"/>
+              <w:right w:type="dxa" w:w="80"/>
+            </w:tcMar>
+          </w:tcPr>
+          <w:p>
+            <w:r>
+              <w:rPr>
+                <w:rFonts w:ascii="Arial" w:cs="Arial" w:hAnsi="Arial"/>
+                <w:color w:val="1A1A2E"/>
+                <w:sz w:val="17"/>
+                <w:szCs w:val="17"/>
+              </w:rPr>
+              <w:t xml:space="preserve">AUDIT_LOG_DIR, AUDIT_RETENTION_DAYS, DISABLE_DISCLAIMER</w:t>
             </w:r>
           </w:p>
         </w:tc>
@@ -22754,7 +22818,7 @@
           <w:sz w:val="18"/>
           <w:szCs w:val="18"/>
         </w:rPr>
-        <w:t>pytest · 100/100 PASSED · GitHub Actions · Automatisation · Regle 80/20</w:t>
+        <w:t>pytest -- 100/100 PASSED -- GitHub Actions -- Regle 80/20 -- Fonctions pures</w:t>
       </w:r>
     </w:p>
     <w:p>
@@ -22769,7 +22833,7 @@
           <w:sz w:val="22"/>
           <w:szCs w:val="22"/>
         </w:rPr>
-        <w:t>Glossaire complet</w:t>
+        <w:t>Glossaire</w:t>
       </w:r>
     </w:p>
     <w:tbl>
@@ -22831,7 +22895,7 @@
                 <w:sz w:val="19"/>
                 <w:szCs w:val="19"/>
               </w:rPr>
-              <w:t xml:space="preserve">Programme qui verifie automatiquement qu'une fonction se comporte correctement. Si quelqu'un modifie le code et casse quelque chose, le test echoue immediatement - avant que ca parte en production.</w:t>
+              <w:t xml:space="preserve">Programme qui verifie automatiquement qu'une fonction se comporte correctement. Si quelqu'un modifie le code et casse quelque chose, le test echoue immediatement.</w:t>
             </w:r>
           </w:p>
         </w:tc>
@@ -22896,7 +22960,7 @@
                 <w:sz w:val="19"/>
                 <w:szCs w:val="19"/>
               </w:rPr>
-              <w:t xml:space="preserve">L'outil Python standard pour ecrire et lancer des tests. Il trouve automatiquement tous les fichiers test_*.py et lance les fonctions test_*(). Affiche quels tests passent (PASSED) ou echouent (FAILED).</w:t>
+              <w:t xml:space="preserve">L'outil Python standard pour les tests. Trouve automatiquement les fichiers test_*.py et les fonctions test_*(). Affiche PASSED ou FAILED pour chaque test.</w:t>
             </w:r>
           </w:p>
         </w:tc>
@@ -22961,7 +23025,7 @@
                 <w:sz w:val="19"/>
                 <w:szCs w:val="19"/>
               </w:rPr>
-              <w:t xml:space="preserve">Continuous Integration / Continuous Deployment. CI = chaque push declenche des tests automatiques. CD = si les tests passent, le code est deploye. Ici on fait la CI.</w:t>
+              <w:t xml:space="preserve">Continuous Integration : chaque push declenche les tests automatiquement sur un serveur distant. Si un test echoue, on le voit avant que le code parte en production.</w:t>
             </w:r>
           </w:p>
         </w:tc>
@@ -23026,7 +23090,7 @@
                 <w:sz w:val="19"/>
                 <w:szCs w:val="19"/>
               </w:rPr>
-              <w:t xml:space="preserve">Service de GitHub qui execute automatiquement des commandes sur un serveur distant a chaque push. On definit les etapes dans un fichier YAML. Gratuit pour les repos publics.</w:t>
+              <w:t xml:space="preserve">Service GitHub qui execute des commandes sur un serveur Ubuntu a chaque push. Gratuit pour les repos publics. On definit les etapes dans .github/workflows/tests.yml.</w:t>
             </w:r>
           </w:p>
         </w:tc>
@@ -23069,7 +23133,7 @@
                 <w:sz w:val="19"/>
                 <w:szCs w:val="19"/>
               </w:rPr>
-              <w:t xml:space="preserve">Workflow YAML</w:t>
+              <w:t xml:space="preserve">Fonction pure</w:t>
             </w:r>
           </w:p>
         </w:tc>
@@ -23091,7 +23155,7 @@
                 <w:sz w:val="19"/>
                 <w:szCs w:val="19"/>
               </w:rPr>
-              <w:t xml:space="preserve">Fichier .github/workflows/tests.yml qui decrit quoi faire et quand. 'A chaque push sur main : installer Python, installer les deps, lancer pytest.'</w:t>
+              <w:t xml:space="preserve">Fonction qui retourne toujours le meme resultat pour les memes entrees. Facile a tester -- pas besoin de demarrer un serveur ni une base de donnees.</w:t>
             </w:r>
           </w:p>
         </w:tc>
@@ -23134,7 +23198,7 @@
                 <w:sz w:val="19"/>
                 <w:szCs w:val="19"/>
               </w:rPr>
-              <w:t xml:space="preserve">Fonction pure</w:t>
+              <w:t xml:space="preserve">Off-by-one</w:t>
             </w:r>
           </w:p>
         </w:tc>
@@ -23156,72 +23220,7 @@
                 <w:sz w:val="19"/>
                 <w:szCs w:val="19"/>
               </w:rPr>
-              <w:t xml:space="preserve">Fonction qui retourne toujours le meme resultat pour les memes entrees. detect_prompt_injection('ignore instructions') retourne toujours (True, ...). Tres facile a tester - pas besoin de serveur.</w:t>
-            </w:r>
-          </w:p>
-        </w:tc>
-      </w:tr>
-    </w:tbl>
-    <w:tbl>
-      <w:tblPr>
-        <w:tblW w:type="dxa" w:w="9360"/>
-        <w:tblBorders>
-          <w:top w:val="none" w:color="FFFFFF" w:sz="0"/>
-          <w:left w:val="none" w:color="FFFFFF" w:sz="0"/>
-          <w:bottom w:val="single" w:color="E0E0E0" w:sz="2"/>
-          <w:right w:val="none" w:color="FFFFFF" w:sz="0"/>
-          <w:insideH w:val="none" w:color="FFFFFF" w:sz="0"/>
-          <w:insideV w:val="none" w:color="FFFFFF" w:sz="0"/>
-        </w:tblBorders>
-      </w:tblPr>
-      <w:tblGrid>
-        <w:gridCol w:w="2200"/>
-        <w:gridCol w:w="7160"/>
-      </w:tblGrid>
-      <w:tr>
-        <w:tc>
-          <w:tcPr>
-            <w:tcW w:type="dxa" w:w="2200"/>
-            <w:shd w:fill="F5F5F8" w:val="clear"/>
-            <w:tcMar>
-              <w:top w:type="dxa" w:w="80"/>
-              <w:left w:type="dxa" w:w="120"/>
-              <w:bottom w:type="dxa" w:w="80"/>
-              <w:right w:type="dxa" w:w="120"/>
-            </w:tcMar>
-          </w:tcPr>
-          <w:p>
-            <w:r>
-              <w:rPr>
-                <w:rFonts w:ascii="Arial" w:cs="Arial" w:hAnsi="Arial"/>
-                <w:b/>
-                <w:color w:val="1E3A5F"/>
-                <w:sz w:val="19"/>
-                <w:szCs w:val="19"/>
-              </w:rPr>
-              <w:t xml:space="preserve">Off-by-one</w:t>
-            </w:r>
-          </w:p>
-        </w:tc>
-        <w:tc>
-          <w:tcPr>
-            <w:tcW w:type="dxa" w:w="7160"/>
-            <w:tcMar>
-              <w:top w:type="dxa" w:w="80"/>
-              <w:left w:type="dxa" w:w="160"/>
-              <w:bottom w:type="dxa" w:w="80"/>
-              <w:right w:type="dxa" w:w="120"/>
-            </w:tcMar>
-          </w:tcPr>
-          <w:p>
-            <w:r>
-              <w:rPr>
-                <w:rFonts w:ascii="Arial" w:cs="Arial" w:hAnsi="Arial"/>
-                <w:color w:val="1A1A2E"/>
-                <w:sz w:val="19"/>
-                <w:szCs w:val="19"/>
-              </w:rPr>
-              <w:t xml:space="preserve">Erreur classique de programmation : une limite de 2 au lieu de 3, ou &gt;= au lieu de &gt;. Le test test_exactly_threshold_high verifie exactement la valeur limite pour eviter ce bug.</w:t>
+              <w:t xml:space="preserve">Erreur classique : une limite de 2 au lieu de 3. Le test test_exactly_threshold_high verifie exactement la valeur limite pour eviter ce bug.</w:t>
             </w:r>
           </w:p>
         </w:tc>
@@ -23231,21 +23230,6 @@
       <w:pPr>
         <w:spacing w:after="80"/>
       </w:pPr>
-    </w:p>
-    <w:p>
-      <w:pPr>
-        <w:spacing w:after="100" w:before="200"/>
-      </w:pPr>
-      <w:r>
-        <w:rPr>
-          <w:rFonts w:ascii="Arial" w:cs="Arial" w:hAnsi="Arial"/>
-          <w:b/>
-          <w:color w:val="C9A84C"/>
-          <w:sz w:val="22"/>
-          <w:szCs w:val="22"/>
-        </w:rPr>
-        <w:t>Pourquoi ecrire des tests - L'argument cabinet</w:t>
-      </w:r>
     </w:p>
     <w:tbl>
       <w:tblPr>
@@ -23284,7 +23268,7 @@
                 <w:sz w:val="17"/>
                 <w:szCs w:val="17"/>
               </w:rPr>
-              <w:t>LE SCENARIO SANS TESTS</w:t>
+              <w:t>SCENARIO SANS TESTS</w:t>
             </w:r>
           </w:p>
           <w:p>
@@ -23298,7 +23282,7 @@
                 <w:sz w:val="19"/>
                 <w:szCs w:val="19"/>
               </w:rPr>
-              <w:t xml:space="preserve">Tu modifies check_hallucination_guardrail() pour corriger un bug. Tu testes manuellement dans le Swagger - ca a l'air de marcher. Tu commites. Deux semaines plus tard, un client se plaint que des reponses passent avec des sources fantomes. Pourquoi ? Parce que ton correctif a casse un cas limite que tu n'avais pas teste manuellement.</w:t>
+              <w:t xml:space="preserve">Tu modifies check_hallucination_guardrail(). Tu testes manuellement -- ca a l'air de marcher. Deux semaines plus tard, un client recoit une reponse avec des sources fantomes. Le correctif avait casse un cas limite invisible manuellement.</w:t>
             </w:r>
           </w:p>
         </w:tc>
@@ -23346,7 +23330,7 @@
                 <w:sz w:val="17"/>
                 <w:szCs w:val="17"/>
               </w:rPr>
-              <w:t>LE SCENARIO AVEC TESTS</w:t>
+              <w:t>SCENARIO AVEC TESTS</w:t>
             </w:r>
           </w:p>
           <w:p>
@@ -23360,7 +23344,7 @@
                 <w:sz w:val="19"/>
                 <w:szCs w:val="19"/>
               </w:rPr>
-              <w:t xml:space="preserve">Tu modifies check_hallucination_guardrail(). Tu commites. GitHub Actions lance 22 tests sur cette fonction en 0.3 secondes. Le test test_exactly_threshold_high echoue. Tu vois immediatement quel cas limite est casse, tu corriges avant de pusher. Le client ne voit jamais le bug.</w:t>
+              <w:t xml:space="preserve">Tu commites. GitHub Actions lance 22 tests en 0.3 secondes. test_exactly_threshold_high echoue. Tu corriges avant de pusher. Le client ne voit jamais le bug.</w:t>
             </w:r>
           </w:p>
         </w:tc>
@@ -23383,7 +23367,896 @@
           <w:sz w:val="22"/>
           <w:szCs w:val="22"/>
         </w:rPr>
-        <w:t>Regle 80/20 - Ce qu'on teste et pourquoi</w:t>
+        <w:t>Les 4 fichiers de tests -- 100/100 PASSED</w:t>
+      </w:r>
+    </w:p>
+    <w:tbl>
+      <w:tblPr>
+        <w:tblW w:type="dxa" w:w="9360"/>
+        <w:tblBorders>
+          <w:top w:val="single" w:color="1E3A5F" w:sz="4"/>
+          <w:left w:val="single" w:color="1E3A5F" w:sz="4"/>
+          <w:bottom w:val="single" w:color="1E3A5F" w:sz="4"/>
+          <w:right w:val="single" w:color="1E3A5F" w:sz="4"/>
+          <w:insideH w:val="single" w:color="CCCCCC" w:sz="2"/>
+          <w:insideV w:val="single" w:color="CCCCCC" w:sz="2"/>
+        </w:tblBorders>
+      </w:tblPr>
+      <w:tblGrid>
+        <w:gridCol w:w="2500"/>
+        <w:gridCol w:w="2500"/>
+        <w:gridCol w:w="700"/>
+        <w:gridCol w:w="3660"/>
+      </w:tblGrid>
+      <w:tr>
+        <w:tc>
+          <w:tcPr>
+            <w:tcW w:type="dxa" w:w="2500"/>
+            <w:shd w:fill="1E3A5F" w:val="clear"/>
+            <w:tcMar>
+              <w:top w:type="dxa" w:w="60"/>
+              <w:left w:type="dxa" w:w="80"/>
+              <w:bottom w:type="dxa" w:w="60"/>
+              <w:right w:type="dxa" w:w="80"/>
+            </w:tcMar>
+          </w:tcPr>
+          <w:p>
+            <w:r>
+              <w:rPr>
+                <w:rFonts w:ascii="Arial" w:cs="Arial" w:hAnsi="Arial"/>
+                <w:b/>
+                <w:bCs/>
+                <w:color w:val="FFFFFF"/>
+                <w:sz w:val="17"/>
+                <w:szCs w:val="17"/>
+              </w:rPr>
+              <w:t xml:space="preserve">Fichier</w:t>
+            </w:r>
+          </w:p>
+        </w:tc>
+        <w:tc>
+          <w:tcPr>
+            <w:tcW w:type="dxa" w:w="2500"/>
+            <w:shd w:fill="1E3A5F" w:val="clear"/>
+            <w:tcMar>
+              <w:top w:type="dxa" w:w="60"/>
+              <w:left w:type="dxa" w:w="80"/>
+              <w:bottom w:type="dxa" w:w="60"/>
+              <w:right w:type="dxa" w:w="80"/>
+            </w:tcMar>
+          </w:tcPr>
+          <w:p>
+            <w:r>
+              <w:rPr>
+                <w:rFonts w:ascii="Arial" w:cs="Arial" w:hAnsi="Arial"/>
+                <w:b/>
+                <w:bCs/>
+                <w:color w:val="FFFFFF"/>
+                <w:sz w:val="17"/>
+                <w:szCs w:val="17"/>
+              </w:rPr>
+              <w:t xml:space="preserve">Teste quoi</w:t>
+            </w:r>
+          </w:p>
+        </w:tc>
+        <w:tc>
+          <w:tcPr>
+            <w:tcW w:type="dxa" w:w="700"/>
+            <w:shd w:fill="1E3A5F" w:val="clear"/>
+            <w:tcMar>
+              <w:top w:type="dxa" w:w="60"/>
+              <w:left w:type="dxa" w:w="80"/>
+              <w:bottom w:type="dxa" w:w="60"/>
+              <w:right w:type="dxa" w:w="80"/>
+            </w:tcMar>
+          </w:tcPr>
+          <w:p>
+            <w:r>
+              <w:rPr>
+                <w:rFonts w:ascii="Arial" w:cs="Arial" w:hAnsi="Arial"/>
+                <w:b/>
+                <w:bCs/>
+                <w:color w:val="FFFFFF"/>
+                <w:sz w:val="17"/>
+                <w:szCs w:val="17"/>
+              </w:rPr>
+              <w:t xml:space="preserve">Tests</w:t>
+            </w:r>
+          </w:p>
+        </w:tc>
+        <w:tc>
+          <w:tcPr>
+            <w:tcW w:type="dxa" w:w="3660"/>
+            <w:shd w:fill="1E3A5F" w:val="clear"/>
+            <w:tcMar>
+              <w:top w:type="dxa" w:w="60"/>
+              <w:left w:type="dxa" w:w="80"/>
+              <w:bottom w:type="dxa" w:w="60"/>
+              <w:right w:type="dxa" w:w="80"/>
+            </w:tcMar>
+          </w:tcPr>
+          <w:p>
+            <w:r>
+              <w:rPr>
+                <w:rFonts w:ascii="Arial" w:cs="Arial" w:hAnsi="Arial"/>
+                <w:b/>
+                <w:bCs/>
+                <w:color w:val="FFFFFF"/>
+                <w:sz w:val="17"/>
+                <w:szCs w:val="17"/>
+              </w:rPr>
+              <w:t xml:space="preserve">Pourquoi</w:t>
+            </w:r>
+          </w:p>
+        </w:tc>
+      </w:tr>
+      <w:tr>
+        <w:tc>
+          <w:tcPr>
+            <w:tcW w:type="dxa" w:w="2500"/>
+            <w:shd w:fill="FFFFFF" w:val="clear"/>
+            <w:tcMar>
+              <w:top w:type="dxa" w:w="60"/>
+              <w:left w:type="dxa" w:w="80"/>
+              <w:bottom w:type="dxa" w:w="60"/>
+              <w:right w:type="dxa" w:w="80"/>
+            </w:tcMar>
+          </w:tcPr>
+          <w:p>
+            <w:r>
+              <w:rPr>
+                <w:rFonts w:ascii="Arial" w:cs="Arial" w:hAnsi="Arial"/>
+                <w:color w:val="1A1A2E"/>
+                <w:sz w:val="17"/>
+                <w:szCs w:val="17"/>
+              </w:rPr>
+              <w:t xml:space="preserve">test_injection.py</w:t>
+            </w:r>
+          </w:p>
+        </w:tc>
+        <w:tc>
+          <w:tcPr>
+            <w:tcW w:type="dxa" w:w="2500"/>
+            <w:shd w:fill="FFFFFF" w:val="clear"/>
+            <w:tcMar>
+              <w:top w:type="dxa" w:w="60"/>
+              <w:left w:type="dxa" w:w="80"/>
+              <w:bottom w:type="dxa" w:w="60"/>
+              <w:right w:type="dxa" w:w="80"/>
+            </w:tcMar>
+          </w:tcPr>
+          <w:p>
+            <w:r>
+              <w:rPr>
+                <w:rFonts w:ascii="Arial" w:cs="Arial" w:hAnsi="Arial"/>
+                <w:color w:val="1A1A2E"/>
+                <w:sz w:val="17"/>
+                <w:szCs w:val="17"/>
+              </w:rPr>
+              <w:t xml:space="preserve">detect_prompt_injection()</w:t>
+            </w:r>
+          </w:p>
+        </w:tc>
+        <w:tc>
+          <w:tcPr>
+            <w:tcW w:type="dxa" w:w="700"/>
+            <w:shd w:fill="FFFFFF" w:val="clear"/>
+            <w:tcMar>
+              <w:top w:type="dxa" w:w="60"/>
+              <w:left w:type="dxa" w:w="80"/>
+              <w:bottom w:type="dxa" w:w="60"/>
+              <w:right w:type="dxa" w:w="80"/>
+            </w:tcMar>
+          </w:tcPr>
+          <w:p>
+            <w:r>
+              <w:rPr>
+                <w:rFonts w:ascii="Arial" w:cs="Arial" w:hAnsi="Arial"/>
+                <w:color w:val="1A1A2E"/>
+                <w:sz w:val="17"/>
+                <w:szCs w:val="17"/>
+              </w:rPr>
+              <w:t xml:space="preserve">24</w:t>
+            </w:r>
+          </w:p>
+        </w:tc>
+        <w:tc>
+          <w:tcPr>
+            <w:tcW w:type="dxa" w:w="3660"/>
+            <w:shd w:fill="FFFFFF" w:val="clear"/>
+            <w:tcMar>
+              <w:top w:type="dxa" w:w="60"/>
+              <w:left w:type="dxa" w:w="80"/>
+              <w:bottom w:type="dxa" w:w="60"/>
+              <w:right w:type="dxa" w:w="80"/>
+            </w:tcMar>
+          </w:tcPr>
+          <w:p>
+            <w:r>
+              <w:rPr>
+                <w:rFonts w:ascii="Arial" w:cs="Arial" w:hAnsi="Arial"/>
+                <w:color w:val="1A1A2E"/>
+                <w:sz w:val="17"/>
+                <w:szCs w:val="17"/>
+              </w:rPr>
+              <w:t xml:space="preserve">Les faux positifs aussi dangereux que vrais positifs manques</w:t>
+            </w:r>
+          </w:p>
+        </w:tc>
+      </w:tr>
+      <w:tr>
+        <w:tc>
+          <w:tcPr>
+            <w:tcW w:type="dxa" w:w="2500"/>
+            <w:shd w:fill="F5F5F8" w:val="clear"/>
+            <w:tcMar>
+              <w:top w:type="dxa" w:w="60"/>
+              <w:left w:type="dxa" w:w="80"/>
+              <w:bottom w:type="dxa" w:w="60"/>
+              <w:right w:type="dxa" w:w="80"/>
+            </w:tcMar>
+          </w:tcPr>
+          <w:p>
+            <w:r>
+              <w:rPr>
+                <w:rFonts w:ascii="Arial" w:cs="Arial" w:hAnsi="Arial"/>
+                <w:color w:val="1A1A2E"/>
+                <w:sz w:val="17"/>
+                <w:szCs w:val="17"/>
+              </w:rPr>
+              <w:t xml:space="preserve">test_guardrail.py</w:t>
+            </w:r>
+          </w:p>
+        </w:tc>
+        <w:tc>
+          <w:tcPr>
+            <w:tcW w:type="dxa" w:w="2500"/>
+            <w:shd w:fill="F5F5F8" w:val="clear"/>
+            <w:tcMar>
+              <w:top w:type="dxa" w:w="60"/>
+              <w:left w:type="dxa" w:w="80"/>
+              <w:bottom w:type="dxa" w:w="60"/>
+              <w:right w:type="dxa" w:w="80"/>
+            </w:tcMar>
+          </w:tcPr>
+          <w:p>
+            <w:r>
+              <w:rPr>
+                <w:rFonts w:ascii="Arial" w:cs="Arial" w:hAnsi="Arial"/>
+                <w:color w:val="1A1A2E"/>
+                <w:sz w:val="17"/>
+                <w:szCs w:val="17"/>
+              </w:rPr>
+              <w:t xml:space="preserve">check_hallucination_guardrail()</w:t>
+            </w:r>
+          </w:p>
+        </w:tc>
+        <w:tc>
+          <w:tcPr>
+            <w:tcW w:type="dxa" w:w="700"/>
+            <w:shd w:fill="F5F5F8" w:val="clear"/>
+            <w:tcMar>
+              <w:top w:type="dxa" w:w="60"/>
+              <w:left w:type="dxa" w:w="80"/>
+              <w:bottom w:type="dxa" w:w="60"/>
+              <w:right w:type="dxa" w:w="80"/>
+            </w:tcMar>
+          </w:tcPr>
+          <w:p>
+            <w:r>
+              <w:rPr>
+                <w:rFonts w:ascii="Arial" w:cs="Arial" w:hAnsi="Arial"/>
+                <w:color w:val="1A1A2E"/>
+                <w:sz w:val="17"/>
+                <w:szCs w:val="17"/>
+              </w:rPr>
+              <w:t xml:space="preserve">22</w:t>
+            </w:r>
+          </w:p>
+        </w:tc>
+        <w:tc>
+          <w:tcPr>
+            <w:tcW w:type="dxa" w:w="3660"/>
+            <w:shd w:fill="F5F5F8" w:val="clear"/>
+            <w:tcMar>
+              <w:top w:type="dxa" w:w="60"/>
+              <w:left w:type="dxa" w:w="80"/>
+              <w:bottom w:type="dxa" w:w="60"/>
+              <w:right w:type="dxa" w:w="80"/>
+            </w:tcMar>
+          </w:tcPr>
+          <w:p>
+            <w:r>
+              <w:rPr>
+                <w:rFonts w:ascii="Arial" w:cs="Arial" w:hAnsi="Arial"/>
+                <w:color w:val="1A1A2E"/>
+                <w:sz w:val="17"/>
+                <w:szCs w:val="17"/>
+              </w:rPr>
+              <w:t xml:space="preserve">Seuils LOW/HIGH critiques. Test valeurs exactes, evite off-by-one</w:t>
+            </w:r>
+          </w:p>
+        </w:tc>
+      </w:tr>
+      <w:tr>
+        <w:tc>
+          <w:tcPr>
+            <w:tcW w:type="dxa" w:w="2500"/>
+            <w:shd w:fill="FFFFFF" w:val="clear"/>
+            <w:tcMar>
+              <w:top w:type="dxa" w:w="60"/>
+              <w:left w:type="dxa" w:w="80"/>
+              <w:bottom w:type="dxa" w:w="60"/>
+              <w:right w:type="dxa" w:w="80"/>
+            </w:tcMar>
+          </w:tcPr>
+          <w:p>
+            <w:r>
+              <w:rPr>
+                <w:rFonts w:ascii="Arial" w:cs="Arial" w:hAnsi="Arial"/>
+                <w:color w:val="1A1A2E"/>
+                <w:sz w:val="17"/>
+                <w:szCs w:val="17"/>
+              </w:rPr>
+              <w:t xml:space="preserve">test_auth.py</w:t>
+            </w:r>
+          </w:p>
+        </w:tc>
+        <w:tc>
+          <w:tcPr>
+            <w:tcW w:type="dxa" w:w="2500"/>
+            <w:shd w:fill="FFFFFF" w:val="clear"/>
+            <w:tcMar>
+              <w:top w:type="dxa" w:w="60"/>
+              <w:left w:type="dxa" w:w="80"/>
+              <w:bottom w:type="dxa" w:w="60"/>
+              <w:right w:type="dxa" w:w="80"/>
+            </w:tcMar>
+          </w:tcPr>
+          <w:p>
+            <w:r>
+              <w:rPr>
+                <w:rFonts w:ascii="Arial" w:cs="Arial" w:hAnsi="Arial"/>
+                <w:color w:val="1A1A2E"/>
+                <w:sz w:val="17"/>
+                <w:szCs w:val="17"/>
+              </w:rPr>
+              <w:t xml:space="preserve">JWT + API keys + rate limiting</w:t>
+            </w:r>
+          </w:p>
+        </w:tc>
+        <w:tc>
+          <w:tcPr>
+            <w:tcW w:type="dxa" w:w="700"/>
+            <w:shd w:fill="FFFFFF" w:val="clear"/>
+            <w:tcMar>
+              <w:top w:type="dxa" w:w="60"/>
+              <w:left w:type="dxa" w:w="80"/>
+              <w:bottom w:type="dxa" w:w="60"/>
+              <w:right w:type="dxa" w:w="80"/>
+            </w:tcMar>
+          </w:tcPr>
+          <w:p>
+            <w:r>
+              <w:rPr>
+                <w:rFonts w:ascii="Arial" w:cs="Arial" w:hAnsi="Arial"/>
+                <w:color w:val="1A1A2E"/>
+                <w:sz w:val="17"/>
+                <w:szCs w:val="17"/>
+              </w:rPr>
+              <w:t xml:space="preserve">22</w:t>
+            </w:r>
+          </w:p>
+        </w:tc>
+        <w:tc>
+          <w:tcPr>
+            <w:tcW w:type="dxa" w:w="3660"/>
+            <w:shd w:fill="FFFFFF" w:val="clear"/>
+            <w:tcMar>
+              <w:top w:type="dxa" w:w="60"/>
+              <w:left w:type="dxa" w:w="80"/>
+              <w:bottom w:type="dxa" w:w="60"/>
+              <w:right w:type="dxa" w:w="80"/>
+            </w:tcMar>
+          </w:tcPr>
+          <w:p>
+            <w:r>
+              <w:rPr>
+                <w:rFonts w:ascii="Arial" w:cs="Arial" w:hAnsi="Arial"/>
+                <w:color w:val="1A1A2E"/>
+                <w:sz w:val="17"/>
+                <w:szCs w:val="17"/>
+              </w:rPr>
+              <w:t xml:space="preserve">Securite non testable manuellement. Token expire qui passe = faille</w:t>
+            </w:r>
+          </w:p>
+        </w:tc>
+      </w:tr>
+      <w:tr>
+        <w:tc>
+          <w:tcPr>
+            <w:tcW w:type="dxa" w:w="2500"/>
+            <w:shd w:fill="F5F5F8" w:val="clear"/>
+            <w:tcMar>
+              <w:top w:type="dxa" w:w="60"/>
+              <w:left w:type="dxa" w:w="80"/>
+              <w:bottom w:type="dxa" w:w="60"/>
+              <w:right w:type="dxa" w:w="80"/>
+            </w:tcMar>
+          </w:tcPr>
+          <w:p>
+            <w:r>
+              <w:rPr>
+                <w:rFonts w:ascii="Arial" w:cs="Arial" w:hAnsi="Arial"/>
+                <w:color w:val="1A1A2E"/>
+                <w:sz w:val="17"/>
+                <w:szCs w:val="17"/>
+              </w:rPr>
+              <w:t xml:space="preserve">test_audit_disclaimer.py</w:t>
+            </w:r>
+          </w:p>
+        </w:tc>
+        <w:tc>
+          <w:tcPr>
+            <w:tcW w:type="dxa" w:w="2500"/>
+            <w:shd w:fill="F5F5F8" w:val="clear"/>
+            <w:tcMar>
+              <w:top w:type="dxa" w:w="60"/>
+              <w:left w:type="dxa" w:w="80"/>
+              <w:bottom w:type="dxa" w:w="60"/>
+              <w:right w:type="dxa" w:w="80"/>
+            </w:tcMar>
+          </w:tcPr>
+          <w:p>
+            <w:r>
+              <w:rPr>
+                <w:rFonts w:ascii="Arial" w:cs="Arial" w:hAnsi="Arial"/>
+                <w:color w:val="1A1A2E"/>
+                <w:sz w:val="17"/>
+                <w:szCs w:val="17"/>
+              </w:rPr>
+              <w:t xml:space="preserve">Audit log + disclaimer</w:t>
+            </w:r>
+          </w:p>
+        </w:tc>
+        <w:tc>
+          <w:tcPr>
+            <w:tcW w:type="dxa" w:w="700"/>
+            <w:shd w:fill="F5F5F8" w:val="clear"/>
+            <w:tcMar>
+              <w:top w:type="dxa" w:w="60"/>
+              <w:left w:type="dxa" w:w="80"/>
+              <w:bottom w:type="dxa" w:w="60"/>
+              <w:right w:type="dxa" w:w="80"/>
+            </w:tcMar>
+          </w:tcPr>
+          <w:p>
+            <w:r>
+              <w:rPr>
+                <w:rFonts w:ascii="Arial" w:cs="Arial" w:hAnsi="Arial"/>
+                <w:color w:val="1A1A2E"/>
+                <w:sz w:val="17"/>
+                <w:szCs w:val="17"/>
+              </w:rPr>
+              <w:t xml:space="preserve">27</w:t>
+            </w:r>
+          </w:p>
+        </w:tc>
+        <w:tc>
+          <w:tcPr>
+            <w:tcW w:type="dxa" w:w="3660"/>
+            <w:shd w:fill="F5F5F8" w:val="clear"/>
+            <w:tcMar>
+              <w:top w:type="dxa" w:w="60"/>
+              <w:left w:type="dxa" w:w="80"/>
+              <w:bottom w:type="dxa" w:w="60"/>
+              <w:right w:type="dxa" w:w="80"/>
+            </w:tcMar>
+          </w:tcPr>
+          <w:p>
+            <w:r>
+              <w:rPr>
+                <w:rFonts w:ascii="Arial" w:cs="Arial" w:hAnsi="Arial"/>
+                <w:color w:val="1A1A2E"/>
+                <w:sz w:val="17"/>
+                <w:szCs w:val="17"/>
+              </w:rPr>
+              <w:t xml:space="preserve">JSONL valide. Disclaimer doit mentionner pas un conseil juridique</w:t>
+            </w:r>
+          </w:p>
+        </w:tc>
+      </w:tr>
+    </w:tbl>
+    <w:p>
+      <w:pPr>
+        <w:spacing w:after="80"/>
+      </w:pPr>
+    </w:p>
+    <w:tbl>
+      <w:tblPr>
+        <w:tblW w:type="dxa" w:w="9360"/>
+        <w:tblBorders>
+          <w:top w:val="single" w:color="C9A84C" w:sz="4"/>
+          <w:left w:val="single" w:color="C9A84C" w:sz="8"/>
+          <w:bottom w:val="single" w:color="C9A84C" w:sz="4"/>
+          <w:right w:val="single" w:color="C9A84C" w:sz="4"/>
+        </w:tblBorders>
+      </w:tblPr>
+      <w:tblGrid>
+        <w:gridCol w:w="9360"/>
+      </w:tblGrid>
+      <w:tr>
+        <w:tc>
+          <w:tcPr>
+            <w:shd w:fill="FFF8E1" w:val="clear"/>
+            <w:tcMar>
+              <w:top w:type="dxa" w:w="100"/>
+              <w:left w:type="dxa" w:w="200"/>
+              <w:bottom w:type="dxa" w:w="100"/>
+              <w:right w:type="dxa" w:w="200"/>
+            </w:tcMar>
+          </w:tcPr>
+          <w:p>
+            <w:pPr>
+              <w:spacing w:after="40"/>
+            </w:pPr>
+            <w:r>
+              <w:rPr>
+                <w:rFonts w:ascii="Arial" w:cs="Arial" w:hAnsi="Arial"/>
+                <w:b/>
+                <w:caps/>
+                <w:color w:val="7D6608"/>
+                <w:sz w:val="17"/>
+                <w:szCs w:val="17"/>
+              </w:rPr>
+              <w:t>POURQUOI ON N'INSTALLE PAS requirements.txt COMPLET EN CI</w:t>
+            </w:r>
+          </w:p>
+          <w:p>
+            <w:pPr>
+              <w:spacing w:after="0"/>
+            </w:pPr>
+            <w:r>
+              <w:rPr>
+                <w:rFonts w:ascii="Arial" w:cs="Arial" w:hAnsi="Arial"/>
+                <w:color w:val="1A1A2E"/>
+                <w:sz w:val="19"/>
+                <w:szCs w:val="19"/>
+              </w:rPr>
+              <w:t xml:space="preserve">faiss-cpu, sentence-transformers et torch pesent plusieurs gigaoctets. Les tests unitaires n'utilisent pas ces packages -- ils testent uniquement des fonctions pures. On installe seulement pytest, PyJWT, fastapi et pydantic.</w:t>
+            </w:r>
+          </w:p>
+        </w:tc>
+      </w:tr>
+    </w:tbl>
+    <w:p>
+      <w:r>
+        <w:br w:type="page"/>
+      </w:r>
+    </w:p>
+    <w:p>
+      <w:pPr>
+        <w:spacing w:after="60"/>
+      </w:pPr>
+      <w:r>
+        <w:rPr>
+          <w:rFonts w:ascii="Arial" w:cs="Arial" w:hAnsi="Arial"/>
+          <w:b/>
+          <w:color w:val="1E3A5F"/>
+          <w:sz w:val="28"/>
+          <w:szCs w:val="28"/>
+        </w:rPr>
+        <w:t xml:space="preserve">12  Frontend Streamlit (Lex AI)</w:t>
+      </w:r>
+    </w:p>
+    <w:p>
+      <w:pPr>
+        <w:spacing w:after="120"/>
+      </w:pPr>
+      <w:r>
+        <w:rPr>
+          <w:rFonts w:ascii="Arial" w:cs="Arial" w:hAnsi="Arial"/>
+          <w:i/>
+          <w:color w:val="7F8C8D"/>
+          <w:sz w:val="18"/>
+          <w:szCs w:val="18"/>
+        </w:rPr>
+        <w:t>Streamlit -- Lex AI -- Themis -- Switch FR/EN -- Tooltips -- Sources -- Historique</w:t>
+      </w:r>
+    </w:p>
+    <w:p>
+      <w:pPr>
+        <w:spacing w:after="100" w:before="200"/>
+      </w:pPr>
+      <w:r>
+        <w:rPr>
+          <w:rFonts w:ascii="Arial" w:cs="Arial" w:hAnsi="Arial"/>
+          <w:b/>
+          <w:color w:val="C9A84C"/>
+          <w:sz w:val="22"/>
+          <w:szCs w:val="22"/>
+        </w:rPr>
+        <w:t>Glossaire</w:t>
+      </w:r>
+    </w:p>
+    <w:tbl>
+      <w:tblPr>
+        <w:tblW w:type="dxa" w:w="9360"/>
+        <w:tblBorders>
+          <w:top w:val="none" w:color="FFFFFF" w:sz="0"/>
+          <w:left w:val="none" w:color="FFFFFF" w:sz="0"/>
+          <w:bottom w:val="single" w:color="E0E0E0" w:sz="2"/>
+          <w:right w:val="none" w:color="FFFFFF" w:sz="0"/>
+          <w:insideH w:val="none" w:color="FFFFFF" w:sz="0"/>
+          <w:insideV w:val="none" w:color="FFFFFF" w:sz="0"/>
+        </w:tblBorders>
+      </w:tblPr>
+      <w:tblGrid>
+        <w:gridCol w:w="2200"/>
+        <w:gridCol w:w="7160"/>
+      </w:tblGrid>
+      <w:tr>
+        <w:tc>
+          <w:tcPr>
+            <w:tcW w:type="dxa" w:w="2200"/>
+            <w:shd w:fill="F5F5F8" w:val="clear"/>
+            <w:tcMar>
+              <w:top w:type="dxa" w:w="80"/>
+              <w:left w:type="dxa" w:w="120"/>
+              <w:bottom w:type="dxa" w:w="80"/>
+              <w:right w:type="dxa" w:w="120"/>
+            </w:tcMar>
+          </w:tcPr>
+          <w:p>
+            <w:r>
+              <w:rPr>
+                <w:rFonts w:ascii="Arial" w:cs="Arial" w:hAnsi="Arial"/>
+                <w:b/>
+                <w:color w:val="1E3A5F"/>
+                <w:sz w:val="19"/>
+                <w:szCs w:val="19"/>
+              </w:rPr>
+              <w:t xml:space="preserve">Frontend</w:t>
+            </w:r>
+          </w:p>
+        </w:tc>
+        <w:tc>
+          <w:tcPr>
+            <w:tcW w:type="dxa" w:w="7160"/>
+            <w:tcMar>
+              <w:top w:type="dxa" w:w="80"/>
+              <w:left w:type="dxa" w:w="160"/>
+              <w:bottom w:type="dxa" w:w="80"/>
+              <w:right w:type="dxa" w:w="120"/>
+            </w:tcMar>
+          </w:tcPr>
+          <w:p>
+            <w:r>
+              <w:rPr>
+                <w:rFonts w:ascii="Arial" w:cs="Arial" w:hAnsi="Arial"/>
+                <w:color w:val="1A1A2E"/>
+                <w:sz w:val="19"/>
+                <w:szCs w:val="19"/>
+              </w:rPr>
+              <w:t xml:space="preserve">Interface visuelle avec laquelle l'utilisateur interagit directement. Distinct du backend (l'API FastAPI). Le frontend Streamlit communique avec l'API via des requetes HTTP.</w:t>
+            </w:r>
+          </w:p>
+        </w:tc>
+      </w:tr>
+    </w:tbl>
+    <w:tbl>
+      <w:tblPr>
+        <w:tblW w:type="dxa" w:w="9360"/>
+        <w:tblBorders>
+          <w:top w:val="none" w:color="FFFFFF" w:sz="0"/>
+          <w:left w:val="none" w:color="FFFFFF" w:sz="0"/>
+          <w:bottom w:val="single" w:color="E0E0E0" w:sz="2"/>
+          <w:right w:val="none" w:color="FFFFFF" w:sz="0"/>
+          <w:insideH w:val="none" w:color="FFFFFF" w:sz="0"/>
+          <w:insideV w:val="none" w:color="FFFFFF" w:sz="0"/>
+        </w:tblBorders>
+      </w:tblPr>
+      <w:tblGrid>
+        <w:gridCol w:w="2200"/>
+        <w:gridCol w:w="7160"/>
+      </w:tblGrid>
+      <w:tr>
+        <w:tc>
+          <w:tcPr>
+            <w:tcW w:type="dxa" w:w="2200"/>
+            <w:shd w:fill="F5F5F8" w:val="clear"/>
+            <w:tcMar>
+              <w:top w:type="dxa" w:w="80"/>
+              <w:left w:type="dxa" w:w="120"/>
+              <w:bottom w:type="dxa" w:w="80"/>
+              <w:right w:type="dxa" w:w="120"/>
+            </w:tcMar>
+          </w:tcPr>
+          <w:p>
+            <w:r>
+              <w:rPr>
+                <w:rFonts w:ascii="Arial" w:cs="Arial" w:hAnsi="Arial"/>
+                <w:b/>
+                <w:color w:val="1E3A5F"/>
+                <w:sz w:val="19"/>
+                <w:szCs w:val="19"/>
+              </w:rPr>
+              <w:t xml:space="preserve">Streamlit</w:t>
+            </w:r>
+          </w:p>
+        </w:tc>
+        <w:tc>
+          <w:tcPr>
+            <w:tcW w:type="dxa" w:w="7160"/>
+            <w:tcMar>
+              <w:top w:type="dxa" w:w="80"/>
+              <w:left w:type="dxa" w:w="160"/>
+              <w:bottom w:type="dxa" w:w="80"/>
+              <w:right w:type="dxa" w:w="120"/>
+            </w:tcMar>
+          </w:tcPr>
+          <w:p>
+            <w:r>
+              <w:rPr>
+                <w:rFonts w:ascii="Arial" w:cs="Arial" w:hAnsi="Arial"/>
+                <w:color w:val="1A1A2E"/>
+                <w:sz w:val="19"/>
+                <w:szCs w:val="19"/>
+              </w:rPr>
+              <w:t xml:space="preserve">Framework Python qui permet de creer des interfaces web sans ecrire de HTML/CSS/JavaScript. On decrit l'interface en Python, Streamlit genere le HTML. Ideal pour les prototypes et outils internes.</w:t>
+            </w:r>
+          </w:p>
+        </w:tc>
+      </w:tr>
+    </w:tbl>
+    <w:tbl>
+      <w:tblPr>
+        <w:tblW w:type="dxa" w:w="9360"/>
+        <w:tblBorders>
+          <w:top w:val="none" w:color="FFFFFF" w:sz="0"/>
+          <w:left w:val="none" w:color="FFFFFF" w:sz="0"/>
+          <w:bottom w:val="single" w:color="E0E0E0" w:sz="2"/>
+          <w:right w:val="none" w:color="FFFFFF" w:sz="0"/>
+          <w:insideH w:val="none" w:color="FFFFFF" w:sz="0"/>
+          <w:insideV w:val="none" w:color="FFFFFF" w:sz="0"/>
+        </w:tblBorders>
+      </w:tblPr>
+      <w:tblGrid>
+        <w:gridCol w:w="2200"/>
+        <w:gridCol w:w="7160"/>
+      </w:tblGrid>
+      <w:tr>
+        <w:tc>
+          <w:tcPr>
+            <w:tcW w:type="dxa" w:w="2200"/>
+            <w:shd w:fill="F5F5F8" w:val="clear"/>
+            <w:tcMar>
+              <w:top w:type="dxa" w:w="80"/>
+              <w:left w:type="dxa" w:w="120"/>
+              <w:bottom w:type="dxa" w:w="80"/>
+              <w:right w:type="dxa" w:w="120"/>
+            </w:tcMar>
+          </w:tcPr>
+          <w:p>
+            <w:r>
+              <w:rPr>
+                <w:rFonts w:ascii="Arial" w:cs="Arial" w:hAnsi="Arial"/>
+                <w:b/>
+                <w:color w:val="1E3A5F"/>
+                <w:sz w:val="19"/>
+                <w:szCs w:val="19"/>
+              </w:rPr>
+              <w:t xml:space="preserve">Session State</w:t>
+            </w:r>
+          </w:p>
+        </w:tc>
+        <w:tc>
+          <w:tcPr>
+            <w:tcW w:type="dxa" w:w="7160"/>
+            <w:tcMar>
+              <w:top w:type="dxa" w:w="80"/>
+              <w:left w:type="dxa" w:w="160"/>
+              <w:bottom w:type="dxa" w:w="80"/>
+              <w:right w:type="dxa" w:w="120"/>
+            </w:tcMar>
+          </w:tcPr>
+          <w:p>
+            <w:r>
+              <w:rPr>
+                <w:rFonts w:ascii="Arial" w:cs="Arial" w:hAnsi="Arial"/>
+                <w:color w:val="1A1A2E"/>
+                <w:sz w:val="19"/>
+                <w:szCs w:val="19"/>
+              </w:rPr>
+              <w:t xml:space="preserve">Mecanisme Streamlit pour conserver des donnees entre les interactions. Utilise pour l'historique des requetes, la langue (FR/EN), et le token JWT courant.</w:t>
+            </w:r>
+          </w:p>
+        </w:tc>
+      </w:tr>
+    </w:tbl>
+    <w:tbl>
+      <w:tblPr>
+        <w:tblW w:type="dxa" w:w="9360"/>
+        <w:tblBorders>
+          <w:top w:val="none" w:color="FFFFFF" w:sz="0"/>
+          <w:left w:val="none" w:color="FFFFFF" w:sz="0"/>
+          <w:bottom w:val="single" w:color="E0E0E0" w:sz="2"/>
+          <w:right w:val="none" w:color="FFFFFF" w:sz="0"/>
+          <w:insideH w:val="none" w:color="FFFFFF" w:sz="0"/>
+          <w:insideV w:val="none" w:color="FFFFFF" w:sz="0"/>
+        </w:tblBorders>
+      </w:tblPr>
+      <w:tblGrid>
+        <w:gridCol w:w="2200"/>
+        <w:gridCol w:w="7160"/>
+      </w:tblGrid>
+      <w:tr>
+        <w:tc>
+          <w:tcPr>
+            <w:tcW w:type="dxa" w:w="2200"/>
+            <w:shd w:fill="F5F5F8" w:val="clear"/>
+            <w:tcMar>
+              <w:top w:type="dxa" w:w="80"/>
+              <w:left w:type="dxa" w:w="120"/>
+              <w:bottom w:type="dxa" w:w="80"/>
+              <w:right w:type="dxa" w:w="120"/>
+            </w:tcMar>
+          </w:tcPr>
+          <w:p>
+            <w:r>
+              <w:rPr>
+                <w:rFonts w:ascii="Arial" w:cs="Arial" w:hAnsi="Arial"/>
+                <w:b/>
+                <w:color w:val="1E3A5F"/>
+                <w:sz w:val="19"/>
+                <w:szCs w:val="19"/>
+              </w:rPr>
+              <w:t xml:space="preserve">i18n</w:t>
+            </w:r>
+          </w:p>
+        </w:tc>
+        <w:tc>
+          <w:tcPr>
+            <w:tcW w:type="dxa" w:w="7160"/>
+            <w:tcMar>
+              <w:top w:type="dxa" w:w="80"/>
+              <w:left w:type="dxa" w:w="160"/>
+              <w:bottom w:type="dxa" w:w="80"/>
+              <w:right w:type="dxa" w:w="120"/>
+            </w:tcMar>
+          </w:tcPr>
+          <w:p>
+            <w:r>
+              <w:rPr>
+                <w:rFonts w:ascii="Arial" w:cs="Arial" w:hAnsi="Arial"/>
+                <w:color w:val="1A1A2E"/>
+                <w:sz w:val="19"/>
+                <w:szCs w:val="19"/>
+              </w:rPr>
+              <w:t xml:space="preserve">Internationalisation -- support de plusieurs langues dans l'interface. Le switch FR/EN bascule tous les labels : sidebar, placeholder, boutons, titres.</w:t>
+            </w:r>
+          </w:p>
+        </w:tc>
+      </w:tr>
+    </w:tbl>
+    <w:p>
+      <w:pPr>
+        <w:spacing w:after="80"/>
+      </w:pPr>
+    </w:p>
+    <w:p>
+      <w:pPr>
+        <w:spacing w:after="100" w:before="200"/>
+      </w:pPr>
+      <w:r>
+        <w:rPr>
+          <w:rFonts w:ascii="Arial" w:cs="Arial" w:hAnsi="Arial"/>
+          <w:b/>
+          <w:color w:val="C9A84C"/>
+          <w:sz w:val="22"/>
+          <w:szCs w:val="22"/>
+        </w:rPr>
+        <w:t>Fonctionnalites principales</w:t>
       </w:r>
     </w:p>
     <w:p>
@@ -23394,16 +24267,15 @@
         <w:rPr>
           <w:rFonts w:ascii="Arial" w:cs="Arial" w:hAnsi="Arial"/>
           <w:color w:val="1A1A2E"/>
-          <w:sz w:val="20"/>
-          <w:szCs w:val="20"/>
+          <w:sz w:val="19"/>
+          <w:szCs w:val="19"/>
         </w:rPr>
-        <w:t xml:space="preserve">On ne teste pas tout - ce serait trop long a ecrire et a maintenir. 20% des tests couvrent 80% des bugs potentiels. On se concentre sur :</w:t>
+        <w:t xml:space="preserve">Authentification automatique : au premier appel, l'app obtient un token JWT via POST /auth/token/demo et le stocke en session state. Toutes les requetes suivantes utilisent ce token.</w:t>
       </w:r>
     </w:p>
     <w:p>
       <w:pPr>
-        <w:spacing w:after="40"/>
-        <w:ind w:left="360"/>
+        <w:spacing w:after="60"/>
       </w:pPr>
       <w:r>
         <w:rPr>
@@ -23412,13 +24284,12 @@
           <w:sz w:val="19"/>
           <w:szCs w:val="19"/>
         </w:rPr>
-        <w:t xml:space="preserve">&amp;#x2022;  Cas limites (edge cases) : situations a la frontiere du comportement normal. n_chunks=0, token expire depuis -1 seconde, question de exactement 500 chars. C'est la que les bugs se cachent.</w:t>
+        <w:t xml:space="preserve">Sidebar : logo Lex AI (Themis), statut API (vecteurs + reglementations), filtres metadata (reglementation, langue, k, reranking), switch FR/EN, historique 10 dernieres requetes.</w:t>
       </w:r>
     </w:p>
     <w:p>
       <w:pPr>
-        <w:spacing w:after="40"/>
-        <w:ind w:left="360"/>
+        <w:spacing w:after="60"/>
       </w:pPr>
       <w:r>
         <w:rPr>
@@ -23427,13 +24298,12 @@
           <w:sz w:val="19"/>
           <w:szCs w:val="19"/>
         </w:rPr>
-        <w:t xml:space="preserve">&amp;#x2022;  Cas regressifs : ce qui a deja casse ou pourrait casser si on refactorise. test_ignore_in_legal_context garantit que 'ignore' dans une vraie question juridique ne bloque pas.</w:t>
+        <w:t xml:space="preserve">Header : titre + tags corpus avec infobulles CSS custom (GDPR, EU AI Act, DGA, EDPB, CNIL). Instructions. Champ de recherche + bouton avec icone loupe.</w:t>
       </w:r>
     </w:p>
     <w:p>
       <w:pPr>
-        <w:spacing w:after="40"/>
-        <w:ind w:left="360"/>
+        <w:spacing w:after="60"/>
       </w:pPr>
       <w:r>
         <w:rPr>
@@ -23442,7 +24312,21 @@
           <w:sz w:val="19"/>
           <w:szCs w:val="19"/>
         </w:rPr>
-        <w:t xml:space="preserve">&amp;#x2022;  Cas critiques metier : ce qui coute cher si ca rate. Un token expire qui passe = faille de securite. Un guardrail HIGH qui ne bloque pas = reponse non tracable envoyee a un client.</w:t>
+        <w:t xml:space="preserve">Reponse : Markdown rendu (## --titre). Badges [SOURCE X] verts avec tooltip titre/reglementation/annee. Disclaimer propre (sans * ni emoji).</w:t>
+      </w:r>
+    </w:p>
+    <w:p>
+      <w:pPr>
+        <w:spacing w:after="60"/>
+      </w:pPr>
+      <w:r>
+        <w:rPr>
+          <w:rFonts w:ascii="Arial" w:cs="Arial" w:hAnsi="Arial"/>
+          <w:color w:val="1A1A2E"/>
+          <w:sz w:val="19"/>
+          <w:szCs w:val="19"/>
+        </w:rPr>
+        <w:t xml:space="preserve">Sources : expander References citees avec liens cliquables -- scroll smooth vers la carte + highlight teal temporaire. Cartes sources avec tooltip date. Expander Lire le texte complet.</w:t>
       </w:r>
     </w:p>
     <w:p>
@@ -23462,131 +24346,35 @@
           <w:sz w:val="22"/>
           <w:szCs w:val="22"/>
         </w:rPr>
-        <w:t>Les 4 fichiers de tests - Ce qui est teste</w:t>
+        <w:t>UX -- Details techniques notables</w:t>
       </w:r>
     </w:p>
     <w:tbl>
       <w:tblPr>
         <w:tblW w:type="dxa" w:w="9360"/>
         <w:tblBorders>
-          <w:top w:val="single" w:color="1E3A5F" w:sz="4"/>
-          <w:left w:val="single" w:color="1E3A5F" w:sz="4"/>
-          <w:bottom w:val="single" w:color="1E3A5F" w:sz="4"/>
-          <w:right w:val="single" w:color="1E3A5F" w:sz="4"/>
-          <w:insideH w:val="single" w:color="CCCCCC" w:sz="2"/>
-          <w:insideV w:val="single" w:color="CCCCCC" w:sz="2"/>
+          <w:top w:val="none" w:color="FFFFFF" w:sz="0"/>
+          <w:left w:val="none" w:color="FFFFFF" w:sz="0"/>
+          <w:bottom w:val="single" w:color="E0E0E0" w:sz="2"/>
+          <w:right w:val="none" w:color="FFFFFF" w:sz="0"/>
+          <w:insideH w:val="none" w:color="FFFFFF" w:sz="0"/>
+          <w:insideV w:val="none" w:color="FFFFFF" w:sz="0"/>
         </w:tblBorders>
       </w:tblPr>
       <w:tblGrid>
-        <w:gridCol w:w="2400"/>
-        <w:gridCol w:w="2400"/>
-        <w:gridCol w:w="800"/>
-        <w:gridCol w:w="3760"/>
+        <w:gridCol w:w="2200"/>
+        <w:gridCol w:w="7160"/>
       </w:tblGrid>
       <w:tr>
         <w:tc>
           <w:tcPr>
-            <w:tcW w:type="dxa" w:w="2400"/>
-            <w:shd w:fill="1E3A5F" w:val="clear"/>
-            <w:tcMar>
-              <w:top w:type="dxa" w:w="60"/>
-              <w:left w:type="dxa" w:w="80"/>
-              <w:bottom w:type="dxa" w:w="60"/>
-              <w:right w:type="dxa" w:w="80"/>
-            </w:tcMar>
-          </w:tcPr>
-          <w:p>
-            <w:r>
-              <w:rPr>
-                <w:rFonts w:ascii="Arial" w:cs="Arial" w:hAnsi="Arial"/>
-                <w:color w:val="FFFFFF"/>
-                <w:sz w:val="17"/>
-                <w:szCs w:val="17"/>
-              </w:rPr>
-              <w:t xml:space="preserve">Fichier</w:t>
-            </w:r>
-          </w:p>
-        </w:tc>
-        <w:tc>
-          <w:tcPr>
-            <w:tcW w:type="dxa" w:w="2400"/>
-            <w:shd w:fill="1E3A5F" w:val="clear"/>
-            <w:tcMar>
-              <w:top w:type="dxa" w:w="60"/>
-              <w:left w:type="dxa" w:w="80"/>
-              <w:bottom w:type="dxa" w:w="60"/>
-              <w:right w:type="dxa" w:w="80"/>
-            </w:tcMar>
-          </w:tcPr>
-          <w:p>
-            <w:r>
-              <w:rPr>
-                <w:rFonts w:ascii="Arial" w:cs="Arial" w:hAnsi="Arial"/>
-                <w:color w:val="FFFFFF"/>
-                <w:sz w:val="17"/>
-                <w:szCs w:val="17"/>
-              </w:rPr>
-              <w:t xml:space="preserve">Teste quoi</w:t>
-            </w:r>
-          </w:p>
-        </w:tc>
-        <w:tc>
-          <w:tcPr>
-            <w:tcW w:type="dxa" w:w="800"/>
-            <w:shd w:fill="1E3A5F" w:val="clear"/>
-            <w:tcMar>
-              <w:top w:type="dxa" w:w="60"/>
-              <w:left w:type="dxa" w:w="80"/>
-              <w:bottom w:type="dxa" w:w="60"/>
-              <w:right w:type="dxa" w:w="80"/>
-            </w:tcMar>
-          </w:tcPr>
-          <w:p>
-            <w:r>
-              <w:rPr>
-                <w:rFonts w:ascii="Arial" w:cs="Arial" w:hAnsi="Arial"/>
-                <w:color w:val="FFFFFF"/>
-                <w:sz w:val="17"/>
-                <w:szCs w:val="17"/>
-              </w:rPr>
-              <w:t xml:space="preserve">Tests</w:t>
-            </w:r>
-          </w:p>
-        </w:tc>
-        <w:tc>
-          <w:tcPr>
-            <w:tcW w:type="dxa" w:w="3760"/>
-            <w:shd w:fill="1E3A5F" w:val="clear"/>
-            <w:tcMar>
-              <w:top w:type="dxa" w:w="60"/>
-              <w:left w:type="dxa" w:w="80"/>
-              <w:bottom w:type="dxa" w:w="60"/>
-              <w:right w:type="dxa" w:w="80"/>
-            </w:tcMar>
-          </w:tcPr>
-          <w:p>
-            <w:r>
-              <w:rPr>
-                <w:rFonts w:ascii="Arial" w:cs="Arial" w:hAnsi="Arial"/>
-                <w:color w:val="FFFFFF"/>
-                <w:sz w:val="17"/>
-                <w:szCs w:val="17"/>
-              </w:rPr>
-              <w:t xml:space="preserve">Pourquoi</w:t>
-            </w:r>
-          </w:p>
-        </w:tc>
-      </w:tr>
-      <w:tr>
-        <w:tc>
-          <w:tcPr>
-            <w:tcW w:type="dxa" w:w="2400"/>
-            <w:shd w:fill="FFFFFF" w:val="clear"/>
-            <w:tcMar>
-              <w:top w:type="dxa" w:w="60"/>
-              <w:left w:type="dxa" w:w="80"/>
-              <w:bottom w:type="dxa" w:w="60"/>
-              <w:right w:type="dxa" w:w="80"/>
+            <w:tcW w:type="dxa" w:w="2200"/>
+            <w:shd w:fill="F5F5F8" w:val="clear"/>
+            <w:tcMar>
+              <w:top w:type="dxa" w:w="80"/>
+              <w:left w:type="dxa" w:w="120"/>
+              <w:bottom w:type="dxa" w:w="80"/>
+              <w:right w:type="dxa" w:w="120"/>
             </w:tcMar>
           </w:tcPr>
           <w:p>
@@ -23594,24 +24382,22 @@
               <w:rPr>
                 <w:rFonts w:ascii="Arial" w:cs="Arial" w:hAnsi="Arial"/>
                 <w:b/>
-                <w:bCs/>
-                <w:color w:val="1A1A2E"/>
-                <w:sz w:val="17"/>
-                <w:szCs w:val="17"/>
-              </w:rPr>
-              <w:t xml:space="preserve">test_injection.py</w:t>
-            </w:r>
-          </w:p>
-        </w:tc>
-        <w:tc>
-          <w:tcPr>
-            <w:tcW w:type="dxa" w:w="2400"/>
-            <w:shd w:fill="FFFFFF" w:val="clear"/>
-            <w:tcMar>
-              <w:top w:type="dxa" w:w="60"/>
-              <w:left w:type="dxa" w:w="80"/>
-              <w:bottom w:type="dxa" w:w="60"/>
-              <w:right w:type="dxa" w:w="80"/>
+                <w:color w:val="1E3A5F"/>
+                <w:sz w:val="19"/>
+                <w:szCs w:val="19"/>
+              </w:rPr>
+              <w:t xml:space="preserve">Tooltips sources</w:t>
+            </w:r>
+          </w:p>
+        </w:tc>
+        <w:tc>
+          <w:tcPr>
+            <w:tcW w:type="dxa" w:w="7160"/>
+            <w:tcMar>
+              <w:top w:type="dxa" w:w="80"/>
+              <w:left w:type="dxa" w:w="160"/>
+              <w:bottom w:type="dxa" w:w="80"/>
+              <w:right w:type="dxa" w:w="120"/>
             </w:tcMar>
           </w:tcPr>
           <w:p>
@@ -23619,427 +24405,67 @@
               <w:rPr>
                 <w:rFonts w:ascii="Arial" w:cs="Arial" w:hAnsi="Arial"/>
                 <w:color w:val="1A1A2E"/>
-                <w:sz w:val="17"/>
-                <w:szCs w:val="17"/>
-              </w:rPr>
-              <w:t xml:space="preserve">detect_prompt_injection()</w:t>
-            </w:r>
-          </w:p>
-        </w:tc>
-        <w:tc>
-          <w:tcPr>
-            <w:tcW w:type="dxa" w:w="800"/>
-            <w:shd w:fill="FFFFFF" w:val="clear"/>
-            <w:tcMar>
-              <w:top w:type="dxa" w:w="60"/>
-              <w:left w:type="dxa" w:w="80"/>
-              <w:bottom w:type="dxa" w:w="60"/>
-              <w:right w:type="dxa" w:w="80"/>
-            </w:tcMar>
-          </w:tcPr>
-          <w:p>
-            <w:r>
-              <w:rPr>
-                <w:rFonts w:ascii="Arial" w:cs="Arial" w:hAnsi="Arial"/>
-                <w:color w:val="1A1A2E"/>
-                <w:sz w:val="17"/>
-                <w:szCs w:val="17"/>
-              </w:rPr>
-              <w:t xml:space="preserve">24</w:t>
-            </w:r>
-          </w:p>
-        </w:tc>
-        <w:tc>
-          <w:tcPr>
-            <w:tcW w:type="dxa" w:w="3760"/>
-            <w:shd w:fill="FFFFFF" w:val="clear"/>
-            <w:tcMar>
-              <w:top w:type="dxa" w:w="60"/>
-              <w:left w:type="dxa" w:w="80"/>
-              <w:bottom w:type="dxa" w:w="60"/>
-              <w:right w:type="dxa" w:w="80"/>
-            </w:tcMar>
-          </w:tcPr>
-          <w:p>
-            <w:r>
-              <w:rPr>
-                <w:rFonts w:ascii="Arial" w:cs="Arial" w:hAnsi="Arial"/>
-                <w:color w:val="1A1A2E"/>
-                <w:sz w:val="17"/>
-                <w:szCs w:val="17"/>
-              </w:rPr>
-              <w:t xml:space="preserve">Faux positifs aussi dangereux que vrais positifs manques</w:t>
-            </w:r>
-          </w:p>
-        </w:tc>
-      </w:tr>
-      <w:tr>
-        <w:tc>
-          <w:tcPr>
-            <w:tcW w:type="dxa" w:w="2400"/>
-            <w:shd w:fill="F5F5F8" w:val="clear"/>
-            <w:tcMar>
-              <w:top w:type="dxa" w:w="60"/>
-              <w:left w:type="dxa" w:w="80"/>
-              <w:bottom w:type="dxa" w:w="60"/>
-              <w:right w:type="dxa" w:w="80"/>
-            </w:tcMar>
-          </w:tcPr>
-          <w:p>
-            <w:r>
-              <w:rPr>
-                <w:rFonts w:ascii="Arial" w:cs="Arial" w:hAnsi="Arial"/>
-                <w:b/>
-                <w:bCs/>
-                <w:color w:val="1A1A2E"/>
-                <w:sz w:val="17"/>
-                <w:szCs w:val="17"/>
-              </w:rPr>
-              <w:t xml:space="preserve">test_guardrail.py</w:t>
-            </w:r>
-          </w:p>
-        </w:tc>
-        <w:tc>
-          <w:tcPr>
-            <w:tcW w:type="dxa" w:w="2400"/>
-            <w:shd w:fill="F5F5F8" w:val="clear"/>
-            <w:tcMar>
-              <w:top w:type="dxa" w:w="60"/>
-              <w:left w:type="dxa" w:w="80"/>
-              <w:bottom w:type="dxa" w:w="60"/>
-              <w:right w:type="dxa" w:w="80"/>
-            </w:tcMar>
-          </w:tcPr>
-          <w:p>
-            <w:r>
-              <w:rPr>
-                <w:rFonts w:ascii="Arial" w:cs="Arial" w:hAnsi="Arial"/>
-                <w:color w:val="1A1A2E"/>
-                <w:sz w:val="17"/>
-                <w:szCs w:val="17"/>
-              </w:rPr>
-              <w:t xml:space="preserve">check_hallucination_guardrail()</w:t>
-            </w:r>
-          </w:p>
-        </w:tc>
-        <w:tc>
-          <w:tcPr>
-            <w:tcW w:type="dxa" w:w="800"/>
-            <w:shd w:fill="F5F5F8" w:val="clear"/>
-            <w:tcMar>
-              <w:top w:type="dxa" w:w="60"/>
-              <w:left w:type="dxa" w:w="80"/>
-              <w:bottom w:type="dxa" w:w="60"/>
-              <w:right w:type="dxa" w:w="80"/>
-            </w:tcMar>
-          </w:tcPr>
-          <w:p>
-            <w:r>
-              <w:rPr>
-                <w:rFonts w:ascii="Arial" w:cs="Arial" w:hAnsi="Arial"/>
-                <w:color w:val="1A1A2E"/>
-                <w:sz w:val="17"/>
-                <w:szCs w:val="17"/>
-              </w:rPr>
-              <w:t xml:space="preserve">22</w:t>
-            </w:r>
-          </w:p>
-        </w:tc>
-        <w:tc>
-          <w:tcPr>
-            <w:tcW w:type="dxa" w:w="3760"/>
-            <w:shd w:fill="F5F5F8" w:val="clear"/>
-            <w:tcMar>
-              <w:top w:type="dxa" w:w="60"/>
-              <w:left w:type="dxa" w:w="80"/>
-              <w:bottom w:type="dxa" w:w="60"/>
-              <w:right w:type="dxa" w:w="80"/>
-            </w:tcMar>
-          </w:tcPr>
-          <w:p>
-            <w:r>
-              <w:rPr>
-                <w:rFonts w:ascii="Arial" w:cs="Arial" w:hAnsi="Arial"/>
-                <w:color w:val="1A1A2E"/>
-                <w:sz w:val="17"/>
-                <w:szCs w:val="17"/>
-              </w:rPr>
-              <w:t xml:space="preserve">Seuils LOW/HIGH critiques. Test valeurs exactes pour eviter off-by-one</w:t>
-            </w:r>
-          </w:p>
-        </w:tc>
-      </w:tr>
-      <w:tr>
-        <w:tc>
-          <w:tcPr>
-            <w:tcW w:type="dxa" w:w="2400"/>
-            <w:shd w:fill="FFFFFF" w:val="clear"/>
-            <w:tcMar>
-              <w:top w:type="dxa" w:w="60"/>
-              <w:left w:type="dxa" w:w="80"/>
-              <w:bottom w:type="dxa" w:w="60"/>
-              <w:right w:type="dxa" w:w="80"/>
-            </w:tcMar>
-          </w:tcPr>
-          <w:p>
-            <w:r>
-              <w:rPr>
-                <w:rFonts w:ascii="Arial" w:cs="Arial" w:hAnsi="Arial"/>
-                <w:b/>
-                <w:bCs/>
-                <w:color w:val="1A1A2E"/>
-                <w:sz w:val="17"/>
-                <w:szCs w:val="17"/>
-              </w:rPr>
-              <w:t xml:space="preserve">test_auth.py</w:t>
-            </w:r>
-          </w:p>
-        </w:tc>
-        <w:tc>
-          <w:tcPr>
-            <w:tcW w:type="dxa" w:w="2400"/>
-            <w:shd w:fill="FFFFFF" w:val="clear"/>
-            <w:tcMar>
-              <w:top w:type="dxa" w:w="60"/>
-              <w:left w:type="dxa" w:w="80"/>
-              <w:bottom w:type="dxa" w:w="60"/>
-              <w:right w:type="dxa" w:w="80"/>
-            </w:tcMar>
-          </w:tcPr>
-          <w:p>
-            <w:r>
-              <w:rPr>
-                <w:rFonts w:ascii="Arial" w:cs="Arial" w:hAnsi="Arial"/>
-                <w:color w:val="1A1A2E"/>
-                <w:sz w:val="17"/>
-                <w:szCs w:val="17"/>
-              </w:rPr>
-              <w:t xml:space="preserve">JWT + API keys + rate limiting</w:t>
-            </w:r>
-          </w:p>
-        </w:tc>
-        <w:tc>
-          <w:tcPr>
-            <w:tcW w:type="dxa" w:w="800"/>
-            <w:shd w:fill="FFFFFF" w:val="clear"/>
-            <w:tcMar>
-              <w:top w:type="dxa" w:w="60"/>
-              <w:left w:type="dxa" w:w="80"/>
-              <w:bottom w:type="dxa" w:w="60"/>
-              <w:right w:type="dxa" w:w="80"/>
-            </w:tcMar>
-          </w:tcPr>
-          <w:p>
-            <w:r>
-              <w:rPr>
-                <w:rFonts w:ascii="Arial" w:cs="Arial" w:hAnsi="Arial"/>
-                <w:color w:val="1A1A2E"/>
-                <w:sz w:val="17"/>
-                <w:szCs w:val="17"/>
-              </w:rPr>
-              <w:t xml:space="preserve">22</w:t>
-            </w:r>
-          </w:p>
-        </w:tc>
-        <w:tc>
-          <w:tcPr>
-            <w:tcW w:type="dxa" w:w="3760"/>
-            <w:shd w:fill="FFFFFF" w:val="clear"/>
-            <w:tcMar>
-              <w:top w:type="dxa" w:w="60"/>
-              <w:left w:type="dxa" w:w="80"/>
-              <w:bottom w:type="dxa" w:w="60"/>
-              <w:right w:type="dxa" w:w="80"/>
-            </w:tcMar>
-          </w:tcPr>
-          <w:p>
-            <w:r>
-              <w:rPr>
-                <w:rFonts w:ascii="Arial" w:cs="Arial" w:hAnsi="Arial"/>
-                <w:color w:val="1A1A2E"/>
-                <w:sz w:val="17"/>
-                <w:szCs w:val="17"/>
-              </w:rPr>
-              <w:t xml:space="preserve">Securite non testable manuellement. Token expire qui passe = faille</w:t>
-            </w:r>
-          </w:p>
-        </w:tc>
-      </w:tr>
-      <w:tr>
-        <w:tc>
-          <w:tcPr>
-            <w:tcW w:type="dxa" w:w="2400"/>
-            <w:shd w:fill="F5F5F8" w:val="clear"/>
-            <w:tcMar>
-              <w:top w:type="dxa" w:w="60"/>
-              <w:left w:type="dxa" w:w="80"/>
-              <w:bottom w:type="dxa" w:w="60"/>
-              <w:right w:type="dxa" w:w="80"/>
-            </w:tcMar>
-          </w:tcPr>
-          <w:p>
-            <w:r>
-              <w:rPr>
-                <w:rFonts w:ascii="Arial" w:cs="Arial" w:hAnsi="Arial"/>
-                <w:b/>
-                <w:bCs/>
-                <w:color w:val="1A1A2E"/>
-                <w:sz w:val="17"/>
-                <w:szCs w:val="17"/>
-              </w:rPr>
-              <w:t xml:space="preserve">test_audit_disclaimer.py</w:t>
-            </w:r>
-          </w:p>
-        </w:tc>
-        <w:tc>
-          <w:tcPr>
-            <w:tcW w:type="dxa" w:w="2400"/>
-            <w:shd w:fill="F5F5F8" w:val="clear"/>
-            <w:tcMar>
-              <w:top w:type="dxa" w:w="60"/>
-              <w:left w:type="dxa" w:w="80"/>
-              <w:bottom w:type="dxa" w:w="60"/>
-              <w:right w:type="dxa" w:w="80"/>
-            </w:tcMar>
-          </w:tcPr>
-          <w:p>
-            <w:r>
-              <w:rPr>
-                <w:rFonts w:ascii="Arial" w:cs="Arial" w:hAnsi="Arial"/>
-                <w:color w:val="1A1A2E"/>
-                <w:sz w:val="17"/>
-                <w:szCs w:val="17"/>
-              </w:rPr>
-              <w:t xml:space="preserve">Audit log + disclaimer</w:t>
-            </w:r>
-          </w:p>
-        </w:tc>
-        <w:tc>
-          <w:tcPr>
-            <w:tcW w:type="dxa" w:w="800"/>
-            <w:shd w:fill="F5F5F8" w:val="clear"/>
-            <w:tcMar>
-              <w:top w:type="dxa" w:w="60"/>
-              <w:left w:type="dxa" w:w="80"/>
-              <w:bottom w:type="dxa" w:w="60"/>
-              <w:right w:type="dxa" w:w="80"/>
-            </w:tcMar>
-          </w:tcPr>
-          <w:p>
-            <w:r>
-              <w:rPr>
-                <w:rFonts w:ascii="Arial" w:cs="Arial" w:hAnsi="Arial"/>
-                <w:color w:val="1A1A2E"/>
-                <w:sz w:val="17"/>
-                <w:szCs w:val="17"/>
-              </w:rPr>
-              <w:t xml:space="preserve">27</w:t>
-            </w:r>
-          </w:p>
-        </w:tc>
-        <w:tc>
-          <w:tcPr>
-            <w:tcW w:type="dxa" w:w="3760"/>
-            <w:shd w:fill="F5F5F8" w:val="clear"/>
-            <w:tcMar>
-              <w:top w:type="dxa" w:w="60"/>
-              <w:left w:type="dxa" w:w="80"/>
-              <w:bottom w:type="dxa" w:w="60"/>
-              <w:right w:type="dxa" w:w="80"/>
-            </w:tcMar>
-          </w:tcPr>
-          <w:p>
-            <w:r>
-              <w:rPr>
-                <w:rFonts w:ascii="Arial" w:cs="Arial" w:hAnsi="Arial"/>
-                <w:color w:val="1A1A2E"/>
-                <w:sz w:val="17"/>
-                <w:szCs w:val="17"/>
-              </w:rPr>
-              <w:t xml:space="preserve">JSONL valide. Disclaimer doit mentionner 'pas un conseil juridique'</w:t>
+                <w:sz w:val="19"/>
+                <w:szCs w:val="19"/>
+              </w:rPr>
+              <w:t xml:space="preserve">Survol [SOURCE X] dans le texte --&gt; infobulle avec titre officiel, reglementation, annee. Survol carte source --&gt; tooltip CSS blanc sur fond noir avec fleche.</w:t>
             </w:r>
           </w:p>
         </w:tc>
       </w:tr>
     </w:tbl>
-    <w:p>
-      <w:pPr>
-        <w:spacing w:after="80"/>
-      </w:pPr>
-    </w:p>
-    <w:p>
-      <w:pPr>
-        <w:spacing w:after="100" w:before="200"/>
-      </w:pPr>
-      <w:r>
-        <w:rPr>
-          <w:rFonts w:ascii="Arial" w:cs="Arial" w:hAnsi="Arial"/>
-          <w:b/>
-          <w:color w:val="C9A84C"/>
-          <w:sz w:val="22"/>
-          <w:szCs w:val="22"/>
-        </w:rPr>
-        <w:t>GitHub Actions - Mini cours complet</w:t>
-      </w:r>
-    </w:p>
-    <w:p>
-      <w:pPr>
-        <w:spacing w:after="80"/>
-      </w:pPr>
-      <w:r>
-        <w:rPr>
-          <w:rFonts w:ascii="Arial" w:cs="Arial" w:hAnsi="Arial"/>
-          <w:color w:val="1A1A2E"/>
-          <w:sz w:val="20"/>
-          <w:szCs w:val="20"/>
-        </w:rPr>
-        <w:t xml:space="preserve">GitHub Actions est un service integre a GitHub qui automatise des taches. A chaque push sur main, GitHub lance nos tests sur un serveur Ubuntu distant. Si un test echoue, on voit exactement lequel dans l'onglet Actions.</w:t>
-      </w:r>
-    </w:p>
     <w:tbl>
       <w:tblPr>
         <w:tblW w:type="dxa" w:w="9360"/>
         <w:tblBorders>
-          <w:top w:val="single" w:color="1A5276" w:sz="4"/>
-          <w:left w:val="single" w:color="1A5276" w:sz="8"/>
-          <w:bottom w:val="single" w:color="1A5276" w:sz="4"/>
-          <w:right w:val="single" w:color="1A5276" w:sz="4"/>
+          <w:top w:val="none" w:color="FFFFFF" w:sz="0"/>
+          <w:left w:val="none" w:color="FFFFFF" w:sz="0"/>
+          <w:bottom w:val="single" w:color="E0E0E0" w:sz="2"/>
+          <w:right w:val="none" w:color="FFFFFF" w:sz="0"/>
+          <w:insideH w:val="none" w:color="FFFFFF" w:sz="0"/>
+          <w:insideV w:val="none" w:color="FFFFFF" w:sz="0"/>
         </w:tblBorders>
       </w:tblPr>
       <w:tblGrid>
-        <w:gridCol w:w="9360"/>
+        <w:gridCol w:w="2200"/>
+        <w:gridCol w:w="7160"/>
       </w:tblGrid>
       <w:tr>
         <w:tc>
           <w:tcPr>
-            <w:shd w:fill="EBF5FB" w:val="clear"/>
-            <w:tcMar>
-              <w:top w:type="dxa" w:w="100"/>
-              <w:left w:type="dxa" w:w="200"/>
-              <w:bottom w:type="dxa" w:w="100"/>
-              <w:right w:type="dxa" w:w="200"/>
-            </w:tcMar>
-          </w:tcPr>
-          <w:p>
-            <w:pPr>
-              <w:spacing w:after="40"/>
-            </w:pPr>
+            <w:tcW w:type="dxa" w:w="2200"/>
+            <w:shd w:fill="F5F5F8" w:val="clear"/>
+            <w:tcMar>
+              <w:top w:type="dxa" w:w="80"/>
+              <w:left w:type="dxa" w:w="120"/>
+              <w:bottom w:type="dxa" w:w="80"/>
+              <w:right w:type="dxa" w:w="120"/>
+            </w:tcMar>
+          </w:tcPr>
+          <w:p>
             <w:r>
               <w:rPr>
                 <w:rFonts w:ascii="Arial" w:cs="Arial" w:hAnsi="Arial"/>
                 <w:b/>
-                <w:caps/>
-                <w:color w:val="1A5276"/>
-                <w:sz w:val="17"/>
-                <w:szCs w:val="17"/>
-              </w:rPr>
-              <w:t>COMMENT CA MARCHE CONCRETEMENT - DE TON TERMINAL A GITHUB</w:t>
-            </w:r>
-          </w:p>
-          <w:p>
-            <w:pPr>
-              <w:spacing w:after="0"/>
-            </w:pPr>
+                <w:color w:val="1E3A5F"/>
+                <w:sz w:val="19"/>
+                <w:szCs w:val="19"/>
+              </w:rPr>
+              <w:t xml:space="preserve">Navigation references</w:t>
+            </w:r>
+          </w:p>
+        </w:tc>
+        <w:tc>
+          <w:tcPr>
+            <w:tcW w:type="dxa" w:w="7160"/>
+            <w:tcMar>
+              <w:top w:type="dxa" w:w="80"/>
+              <w:left w:type="dxa" w:w="160"/>
+              <w:bottom w:type="dxa" w:w="80"/>
+              <w:right w:type="dxa" w:w="120"/>
+            </w:tcMar>
+          </w:tcPr>
+          <w:p>
             <w:r>
               <w:rPr>
                 <w:rFonts w:ascii="Arial" w:cs="Arial" w:hAnsi="Arial"/>
@@ -24047,7 +24473,202 @@
                 <w:sz w:val="19"/>
                 <w:szCs w:val="19"/>
               </w:rPr>
-              <w:t xml:space="preserve">1. Tu fais git push origin main sur ton Mac. 2. GitHub recoit le code et detecte .github/workflows/tests.yml. 3. GitHub demarre une machine virtuelle Ubuntu sur ses serveurs (gratuit pour repos publics). 4. La machine execute les etapes : clone le repo, installe Python 3.12, installe les deps, lance pytest tests/ -v. 5. Resultat visible dans l'onglet Actions : vert si tous passent, rouge sinon.</w:t>
+              <w:t xml:space="preserve">Clic sur une reference dans References citees --&gt; scroll smooth vers la carte + highlight teal temporaire (1.5s) via JavaScript inline.</w:t>
+            </w:r>
+          </w:p>
+        </w:tc>
+      </w:tr>
+    </w:tbl>
+    <w:tbl>
+      <w:tblPr>
+        <w:tblW w:type="dxa" w:w="9360"/>
+        <w:tblBorders>
+          <w:top w:val="none" w:color="FFFFFF" w:sz="0"/>
+          <w:left w:val="none" w:color="FFFFFF" w:sz="0"/>
+          <w:bottom w:val="single" w:color="E0E0E0" w:sz="2"/>
+          <w:right w:val="none" w:color="FFFFFF" w:sz="0"/>
+          <w:insideH w:val="none" w:color="FFFFFF" w:sz="0"/>
+          <w:insideV w:val="none" w:color="FFFFFF" w:sz="0"/>
+        </w:tblBorders>
+      </w:tblPr>
+      <w:tblGrid>
+        <w:gridCol w:w="2200"/>
+        <w:gridCol w:w="7160"/>
+      </w:tblGrid>
+      <w:tr>
+        <w:tc>
+          <w:tcPr>
+            <w:tcW w:type="dxa" w:w="2200"/>
+            <w:shd w:fill="F5F5F8" w:val="clear"/>
+            <w:tcMar>
+              <w:top w:type="dxa" w:w="80"/>
+              <w:left w:type="dxa" w:w="120"/>
+              <w:bottom w:type="dxa" w:w="80"/>
+              <w:right w:type="dxa" w:w="120"/>
+            </w:tcMar>
+          </w:tcPr>
+          <w:p>
+            <w:r>
+              <w:rPr>
+                <w:rFonts w:ascii="Arial" w:cs="Arial" w:hAnsi="Arial"/>
+                <w:b/>
+                <w:color w:val="1E3A5F"/>
+                <w:sz w:val="19"/>
+                <w:szCs w:val="19"/>
+              </w:rPr>
+              <w:t xml:space="preserve">Texte complet</w:t>
+            </w:r>
+          </w:p>
+        </w:tc>
+        <w:tc>
+          <w:tcPr>
+            <w:tcW w:type="dxa" w:w="7160"/>
+            <w:tcMar>
+              <w:top w:type="dxa" w:w="80"/>
+              <w:left w:type="dxa" w:w="160"/>
+              <w:bottom w:type="dxa" w:w="80"/>
+              <w:right w:type="dxa" w:w="120"/>
+            </w:tcMar>
+          </w:tcPr>
+          <w:p>
+            <w:r>
+              <w:rPr>
+                <w:rFonts w:ascii="Arial" w:cs="Arial" w:hAnsi="Arial"/>
+                <w:color w:val="1A1A2E"/>
+                <w:sz w:val="19"/>
+                <w:szCs w:val="19"/>
+              </w:rPr>
+              <w:t xml:space="preserve">Chaque source affiche un apercu 200 chars. Un expander Lire le texte complet donne acces au chunk entier du corpus.</w:t>
+            </w:r>
+          </w:p>
+        </w:tc>
+      </w:tr>
+    </w:tbl>
+    <w:tbl>
+      <w:tblPr>
+        <w:tblW w:type="dxa" w:w="9360"/>
+        <w:tblBorders>
+          <w:top w:val="none" w:color="FFFFFF" w:sz="0"/>
+          <w:left w:val="none" w:color="FFFFFF" w:sz="0"/>
+          <w:bottom w:val="single" w:color="E0E0E0" w:sz="2"/>
+          <w:right w:val="none" w:color="FFFFFF" w:sz="0"/>
+          <w:insideH w:val="none" w:color="FFFFFF" w:sz="0"/>
+          <w:insideV w:val="none" w:color="FFFFFF" w:sz="0"/>
+        </w:tblBorders>
+      </w:tblPr>
+      <w:tblGrid>
+        <w:gridCol w:w="2200"/>
+        <w:gridCol w:w="7160"/>
+      </w:tblGrid>
+      <w:tr>
+        <w:tc>
+          <w:tcPr>
+            <w:tcW w:type="dxa" w:w="2200"/>
+            <w:shd w:fill="F5F5F8" w:val="clear"/>
+            <w:tcMar>
+              <w:top w:type="dxa" w:w="80"/>
+              <w:left w:type="dxa" w:w="120"/>
+              <w:bottom w:type="dxa" w:w="80"/>
+              <w:right w:type="dxa" w:w="120"/>
+            </w:tcMar>
+          </w:tcPr>
+          <w:p>
+            <w:r>
+              <w:rPr>
+                <w:rFonts w:ascii="Arial" w:cs="Arial" w:hAnsi="Arial"/>
+                <w:b/>
+                <w:color w:val="1E3A5F"/>
+                <w:sz w:val="19"/>
+                <w:szCs w:val="19"/>
+              </w:rPr>
+              <w:t xml:space="preserve">Bouton retour haut</w:t>
+            </w:r>
+          </w:p>
+        </w:tc>
+        <w:tc>
+          <w:tcPr>
+            <w:tcW w:type="dxa" w:w="7160"/>
+            <w:tcMar>
+              <w:top w:type="dxa" w:w="80"/>
+              <w:left w:type="dxa" w:w="160"/>
+              <w:bottom w:type="dxa" w:w="80"/>
+              <w:right w:type="dxa" w:w="120"/>
+            </w:tcMar>
+          </w:tcPr>
+          <w:p>
+            <w:r>
+              <w:rPr>
+                <w:rFonts w:ascii="Arial" w:cs="Arial" w:hAnsi="Arial"/>
+                <w:color w:val="1A1A2E"/>
+                <w:sz w:val="19"/>
+                <w:szCs w:val="19"/>
+              </w:rPr>
+              <w:t xml:space="preserve">Bouton fixe en bas a droite via st.components.v1.html. Contourne le Shadow DOM de Streamlit pour scroller le bon conteneur parent.</w:t>
+            </w:r>
+          </w:p>
+        </w:tc>
+      </w:tr>
+    </w:tbl>
+    <w:tbl>
+      <w:tblPr>
+        <w:tblW w:type="dxa" w:w="9360"/>
+        <w:tblBorders>
+          <w:top w:val="none" w:color="FFFFFF" w:sz="0"/>
+          <w:left w:val="none" w:color="FFFFFF" w:sz="0"/>
+          <w:bottom w:val="single" w:color="E0E0E0" w:sz="2"/>
+          <w:right w:val="none" w:color="FFFFFF" w:sz="0"/>
+          <w:insideH w:val="none" w:color="FFFFFF" w:sz="0"/>
+          <w:insideV w:val="none" w:color="FFFFFF" w:sz="0"/>
+        </w:tblBorders>
+      </w:tblPr>
+      <w:tblGrid>
+        <w:gridCol w:w="2200"/>
+        <w:gridCol w:w="7160"/>
+      </w:tblGrid>
+      <w:tr>
+        <w:tc>
+          <w:tcPr>
+            <w:tcW w:type="dxa" w:w="2200"/>
+            <w:shd w:fill="F5F5F8" w:val="clear"/>
+            <w:tcMar>
+              <w:top w:type="dxa" w:w="80"/>
+              <w:left w:type="dxa" w:w="120"/>
+              <w:bottom w:type="dxa" w:w="80"/>
+              <w:right w:type="dxa" w:w="120"/>
+            </w:tcMar>
+          </w:tcPr>
+          <w:p>
+            <w:r>
+              <w:rPr>
+                <w:rFonts w:ascii="Arial" w:cs="Arial" w:hAnsi="Arial"/>
+                <w:b/>
+                <w:color w:val="1E3A5F"/>
+                <w:sz w:val="19"/>
+                <w:szCs w:val="19"/>
+              </w:rPr>
+              <w:t xml:space="preserve">Markdown rendu</w:t>
+            </w:r>
+          </w:p>
+        </w:tc>
+        <w:tc>
+          <w:tcPr>
+            <w:tcW w:type="dxa" w:w="7160"/>
+            <w:tcMar>
+              <w:top w:type="dxa" w:w="80"/>
+              <w:left w:type="dxa" w:w="160"/>
+              <w:bottom w:type="dxa" w:w="80"/>
+              <w:right w:type="dxa" w:w="120"/>
+            </w:tcMar>
+          </w:tcPr>
+          <w:p>
+            <w:r>
+              <w:rPr>
+                <w:rFonts w:ascii="Arial" w:cs="Arial" w:hAnsi="Arial"/>
+                <w:color w:val="1A1A2E"/>
+                <w:sz w:val="19"/>
+                <w:szCs w:val="19"/>
+              </w:rPr>
+              <w:t xml:space="preserve">## et ### dans les reponses Claude sont convertis en titres HTML via une fonction md_to_html() custom. ** et * rendus en gras et italique.</w:t>
             </w:r>
           </w:p>
         </w:tc>
@@ -24091,7 +24712,7 @@
                 <w:sz w:val="16"/>
                 <w:szCs w:val="16"/>
               </w:rPr>
-              <w:t>.github/workflows/tests.yml - Annote ligne par ligne</w:t>
+              <w:t>bash -- Lancer le frontend</w:t>
             </w:r>
           </w:p>
         </w:tc>
@@ -24114,11 +24735,11 @@
             <w:r>
               <w:rPr>
                 <w:rFonts w:ascii="Courier New" w:cs="Courier New" w:hAnsi="Courier New"/>
-                <w:color w:val="C9A84C"/>
+                <w:color w:val="888888"/>
                 <w:sz w:val="17"/>
                 <w:szCs w:val="17"/>
               </w:rPr>
-              <w:t xml:space="preserve">name: Tests CI              # nom affiche dans GitHub Actions</w:t>
+              <w:t xml:space="preserve"># Terminal 1 -- API FastAPI</w:t>
             </w:r>
           </w:p>
         </w:tc>
@@ -24141,11 +24762,11 @@
             <w:r>
               <w:rPr>
                 <w:rFonts w:ascii="Courier New" w:cs="Courier New" w:hAnsi="Courier New"/>
-                <w:color w:val="888888"/>
+                <w:color w:val="4CAF50"/>
                 <w:sz w:val="17"/>
                 <w:szCs w:val="17"/>
               </w:rPr>
-              <w:t xml:space="preserve"/>
+              <w:t xml:space="preserve">TRANSFORMERS_OFFLINE=1 venv/bin/python -m uvicorn api.main:app --reload --port 8000</w:t>
             </w:r>
           </w:p>
         </w:tc>
@@ -24168,11 +24789,11 @@
             <w:r>
               <w:rPr>
                 <w:rFonts w:ascii="Courier New" w:cs="Courier New" w:hAnsi="Courier New"/>
-                <w:color w:val="C9A84C"/>
+                <w:color w:val="888888"/>
                 <w:sz w:val="17"/>
                 <w:szCs w:val="17"/>
               </w:rPr>
-              <w:t xml:space="preserve">on:                          # quand declencher ce workflow</w:t>
+              <w:t xml:space="preserve"/>
             </w:r>
           </w:p>
         </w:tc>
@@ -24195,11 +24816,11 @@
             <w:r>
               <w:rPr>
                 <w:rFonts w:ascii="Courier New" w:cs="Courier New" w:hAnsi="Courier New"/>
-                <w:color w:val="CCCCCC"/>
+                <w:color w:val="888888"/>
                 <w:sz w:val="17"/>
                 <w:szCs w:val="17"/>
               </w:rPr>
-              <w:t xml:space="preserve">  push:</w:t>
+              <w:t xml:space="preserve"># Terminal 2 -- Frontend Streamlit</w:t>
             </w:r>
           </w:p>
         </w:tc>
@@ -24222,11 +24843,11 @@
             <w:r>
               <w:rPr>
                 <w:rFonts w:ascii="Courier New" w:cs="Courier New" w:hAnsi="Courier New"/>
-                <w:color w:val="CCCCCC"/>
+                <w:color w:val="4CAF50"/>
                 <w:sz w:val="17"/>
                 <w:szCs w:val="17"/>
               </w:rPr>
-              <w:t xml:space="preserve">    branches: [ main ]        # a chaque push sur main</w:t>
+              <w:t xml:space="preserve">venv/bin/streamlit run frontend/app.py</w:t>
             </w:r>
           </w:p>
         </w:tc>
@@ -24276,524 +24897,11 @@
             <w:r>
               <w:rPr>
                 <w:rFonts w:ascii="Courier New" w:cs="Courier New" w:hAnsi="Courier New"/>
-                <w:color w:val="C9A84C"/>
-                <w:sz w:val="17"/>
-                <w:szCs w:val="17"/>
-              </w:rPr>
-              <w:t xml:space="preserve">jobs:</w:t>
-            </w:r>
-          </w:p>
-        </w:tc>
-      </w:tr>
-      <w:tr>
-        <w:tc>
-          <w:tcPr>
-            <w:shd w:fill="1A1A2E" w:val="clear"/>
-            <w:tcMar>
-              <w:top w:type="dxa" w:w="20"/>
-              <w:left w:type="dxa" w:w="200"/>
-              <w:bottom w:type="dxa" w:w="20"/>
-              <w:right w:type="dxa" w:w="200"/>
-            </w:tcMar>
-          </w:tcPr>
-          <w:p>
-            <w:pPr>
-              <w:spacing w:after="0"/>
-            </w:pPr>
-            <w:r>
-              <w:rPr>
-                <w:rFonts w:ascii="Courier New" w:cs="Courier New" w:hAnsi="Courier New"/>
                 <w:color w:val="CCCCCC"/>
                 <w:sz w:val="17"/>
                 <w:szCs w:val="17"/>
               </w:rPr>
-              <w:t xml:space="preserve">  test:</w:t>
-            </w:r>
-          </w:p>
-        </w:tc>
-      </w:tr>
-      <w:tr>
-        <w:tc>
-          <w:tcPr>
-            <w:shd w:fill="1A1A2E" w:val="clear"/>
-            <w:tcMar>
-              <w:top w:type="dxa" w:w="20"/>
-              <w:left w:type="dxa" w:w="200"/>
-              <w:bottom w:type="dxa" w:w="20"/>
-              <w:right w:type="dxa" w:w="200"/>
-            </w:tcMar>
-          </w:tcPr>
-          <w:p>
-            <w:pPr>
-              <w:spacing w:after="0"/>
-            </w:pPr>
-            <w:r>
-              <w:rPr>
-                <w:rFonts w:ascii="Courier New" w:cs="Courier New" w:hAnsi="Courier New"/>
-                <w:color w:val="CCCCCC"/>
-                <w:sz w:val="17"/>
-                <w:szCs w:val="17"/>
-              </w:rPr>
-              <w:t xml:space="preserve">    runs-on: ubuntu-latest   # machine Ubuntu gratuite</w:t>
-            </w:r>
-          </w:p>
-        </w:tc>
-      </w:tr>
-      <w:tr>
-        <w:tc>
-          <w:tcPr>
-            <w:shd w:fill="1A1A2E" w:val="clear"/>
-            <w:tcMar>
-              <w:top w:type="dxa" w:w="20"/>
-              <w:left w:type="dxa" w:w="200"/>
-              <w:bottom w:type="dxa" w:w="20"/>
-              <w:right w:type="dxa" w:w="200"/>
-            </w:tcMar>
-          </w:tcPr>
-          <w:p>
-            <w:pPr>
-              <w:spacing w:after="0"/>
-            </w:pPr>
-            <w:r>
-              <w:rPr>
-                <w:rFonts w:ascii="Courier New" w:cs="Courier New" w:hAnsi="Courier New"/>
-                <w:color w:val="888888"/>
-                <w:sz w:val="17"/>
-                <w:szCs w:val="17"/>
-              </w:rPr>
-              <w:t xml:space="preserve"/>
-            </w:r>
-          </w:p>
-        </w:tc>
-      </w:tr>
-      <w:tr>
-        <w:tc>
-          <w:tcPr>
-            <w:shd w:fill="1A1A2E" w:val="clear"/>
-            <w:tcMar>
-              <w:top w:type="dxa" w:w="20"/>
-              <w:left w:type="dxa" w:w="200"/>
-              <w:bottom w:type="dxa" w:w="20"/>
-              <w:right w:type="dxa" w:w="200"/>
-            </w:tcMar>
-          </w:tcPr>
-          <w:p>
-            <w:pPr>
-              <w:spacing w:after="0"/>
-            </w:pPr>
-            <w:r>
-              <w:rPr>
-                <w:rFonts w:ascii="Courier New" w:cs="Courier New" w:hAnsi="Courier New"/>
-                <w:color w:val="C9A84C"/>
-                <w:sz w:val="17"/>
-                <w:szCs w:val="17"/>
-              </w:rPr>
-              <w:t xml:space="preserve">    steps:                   # etapes dans l'ordre</w:t>
-            </w:r>
-          </w:p>
-        </w:tc>
-      </w:tr>
-      <w:tr>
-        <w:tc>
-          <w:tcPr>
-            <w:shd w:fill="1A1A2E" w:val="clear"/>
-            <w:tcMar>
-              <w:top w:type="dxa" w:w="20"/>
-              <w:left w:type="dxa" w:w="200"/>
-              <w:bottom w:type="dxa" w:w="20"/>
-              <w:right w:type="dxa" w:w="200"/>
-            </w:tcMar>
-          </w:tcPr>
-          <w:p>
-            <w:pPr>
-              <w:spacing w:after="0"/>
-            </w:pPr>
-            <w:r>
-              <w:rPr>
-                <w:rFonts w:ascii="Courier New" w:cs="Courier New" w:hAnsi="Courier New"/>
-                <w:color w:val="CCCCCC"/>
-                <w:sz w:val="17"/>
-                <w:szCs w:val="17"/>
-              </w:rPr>
-              <w:t xml:space="preserve">      - uses: actions/checkout@v4     # clone le repo</w:t>
-            </w:r>
-          </w:p>
-        </w:tc>
-      </w:tr>
-      <w:tr>
-        <w:tc>
-          <w:tcPr>
-            <w:shd w:fill="1A1A2E" w:val="clear"/>
-            <w:tcMar>
-              <w:top w:type="dxa" w:w="20"/>
-              <w:left w:type="dxa" w:w="200"/>
-              <w:bottom w:type="dxa" w:w="20"/>
-              <w:right w:type="dxa" w:w="200"/>
-            </w:tcMar>
-          </w:tcPr>
-          <w:p>
-            <w:pPr>
-              <w:spacing w:after="0"/>
-            </w:pPr>
-            <w:r>
-              <w:rPr>
-                <w:rFonts w:ascii="Courier New" w:cs="Courier New" w:hAnsi="Courier New"/>
-                <w:color w:val="CCCCCC"/>
-                <w:sz w:val="17"/>
-                <w:szCs w:val="17"/>
-              </w:rPr>
-              <w:t xml:space="preserve">      - uses: actions/setup-python@v5  # installe Python 3.12</w:t>
-            </w:r>
-          </w:p>
-        </w:tc>
-      </w:tr>
-      <w:tr>
-        <w:tc>
-          <w:tcPr>
-            <w:shd w:fill="1A1A2E" w:val="clear"/>
-            <w:tcMar>
-              <w:top w:type="dxa" w:w="20"/>
-              <w:left w:type="dxa" w:w="200"/>
-              <w:bottom w:type="dxa" w:w="20"/>
-              <w:right w:type="dxa" w:w="200"/>
-            </w:tcMar>
-          </w:tcPr>
-          <w:p>
-            <w:pPr>
-              <w:spacing w:after="0"/>
-            </w:pPr>
-            <w:r>
-              <w:rPr>
-                <w:rFonts w:ascii="Courier New" w:cs="Courier New" w:hAnsi="Courier New"/>
-                <w:color w:val="888888"/>
-                <w:sz w:val="17"/>
-                <w:szCs w:val="17"/>
-              </w:rPr>
-              <w:t xml:space="preserve"/>
-            </w:r>
-          </w:p>
-        </w:tc>
-      </w:tr>
-      <w:tr>
-        <w:tc>
-          <w:tcPr>
-            <w:shd w:fill="1A1A2E" w:val="clear"/>
-            <w:tcMar>
-              <w:top w:type="dxa" w:w="20"/>
-              <w:left w:type="dxa" w:w="200"/>
-              <w:bottom w:type="dxa" w:w="20"/>
-              <w:right w:type="dxa" w:w="200"/>
-            </w:tcMar>
-          </w:tcPr>
-          <w:p>
-            <w:pPr>
-              <w:spacing w:after="0"/>
-            </w:pPr>
-            <w:r>
-              <w:rPr>
-                <w:rFonts w:ascii="Courier New" w:cs="Courier New" w:hAnsi="Courier New"/>
-                <w:color w:val="C9A84C"/>
-                <w:sz w:val="17"/>
-                <w:szCs w:val="17"/>
-              </w:rPr>
-              <w:t xml:space="preserve">      - name: Install test dependencies</w:t>
-            </w:r>
-          </w:p>
-        </w:tc>
-      </w:tr>
-      <w:tr>
-        <w:tc>
-          <w:tcPr>
-            <w:shd w:fill="1A1A2E" w:val="clear"/>
-            <w:tcMar>
-              <w:top w:type="dxa" w:w="20"/>
-              <w:left w:type="dxa" w:w="200"/>
-              <w:bottom w:type="dxa" w:w="20"/>
-              <w:right w:type="dxa" w:w="200"/>
-            </w:tcMar>
-          </w:tcPr>
-          <w:p>
-            <w:pPr>
-              <w:spacing w:after="0"/>
-            </w:pPr>
-            <w:r>
-              <w:rPr>
-                <w:rFonts w:ascii="Courier New" w:cs="Courier New" w:hAnsi="Courier New"/>
-                <w:color w:val="CCCCCC"/>
-                <w:sz w:val="17"/>
-                <w:szCs w:val="17"/>
-              </w:rPr>
-              <w:t xml:space="preserve">        run: |</w:t>
-            </w:r>
-          </w:p>
-        </w:tc>
-      </w:tr>
-      <w:tr>
-        <w:tc>
-          <w:tcPr>
-            <w:shd w:fill="1A1A2E" w:val="clear"/>
-            <w:tcMar>
-              <w:top w:type="dxa" w:w="20"/>
-              <w:left w:type="dxa" w:w="200"/>
-              <w:bottom w:type="dxa" w:w="20"/>
-              <w:right w:type="dxa" w:w="200"/>
-            </w:tcMar>
-          </w:tcPr>
-          <w:p>
-            <w:pPr>
-              <w:spacing w:after="0"/>
-            </w:pPr>
-            <w:r>
-              <w:rPr>
-                <w:rFonts w:ascii="Courier New" w:cs="Courier New" w:hAnsi="Courier New"/>
-                <w:color w:val="CCCCCC"/>
-                <w:sz w:val="17"/>
-                <w:szCs w:val="17"/>
-              </w:rPr>
-              <w:t xml:space="preserve">          pip install pytest pytest-cov  # outil de test</w:t>
-            </w:r>
-          </w:p>
-        </w:tc>
-      </w:tr>
-      <w:tr>
-        <w:tc>
-          <w:tcPr>
-            <w:shd w:fill="1A1A2E" w:val="clear"/>
-            <w:tcMar>
-              <w:top w:type="dxa" w:w="20"/>
-              <w:left w:type="dxa" w:w="200"/>
-              <w:bottom w:type="dxa" w:w="20"/>
-              <w:right w:type="dxa" w:w="200"/>
-            </w:tcMar>
-          </w:tcPr>
-          <w:p>
-            <w:pPr>
-              <w:spacing w:after="0"/>
-            </w:pPr>
-            <w:r>
-              <w:rPr>
-                <w:rFonts w:ascii="Courier New" w:cs="Courier New" w:hAnsi="Courier New"/>
-                <w:color w:val="CCCCCC"/>
-                <w:sz w:val="17"/>
-                <w:szCs w:val="17"/>
-              </w:rPr>
-              <w:t xml:space="preserve">          pip install PyJWT cryptography # auth</w:t>
-            </w:r>
-          </w:p>
-        </w:tc>
-      </w:tr>
-      <w:tr>
-        <w:tc>
-          <w:tcPr>
-            <w:shd w:fill="1A1A2E" w:val="clear"/>
-            <w:tcMar>
-              <w:top w:type="dxa" w:w="20"/>
-              <w:left w:type="dxa" w:w="200"/>
-              <w:bottom w:type="dxa" w:w="20"/>
-              <w:right w:type="dxa" w:w="200"/>
-            </w:tcMar>
-          </w:tcPr>
-          <w:p>
-            <w:pPr>
-              <w:spacing w:after="0"/>
-            </w:pPr>
-            <w:r>
-              <w:rPr>
-                <w:rFonts w:ascii="Courier New" w:cs="Courier New" w:hAnsi="Courier New"/>
-                <w:color w:val="CCCCCC"/>
-                <w:sz w:val="17"/>
-                <w:szCs w:val="17"/>
-              </w:rPr>
-              <w:t xml:space="preserve">          pip install fastapi pydantic   # framework</w:t>
-            </w:r>
-          </w:p>
-        </w:tc>
-      </w:tr>
-      <w:tr>
-        <w:tc>
-          <w:tcPr>
-            <w:shd w:fill="1A1A2E" w:val="clear"/>
-            <w:tcMar>
-              <w:top w:type="dxa" w:w="20"/>
-              <w:left w:type="dxa" w:w="200"/>
-              <w:bottom w:type="dxa" w:w="20"/>
-              <w:right w:type="dxa" w:w="200"/>
-            </w:tcMar>
-          </w:tcPr>
-          <w:p>
-            <w:pPr>
-              <w:spacing w:after="0"/>
-            </w:pPr>
-            <w:r>
-              <w:rPr>
-                <w:rFonts w:ascii="Courier New" w:cs="Courier New" w:hAnsi="Courier New"/>
-                <w:color w:val="888888"/>
-                <w:sz w:val="17"/>
-                <w:szCs w:val="17"/>
-              </w:rPr>
-              <w:t xml:space="preserve">          # NE PAS installer faiss/sentence-transformers</w:t>
-            </w:r>
-          </w:p>
-        </w:tc>
-      </w:tr>
-      <w:tr>
-        <w:tc>
-          <w:tcPr>
-            <w:shd w:fill="1A1A2E" w:val="clear"/>
-            <w:tcMar>
-              <w:top w:type="dxa" w:w="20"/>
-              <w:left w:type="dxa" w:w="200"/>
-              <w:bottom w:type="dxa" w:w="20"/>
-              <w:right w:type="dxa" w:w="200"/>
-            </w:tcMar>
-          </w:tcPr>
-          <w:p>
-            <w:pPr>
-              <w:spacing w:after="0"/>
-            </w:pPr>
-            <w:r>
-              <w:rPr>
-                <w:rFonts w:ascii="Courier New" w:cs="Courier New" w:hAnsi="Courier New"/>
-                <w:color w:val="888888"/>
-                <w:sz w:val="17"/>
-                <w:szCs w:val="17"/>
-              </w:rPr>
-              <w:t xml:space="preserve">          # -&gt; trop lourds, inutiles pour les tests unitaires</w:t>
-            </w:r>
-          </w:p>
-        </w:tc>
-      </w:tr>
-      <w:tr>
-        <w:tc>
-          <w:tcPr>
-            <w:shd w:fill="1A1A2E" w:val="clear"/>
-            <w:tcMar>
-              <w:top w:type="dxa" w:w="20"/>
-              <w:left w:type="dxa" w:w="200"/>
-              <w:bottom w:type="dxa" w:w="20"/>
-              <w:right w:type="dxa" w:w="200"/>
-            </w:tcMar>
-          </w:tcPr>
-          <w:p>
-            <w:pPr>
-              <w:spacing w:after="0"/>
-            </w:pPr>
-            <w:r>
-              <w:rPr>
-                <w:rFonts w:ascii="Courier New" w:cs="Courier New" w:hAnsi="Courier New"/>
-                <w:color w:val="888888"/>
-                <w:sz w:val="17"/>
-                <w:szCs w:val="17"/>
-              </w:rPr>
-              <w:t xml:space="preserve"/>
-            </w:r>
-          </w:p>
-        </w:tc>
-      </w:tr>
-      <w:tr>
-        <w:tc>
-          <w:tcPr>
-            <w:shd w:fill="1A1A2E" w:val="clear"/>
-            <w:tcMar>
-              <w:top w:type="dxa" w:w="20"/>
-              <w:left w:type="dxa" w:w="200"/>
-              <w:bottom w:type="dxa" w:w="20"/>
-              <w:right w:type="dxa" w:w="200"/>
-            </w:tcMar>
-          </w:tcPr>
-          <w:p>
-            <w:pPr>
-              <w:spacing w:after="0"/>
-            </w:pPr>
-            <w:r>
-              <w:rPr>
-                <w:rFonts w:ascii="Courier New" w:cs="Courier New" w:hAnsi="Courier New"/>
-                <w:color w:val="C9A84C"/>
-                <w:sz w:val="17"/>
-                <w:szCs w:val="17"/>
-              </w:rPr>
-              <w:t xml:space="preserve">      - name: Run unit tests</w:t>
-            </w:r>
-          </w:p>
-        </w:tc>
-      </w:tr>
-      <w:tr>
-        <w:tc>
-          <w:tcPr>
-            <w:shd w:fill="1A1A2E" w:val="clear"/>
-            <w:tcMar>
-              <w:top w:type="dxa" w:w="20"/>
-              <w:left w:type="dxa" w:w="200"/>
-              <w:bottom w:type="dxa" w:w="20"/>
-              <w:right w:type="dxa" w:w="200"/>
-            </w:tcMar>
-          </w:tcPr>
-          <w:p>
-            <w:pPr>
-              <w:spacing w:after="0"/>
-            </w:pPr>
-            <w:r>
-              <w:rPr>
-                <w:rFonts w:ascii="Courier New" w:cs="Courier New" w:hAnsi="Courier New"/>
-                <w:color w:val="CCCCCC"/>
-                <w:sz w:val="17"/>
-                <w:szCs w:val="17"/>
-              </w:rPr>
-              <w:t xml:space="preserve">        env:</w:t>
-            </w:r>
-          </w:p>
-        </w:tc>
-      </w:tr>
-      <w:tr>
-        <w:tc>
-          <w:tcPr>
-            <w:shd w:fill="1A1A2E" w:val="clear"/>
-            <w:tcMar>
-              <w:top w:type="dxa" w:w="20"/>
-              <w:left w:type="dxa" w:w="200"/>
-              <w:bottom w:type="dxa" w:w="20"/>
-              <w:right w:type="dxa" w:w="200"/>
-            </w:tcMar>
-          </w:tcPr>
-          <w:p>
-            <w:pPr>
-              <w:spacing w:after="0"/>
-            </w:pPr>
-            <w:r>
-              <w:rPr>
-                <w:rFonts w:ascii="Courier New" w:cs="Courier New" w:hAnsi="Courier New"/>
-                <w:color w:val="CCCCCC"/>
-                <w:sz w:val="17"/>
-                <w:szCs w:val="17"/>
-              </w:rPr>
-              <w:t xml:space="preserve">          JWT_SECRET_KEY: 'ci_test_secret...'  # jamais la vraie cle</w:t>
-            </w:r>
-          </w:p>
-        </w:tc>
-      </w:tr>
-      <w:tr>
-        <w:tc>
-          <w:tcPr>
-            <w:shd w:fill="1A1A2E" w:val="clear"/>
-            <w:tcMar>
-              <w:top w:type="dxa" w:w="20"/>
-              <w:left w:type="dxa" w:w="200"/>
-              <w:bottom w:type="dxa" w:w="20"/>
-              <w:right w:type="dxa" w:w="200"/>
-            </w:tcMar>
-          </w:tcPr>
-          <w:p>
-            <w:pPr>
-              <w:spacing w:after="0"/>
-            </w:pPr>
-            <w:r>
-              <w:rPr>
-                <w:rFonts w:ascii="Courier New" w:cs="Courier New" w:hAnsi="Courier New"/>
-                <w:color w:val="CCCCCC"/>
-                <w:sz w:val="17"/>
-                <w:szCs w:val="17"/>
-              </w:rPr>
-              <w:t xml:space="preserve">        run: python -m pytest tests/ -v --tb=short</w:t>
+              <w:t xml:space="preserve"># Ouvrir dans le navigateur : http://localhost:8501</w:t>
             </w:r>
           </w:p>
         </w:tc>
@@ -24808,341 +24916,376 @@
       <w:tblPr>
         <w:tblW w:type="dxa" w:w="9360"/>
         <w:tblBorders>
-          <w:top w:val="single" w:color="C9A84C" w:sz="4"/>
-          <w:left w:val="single" w:color="C9A84C" w:sz="8"/>
-          <w:bottom w:val="single" w:color="C9A84C" w:sz="4"/>
-          <w:right w:val="single" w:color="C9A84C" w:sz="4"/>
+          <w:top w:val="single" w:color="1E3A5F" w:sz="4"/>
+          <w:left w:val="single" w:color="1E3A5F" w:sz="4"/>
+          <w:bottom w:val="single" w:color="1E3A5F" w:sz="4"/>
+          <w:right w:val="single" w:color="1E3A5F" w:sz="4"/>
+          <w:insideH w:val="single" w:color="CCCCCC" w:sz="2"/>
+          <w:insideV w:val="single" w:color="CCCCCC" w:sz="2"/>
         </w:tblBorders>
       </w:tblPr>
       <w:tblGrid>
-        <w:gridCol w:w="9360"/>
+        <w:gridCol w:w="3200"/>
+        <w:gridCol w:w="1200"/>
+        <w:gridCol w:w="4960"/>
       </w:tblGrid>
       <w:tr>
         <w:tc>
           <w:tcPr>
-            <w:shd w:fill="FFF8E1" w:val="clear"/>
-            <w:tcMar>
-              <w:top w:type="dxa" w:w="100"/>
-              <w:left w:type="dxa" w:w="200"/>
-              <w:bottom w:type="dxa" w:w="100"/>
-              <w:right w:type="dxa" w:w="200"/>
-            </w:tcMar>
-          </w:tcPr>
-          <w:p>
-            <w:pPr>
-              <w:spacing w:after="40"/>
-            </w:pPr>
+            <w:tcW w:type="dxa" w:w="3200"/>
+            <w:shd w:fill="1E3A5F" w:val="clear"/>
+            <w:tcMar>
+              <w:top w:type="dxa" w:w="60"/>
+              <w:left w:type="dxa" w:w="80"/>
+              <w:bottom w:type="dxa" w:w="60"/>
+              <w:right w:type="dxa" w:w="80"/>
+            </w:tcMar>
+          </w:tcPr>
+          <w:p>
             <w:r>
               <w:rPr>
                 <w:rFonts w:ascii="Arial" w:cs="Arial" w:hAnsi="Arial"/>
                 <w:b/>
-                <w:caps/>
-                <w:color w:val="7D6608"/>
+                <w:bCs/>
+                <w:color w:val="FFFFFF"/>
                 <w:sz w:val="17"/>
                 <w:szCs w:val="17"/>
               </w:rPr>
-              <w:t>POURQUOI ON N'INSTALLE PAS requirements.txt COMPLET EN CI</w:t>
-            </w:r>
-          </w:p>
-          <w:p>
-            <w:pPr>
-              <w:spacing w:after="0"/>
-            </w:pPr>
+              <w:t xml:space="preserve">Fichier</w:t>
+            </w:r>
+          </w:p>
+        </w:tc>
+        <w:tc>
+          <w:tcPr>
+            <w:tcW w:type="dxa" w:w="1200"/>
+            <w:shd w:fill="1E3A5F" w:val="clear"/>
+            <w:tcMar>
+              <w:top w:type="dxa" w:w="60"/>
+              <w:left w:type="dxa" w:w="80"/>
+              <w:bottom w:type="dxa" w:w="60"/>
+              <w:right w:type="dxa" w:w="80"/>
+            </w:tcMar>
+          </w:tcPr>
+          <w:p>
             <w:r>
               <w:rPr>
                 <w:rFonts w:ascii="Arial" w:cs="Arial" w:hAnsi="Arial"/>
-                <w:color w:val="1A1A2E"/>
-                <w:sz w:val="19"/>
-                <w:szCs w:val="19"/>
-              </w:rPr>
-              <w:t xml:space="preserve">Le requirements.txt complet inclut faiss-cpu, sentence-transformers et torch - packages qui pesent plusieurs gigaoctets et prennent 5-10 minutes a installer. Les tests unitaires n'utilisent pas ces packages - ils testent uniquement des fonctions pures. On installe seulement pytest, PyJWT, fastapi et pydantic.</w:t>
-            </w:r>
-          </w:p>
-        </w:tc>
-      </w:tr>
-    </w:tbl>
-    <w:p>
-      <w:pPr>
-        <w:spacing w:after="80"/>
-      </w:pPr>
-    </w:p>
-    <w:tbl>
-      <w:tblPr>
-        <w:tblW w:type="dxa" w:w="9360"/>
-        <w:tblBorders>
-          <w:top w:val="single" w:color="C9A84C" w:sz="4"/>
-          <w:left w:val="single" w:color="C9A84C" w:sz="4"/>
-          <w:bottom w:val="single" w:color="C9A84C" w:sz="4"/>
-          <w:right w:val="single" w:color="C9A84C" w:sz="4"/>
-        </w:tblBorders>
-      </w:tblPr>
-      <w:tblGrid>
-        <w:gridCol w:w="9360"/>
-      </w:tblGrid>
-      <w:tr>
-        <w:tc>
-          <w:tcPr>
-            <w:shd w:fill="C9A84C" w:val="clear"/>
-            <w:tcMar>
-              <w:top w:type="dxa" w:w="60"/>
-              <w:left w:type="dxa" w:w="200"/>
-              <w:bottom w:type="dxa" w:w="60"/>
-              <w:right w:type="dxa" w:w="200"/>
-            </w:tcMar>
-          </w:tcPr>
-          <w:p>
-            <w:r>
-              <w:rPr>
-                <w:rFonts w:ascii="Courier New" w:cs="Courier New" w:hAnsi="Courier New"/>
                 <w:b/>
-                <w:color w:val="1A1A1A"/>
-                <w:sz w:val="16"/>
-                <w:szCs w:val="16"/>
-              </w:rPr>
-              <w:t>Resultat CI - GitHub Actions - 100/100 PASSED</w:t>
-            </w:r>
-          </w:p>
-        </w:tc>
-      </w:tr>
-      <w:tr>
-        <w:tc>
-          <w:tcPr>
-            <w:shd w:fill="1A1A2E" w:val="clear"/>
-            <w:tcMar>
-              <w:top w:type="dxa" w:w="20"/>
-              <w:left w:type="dxa" w:w="200"/>
-              <w:bottom w:type="dxa" w:w="20"/>
-              <w:right w:type="dxa" w:w="200"/>
-            </w:tcMar>
-          </w:tcPr>
-          <w:p>
-            <w:pPr>
-              <w:spacing w:after="0"/>
-            </w:pPr>
-            <w:r>
-              <w:rPr>
-                <w:rFonts w:ascii="Courier New" w:cs="Courier New" w:hAnsi="Courier New"/>
-                <w:color w:val="CCCCCC"/>
+                <w:bCs/>
+                <w:color w:val="FFFFFF"/>
                 <w:sz w:val="17"/>
                 <w:szCs w:val="17"/>
               </w:rPr>
-              <w:t xml:space="preserve">platform linux -- Python 3.12.13 · pytest 9.0.2</w:t>
-            </w:r>
-          </w:p>
-        </w:tc>
-      </w:tr>
-      <w:tr>
-        <w:tc>
-          <w:tcPr>
-            <w:shd w:fill="1A1A2E" w:val="clear"/>
-            <w:tcMar>
-              <w:top w:type="dxa" w:w="20"/>
-              <w:left w:type="dxa" w:w="200"/>
-              <w:bottom w:type="dxa" w:w="20"/>
-              <w:right w:type="dxa" w:w="200"/>
-            </w:tcMar>
-          </w:tcPr>
-          <w:p>
-            <w:pPr>
-              <w:spacing w:after="0"/>
-            </w:pPr>
-            <w:r>
-              <w:rPr>
-                <w:rFonts w:ascii="Courier New" w:cs="Courier New" w:hAnsi="Courier New"/>
-                <w:color w:val="CCCCCC"/>
+              <w:t xml:space="preserve">Action</w:t>
+            </w:r>
+          </w:p>
+        </w:tc>
+        <w:tc>
+          <w:tcPr>
+            <w:tcW w:type="dxa" w:w="4960"/>
+            <w:shd w:fill="1E3A5F" w:val="clear"/>
+            <w:tcMar>
+              <w:top w:type="dxa" w:w="60"/>
+              <w:left w:type="dxa" w:w="80"/>
+              <w:bottom w:type="dxa" w:w="60"/>
+              <w:right w:type="dxa" w:w="80"/>
+            </w:tcMar>
+          </w:tcPr>
+          <w:p>
+            <w:r>
+              <w:rPr>
+                <w:rFonts w:ascii="Arial" w:cs="Arial" w:hAnsi="Arial"/>
+                <w:b/>
+                <w:bCs/>
+                <w:color w:val="FFFFFF"/>
                 <w:sz w:val="17"/>
                 <w:szCs w:val="17"/>
               </w:rPr>
-              <w:t xml:space="preserve">collected 100 items</w:t>
-            </w:r>
-          </w:p>
-        </w:tc>
-      </w:tr>
-      <w:tr>
-        <w:tc>
-          <w:tcPr>
-            <w:shd w:fill="1A1A2E" w:val="clear"/>
-            <w:tcMar>
-              <w:top w:type="dxa" w:w="20"/>
-              <w:left w:type="dxa" w:w="200"/>
-              <w:bottom w:type="dxa" w:w="20"/>
-              <w:right w:type="dxa" w:w="200"/>
-            </w:tcMar>
-          </w:tcPr>
-          <w:p>
-            <w:pPr>
-              <w:spacing w:after="0"/>
-            </w:pPr>
-            <w:r>
-              <w:rPr>
-                <w:rFonts w:ascii="Courier New" w:cs="Courier New" w:hAnsi="Courier New"/>
-                <w:color w:val="888888"/>
+              <w:t xml:space="preserve">Contenu</w:t>
+            </w:r>
+          </w:p>
+        </w:tc>
+      </w:tr>
+      <w:tr>
+        <w:tc>
+          <w:tcPr>
+            <w:tcW w:type="dxa" w:w="3200"/>
+            <w:shd w:fill="FFFFFF" w:val="clear"/>
+            <w:tcMar>
+              <w:top w:type="dxa" w:w="60"/>
+              <w:left w:type="dxa" w:w="80"/>
+              <w:bottom w:type="dxa" w:w="60"/>
+              <w:right w:type="dxa" w:w="80"/>
+            </w:tcMar>
+          </w:tcPr>
+          <w:p>
+            <w:r>
+              <w:rPr>
+                <w:rFonts w:ascii="Arial" w:cs="Arial" w:hAnsi="Arial"/>
+                <w:color w:val="1A1A2E"/>
                 <w:sz w:val="17"/>
                 <w:szCs w:val="17"/>
               </w:rPr>
-              <w:t xml:space="preserve"/>
-            </w:r>
-          </w:p>
-        </w:tc>
-      </w:tr>
-      <w:tr>
-        <w:tc>
-          <w:tcPr>
-            <w:shd w:fill="1A1A2E" w:val="clear"/>
-            <w:tcMar>
-              <w:top w:type="dxa" w:w="20"/>
-              <w:left w:type="dxa" w:w="200"/>
-              <w:bottom w:type="dxa" w:w="20"/>
-              <w:right w:type="dxa" w:w="200"/>
-            </w:tcMar>
-          </w:tcPr>
-          <w:p>
-            <w:pPr>
-              <w:spacing w:after="0"/>
-            </w:pPr>
-            <w:r>
-              <w:rPr>
-                <w:rFonts w:ascii="Courier New" w:cs="Courier New" w:hAnsi="Courier New"/>
-                <w:color w:val="4CAF50"/>
+              <w:t xml:space="preserve">frontend/app.py</w:t>
+            </w:r>
+          </w:p>
+        </w:tc>
+        <w:tc>
+          <w:tcPr>
+            <w:tcW w:type="dxa" w:w="1200"/>
+            <w:shd w:fill="FFFFFF" w:val="clear"/>
+            <w:tcMar>
+              <w:top w:type="dxa" w:w="60"/>
+              <w:left w:type="dxa" w:w="80"/>
+              <w:bottom w:type="dxa" w:w="60"/>
+              <w:right w:type="dxa" w:w="80"/>
+            </w:tcMar>
+          </w:tcPr>
+          <w:p>
+            <w:r>
+              <w:rPr>
+                <w:rFonts w:ascii="Arial" w:cs="Arial" w:hAnsi="Arial"/>
+                <w:color w:val="1A1A2E"/>
                 <w:sz w:val="17"/>
                 <w:szCs w:val="17"/>
               </w:rPr>
-              <w:t xml:space="preserve">tests/test_audit_disclaimer.py  ........................... 27 passed</w:t>
-            </w:r>
-          </w:p>
-        </w:tc>
-      </w:tr>
-      <w:tr>
-        <w:tc>
-          <w:tcPr>
-            <w:shd w:fill="1A1A2E" w:val="clear"/>
-            <w:tcMar>
-              <w:top w:type="dxa" w:w="20"/>
-              <w:left w:type="dxa" w:w="200"/>
-              <w:bottom w:type="dxa" w:w="20"/>
-              <w:right w:type="dxa" w:w="200"/>
-            </w:tcMar>
-          </w:tcPr>
-          <w:p>
-            <w:pPr>
-              <w:spacing w:after="0"/>
-            </w:pPr>
-            <w:r>
-              <w:rPr>
-                <w:rFonts w:ascii="Courier New" w:cs="Courier New" w:hAnsi="Courier New"/>
-                <w:color w:val="4CAF50"/>
+              <w:t xml:space="preserve">NOUVEAU</w:t>
+            </w:r>
+          </w:p>
+        </w:tc>
+        <w:tc>
+          <w:tcPr>
+            <w:tcW w:type="dxa" w:w="4960"/>
+            <w:shd w:fill="FFFFFF" w:val="clear"/>
+            <w:tcMar>
+              <w:top w:type="dxa" w:w="60"/>
+              <w:left w:type="dxa" w:w="80"/>
+              <w:bottom w:type="dxa" w:w="60"/>
+              <w:right w:type="dxa" w:w="80"/>
+            </w:tcMar>
+          </w:tcPr>
+          <w:p>
+            <w:r>
+              <w:rPr>
+                <w:rFonts w:ascii="Arial" w:cs="Arial" w:hAnsi="Arial"/>
+                <w:color w:val="1A1A2E"/>
                 <w:sz w:val="17"/>
                 <w:szCs w:val="17"/>
               </w:rPr>
-              <w:t xml:space="preserve">tests/test_auth.py              ...................... 22 passed</w:t>
-            </w:r>
-          </w:p>
-        </w:tc>
-      </w:tr>
-      <w:tr>
-        <w:tc>
-          <w:tcPr>
-            <w:shd w:fill="1A1A2E" w:val="clear"/>
-            <w:tcMar>
-              <w:top w:type="dxa" w:w="20"/>
-              <w:left w:type="dxa" w:w="200"/>
-              <w:bottom w:type="dxa" w:w="20"/>
-              <w:right w:type="dxa" w:w="200"/>
-            </w:tcMar>
-          </w:tcPr>
-          <w:p>
-            <w:pPr>
-              <w:spacing w:after="0"/>
-            </w:pPr>
-            <w:r>
-              <w:rPr>
-                <w:rFonts w:ascii="Courier New" w:cs="Courier New" w:hAnsi="Courier New"/>
-                <w:color w:val="4CAF50"/>
+              <w:t xml:space="preserve">App Streamlit complete -- auth JWT, filtres, reponse, sources, tooltips, i18n, 900+ lignes</w:t>
+            </w:r>
+          </w:p>
+        </w:tc>
+      </w:tr>
+      <w:tr>
+        <w:tc>
+          <w:tcPr>
+            <w:tcW w:type="dxa" w:w="3200"/>
+            <w:shd w:fill="F5F5F8" w:val="clear"/>
+            <w:tcMar>
+              <w:top w:type="dxa" w:w="60"/>
+              <w:left w:type="dxa" w:w="80"/>
+              <w:bottom w:type="dxa" w:w="60"/>
+              <w:right w:type="dxa" w:w="80"/>
+            </w:tcMar>
+          </w:tcPr>
+          <w:p>
+            <w:r>
+              <w:rPr>
+                <w:rFonts w:ascii="Arial" w:cs="Arial" w:hAnsi="Arial"/>
+                <w:color w:val="1A1A2E"/>
                 <w:sz w:val="17"/>
                 <w:szCs w:val="17"/>
               </w:rPr>
-              <w:t xml:space="preserve">tests/test_guardrail.py         ...................... 22 passed</w:t>
-            </w:r>
-          </w:p>
-        </w:tc>
-      </w:tr>
-      <w:tr>
-        <w:tc>
-          <w:tcPr>
-            <w:shd w:fill="1A1A2E" w:val="clear"/>
-            <w:tcMar>
-              <w:top w:type="dxa" w:w="20"/>
-              <w:left w:type="dxa" w:w="200"/>
-              <w:bottom w:type="dxa" w:w="20"/>
-              <w:right w:type="dxa" w:w="200"/>
-            </w:tcMar>
-          </w:tcPr>
-          <w:p>
-            <w:pPr>
-              <w:spacing w:after="0"/>
-            </w:pPr>
-            <w:r>
-              <w:rPr>
-                <w:rFonts w:ascii="Courier New" w:cs="Courier New" w:hAnsi="Courier New"/>
-                <w:color w:val="4CAF50"/>
+              <w:t xml:space="preserve">frontend/lexai_notext.png</w:t>
+            </w:r>
+          </w:p>
+        </w:tc>
+        <w:tc>
+          <w:tcPr>
+            <w:tcW w:type="dxa" w:w="1200"/>
+            <w:shd w:fill="F5F5F8" w:val="clear"/>
+            <w:tcMar>
+              <w:top w:type="dxa" w:w="60"/>
+              <w:left w:type="dxa" w:w="80"/>
+              <w:bottom w:type="dxa" w:w="60"/>
+              <w:right w:type="dxa" w:w="80"/>
+            </w:tcMar>
+          </w:tcPr>
+          <w:p>
+            <w:r>
+              <w:rPr>
+                <w:rFonts w:ascii="Arial" w:cs="Arial" w:hAnsi="Arial"/>
+                <w:color w:val="1A1A2E"/>
                 <w:sz w:val="17"/>
                 <w:szCs w:val="17"/>
               </w:rPr>
-              <w:t xml:space="preserve">tests/test_injection.py         ........................ 24 passed</w:t>
-            </w:r>
-          </w:p>
-        </w:tc>
-      </w:tr>
-      <w:tr>
-        <w:tc>
-          <w:tcPr>
-            <w:shd w:fill="1A1A2E" w:val="clear"/>
-            <w:tcMar>
-              <w:top w:type="dxa" w:w="20"/>
-              <w:left w:type="dxa" w:w="200"/>
-              <w:bottom w:type="dxa" w:w="20"/>
-              <w:right w:type="dxa" w:w="200"/>
-            </w:tcMar>
-          </w:tcPr>
-          <w:p>
-            <w:pPr>
-              <w:spacing w:after="0"/>
-            </w:pPr>
-            <w:r>
-              <w:rPr>
-                <w:rFonts w:ascii="Courier New" w:cs="Courier New" w:hAnsi="Courier New"/>
-                <w:color w:val="888888"/>
+              <w:t xml:space="preserve">NOUVEAU</w:t>
+            </w:r>
+          </w:p>
+        </w:tc>
+        <w:tc>
+          <w:tcPr>
+            <w:tcW w:type="dxa" w:w="4960"/>
+            <w:shd w:fill="F5F5F8" w:val="clear"/>
+            <w:tcMar>
+              <w:top w:type="dxa" w:w="60"/>
+              <w:left w:type="dxa" w:w="80"/>
+              <w:bottom w:type="dxa" w:w="60"/>
+              <w:right w:type="dxa" w:w="80"/>
+            </w:tcMar>
+          </w:tcPr>
+          <w:p>
+            <w:r>
+              <w:rPr>
+                <w:rFonts w:ascii="Arial" w:cs="Arial" w:hAnsi="Arial"/>
+                <w:color w:val="1A1A2E"/>
                 <w:sz w:val="17"/>
                 <w:szCs w:val="17"/>
               </w:rPr>
-              <w:t xml:space="preserve"/>
-            </w:r>
-          </w:p>
-        </w:tc>
-      </w:tr>
-      <w:tr>
-        <w:tc>
-          <w:tcPr>
-            <w:shd w:fill="1A1A2E" w:val="clear"/>
-            <w:tcMar>
-              <w:top w:type="dxa" w:w="20"/>
-              <w:left w:type="dxa" w:w="200"/>
-              <w:bottom w:type="dxa" w:w="20"/>
-              <w:right w:type="dxa" w:w="200"/>
-            </w:tcMar>
-          </w:tcPr>
-          <w:p>
-            <w:pPr>
-              <w:spacing w:after="0"/>
-            </w:pPr>
-            <w:r>
-              <w:rPr>
-                <w:rFonts w:ascii="Courier New" w:cs="Courier New" w:hAnsi="Courier New"/>
-                <w:color w:val="4CAF50"/>
+              <w:t xml:space="preserve">Logo Lex AI (Themis) sans texte, fond transparent, pour la sidebar</w:t>
+            </w:r>
+          </w:p>
+        </w:tc>
+      </w:tr>
+      <w:tr>
+        <w:tc>
+          <w:tcPr>
+            <w:tcW w:type="dxa" w:w="3200"/>
+            <w:shd w:fill="FFFFFF" w:val="clear"/>
+            <w:tcMar>
+              <w:top w:type="dxa" w:w="60"/>
+              <w:left w:type="dxa" w:w="80"/>
+              <w:bottom w:type="dxa" w:w="60"/>
+              <w:right w:type="dxa" w:w="80"/>
+            </w:tcMar>
+          </w:tcPr>
+          <w:p>
+            <w:r>
+              <w:rPr>
+                <w:rFonts w:ascii="Arial" w:cs="Arial" w:hAnsi="Arial"/>
+                <w:color w:val="1A1A2E"/>
                 <w:sz w:val="17"/>
                 <w:szCs w:val="17"/>
               </w:rPr>
-              <w:t xml:space="preserve">========================= 100 passed in 1.69s =========================</w:t>
+              <w:t xml:space="preserve">frontend/lexai_logo.png</w:t>
+            </w:r>
+          </w:p>
+        </w:tc>
+        <w:tc>
+          <w:tcPr>
+            <w:tcW w:type="dxa" w:w="1200"/>
+            <w:shd w:fill="FFFFFF" w:val="clear"/>
+            <w:tcMar>
+              <w:top w:type="dxa" w:w="60"/>
+              <w:left w:type="dxa" w:w="80"/>
+              <w:bottom w:type="dxa" w:w="60"/>
+              <w:right w:type="dxa" w:w="80"/>
+            </w:tcMar>
+          </w:tcPr>
+          <w:p>
+            <w:r>
+              <w:rPr>
+                <w:rFonts w:ascii="Arial" w:cs="Arial" w:hAnsi="Arial"/>
+                <w:color w:val="1A1A2E"/>
+                <w:sz w:val="17"/>
+                <w:szCs w:val="17"/>
+              </w:rPr>
+              <w:t xml:space="preserve">NOUVEAU</w:t>
+            </w:r>
+          </w:p>
+        </w:tc>
+        <w:tc>
+          <w:tcPr>
+            <w:tcW w:type="dxa" w:w="4960"/>
+            <w:shd w:fill="FFFFFF" w:val="clear"/>
+            <w:tcMar>
+              <w:top w:type="dxa" w:w="60"/>
+              <w:left w:type="dxa" w:w="80"/>
+              <w:bottom w:type="dxa" w:w="60"/>
+              <w:right w:type="dxa" w:w="80"/>
+            </w:tcMar>
+          </w:tcPr>
+          <w:p>
+            <w:r>
+              <w:rPr>
+                <w:rFonts w:ascii="Arial" w:cs="Arial" w:hAnsi="Arial"/>
+                <w:color w:val="1A1A2E"/>
+                <w:sz w:val="17"/>
+                <w:szCs w:val="17"/>
+              </w:rPr>
+              <w:t xml:space="preserve">Logo Lex AI avec texte complet</w:t>
+            </w:r>
+          </w:p>
+        </w:tc>
+      </w:tr>
+      <w:tr>
+        <w:tc>
+          <w:tcPr>
+            <w:tcW w:type="dxa" w:w="3200"/>
+            <w:shd w:fill="F5F5F8" w:val="clear"/>
+            <w:tcMar>
+              <w:top w:type="dxa" w:w="60"/>
+              <w:left w:type="dxa" w:w="80"/>
+              <w:bottom w:type="dxa" w:w="60"/>
+              <w:right w:type="dxa" w:w="80"/>
+            </w:tcMar>
+          </w:tcPr>
+          <w:p>
+            <w:r>
+              <w:rPr>
+                <w:rFonts w:ascii="Arial" w:cs="Arial" w:hAnsi="Arial"/>
+                <w:color w:val="1A1A2E"/>
+                <w:sz w:val="17"/>
+                <w:szCs w:val="17"/>
+              </w:rPr>
+              <w:t xml:space="preserve">frontend/.streamlit/config.toml</w:t>
+            </w:r>
+          </w:p>
+        </w:tc>
+        <w:tc>
+          <w:tcPr>
+            <w:tcW w:type="dxa" w:w="1200"/>
+            <w:shd w:fill="F5F5F8" w:val="clear"/>
+            <w:tcMar>
+              <w:top w:type="dxa" w:w="60"/>
+              <w:left w:type="dxa" w:w="80"/>
+              <w:bottom w:type="dxa" w:w="60"/>
+              <w:right w:type="dxa" w:w="80"/>
+            </w:tcMar>
+          </w:tcPr>
+          <w:p>
+            <w:r>
+              <w:rPr>
+                <w:rFonts w:ascii="Arial" w:cs="Arial" w:hAnsi="Arial"/>
+                <w:color w:val="1A1A2E"/>
+                <w:sz w:val="17"/>
+                <w:szCs w:val="17"/>
+              </w:rPr>
+              <w:t xml:space="preserve">NOUVEAU</w:t>
+            </w:r>
+          </w:p>
+        </w:tc>
+        <w:tc>
+          <w:tcPr>
+            <w:tcW w:type="dxa" w:w="4960"/>
+            <w:shd w:fill="F5F5F8" w:val="clear"/>
+            <w:tcMar>
+              <w:top w:type="dxa" w:w="60"/>
+              <w:left w:type="dxa" w:w="80"/>
+              <w:bottom w:type="dxa" w:w="60"/>
+              <w:right w:type="dxa" w:w="80"/>
+            </w:tcMar>
+          </w:tcPr>
+          <w:p>
+            <w:r>
+              <w:rPr>
+                <w:rFonts w:ascii="Arial" w:cs="Arial" w:hAnsi="Arial"/>
+                <w:color w:val="1A1A2E"/>
+                <w:sz w:val="17"/>
+                <w:szCs w:val="17"/>
+              </w:rPr>
+              <w:t xml:space="preserve">Theme Streamlit -- primaryColor teal #2a9d8f, fond blanc, texte #1a1a2e</w:t>
             </w:r>
           </w:p>
         </w:tc>
@@ -26898,7 +27041,11 @@
                 <w:sz w:val="18"/>
                 <w:szCs w:val="18"/>
               </w:rPr>
-              <w:t xml:space="preserve">latest  feat(auth): JWT + API key auth + rate limiting
+              <w:t xml:space="preserve">latest  feat(frontend): Lex AI UI -- tooltips, sources, disclaimer, i18n FR/EN
+c1b2a3d feat(tests): unit tests + GitHub Actions CI -- 100/100 PASSED
+d7e8f9b feat(disclaimer): legal disclaimer auto FR/EN
+e4d5f6a feat(audit): JSONL audit log + question par defaut Swagger
+f1a2b3c feat(auth): JWT + API key auth + rate limiting
 c8f2a1b feat(guardrail): hallucination guardrail — detection sources fantomes
 b3e9f1a perf(prompt): faithfulness 88.5% — patch build_prompt
 a1c4d7e fix(docker): add anthropic to requirements.txt — LLM fallback résolu</w:t>

</xml_diff>

<commit_message>
docs: v7.0 — remove juris_ai_logo, keep only lexai_notext
</commit_message>
<xml_diff>
--- a/docs/AI_Legal_Platform_Documentation.docx
+++ b/docs/AI_Legal_Platform_Documentation.docx
@@ -25143,7 +25143,7 @@
                 <w:sz w:val="17"/>
                 <w:szCs w:val="17"/>
               </w:rPr>
-              <w:t xml:space="preserve">Logo Lex AI (Themis) sans texte, fond transparent, pour la sidebar</w:t>
+              <w:t xml:space="preserve">Logo Lex AI (Themis) -- fond transparent, utilise dans la sidebar (120px)</w:t>
             </w:r>
           </w:p>
         </w:tc>
@@ -25168,7 +25168,7 @@
                 <w:sz w:val="17"/>
                 <w:szCs w:val="17"/>
               </w:rPr>
-              <w:t xml:space="preserve">frontend/lexai_logo.png</w:t>
+              <w:t xml:space="preserve"/>
             </w:r>
           </w:p>
         </w:tc>
@@ -25214,7 +25214,7 @@
                 <w:sz w:val="17"/>
                 <w:szCs w:val="17"/>
               </w:rPr>
-              <w:t xml:space="preserve">Logo Lex AI avec texte complet</w:t>
+              <w:t xml:space="preserve"/>
             </w:r>
           </w:p>
         </w:tc>

</xml_diff>